<commit_message>
Sablon duzeltme: 4.5 yuzde alanlari etiket sonrasina alindi
</commit_message>
<xml_diff>
--- a/assets/IsAnaliziForm-template.docx
+++ b/assets/IsAnaliziForm-template.docx
@@ -12004,9 +12004,7 @@
                 <w:lang w:val="tr-TR"/>
               </w:rPr>
             </w:pPr>
-            <w:r>
-              <w:t xml:space="preserve"> {{yuzde_masa}}</w:t>
-            </w:r>
+            <w:r/>
           </w:p>
           <w:p>
             <w:pPr>
@@ -12029,6 +12027,9 @@
               </w:rPr>
               <w:t xml:space="preserve">Ofis Ortamında  Masa Başında            % </w:t>
             </w:r>
+            <w:r>
+              <w:t xml:space="preserve"> {{yuzde_masa}}</w:t>
+            </w:r>
           </w:p>
         </w:tc>
       </w:tr>
@@ -12052,9 +12053,7 @@
                 <w:lang w:val="tr-TR"/>
               </w:rPr>
             </w:pPr>
-            <w:r>
-              <w:t xml:space="preserve"> {{yuzde_bolumler}}</w:t>
-            </w:r>
+            <w:r/>
           </w:p>
           <w:p>
             <w:pPr>
@@ -12077,6 +12076,9 @@
               </w:rPr>
               <w:t xml:space="preserve">Ofis Ortamında Bölümler Arasında     % </w:t>
             </w:r>
+            <w:r>
+              <w:t xml:space="preserve"> {{yuzde_bolumler}}</w:t>
+            </w:r>
           </w:p>
         </w:tc>
       </w:tr>
@@ -12100,9 +12102,7 @@
                 <w:lang w:val="tr-TR"/>
               </w:rPr>
             </w:pPr>
-            <w:r>
-              <w:t xml:space="preserve"> {{yuzde_mobil}}</w:t>
-            </w:r>
+            <w:r/>
           </w:p>
           <w:p>
             <w:pPr>
@@ -12124,6 +12124,9 @@
                 <w:lang w:val="tr-TR"/>
               </w:rPr>
               <w:t xml:space="preserve">Ofis Ortamı Dışında Mobil                  % </w:t>
+            </w:r>
+            <w:r>
+              <w:t xml:space="preserve"> {{yuzde_mobil}}</w:t>
             </w:r>
           </w:p>
         </w:tc>

</xml_diff>

<commit_message>
Cevaplar soru paragrafinda alt satirdan baslasin
</commit_message>
<xml_diff>
--- a/assets/IsAnaliziForm-template.docx
+++ b/assets/IsAnaliziForm-template.docx
@@ -2188,7 +2188,8 @@
         <w:t>:</w:t>
       </w:r>
       <w:r>
-        <w:t xml:space="preserve"> {{ayni_unvan_sayisi}}</w:t>
+        <w:br/>
+        <w:t xml:space="preserve">{{ayni_unvan_sayisi}}</w:t>
       </w:r>
     </w:p>
     <w:p>
@@ -2225,7 +2226,8 @@
         <w:t>:</w:t>
       </w:r>
       <w:r>
-        <w:t xml:space="preserve"> {{fazla_mesai}}</w:t>
+        <w:br/>
+        <w:t xml:space="preserve">{{fazla_mesai}}</w:t>
       </w:r>
     </w:p>
     <w:p>
@@ -2262,7 +2264,8 @@
         <w:t>:</w:t>
       </w:r>
       <w:r>
-        <w:t xml:space="preserve"> {{nobet}}</w:t>
+        <w:br/>
+        <w:t xml:space="preserve">{{nobet}}</w:t>
       </w:r>
     </w:p>
     <w:p>
@@ -2299,7 +2302,8 @@
         <w:t>nvanları :</w:t>
       </w:r>
       <w:r>
-        <w:t xml:space="preserve"> {{vekalet_eden}}</w:t>
+        <w:br/>
+        <w:t xml:space="preserve">{{vekalet_eden}}</w:t>
       </w:r>
     </w:p>
     <w:p>
@@ -2341,7 +2345,8 @@
         <w:t>nvanları :</w:t>
       </w:r>
       <w:r>
-        <w:t xml:space="preserve"> {{vekalet_edilen}}</w:t>
+        <w:br/>
+        <w:t xml:space="preserve">{{vekalet_edilen}}</w:t>
       </w:r>
     </w:p>
     <w:p>
@@ -2528,7 +2533,8 @@
         <w:t>Aşağıdaki boş alana bir iki cümle ile özet olarak görevinizin genel amacını açıklayınız.</w:t>
       </w:r>
       <w:r>
-        <w:t xml:space="preserve"> {{rol_amaci}}</w:t>
+        <w:br/>
+        <w:t xml:space="preserve">{{rol_amaci}}</w:t>
       </w:r>
     </w:p>
     <w:p>
@@ -5210,7 +5216,8 @@
         <w:t>Bu faaliyetleri yapmak için hangi girdiler gerekmektedir? Bunları hangi birim/bölüm sağlamaktadır?</w:t>
       </w:r>
       <w:r>
-        <w:t xml:space="preserve"> {{girdiler_birimler}}</w:t>
+        <w:br/>
+        <w:t xml:space="preserve">{{girdiler_birimler}}</w:t>
       </w:r>
     </w:p>
     <w:p>
@@ -5349,7 +5356,8 @@
         <w:t>Bu faaliyetler sonunda hangi çıktılar üretilmektedir ve bunlar nereye gider?</w:t>
       </w:r>
       <w:r>
-        <w:t xml:space="preserve"> {{ciktilar}}</w:t>
+        <w:br/>
+        <w:t xml:space="preserve">{{ciktilar}}</w:t>
       </w:r>
     </w:p>
     <w:p>
@@ -5446,7 +5454,8 @@
         <w:t>Faaliyetleri gerçekleştirirken hangi sistemler kullanılmaktadır?</w:t>
       </w:r>
       <w:r>
-        <w:t xml:space="preserve"> {{sistemler}}</w:t>
+        <w:br/>
+        <w:t xml:space="preserve">{{sistemler}}</w:t>
       </w:r>
     </w:p>
     <w:p>
@@ -5569,7 +5578,8 @@
         <w:t>) nelerdir?</w:t>
       </w:r>
       <w:r>
-        <w:t xml:space="preserve"> {{kullanilan_girdiler}}</w:t>
+        <w:br/>
+        <w:t xml:space="preserve">{{kullanilan_girdiler}}</w:t>
       </w:r>
     </w:p>
     <w:p>
@@ -5690,7 +5700,8 @@
         <w:t xml:space="preserve">Faaliyet sonuçlarınızı (çıktılarınızı) hedefe ulaşma açısından performansınızı ölçüyor musunuz? </w:t>
       </w:r>
       <w:r>
-        <w:t xml:space="preserve"> {{performans_olcum}}</w:t>
+        <w:br/>
+        <w:t xml:space="preserve">{{performans_olcum}}</w:t>
       </w:r>
     </w:p>
     <w:p>
@@ -5752,7 +5763,8 @@
         <w:t xml:space="preserve">Faaliyetlerinizin mevcut performansı nedir? </w:t>
       </w:r>
       <w:r>
-        <w:t xml:space="preserve"> {{mevcut_performans}}</w:t>
+        <w:br/>
+        <w:t xml:space="preserve">{{mevcut_performans}}</w:t>
       </w:r>
     </w:p>
     <w:p>
@@ -5876,7 +5888,8 @@
         <w:t xml:space="preserve">) ölçüyorsunuz.  </w:t>
       </w:r>
       <w:r>
-        <w:t xml:space="preserve"> {{performans_gostergeleri}}</w:t>
+        <w:br/>
+        <w:t xml:space="preserve">{{performans_gostergeleri}}</w:t>
       </w:r>
     </w:p>
     <w:p>
@@ -6038,7 +6051,8 @@
         <w:t xml:space="preserve">İşle ilgili hazırlanan, kontrol edilen veya onaylanan form, doküman ve raporlar nelerdir? </w:t>
       </w:r>
       <w:r>
-        <w:t xml:space="preserve"> {{hazirlanan_dokumanlar}}</w:t>
+        <w:br/>
+        <w:t xml:space="preserve">{{hazirlanan_dokumanlar}}</w:t>
       </w:r>
     </w:p>
     <w:p>
@@ -10926,7 +10940,8 @@
         <w:tab/>
       </w:r>
       <w:r>
-        <w:t xml:space="preserve"> {{y_diger_aciklama}}</w:t>
+        <w:br/>
+        <w:t xml:space="preserve">{{y_diger_aciklama}}</w:t>
       </w:r>
     </w:p>
     <w:p>
@@ -12281,7 +12296,8 @@
         <w:t>önerileriniz nelerdir?</w:t>
       </w:r>
       <w:r>
-        <w:t xml:space="preserve"> {{oturma_duzeni}}</w:t>
+        <w:br/>
+        <w:t xml:space="preserve">{{oturma_duzeni}}</w:t>
       </w:r>
     </w:p>
     <w:p>
@@ -12502,7 +12518,8 @@
         <w:t>düşürme, mobbing vs)</w:t>
       </w:r>
       <w:r>
-        <w:t xml:space="preserve"> {{sosyal_sorunlar}}</w:t>
+        <w:br/>
+        <w:t xml:space="preserve">{{sosyal_sorunlar}}</w:t>
       </w:r>
     </w:p>
     <w:p>
@@ -17655,7 +17672,8 @@
         <w:t>Biriminizde yürütülen faaliyetlerin ve hizmetlerin daha etkili, verimli, kaliteli ve daha az maliyetle gerçekleştirilmesi için önerileriniz nelerdir?</w:t>
       </w:r>
       <w:r>
-        <w:t xml:space="preserve"> {{birim_oneriler}}</w:t>
+        <w:br/>
+        <w:t xml:space="preserve">{{birim_oneriler}}</w:t>
       </w:r>
     </w:p>
     <w:p>
@@ -17741,7 +17759,8 @@
         <w:t>Göreviniz/İşiniz gereği seyahat ediyorsanız, bunun amacı ve sıklığı nedir?</w:t>
       </w:r>
       <w:r>
-        <w:t xml:space="preserve"> {{seyahat}}</w:t>
+        <w:br/>
+        <w:t xml:space="preserve">{{seyahat}}</w:t>
       </w:r>
     </w:p>
     <w:p>
@@ -17818,7 +17837,8 @@
         <w:t>ir?</w:t>
       </w:r>
       <w:r>
-        <w:t xml:space="preserve"> {{aciklama_yararli}}</w:t>
+        <w:br/>
+        <w:t xml:space="preserve">{{aciklama_yararli}}</w:t>
       </w:r>
     </w:p>
     <w:p>
@@ -19056,7 +19076,8 @@
         <w:t>işler var mıdır? Varsa işlerin, yapılmama nedenlerini ve hangi kadro unvanı tarafından yapılması gerektiğini belirtiniz?</w:t>
       </w:r>
       <w:r>
-        <w:t xml:space="preserve"> {{yapilamayan_isler}}</w:t>
+        <w:br/>
+        <w:t xml:space="preserve">{{yapilamayan_isler}}</w:t>
       </w:r>
     </w:p>
     <w:p>
@@ -20895,7 +20916,8 @@
         <w:t>Çok memnunum</w:t>
       </w:r>
       <w:r>
-        <w:t xml:space="preserve">  (İşaretlenen: {{memnuniyet}})</w:t>
+        <w:br/>
+        <w:t xml:space="preserve">(İşaretlenen: {{memnuniyet}})</w:t>
       </w:r>
     </w:p>
     <w:p>
@@ -21002,7 +21024,8 @@
         <w:t>Sizce bu işte kaç kişi çalışmalıdır? Gerekçesini (nedeni) yazınız?</w:t>
       </w:r>
       <w:r>
-        <w:t xml:space="preserve"> {{kac_kisi}}</w:t>
+        <w:br/>
+        <w:t xml:space="preserve">{{kac_kisi}}</w:t>
       </w:r>
     </w:p>
     <w:p>
@@ -21073,7 +21096,8 @@
         <w:t>Faaliyetlerin yapılmasında personel sıkıntısı çekiyor musunuz?  Hangi faaliyetlerde ve kadro unvanlarında sıkıntı çekiyorsunuz. Yeni personel alımına dair öneriniz varsa lütfen yazınız.</w:t>
       </w:r>
       <w:r>
-        <w:t xml:space="preserve"> {{personel_sikintisi}}</w:t>
+        <w:br/>
+        <w:t xml:space="preserve">{{personel_sikintisi}}</w:t>
       </w:r>
     </w:p>
     <w:p>
@@ -21145,7 +21169,8 @@
         <w:t xml:space="preserve">Eleman sayınız yeterli mi? Yeterli olduğu halde az iş çıktığına inanıyorsanız, sebebini yazınız. </w:t>
       </w:r>
       <w:r>
-        <w:t xml:space="preserve"> {{eleman_yeterli_mi}}</w:t>
+        <w:br/>
+        <w:t xml:space="preserve">{{eleman_yeterli_mi}}</w:t>
       </w:r>
     </w:p>
     <w:p>
@@ -21216,7 +21241,8 @@
         <w:t>Kurumunuzdaki faaliyetlerin daha etkili, verimli, kaliteli, daha az maliyetle gerçekleştirilmesi için önerileriniz var mı? Varsa belirtiniz.</w:t>
       </w:r>
       <w:r>
-        <w:t xml:space="preserve"> {{verimlilik_onerileri}}</w:t>
+        <w:br/>
+        <w:t xml:space="preserve">{{verimlilik_onerileri}}</w:t>
       </w:r>
     </w:p>
     <w:p>
@@ -21288,7 +21314,8 @@
         <w:t>Faaliyetlerinizin ya da çalışanlarınızın performansını artırmak için önerileriniz nelerdir?</w:t>
       </w:r>
       <w:r>
-        <w:t xml:space="preserve"> {{performans_artirma}}</w:t>
+        <w:br/>
+        <w:t xml:space="preserve">{{performans_artirma}}</w:t>
       </w:r>
     </w:p>
     <w:p>
@@ -21333,7 +21360,8 @@
         <w:t>Faaliyetlerinizin iyileştirilmesini zorlaştıran engeller var mıdır? Varsa zorlaştıran engelleri belirtiniz.</w:t>
       </w:r>
       <w:r>
-        <w:t xml:space="preserve"> {{iyilestirme_engelleri}}</w:t>
+        <w:br/>
+        <w:t xml:space="preserve">{{iyilestirme_engelleri}}</w:t>
       </w:r>
     </w:p>
     <w:p>
@@ -21423,7 +21451,8 @@
         <w:t>Faaliyetlerinizin daha etkili ve verimli olması için birim organizasyon şemanızda değişikliğe ihtiyaç var mıdır? Varsa değişiklik önerilerinizi belirtiniz.</w:t>
       </w:r>
       <w:r>
-        <w:t xml:space="preserve"> {{org_degisikligi}}</w:t>
+        <w:br/>
+        <w:t xml:space="preserve">{{org_degisikligi}}</w:t>
       </w:r>
     </w:p>
     <w:p>
@@ -26453,7 +26482,8 @@
         <w:tab/>
       </w:r>
       <w:r>
-        <w:t xml:space="preserve"> {{dogrudan_sayi}}</w:t>
+        <w:br/>
+        <w:t xml:space="preserve">{{dogrudan_sayi}}</w:t>
       </w:r>
     </w:p>
     <w:p>
@@ -26496,7 +26526,8 @@
         <w:tab/>
       </w:r>
       <w:r>
-        <w:t xml:space="preserve"> {{dolayli_sayi}}</w:t>
+        <w:br/>
+        <w:t xml:space="preserve">{{dolayli_sayi}}</w:t>
       </w:r>
     </w:p>
     <w:p>

</xml_diff>

<commit_message>
11. bolum KONULAR/NICIN tablosu iki sutunlu ve cizgili
</commit_message>
<xml_diff>
--- a/assets/IsAnaliziForm-template.docx
+++ b/assets/IsAnaliziForm-template.docx
@@ -21563,11 +21563,17 @@
         <w:tblInd w:w="828" w:type="dxa"/>
         <w:tblBorders>
           <w:bottom w:val="single" w:sz="4" w:space="0" w:color="auto"/>
+          <w:top w:val="single" w:sz="4" w:space="0" w:color="auto"/>
+          <w:left w:val="single" w:sz="4" w:space="0" w:color="auto"/>
+          <w:right w:val="single" w:sz="4" w:space="0" w:color="auto"/>
+          <w:insideH w:val="single" w:sz="4" w:space="0" w:color="auto"/>
+          <w:insideV w:val="single" w:sz="4" w:space="0" w:color="auto"/>
         </w:tblBorders>
         <w:tblLook w:val="01E0" w:firstRow="1" w:lastRow="1" w:firstColumn="1" w:lastColumn="1" w:noHBand="0" w:noVBand="0"/>
       </w:tblPr>
       <w:tblGrid>
-        <w:gridCol w:w="10112"/>
+        <w:gridCol w:w="5056"/>
+        <w:gridCol w:w="5056"/>
       </w:tblGrid>
       <w:tr>
         <w:tc>
@@ -21582,10 +21588,11 @@
             <w:r>
               <w:t xml:space="preserve">{{zor_yanlar}}</w:t>
             </w:r>
-          </w:p>
-        </w:tc>
-      </w:tr>
-      <w:tr>
+            <w:r>
+              <w:t xml:space="preserve">{{#zor_yanlar}}{{konu}}</w:t>
+            </w:r>
+          </w:p>
+        </w:tc>
         <w:tc>
           <w:tcPr>
             <w:tcW w:w="10112" w:type="dxa"/>
@@ -21595,213 +21602,9 @@
             </w:tcBorders>
           </w:tcPr>
           <w:p>
-            <w:pPr>
-              <w:spacing w:line="360" w:lineRule="auto"/>
-              <w:jc w:val="both"/>
-              <w:rPr>
-                <w:rFonts w:ascii="Calibri" w:hAnsi="Calibri" w:cs="Calibri"/>
-                <w:noProof/>
-                <w:lang w:val="tr-TR"/>
-              </w:rPr>
-            </w:pPr>
-          </w:p>
-        </w:tc>
-      </w:tr>
-      <w:tr>
-        <w:tc>
-          <w:tcPr>
-            <w:tcW w:w="10112" w:type="dxa"/>
-            <w:tcBorders>
-              <w:top w:val="single" w:sz="4" w:space="0" w:color="auto"/>
-              <w:bottom w:val="single" w:sz="4" w:space="0" w:color="auto"/>
-            </w:tcBorders>
-          </w:tcPr>
-          <w:p>
-            <w:pPr>
-              <w:spacing w:line="360" w:lineRule="auto"/>
-              <w:jc w:val="both"/>
-              <w:rPr>
-                <w:rFonts w:ascii="Calibri" w:hAnsi="Calibri" w:cs="Calibri"/>
-                <w:noProof/>
-                <w:lang w:val="tr-TR"/>
-              </w:rPr>
-            </w:pPr>
-          </w:p>
-        </w:tc>
-      </w:tr>
-      <w:tr>
-        <w:tc>
-          <w:tcPr>
-            <w:tcW w:w="10112" w:type="dxa"/>
-            <w:tcBorders>
-              <w:top w:val="single" w:sz="4" w:space="0" w:color="auto"/>
-              <w:bottom w:val="single" w:sz="4" w:space="0" w:color="auto"/>
-            </w:tcBorders>
-          </w:tcPr>
-          <w:p>
-            <w:pPr>
-              <w:spacing w:line="360" w:lineRule="auto"/>
-              <w:jc w:val="both"/>
-              <w:rPr>
-                <w:rFonts w:ascii="Calibri" w:hAnsi="Calibri" w:cs="Calibri"/>
-                <w:noProof/>
-                <w:lang w:val="tr-TR"/>
-              </w:rPr>
-            </w:pPr>
-          </w:p>
-        </w:tc>
-      </w:tr>
-      <w:tr>
-        <w:tc>
-          <w:tcPr>
-            <w:tcW w:w="10112" w:type="dxa"/>
-            <w:tcBorders>
-              <w:top w:val="single" w:sz="4" w:space="0" w:color="auto"/>
-              <w:bottom w:val="single" w:sz="4" w:space="0" w:color="auto"/>
-            </w:tcBorders>
-          </w:tcPr>
-          <w:p>
-            <w:pPr>
-              <w:spacing w:line="360" w:lineRule="auto"/>
-              <w:jc w:val="both"/>
-              <w:rPr>
-                <w:rFonts w:ascii="Calibri" w:hAnsi="Calibri" w:cs="Calibri"/>
-                <w:noProof/>
-                <w:lang w:val="tr-TR"/>
-              </w:rPr>
-            </w:pPr>
-          </w:p>
-        </w:tc>
-      </w:tr>
-      <w:tr>
-        <w:tc>
-          <w:tcPr>
-            <w:tcW w:w="10112" w:type="dxa"/>
-            <w:tcBorders>
-              <w:top w:val="single" w:sz="4" w:space="0" w:color="auto"/>
-              <w:bottom w:val="single" w:sz="4" w:space="0" w:color="auto"/>
-            </w:tcBorders>
-          </w:tcPr>
-          <w:p>
-            <w:pPr>
-              <w:spacing w:line="360" w:lineRule="auto"/>
-              <w:jc w:val="both"/>
-              <w:rPr>
-                <w:rFonts w:ascii="Calibri" w:hAnsi="Calibri" w:cs="Calibri"/>
-                <w:noProof/>
-                <w:lang w:val="tr-TR"/>
-              </w:rPr>
-            </w:pPr>
-          </w:p>
-        </w:tc>
-      </w:tr>
-      <w:tr>
-        <w:tc>
-          <w:tcPr>
-            <w:tcW w:w="10112" w:type="dxa"/>
-            <w:tcBorders>
-              <w:top w:val="single" w:sz="4" w:space="0" w:color="auto"/>
-              <w:bottom w:val="single" w:sz="4" w:space="0" w:color="auto"/>
-            </w:tcBorders>
-          </w:tcPr>
-          <w:p>
-            <w:pPr>
-              <w:spacing w:line="360" w:lineRule="auto"/>
-              <w:jc w:val="both"/>
-              <w:rPr>
-                <w:rFonts w:ascii="Calibri" w:hAnsi="Calibri" w:cs="Calibri"/>
-                <w:noProof/>
-                <w:lang w:val="tr-TR"/>
-              </w:rPr>
-            </w:pPr>
-          </w:p>
-        </w:tc>
-      </w:tr>
-      <w:tr>
-        <w:tc>
-          <w:tcPr>
-            <w:tcW w:w="10112" w:type="dxa"/>
-            <w:tcBorders>
-              <w:top w:val="single" w:sz="4" w:space="0" w:color="auto"/>
-              <w:bottom w:val="single" w:sz="4" w:space="0" w:color="auto"/>
-            </w:tcBorders>
-          </w:tcPr>
-          <w:p>
-            <w:pPr>
-              <w:spacing w:line="360" w:lineRule="auto"/>
-              <w:jc w:val="both"/>
-              <w:rPr>
-                <w:rFonts w:ascii="Calibri" w:hAnsi="Calibri" w:cs="Calibri"/>
-                <w:noProof/>
-                <w:lang w:val="tr-TR"/>
-              </w:rPr>
-            </w:pPr>
-          </w:p>
-        </w:tc>
-      </w:tr>
-      <w:tr>
-        <w:tc>
-          <w:tcPr>
-            <w:tcW w:w="10112" w:type="dxa"/>
-            <w:tcBorders>
-              <w:top w:val="single" w:sz="4" w:space="0" w:color="auto"/>
-              <w:bottom w:val="single" w:sz="4" w:space="0" w:color="auto"/>
-            </w:tcBorders>
-          </w:tcPr>
-          <w:p>
-            <w:pPr>
-              <w:spacing w:line="360" w:lineRule="auto"/>
-              <w:jc w:val="both"/>
-              <w:rPr>
-                <w:rFonts w:ascii="Calibri" w:hAnsi="Calibri" w:cs="Calibri"/>
-                <w:noProof/>
-                <w:lang w:val="tr-TR"/>
-              </w:rPr>
-            </w:pPr>
-          </w:p>
-        </w:tc>
-      </w:tr>
-      <w:tr>
-        <w:tc>
-          <w:tcPr>
-            <w:tcW w:w="10112" w:type="dxa"/>
-            <w:tcBorders>
-              <w:top w:val="single" w:sz="4" w:space="0" w:color="auto"/>
-              <w:bottom w:val="single" w:sz="4" w:space="0" w:color="auto"/>
-            </w:tcBorders>
-          </w:tcPr>
-          <w:p>
-            <w:pPr>
-              <w:spacing w:line="360" w:lineRule="auto"/>
-              <w:jc w:val="both"/>
-              <w:rPr>
-                <w:rFonts w:ascii="Calibri" w:hAnsi="Calibri" w:cs="Calibri"/>
-                <w:noProof/>
-                <w:lang w:val="tr-TR"/>
-              </w:rPr>
-            </w:pPr>
-          </w:p>
-        </w:tc>
-      </w:tr>
-      <w:tr>
-        <w:tc>
-          <w:tcPr>
-            <w:tcW w:w="10112" w:type="dxa"/>
-            <w:tcBorders>
-              <w:top w:val="single" w:sz="4" w:space="0" w:color="auto"/>
-              <w:bottom w:val="single" w:sz="4" w:space="0" w:color="auto"/>
-            </w:tcBorders>
-          </w:tcPr>
-          <w:p>
-            <w:pPr>
-              <w:spacing w:line="360" w:lineRule="auto"/>
-              <w:jc w:val="both"/>
-              <w:rPr>
-                <w:rFonts w:ascii="Calibri" w:hAnsi="Calibri" w:cs="Calibri"/>
-                <w:noProof/>
-                <w:lang w:val="tr-TR"/>
-              </w:rPr>
-            </w:pPr>
+            <w:r>
+              <w:t xml:space="preserve">{{neden}}{{/zor_yanlar}}</w:t>
+            </w:r>
           </w:p>
         </w:tc>
       </w:tr>

</xml_diff>

<commit_message>
Cevap kutulari cizgiler uzerinden satira yayilsin
</commit_message>
<xml_diff>
--- a/assets/IsAnaliziForm-template.docx
+++ b/assets/IsAnaliziForm-template.docx
@@ -3268,160 +3268,8 @@
           </w:tcPr>
           <w:p>
             <w:r>
-              <w:t xml:space="preserve">{{mevcut_yetkiler}}</w:t>
-            </w:r>
-          </w:p>
-        </w:tc>
-      </w:tr>
-      <w:tr>
-        <w:tc>
-          <w:tcPr>
-            <w:tcW w:w="10112" w:type="dxa"/>
-            <w:tcBorders>
-              <w:top w:val="single" w:sz="4" w:space="0" w:color="auto"/>
-              <w:bottom w:val="single" w:sz="4" w:space="0" w:color="auto"/>
-            </w:tcBorders>
-          </w:tcPr>
-          <w:p>
-            <w:pPr>
-              <w:jc w:val="both"/>
-              <w:rPr>
-                <w:rFonts w:ascii="Calibri" w:hAnsi="Calibri" w:cs="Calibri"/>
-                <w:noProof/>
-                <w:lang w:val="tr-TR"/>
-              </w:rPr>
-            </w:pPr>
-          </w:p>
-          <w:p>
-            <w:pPr>
-              <w:jc w:val="both"/>
-              <w:rPr>
-                <w:rFonts w:ascii="Calibri" w:hAnsi="Calibri" w:cs="Calibri"/>
-                <w:noProof/>
-                <w:lang w:val="tr-TR"/>
-              </w:rPr>
-            </w:pPr>
-          </w:p>
-        </w:tc>
-      </w:tr>
-      <w:tr>
-        <w:tc>
-          <w:tcPr>
-            <w:tcW w:w="10112" w:type="dxa"/>
-            <w:tcBorders>
-              <w:top w:val="single" w:sz="4" w:space="0" w:color="auto"/>
-              <w:bottom w:val="single" w:sz="4" w:space="0" w:color="auto"/>
-            </w:tcBorders>
-          </w:tcPr>
-          <w:p>
-            <w:pPr>
-              <w:jc w:val="both"/>
-              <w:rPr>
-                <w:rFonts w:ascii="Calibri" w:hAnsi="Calibri" w:cs="Calibri"/>
-                <w:noProof/>
-                <w:lang w:val="tr-TR"/>
-              </w:rPr>
-            </w:pPr>
-          </w:p>
-          <w:p>
-            <w:pPr>
-              <w:jc w:val="both"/>
-              <w:rPr>
-                <w:rFonts w:ascii="Calibri" w:hAnsi="Calibri" w:cs="Calibri"/>
-                <w:noProof/>
-                <w:lang w:val="tr-TR"/>
-              </w:rPr>
-            </w:pPr>
-          </w:p>
-        </w:tc>
-      </w:tr>
-      <w:tr>
-        <w:tc>
-          <w:tcPr>
-            <w:tcW w:w="10112" w:type="dxa"/>
-            <w:tcBorders>
-              <w:top w:val="single" w:sz="4" w:space="0" w:color="auto"/>
-            </w:tcBorders>
-          </w:tcPr>
-          <w:p>
-            <w:pPr>
-              <w:jc w:val="both"/>
-              <w:rPr>
-                <w:rFonts w:ascii="Calibri" w:hAnsi="Calibri" w:cs="Calibri"/>
-                <w:noProof/>
-                <w:lang w:val="tr-TR"/>
-              </w:rPr>
-            </w:pPr>
-          </w:p>
-          <w:p>
-            <w:pPr>
-              <w:jc w:val="both"/>
-              <w:rPr>
-                <w:rFonts w:ascii="Calibri" w:hAnsi="Calibri" w:cs="Calibri"/>
-                <w:noProof/>
-                <w:lang w:val="tr-TR"/>
-              </w:rPr>
-            </w:pPr>
-          </w:p>
-        </w:tc>
-      </w:tr>
-      <w:tr>
-        <w:tc>
-          <w:tcPr>
-            <w:tcW w:w="10112" w:type="dxa"/>
-            <w:tcBorders>
-              <w:top w:val="single" w:sz="4" w:space="0" w:color="auto"/>
-            </w:tcBorders>
-          </w:tcPr>
-          <w:p>
-            <w:pPr>
-              <w:jc w:val="both"/>
-              <w:rPr>
-                <w:rFonts w:ascii="Calibri" w:hAnsi="Calibri" w:cs="Calibri"/>
-                <w:noProof/>
-                <w:lang w:val="tr-TR"/>
-              </w:rPr>
-            </w:pPr>
-          </w:p>
-          <w:p>
-            <w:pPr>
-              <w:jc w:val="both"/>
-              <w:rPr>
-                <w:rFonts w:ascii="Calibri" w:hAnsi="Calibri" w:cs="Calibri"/>
-                <w:noProof/>
-                <w:lang w:val="tr-TR"/>
-              </w:rPr>
-            </w:pPr>
-          </w:p>
-        </w:tc>
-      </w:tr>
-      <w:tr>
-        <w:tc>
-          <w:tcPr>
-            <w:tcW w:w="10112" w:type="dxa"/>
-            <w:tcBorders>
-              <w:top w:val="single" w:sz="4" w:space="0" w:color="auto"/>
-            </w:tcBorders>
-          </w:tcPr>
-          <w:p>
-            <w:pPr>
-              <w:jc w:val="both"/>
-              <w:rPr>
-                <w:rFonts w:ascii="Calibri" w:hAnsi="Calibri" w:cs="Calibri"/>
-                <w:noProof/>
-                <w:lang w:val="tr-TR"/>
-              </w:rPr>
-            </w:pPr>
-          </w:p>
-          <w:p>
-            <w:pPr>
-              <w:jc w:val="both"/>
-              <w:rPr>
-                <w:rFonts w:ascii="Calibri" w:hAnsi="Calibri" w:cs="Calibri"/>
-                <w:noProof/>
-                <w:lang w:val="tr-TR"/>
-              </w:rPr>
-            </w:pPr>
+              <w:t xml:space="preserve">{{#mevcut_yetkiler}}{{satir}}{{/mevcut_yetkiler}}</w:t>
+            </w:r>
           </w:p>
         </w:tc>
       </w:tr>
@@ -3478,221 +3326,8 @@
           </w:tcPr>
           <w:p>
             <w:r>
-              <w:t xml:space="preserve">{{gereken_yetkiler}}</w:t>
-            </w:r>
-          </w:p>
-        </w:tc>
-      </w:tr>
-      <w:tr>
-        <w:tc>
-          <w:tcPr>
-            <w:tcW w:w="10112" w:type="dxa"/>
-            <w:tcBorders>
-              <w:top w:val="single" w:sz="4" w:space="0" w:color="auto"/>
-              <w:bottom w:val="single" w:sz="4" w:space="0" w:color="auto"/>
-            </w:tcBorders>
-          </w:tcPr>
-          <w:p>
-            <w:pPr>
-              <w:jc w:val="both"/>
-              <w:rPr>
-                <w:rFonts w:ascii="Calibri" w:hAnsi="Calibri" w:cs="Calibri"/>
-                <w:noProof/>
-                <w:lang w:val="tr-TR"/>
-              </w:rPr>
-            </w:pPr>
-          </w:p>
-          <w:p>
-            <w:pPr>
-              <w:jc w:val="both"/>
-              <w:rPr>
-                <w:rFonts w:ascii="Calibri" w:hAnsi="Calibri" w:cs="Calibri"/>
-                <w:noProof/>
-                <w:lang w:val="tr-TR"/>
-              </w:rPr>
-            </w:pPr>
-          </w:p>
-        </w:tc>
-      </w:tr>
-      <w:tr>
-        <w:tc>
-          <w:tcPr>
-            <w:tcW w:w="10112" w:type="dxa"/>
-            <w:tcBorders>
-              <w:top w:val="single" w:sz="4" w:space="0" w:color="auto"/>
-              <w:bottom w:val="single" w:sz="4" w:space="0" w:color="auto"/>
-            </w:tcBorders>
-          </w:tcPr>
-          <w:p>
-            <w:pPr>
-              <w:jc w:val="both"/>
-              <w:rPr>
-                <w:rFonts w:ascii="Calibri" w:hAnsi="Calibri" w:cs="Calibri"/>
-                <w:noProof/>
-                <w:lang w:val="tr-TR"/>
-              </w:rPr>
-            </w:pPr>
-          </w:p>
-          <w:p>
-            <w:pPr>
-              <w:jc w:val="both"/>
-              <w:rPr>
-                <w:rFonts w:ascii="Calibri" w:hAnsi="Calibri" w:cs="Calibri"/>
-                <w:noProof/>
-                <w:lang w:val="tr-TR"/>
-              </w:rPr>
-            </w:pPr>
-          </w:p>
-        </w:tc>
-      </w:tr>
-      <w:tr>
-        <w:tc>
-          <w:tcPr>
-            <w:tcW w:w="10112" w:type="dxa"/>
-            <w:tcBorders>
-              <w:top w:val="single" w:sz="4" w:space="0" w:color="auto"/>
-              <w:bottom w:val="single" w:sz="4" w:space="0" w:color="auto"/>
-            </w:tcBorders>
-          </w:tcPr>
-          <w:p>
-            <w:pPr>
-              <w:jc w:val="both"/>
-              <w:rPr>
-                <w:rFonts w:ascii="Calibri" w:hAnsi="Calibri" w:cs="Calibri"/>
-                <w:noProof/>
-                <w:lang w:val="tr-TR"/>
-              </w:rPr>
-            </w:pPr>
-          </w:p>
-          <w:p>
-            <w:pPr>
-              <w:jc w:val="both"/>
-              <w:rPr>
-                <w:rFonts w:ascii="Calibri" w:hAnsi="Calibri" w:cs="Calibri"/>
-                <w:noProof/>
-                <w:lang w:val="tr-TR"/>
-              </w:rPr>
-            </w:pPr>
-          </w:p>
-        </w:tc>
-      </w:tr>
-      <w:tr>
-        <w:tc>
-          <w:tcPr>
-            <w:tcW w:w="10112" w:type="dxa"/>
-            <w:tcBorders>
-              <w:top w:val="single" w:sz="4" w:space="0" w:color="auto"/>
-            </w:tcBorders>
-          </w:tcPr>
-          <w:p>
-            <w:pPr>
-              <w:jc w:val="both"/>
-              <w:rPr>
-                <w:rFonts w:ascii="Calibri" w:hAnsi="Calibri" w:cs="Calibri"/>
-                <w:noProof/>
-                <w:lang w:val="tr-TR"/>
-              </w:rPr>
-            </w:pPr>
-          </w:p>
-          <w:p>
-            <w:pPr>
-              <w:jc w:val="both"/>
-              <w:rPr>
-                <w:rFonts w:ascii="Calibri" w:hAnsi="Calibri" w:cs="Calibri"/>
-                <w:noProof/>
-                <w:lang w:val="tr-TR"/>
-              </w:rPr>
-            </w:pPr>
-          </w:p>
-        </w:tc>
-      </w:tr>
-      <w:tr>
-        <w:tc>
-          <w:tcPr>
-            <w:tcW w:w="10112" w:type="dxa"/>
-            <w:tcBorders>
-              <w:top w:val="single" w:sz="4" w:space="0" w:color="auto"/>
-            </w:tcBorders>
-          </w:tcPr>
-          <w:p>
-            <w:pPr>
-              <w:jc w:val="both"/>
-              <w:rPr>
-                <w:rFonts w:ascii="Calibri" w:hAnsi="Calibri" w:cs="Calibri"/>
-                <w:noProof/>
-                <w:lang w:val="tr-TR"/>
-              </w:rPr>
-            </w:pPr>
-          </w:p>
-          <w:p>
-            <w:pPr>
-              <w:jc w:val="both"/>
-              <w:rPr>
-                <w:rFonts w:ascii="Calibri" w:hAnsi="Calibri" w:cs="Calibri"/>
-                <w:noProof/>
-                <w:lang w:val="tr-TR"/>
-              </w:rPr>
-            </w:pPr>
-          </w:p>
-        </w:tc>
-      </w:tr>
-      <w:tr>
-        <w:tc>
-          <w:tcPr>
-            <w:tcW w:w="10112" w:type="dxa"/>
-            <w:tcBorders>
-              <w:top w:val="single" w:sz="4" w:space="0" w:color="auto"/>
-            </w:tcBorders>
-          </w:tcPr>
-          <w:p>
-            <w:pPr>
-              <w:jc w:val="both"/>
-              <w:rPr>
-                <w:rFonts w:ascii="Calibri" w:hAnsi="Calibri" w:cs="Calibri"/>
-                <w:noProof/>
-                <w:lang w:val="tr-TR"/>
-              </w:rPr>
-            </w:pPr>
-          </w:p>
-          <w:p>
-            <w:pPr>
-              <w:jc w:val="both"/>
-              <w:rPr>
-                <w:rFonts w:ascii="Calibri" w:hAnsi="Calibri" w:cs="Calibri"/>
-                <w:noProof/>
-                <w:lang w:val="tr-TR"/>
-              </w:rPr>
-            </w:pPr>
-          </w:p>
-        </w:tc>
-      </w:tr>
-      <w:tr>
-        <w:tc>
-          <w:tcPr>
-            <w:tcW w:w="10112" w:type="dxa"/>
-            <w:tcBorders>
-              <w:top w:val="single" w:sz="4" w:space="0" w:color="auto"/>
-            </w:tcBorders>
-          </w:tcPr>
-          <w:p>
-            <w:pPr>
-              <w:jc w:val="both"/>
-              <w:rPr>
-                <w:rFonts w:ascii="Calibri" w:hAnsi="Calibri" w:cs="Calibri"/>
-                <w:noProof/>
-                <w:lang w:val="tr-TR"/>
-              </w:rPr>
-            </w:pPr>
-          </w:p>
-          <w:p>
-            <w:pPr>
-              <w:jc w:val="both"/>
-              <w:rPr>
-                <w:rFonts w:ascii="Calibri" w:hAnsi="Calibri" w:cs="Calibri"/>
-                <w:noProof/>
-                <w:lang w:val="tr-TR"/>
-              </w:rPr>
-            </w:pPr>
+              <w:t xml:space="preserve">{{#gereken_yetkiler}}{{satir}}{{/gereken_yetkiler}}</w:t>
+            </w:r>
           </w:p>
         </w:tc>
       </w:tr>
@@ -7407,132 +7042,8 @@
           </w:tcPr>
           <w:p>
             <w:r>
-              <w:t xml:space="preserve">{{egitim}}</w:t>
-            </w:r>
-          </w:p>
-        </w:tc>
-      </w:tr>
-      <w:tr>
-        <w:tc>
-          <w:tcPr>
-            <w:tcW w:w="10112" w:type="dxa"/>
-            <w:tcBorders>
-              <w:top w:val="single" w:sz="4" w:space="0" w:color="auto"/>
-              <w:bottom w:val="single" w:sz="4" w:space="0" w:color="auto"/>
-            </w:tcBorders>
-          </w:tcPr>
-          <w:p>
-            <w:pPr>
-              <w:jc w:val="both"/>
-              <w:rPr>
-                <w:rFonts w:ascii="Calibri" w:hAnsi="Calibri" w:cs="Calibri"/>
-                <w:noProof/>
-                <w:lang w:val="tr-TR"/>
-              </w:rPr>
-            </w:pPr>
-          </w:p>
-          <w:p>
-            <w:pPr>
-              <w:jc w:val="both"/>
-              <w:rPr>
-                <w:rFonts w:ascii="Calibri" w:hAnsi="Calibri" w:cs="Calibri"/>
-                <w:noProof/>
-                <w:lang w:val="tr-TR"/>
-              </w:rPr>
-            </w:pPr>
-          </w:p>
-        </w:tc>
-      </w:tr>
-      <w:tr>
-        <w:tc>
-          <w:tcPr>
-            <w:tcW w:w="10112" w:type="dxa"/>
-            <w:tcBorders>
-              <w:top w:val="single" w:sz="4" w:space="0" w:color="auto"/>
-              <w:bottom w:val="single" w:sz="4" w:space="0" w:color="auto"/>
-            </w:tcBorders>
-          </w:tcPr>
-          <w:p>
-            <w:pPr>
-              <w:jc w:val="both"/>
-              <w:rPr>
-                <w:rFonts w:ascii="Calibri" w:hAnsi="Calibri" w:cs="Calibri"/>
-                <w:noProof/>
-                <w:lang w:val="tr-TR"/>
-              </w:rPr>
-            </w:pPr>
-          </w:p>
-          <w:p>
-            <w:pPr>
-              <w:jc w:val="both"/>
-              <w:rPr>
-                <w:rFonts w:ascii="Calibri" w:hAnsi="Calibri" w:cs="Calibri"/>
-                <w:noProof/>
-                <w:lang w:val="tr-TR"/>
-              </w:rPr>
-            </w:pPr>
-          </w:p>
-        </w:tc>
-      </w:tr>
-      <w:tr>
-        <w:tc>
-          <w:tcPr>
-            <w:tcW w:w="10112" w:type="dxa"/>
-            <w:tcBorders>
-              <w:top w:val="single" w:sz="4" w:space="0" w:color="auto"/>
-              <w:bottom w:val="single" w:sz="4" w:space="0" w:color="auto"/>
-            </w:tcBorders>
-          </w:tcPr>
-          <w:p>
-            <w:pPr>
-              <w:jc w:val="both"/>
-              <w:rPr>
-                <w:rFonts w:ascii="Calibri" w:hAnsi="Calibri" w:cs="Calibri"/>
-                <w:noProof/>
-                <w:lang w:val="tr-TR"/>
-              </w:rPr>
-            </w:pPr>
-          </w:p>
-          <w:p>
-            <w:pPr>
-              <w:jc w:val="both"/>
-              <w:rPr>
-                <w:rFonts w:ascii="Calibri" w:hAnsi="Calibri" w:cs="Calibri"/>
-                <w:noProof/>
-                <w:lang w:val="tr-TR"/>
-              </w:rPr>
-            </w:pPr>
-          </w:p>
-        </w:tc>
-      </w:tr>
-      <w:tr>
-        <w:tc>
-          <w:tcPr>
-            <w:tcW w:w="10112" w:type="dxa"/>
-            <w:tcBorders>
-              <w:top w:val="single" w:sz="4" w:space="0" w:color="auto"/>
-              <w:bottom w:val="single" w:sz="4" w:space="0" w:color="auto"/>
-            </w:tcBorders>
-          </w:tcPr>
-          <w:p>
-            <w:pPr>
-              <w:jc w:val="both"/>
-              <w:rPr>
-                <w:rFonts w:ascii="Calibri" w:hAnsi="Calibri" w:cs="Calibri"/>
-                <w:noProof/>
-                <w:lang w:val="tr-TR"/>
-              </w:rPr>
-            </w:pPr>
-          </w:p>
-          <w:p>
-            <w:pPr>
-              <w:jc w:val="both"/>
-              <w:rPr>
-                <w:rFonts w:ascii="Calibri" w:hAnsi="Calibri" w:cs="Calibri"/>
-                <w:noProof/>
-                <w:lang w:val="tr-TR"/>
-              </w:rPr>
-            </w:pPr>
+              <w:t xml:space="preserve">{{#egitim}}{{satir}}{{/egitim}}</w:t>
+            </w:r>
           </w:p>
         </w:tc>
       </w:tr>
@@ -7636,123 +7147,8 @@
           </w:tcPr>
           <w:p>
             <w:r>
-              <w:t xml:space="preserve">{{lisans_sertifikalar}}</w:t>
-            </w:r>
-          </w:p>
-        </w:tc>
-      </w:tr>
-      <w:tr>
-        <w:tc>
-          <w:tcPr>
-            <w:tcW w:w="10112" w:type="dxa"/>
-            <w:tcBorders>
-              <w:top w:val="single" w:sz="4" w:space="0" w:color="auto"/>
-              <w:bottom w:val="single" w:sz="4" w:space="0" w:color="auto"/>
-            </w:tcBorders>
-          </w:tcPr>
-          <w:p>
-            <w:pPr>
-              <w:jc w:val="both"/>
-              <w:rPr>
-                <w:rFonts w:ascii="Calibri" w:hAnsi="Calibri" w:cs="Calibri"/>
-                <w:noProof/>
-                <w:lang w:val="tr-TR"/>
-              </w:rPr>
-            </w:pPr>
-          </w:p>
-          <w:p>
-            <w:pPr>
-              <w:jc w:val="both"/>
-              <w:rPr>
-                <w:rFonts w:ascii="Calibri" w:hAnsi="Calibri" w:cs="Calibri"/>
-                <w:noProof/>
-                <w:lang w:val="tr-TR"/>
-              </w:rPr>
-            </w:pPr>
-          </w:p>
-        </w:tc>
-      </w:tr>
-      <w:tr>
-        <w:tblPrEx>
-          <w:tblBorders>
-            <w:top w:val="single" w:sz="4" w:space="0" w:color="auto"/>
-            <w:left w:val="single" w:sz="4" w:space="0" w:color="auto"/>
-            <w:right w:val="single" w:sz="4" w:space="0" w:color="auto"/>
-            <w:insideH w:val="single" w:sz="4" w:space="0" w:color="auto"/>
-            <w:insideV w:val="single" w:sz="4" w:space="0" w:color="auto"/>
-          </w:tblBorders>
-        </w:tblPrEx>
-        <w:tc>
-          <w:tcPr>
-            <w:tcW w:w="10112" w:type="dxa"/>
-            <w:tcBorders>
-              <w:top w:val="single" w:sz="4" w:space="0" w:color="auto"/>
-              <w:left w:val="nil"/>
-              <w:bottom w:val="single" w:sz="4" w:space="0" w:color="auto"/>
-              <w:right w:val="nil"/>
-            </w:tcBorders>
-          </w:tcPr>
-          <w:p>
-            <w:pPr>
-              <w:jc w:val="both"/>
-              <w:rPr>
-                <w:rFonts w:ascii="Calibri" w:hAnsi="Calibri" w:cs="Calibri"/>
-                <w:noProof/>
-                <w:lang w:val="tr-TR"/>
-              </w:rPr>
-            </w:pPr>
-          </w:p>
-          <w:p>
-            <w:pPr>
-              <w:jc w:val="both"/>
-              <w:rPr>
-                <w:rFonts w:ascii="Calibri" w:hAnsi="Calibri" w:cs="Calibri"/>
-                <w:noProof/>
-                <w:lang w:val="tr-TR"/>
-              </w:rPr>
-            </w:pPr>
-          </w:p>
-        </w:tc>
-      </w:tr>
-      <w:tr>
-        <w:tblPrEx>
-          <w:tblBorders>
-            <w:top w:val="single" w:sz="4" w:space="0" w:color="auto"/>
-            <w:left w:val="single" w:sz="4" w:space="0" w:color="auto"/>
-            <w:right w:val="single" w:sz="4" w:space="0" w:color="auto"/>
-            <w:insideH w:val="single" w:sz="4" w:space="0" w:color="auto"/>
-            <w:insideV w:val="single" w:sz="4" w:space="0" w:color="auto"/>
-          </w:tblBorders>
-        </w:tblPrEx>
-        <w:tc>
-          <w:tcPr>
-            <w:tcW w:w="10112" w:type="dxa"/>
-            <w:tcBorders>
-              <w:top w:val="single" w:sz="4" w:space="0" w:color="auto"/>
-              <w:left w:val="nil"/>
-              <w:bottom w:val="single" w:sz="4" w:space="0" w:color="auto"/>
-              <w:right w:val="nil"/>
-            </w:tcBorders>
-          </w:tcPr>
-          <w:p>
-            <w:pPr>
-              <w:jc w:val="both"/>
-              <w:rPr>
-                <w:rFonts w:ascii="Calibri" w:hAnsi="Calibri" w:cs="Calibri"/>
-                <w:noProof/>
-                <w:lang w:val="tr-TR"/>
-              </w:rPr>
-            </w:pPr>
-          </w:p>
-          <w:p>
-            <w:pPr>
-              <w:jc w:val="both"/>
-              <w:rPr>
-                <w:rFonts w:ascii="Calibri" w:hAnsi="Calibri" w:cs="Calibri"/>
-                <w:noProof/>
-                <w:lang w:val="tr-TR"/>
-              </w:rPr>
-            </w:pPr>
+              <w:t xml:space="preserve">{{#lisans_sertifikalar}}{{satir}}{{/lisans_sertifikalar}}</w:t>
+            </w:r>
           </w:p>
         </w:tc>
       </w:tr>
@@ -7820,196 +7216,8 @@
           </w:tcPr>
           <w:p>
             <w:r>
-              <w:t xml:space="preserve">{{diger_bilgi_beceri}}</w:t>
-            </w:r>
-          </w:p>
-        </w:tc>
-      </w:tr>
-      <w:tr>
-        <w:tc>
-          <w:tcPr>
-            <w:tcW w:w="10112" w:type="dxa"/>
-            <w:tcBorders>
-              <w:top w:val="single" w:sz="4" w:space="0" w:color="auto"/>
-              <w:bottom w:val="single" w:sz="4" w:space="0" w:color="auto"/>
-            </w:tcBorders>
-          </w:tcPr>
-          <w:p>
-            <w:pPr>
-              <w:jc w:val="both"/>
-              <w:rPr>
-                <w:rFonts w:ascii="Calibri" w:hAnsi="Calibri" w:cs="Calibri"/>
-                <w:noProof/>
-                <w:lang w:val="tr-TR"/>
-              </w:rPr>
-            </w:pPr>
-          </w:p>
-          <w:p>
-            <w:pPr>
-              <w:jc w:val="both"/>
-              <w:rPr>
-                <w:rFonts w:ascii="Calibri" w:hAnsi="Calibri" w:cs="Calibri"/>
-                <w:noProof/>
-                <w:lang w:val="tr-TR"/>
-              </w:rPr>
-            </w:pPr>
-          </w:p>
-        </w:tc>
-      </w:tr>
-      <w:tr>
-        <w:tc>
-          <w:tcPr>
-            <w:tcW w:w="10112" w:type="dxa"/>
-            <w:tcBorders>
-              <w:top w:val="single" w:sz="4" w:space="0" w:color="auto"/>
-              <w:bottom w:val="single" w:sz="4" w:space="0" w:color="auto"/>
-            </w:tcBorders>
-          </w:tcPr>
-          <w:p>
-            <w:pPr>
-              <w:jc w:val="both"/>
-              <w:rPr>
-                <w:rFonts w:ascii="Calibri" w:hAnsi="Calibri" w:cs="Calibri"/>
-                <w:noProof/>
-                <w:lang w:val="tr-TR"/>
-              </w:rPr>
-            </w:pPr>
-          </w:p>
-          <w:p>
-            <w:pPr>
-              <w:jc w:val="both"/>
-              <w:rPr>
-                <w:rFonts w:ascii="Calibri" w:hAnsi="Calibri" w:cs="Calibri"/>
-                <w:noProof/>
-                <w:lang w:val="tr-TR"/>
-              </w:rPr>
-            </w:pPr>
-          </w:p>
-        </w:tc>
-      </w:tr>
-      <w:tr>
-        <w:tblPrEx>
-          <w:tblBorders>
-            <w:top w:val="single" w:sz="4" w:space="0" w:color="auto"/>
-            <w:left w:val="single" w:sz="4" w:space="0" w:color="auto"/>
-            <w:right w:val="single" w:sz="4" w:space="0" w:color="auto"/>
-            <w:insideH w:val="single" w:sz="4" w:space="0" w:color="auto"/>
-            <w:insideV w:val="single" w:sz="4" w:space="0" w:color="auto"/>
-          </w:tblBorders>
-        </w:tblPrEx>
-        <w:tc>
-          <w:tcPr>
-            <w:tcW w:w="10112" w:type="dxa"/>
-            <w:tcBorders>
-              <w:top w:val="single" w:sz="4" w:space="0" w:color="auto"/>
-              <w:left w:val="nil"/>
-              <w:bottom w:val="single" w:sz="4" w:space="0" w:color="auto"/>
-              <w:right w:val="nil"/>
-            </w:tcBorders>
-          </w:tcPr>
-          <w:p>
-            <w:pPr>
-              <w:jc w:val="both"/>
-              <w:rPr>
-                <w:rFonts w:ascii="Calibri" w:hAnsi="Calibri" w:cs="Calibri"/>
-                <w:noProof/>
-                <w:lang w:val="tr-TR"/>
-              </w:rPr>
-            </w:pPr>
-          </w:p>
-          <w:p>
-            <w:pPr>
-              <w:jc w:val="both"/>
-              <w:rPr>
-                <w:rFonts w:ascii="Calibri" w:hAnsi="Calibri" w:cs="Calibri"/>
-                <w:noProof/>
-                <w:lang w:val="tr-TR"/>
-              </w:rPr>
-            </w:pPr>
-          </w:p>
-        </w:tc>
-      </w:tr>
-      <w:tr>
-        <w:tblPrEx>
-          <w:tblBorders>
-            <w:top w:val="single" w:sz="4" w:space="0" w:color="auto"/>
-            <w:left w:val="single" w:sz="4" w:space="0" w:color="auto"/>
-            <w:right w:val="single" w:sz="4" w:space="0" w:color="auto"/>
-            <w:insideH w:val="single" w:sz="4" w:space="0" w:color="auto"/>
-            <w:insideV w:val="single" w:sz="4" w:space="0" w:color="auto"/>
-          </w:tblBorders>
-        </w:tblPrEx>
-        <w:tc>
-          <w:tcPr>
-            <w:tcW w:w="10112" w:type="dxa"/>
-            <w:tcBorders>
-              <w:top w:val="single" w:sz="4" w:space="0" w:color="auto"/>
-              <w:left w:val="nil"/>
-              <w:bottom w:val="single" w:sz="4" w:space="0" w:color="auto"/>
-              <w:right w:val="nil"/>
-            </w:tcBorders>
-          </w:tcPr>
-          <w:p>
-            <w:pPr>
-              <w:jc w:val="both"/>
-              <w:rPr>
-                <w:rFonts w:ascii="Calibri" w:hAnsi="Calibri" w:cs="Calibri"/>
-                <w:noProof/>
-                <w:lang w:val="tr-TR"/>
-              </w:rPr>
-            </w:pPr>
-          </w:p>
-          <w:p>
-            <w:pPr>
-              <w:jc w:val="both"/>
-              <w:rPr>
-                <w:rFonts w:ascii="Calibri" w:hAnsi="Calibri" w:cs="Calibri"/>
-                <w:noProof/>
-                <w:lang w:val="tr-TR"/>
-              </w:rPr>
-            </w:pPr>
-          </w:p>
-        </w:tc>
-      </w:tr>
-      <w:tr>
-        <w:tblPrEx>
-          <w:tblBorders>
-            <w:top w:val="single" w:sz="4" w:space="0" w:color="auto"/>
-            <w:left w:val="single" w:sz="4" w:space="0" w:color="auto"/>
-            <w:right w:val="single" w:sz="4" w:space="0" w:color="auto"/>
-            <w:insideH w:val="single" w:sz="4" w:space="0" w:color="auto"/>
-            <w:insideV w:val="single" w:sz="4" w:space="0" w:color="auto"/>
-          </w:tblBorders>
-        </w:tblPrEx>
-        <w:tc>
-          <w:tcPr>
-            <w:tcW w:w="10112" w:type="dxa"/>
-            <w:tcBorders>
-              <w:top w:val="single" w:sz="4" w:space="0" w:color="auto"/>
-              <w:left w:val="nil"/>
-              <w:bottom w:val="single" w:sz="4" w:space="0" w:color="auto"/>
-              <w:right w:val="nil"/>
-            </w:tcBorders>
-          </w:tcPr>
-          <w:p>
-            <w:pPr>
-              <w:jc w:val="both"/>
-              <w:rPr>
-                <w:rFonts w:ascii="Calibri" w:hAnsi="Calibri" w:cs="Calibri"/>
-                <w:noProof/>
-                <w:lang w:val="tr-TR"/>
-              </w:rPr>
-            </w:pPr>
-          </w:p>
-          <w:p>
-            <w:pPr>
-              <w:jc w:val="both"/>
-              <w:rPr>
-                <w:rFonts w:ascii="Calibri" w:hAnsi="Calibri" w:cs="Calibri"/>
-                <w:noProof/>
-                <w:lang w:val="tr-TR"/>
-              </w:rPr>
-            </w:pPr>
+              <w:t xml:space="preserve">{{#diger_bilgi_beceri}}{{satir}}{{/diger_bilgi_beceri}}</w:t>
+            </w:r>
           </w:p>
         </w:tc>
       </w:tr>
@@ -8098,112 +7306,8 @@
           </w:tcPr>
           <w:p>
             <w:r>
-              <w:t xml:space="preserve">{{araclar}}</w:t>
-            </w:r>
-          </w:p>
-        </w:tc>
-      </w:tr>
-      <w:tr>
-        <w:tc>
-          <w:tcPr>
-            <w:tcW w:w="10112" w:type="dxa"/>
-            <w:tcBorders>
-              <w:top w:val="single" w:sz="4" w:space="0" w:color="auto"/>
-              <w:bottom w:val="single" w:sz="4" w:space="0" w:color="auto"/>
-            </w:tcBorders>
-          </w:tcPr>
-          <w:p>
-            <w:pPr>
-              <w:jc w:val="both"/>
-              <w:rPr>
-                <w:rFonts w:ascii="Calibri" w:hAnsi="Calibri" w:cs="Calibri"/>
-                <w:noProof/>
-                <w:lang w:val="tr-TR"/>
-              </w:rPr>
-            </w:pPr>
-          </w:p>
-          <w:p>
-            <w:pPr>
-              <w:jc w:val="both"/>
-              <w:rPr>
-                <w:rFonts w:ascii="Calibri" w:hAnsi="Calibri" w:cs="Calibri"/>
-                <w:noProof/>
-                <w:lang w:val="tr-TR"/>
-              </w:rPr>
-            </w:pPr>
-          </w:p>
-        </w:tc>
-      </w:tr>
-      <w:tr>
-        <w:tc>
-          <w:tcPr>
-            <w:tcW w:w="10112" w:type="dxa"/>
-            <w:tcBorders>
-              <w:top w:val="single" w:sz="4" w:space="0" w:color="auto"/>
-              <w:bottom w:val="single" w:sz="4" w:space="0" w:color="auto"/>
-            </w:tcBorders>
-          </w:tcPr>
-          <w:p>
-            <w:pPr>
-              <w:jc w:val="both"/>
-              <w:rPr>
-                <w:rFonts w:ascii="Calibri" w:hAnsi="Calibri" w:cs="Calibri"/>
-                <w:noProof/>
-                <w:lang w:val="tr-TR"/>
-              </w:rPr>
-            </w:pPr>
-          </w:p>
-          <w:p>
-            <w:pPr>
-              <w:jc w:val="both"/>
-              <w:rPr>
-                <w:rFonts w:ascii="Calibri" w:hAnsi="Calibri" w:cs="Calibri"/>
-                <w:noProof/>
-                <w:lang w:val="tr-TR"/>
-              </w:rPr>
-            </w:pPr>
-          </w:p>
-        </w:tc>
-      </w:tr>
-      <w:tr>
-        <w:tblPrEx>
-          <w:tblBorders>
-            <w:top w:val="single" w:sz="4" w:space="0" w:color="auto"/>
-            <w:left w:val="single" w:sz="4" w:space="0" w:color="auto"/>
-            <w:right w:val="single" w:sz="4" w:space="0" w:color="auto"/>
-            <w:insideH w:val="single" w:sz="4" w:space="0" w:color="auto"/>
-            <w:insideV w:val="single" w:sz="4" w:space="0" w:color="auto"/>
-          </w:tblBorders>
-        </w:tblPrEx>
-        <w:tc>
-          <w:tcPr>
-            <w:tcW w:w="10112" w:type="dxa"/>
-            <w:tcBorders>
-              <w:top w:val="single" w:sz="4" w:space="0" w:color="auto"/>
-              <w:left w:val="nil"/>
-              <w:bottom w:val="single" w:sz="4" w:space="0" w:color="auto"/>
-              <w:right w:val="nil"/>
-            </w:tcBorders>
-          </w:tcPr>
-          <w:p>
-            <w:pPr>
-              <w:jc w:val="both"/>
-              <w:rPr>
-                <w:rFonts w:ascii="Calibri" w:hAnsi="Calibri" w:cs="Calibri"/>
-                <w:noProof/>
-                <w:lang w:val="tr-TR"/>
-              </w:rPr>
-            </w:pPr>
-          </w:p>
-          <w:p>
-            <w:pPr>
-              <w:jc w:val="both"/>
-              <w:rPr>
-                <w:rFonts w:ascii="Calibri" w:hAnsi="Calibri" w:cs="Calibri"/>
-                <w:noProof/>
-                <w:lang w:val="tr-TR"/>
-              </w:rPr>
-            </w:pPr>
+              <w:t xml:space="preserve">{{#araclar}}{{satir}}{{/araclar}}</w:t>
+            </w:r>
           </w:p>
         </w:tc>
       </w:tr>
@@ -16531,322 +15635,8 @@
           </w:tcPr>
           <w:p>
             <w:r>
-              <w:t xml:space="preserve">{{yeni_deneyim}}</w:t>
-            </w:r>
-          </w:p>
-        </w:tc>
-      </w:tr>
-      <w:tr>
-        <w:tc>
-          <w:tcPr>
-            <w:tcW w:w="10112" w:type="dxa"/>
-            <w:tcBorders>
-              <w:top w:val="single" w:sz="4" w:space="0" w:color="auto"/>
-              <w:bottom w:val="single" w:sz="4" w:space="0" w:color="auto"/>
-            </w:tcBorders>
-          </w:tcPr>
-          <w:p>
-            <w:pPr>
-              <w:jc w:val="both"/>
-              <w:rPr>
-                <w:rFonts w:ascii="Calibri" w:hAnsi="Calibri" w:cs="Calibri"/>
-                <w:noProof/>
-                <w:lang w:val="tr-TR"/>
-              </w:rPr>
-            </w:pPr>
-          </w:p>
-          <w:p>
-            <w:pPr>
-              <w:jc w:val="both"/>
-              <w:rPr>
-                <w:rFonts w:ascii="Calibri" w:hAnsi="Calibri" w:cs="Calibri"/>
-                <w:noProof/>
-                <w:lang w:val="tr-TR"/>
-              </w:rPr>
-            </w:pPr>
-          </w:p>
-        </w:tc>
-      </w:tr>
-      <w:tr>
-        <w:tc>
-          <w:tcPr>
-            <w:tcW w:w="10112" w:type="dxa"/>
-            <w:tcBorders>
-              <w:top w:val="single" w:sz="4" w:space="0" w:color="auto"/>
-              <w:bottom w:val="single" w:sz="4" w:space="0" w:color="auto"/>
-            </w:tcBorders>
-          </w:tcPr>
-          <w:p>
-            <w:pPr>
-              <w:jc w:val="both"/>
-              <w:rPr>
-                <w:rFonts w:ascii="Calibri" w:hAnsi="Calibri" w:cs="Calibri"/>
-                <w:noProof/>
-                <w:lang w:val="tr-TR"/>
-              </w:rPr>
-            </w:pPr>
-          </w:p>
-          <w:p>
-            <w:pPr>
-              <w:jc w:val="both"/>
-              <w:rPr>
-                <w:rFonts w:ascii="Calibri" w:hAnsi="Calibri" w:cs="Calibri"/>
-                <w:noProof/>
-                <w:lang w:val="tr-TR"/>
-              </w:rPr>
-            </w:pPr>
-          </w:p>
-        </w:tc>
-      </w:tr>
-      <w:tr>
-        <w:tblPrEx>
-          <w:tblBorders>
-            <w:top w:val="single" w:sz="4" w:space="0" w:color="auto"/>
-            <w:left w:val="single" w:sz="4" w:space="0" w:color="auto"/>
-            <w:right w:val="single" w:sz="4" w:space="0" w:color="auto"/>
-            <w:insideH w:val="single" w:sz="4" w:space="0" w:color="auto"/>
-            <w:insideV w:val="single" w:sz="4" w:space="0" w:color="auto"/>
-          </w:tblBorders>
-        </w:tblPrEx>
-        <w:tc>
-          <w:tcPr>
-            <w:tcW w:w="10112" w:type="dxa"/>
-            <w:tcBorders>
-              <w:top w:val="single" w:sz="4" w:space="0" w:color="auto"/>
-              <w:left w:val="nil"/>
-              <w:bottom w:val="single" w:sz="4" w:space="0" w:color="auto"/>
-              <w:right w:val="nil"/>
-            </w:tcBorders>
-          </w:tcPr>
-          <w:p>
-            <w:pPr>
-              <w:jc w:val="both"/>
-              <w:rPr>
-                <w:rFonts w:ascii="Calibri" w:hAnsi="Calibri" w:cs="Calibri"/>
-                <w:noProof/>
-                <w:lang w:val="tr-TR"/>
-              </w:rPr>
-            </w:pPr>
-          </w:p>
-          <w:p>
-            <w:pPr>
-              <w:jc w:val="both"/>
-              <w:rPr>
-                <w:rFonts w:ascii="Calibri" w:hAnsi="Calibri" w:cs="Calibri"/>
-                <w:noProof/>
-                <w:lang w:val="tr-TR"/>
-              </w:rPr>
-            </w:pPr>
-          </w:p>
-        </w:tc>
-      </w:tr>
-      <w:tr>
-        <w:tblPrEx>
-          <w:tblBorders>
-            <w:top w:val="single" w:sz="4" w:space="0" w:color="auto"/>
-            <w:left w:val="single" w:sz="4" w:space="0" w:color="auto"/>
-            <w:right w:val="single" w:sz="4" w:space="0" w:color="auto"/>
-            <w:insideH w:val="single" w:sz="4" w:space="0" w:color="auto"/>
-            <w:insideV w:val="single" w:sz="4" w:space="0" w:color="auto"/>
-          </w:tblBorders>
-        </w:tblPrEx>
-        <w:tc>
-          <w:tcPr>
-            <w:tcW w:w="10112" w:type="dxa"/>
-            <w:tcBorders>
-              <w:top w:val="single" w:sz="4" w:space="0" w:color="auto"/>
-              <w:left w:val="nil"/>
-              <w:bottom w:val="single" w:sz="4" w:space="0" w:color="auto"/>
-              <w:right w:val="nil"/>
-            </w:tcBorders>
-          </w:tcPr>
-          <w:p>
-            <w:pPr>
-              <w:jc w:val="both"/>
-              <w:rPr>
-                <w:rFonts w:ascii="Calibri" w:hAnsi="Calibri" w:cs="Calibri"/>
-                <w:noProof/>
-                <w:lang w:val="tr-TR"/>
-              </w:rPr>
-            </w:pPr>
-          </w:p>
-          <w:p>
-            <w:pPr>
-              <w:jc w:val="both"/>
-              <w:rPr>
-                <w:rFonts w:ascii="Calibri" w:hAnsi="Calibri" w:cs="Calibri"/>
-                <w:noProof/>
-                <w:lang w:val="tr-TR"/>
-              </w:rPr>
-            </w:pPr>
-          </w:p>
-        </w:tc>
-      </w:tr>
-      <w:tr>
-        <w:tblPrEx>
-          <w:tblBorders>
-            <w:top w:val="single" w:sz="4" w:space="0" w:color="auto"/>
-            <w:left w:val="single" w:sz="4" w:space="0" w:color="auto"/>
-            <w:right w:val="single" w:sz="4" w:space="0" w:color="auto"/>
-            <w:insideH w:val="single" w:sz="4" w:space="0" w:color="auto"/>
-            <w:insideV w:val="single" w:sz="4" w:space="0" w:color="auto"/>
-          </w:tblBorders>
-        </w:tblPrEx>
-        <w:tc>
-          <w:tcPr>
-            <w:tcW w:w="10112" w:type="dxa"/>
-            <w:tcBorders>
-              <w:top w:val="single" w:sz="4" w:space="0" w:color="auto"/>
-              <w:left w:val="nil"/>
-              <w:bottom w:val="single" w:sz="4" w:space="0" w:color="auto"/>
-              <w:right w:val="nil"/>
-            </w:tcBorders>
-          </w:tcPr>
-          <w:p>
-            <w:pPr>
-              <w:jc w:val="both"/>
-              <w:rPr>
-                <w:rFonts w:ascii="Calibri" w:hAnsi="Calibri" w:cs="Calibri"/>
-                <w:noProof/>
-                <w:lang w:val="tr-TR"/>
-              </w:rPr>
-            </w:pPr>
-          </w:p>
-          <w:p>
-            <w:pPr>
-              <w:jc w:val="both"/>
-              <w:rPr>
-                <w:rFonts w:ascii="Calibri" w:hAnsi="Calibri" w:cs="Calibri"/>
-                <w:noProof/>
-                <w:lang w:val="tr-TR"/>
-              </w:rPr>
-            </w:pPr>
-          </w:p>
-        </w:tc>
-      </w:tr>
-      <w:tr>
-        <w:tblPrEx>
-          <w:tblBorders>
-            <w:top w:val="single" w:sz="4" w:space="0" w:color="auto"/>
-            <w:left w:val="single" w:sz="4" w:space="0" w:color="auto"/>
-            <w:right w:val="single" w:sz="4" w:space="0" w:color="auto"/>
-            <w:insideH w:val="single" w:sz="4" w:space="0" w:color="auto"/>
-            <w:insideV w:val="single" w:sz="4" w:space="0" w:color="auto"/>
-          </w:tblBorders>
-        </w:tblPrEx>
-        <w:tc>
-          <w:tcPr>
-            <w:tcW w:w="10112" w:type="dxa"/>
-            <w:tcBorders>
-              <w:top w:val="single" w:sz="4" w:space="0" w:color="auto"/>
-              <w:left w:val="nil"/>
-              <w:bottom w:val="single" w:sz="4" w:space="0" w:color="auto"/>
-              <w:right w:val="nil"/>
-            </w:tcBorders>
-          </w:tcPr>
-          <w:p>
-            <w:pPr>
-              <w:jc w:val="both"/>
-              <w:rPr>
-                <w:rFonts w:ascii="Calibri" w:hAnsi="Calibri" w:cs="Calibri"/>
-                <w:noProof/>
-                <w:lang w:val="tr-TR"/>
-              </w:rPr>
-            </w:pPr>
-          </w:p>
-          <w:p>
-            <w:pPr>
-              <w:jc w:val="both"/>
-              <w:rPr>
-                <w:rFonts w:ascii="Calibri" w:hAnsi="Calibri" w:cs="Calibri"/>
-                <w:noProof/>
-                <w:lang w:val="tr-TR"/>
-              </w:rPr>
-            </w:pPr>
-          </w:p>
-        </w:tc>
-      </w:tr>
-      <w:tr>
-        <w:tblPrEx>
-          <w:tblBorders>
-            <w:top w:val="single" w:sz="4" w:space="0" w:color="auto"/>
-            <w:left w:val="single" w:sz="4" w:space="0" w:color="auto"/>
-            <w:right w:val="single" w:sz="4" w:space="0" w:color="auto"/>
-            <w:insideH w:val="single" w:sz="4" w:space="0" w:color="auto"/>
-            <w:insideV w:val="single" w:sz="4" w:space="0" w:color="auto"/>
-          </w:tblBorders>
-        </w:tblPrEx>
-        <w:tc>
-          <w:tcPr>
-            <w:tcW w:w="10112" w:type="dxa"/>
-            <w:tcBorders>
-              <w:top w:val="single" w:sz="4" w:space="0" w:color="auto"/>
-              <w:left w:val="nil"/>
-              <w:bottom w:val="single" w:sz="4" w:space="0" w:color="auto"/>
-              <w:right w:val="nil"/>
-            </w:tcBorders>
-          </w:tcPr>
-          <w:p>
-            <w:pPr>
-              <w:jc w:val="both"/>
-              <w:rPr>
-                <w:rFonts w:ascii="Calibri" w:hAnsi="Calibri" w:cs="Calibri"/>
-                <w:noProof/>
-                <w:lang w:val="tr-TR"/>
-              </w:rPr>
-            </w:pPr>
-          </w:p>
-          <w:p>
-            <w:pPr>
-              <w:jc w:val="both"/>
-              <w:rPr>
-                <w:rFonts w:ascii="Calibri" w:hAnsi="Calibri" w:cs="Calibri"/>
-                <w:noProof/>
-                <w:lang w:val="tr-TR"/>
-              </w:rPr>
-            </w:pPr>
-          </w:p>
-        </w:tc>
-      </w:tr>
-      <w:tr>
-        <w:tblPrEx>
-          <w:tblBorders>
-            <w:top w:val="single" w:sz="4" w:space="0" w:color="auto"/>
-            <w:left w:val="single" w:sz="4" w:space="0" w:color="auto"/>
-            <w:right w:val="single" w:sz="4" w:space="0" w:color="auto"/>
-            <w:insideH w:val="single" w:sz="4" w:space="0" w:color="auto"/>
-            <w:insideV w:val="single" w:sz="4" w:space="0" w:color="auto"/>
-          </w:tblBorders>
-        </w:tblPrEx>
-        <w:tc>
-          <w:tcPr>
-            <w:tcW w:w="10112" w:type="dxa"/>
-            <w:tcBorders>
-              <w:top w:val="single" w:sz="4" w:space="0" w:color="auto"/>
-              <w:left w:val="nil"/>
-              <w:bottom w:val="single" w:sz="4" w:space="0" w:color="auto"/>
-              <w:right w:val="nil"/>
-            </w:tcBorders>
-          </w:tcPr>
-          <w:p>
-            <w:pPr>
-              <w:jc w:val="both"/>
-              <w:rPr>
-                <w:rFonts w:ascii="Calibri" w:hAnsi="Calibri" w:cs="Calibri"/>
-                <w:noProof/>
-                <w:lang w:val="tr-TR"/>
-              </w:rPr>
-            </w:pPr>
-          </w:p>
-          <w:p>
-            <w:pPr>
-              <w:jc w:val="both"/>
-              <w:rPr>
-                <w:rFonts w:ascii="Calibri" w:hAnsi="Calibri" w:cs="Calibri"/>
-                <w:noProof/>
-                <w:lang w:val="tr-TR"/>
-              </w:rPr>
-            </w:pPr>
+              <w:t xml:space="preserve">{{#yeni_deneyim}}{{satir}}{{/yeni_deneyim}}</w:t>
+            </w:r>
           </w:p>
         </w:tc>
       </w:tr>
@@ -16914,322 +15704,8 @@
           </w:tcPr>
           <w:p>
             <w:r>
-              <w:t xml:space="preserve">{{yetkinlik_suresi}}</w:t>
-            </w:r>
-          </w:p>
-        </w:tc>
-      </w:tr>
-      <w:tr>
-        <w:tc>
-          <w:tcPr>
-            <w:tcW w:w="10112" w:type="dxa"/>
-            <w:tcBorders>
-              <w:top w:val="single" w:sz="4" w:space="0" w:color="auto"/>
-              <w:bottom w:val="single" w:sz="4" w:space="0" w:color="auto"/>
-            </w:tcBorders>
-          </w:tcPr>
-          <w:p>
-            <w:pPr>
-              <w:jc w:val="both"/>
-              <w:rPr>
-                <w:rFonts w:ascii="Calibri" w:hAnsi="Calibri" w:cs="Calibri"/>
-                <w:noProof/>
-                <w:lang w:val="tr-TR"/>
-              </w:rPr>
-            </w:pPr>
-          </w:p>
-          <w:p>
-            <w:pPr>
-              <w:jc w:val="both"/>
-              <w:rPr>
-                <w:rFonts w:ascii="Calibri" w:hAnsi="Calibri" w:cs="Calibri"/>
-                <w:noProof/>
-                <w:lang w:val="tr-TR"/>
-              </w:rPr>
-            </w:pPr>
-          </w:p>
-        </w:tc>
-      </w:tr>
-      <w:tr>
-        <w:tc>
-          <w:tcPr>
-            <w:tcW w:w="10112" w:type="dxa"/>
-            <w:tcBorders>
-              <w:top w:val="single" w:sz="4" w:space="0" w:color="auto"/>
-              <w:bottom w:val="single" w:sz="4" w:space="0" w:color="auto"/>
-            </w:tcBorders>
-          </w:tcPr>
-          <w:p>
-            <w:pPr>
-              <w:jc w:val="both"/>
-              <w:rPr>
-                <w:rFonts w:ascii="Calibri" w:hAnsi="Calibri" w:cs="Calibri"/>
-                <w:noProof/>
-                <w:lang w:val="tr-TR"/>
-              </w:rPr>
-            </w:pPr>
-          </w:p>
-          <w:p>
-            <w:pPr>
-              <w:jc w:val="both"/>
-              <w:rPr>
-                <w:rFonts w:ascii="Calibri" w:hAnsi="Calibri" w:cs="Calibri"/>
-                <w:noProof/>
-                <w:lang w:val="tr-TR"/>
-              </w:rPr>
-            </w:pPr>
-          </w:p>
-        </w:tc>
-      </w:tr>
-      <w:tr>
-        <w:tblPrEx>
-          <w:tblBorders>
-            <w:top w:val="single" w:sz="4" w:space="0" w:color="auto"/>
-            <w:left w:val="single" w:sz="4" w:space="0" w:color="auto"/>
-            <w:right w:val="single" w:sz="4" w:space="0" w:color="auto"/>
-            <w:insideH w:val="single" w:sz="4" w:space="0" w:color="auto"/>
-            <w:insideV w:val="single" w:sz="4" w:space="0" w:color="auto"/>
-          </w:tblBorders>
-        </w:tblPrEx>
-        <w:tc>
-          <w:tcPr>
-            <w:tcW w:w="10112" w:type="dxa"/>
-            <w:tcBorders>
-              <w:top w:val="single" w:sz="4" w:space="0" w:color="auto"/>
-              <w:left w:val="nil"/>
-              <w:bottom w:val="single" w:sz="4" w:space="0" w:color="auto"/>
-              <w:right w:val="nil"/>
-            </w:tcBorders>
-          </w:tcPr>
-          <w:p>
-            <w:pPr>
-              <w:jc w:val="both"/>
-              <w:rPr>
-                <w:rFonts w:ascii="Calibri" w:hAnsi="Calibri" w:cs="Calibri"/>
-                <w:noProof/>
-                <w:lang w:val="tr-TR"/>
-              </w:rPr>
-            </w:pPr>
-          </w:p>
-          <w:p>
-            <w:pPr>
-              <w:jc w:val="both"/>
-              <w:rPr>
-                <w:rFonts w:ascii="Calibri" w:hAnsi="Calibri" w:cs="Calibri"/>
-                <w:noProof/>
-                <w:lang w:val="tr-TR"/>
-              </w:rPr>
-            </w:pPr>
-          </w:p>
-        </w:tc>
-      </w:tr>
-      <w:tr>
-        <w:tblPrEx>
-          <w:tblBorders>
-            <w:top w:val="single" w:sz="4" w:space="0" w:color="auto"/>
-            <w:left w:val="single" w:sz="4" w:space="0" w:color="auto"/>
-            <w:right w:val="single" w:sz="4" w:space="0" w:color="auto"/>
-            <w:insideH w:val="single" w:sz="4" w:space="0" w:color="auto"/>
-            <w:insideV w:val="single" w:sz="4" w:space="0" w:color="auto"/>
-          </w:tblBorders>
-        </w:tblPrEx>
-        <w:tc>
-          <w:tcPr>
-            <w:tcW w:w="10112" w:type="dxa"/>
-            <w:tcBorders>
-              <w:top w:val="single" w:sz="4" w:space="0" w:color="auto"/>
-              <w:left w:val="nil"/>
-              <w:bottom w:val="single" w:sz="4" w:space="0" w:color="auto"/>
-              <w:right w:val="nil"/>
-            </w:tcBorders>
-          </w:tcPr>
-          <w:p>
-            <w:pPr>
-              <w:jc w:val="both"/>
-              <w:rPr>
-                <w:rFonts w:ascii="Calibri" w:hAnsi="Calibri" w:cs="Calibri"/>
-                <w:noProof/>
-                <w:lang w:val="tr-TR"/>
-              </w:rPr>
-            </w:pPr>
-          </w:p>
-          <w:p>
-            <w:pPr>
-              <w:jc w:val="both"/>
-              <w:rPr>
-                <w:rFonts w:ascii="Calibri" w:hAnsi="Calibri" w:cs="Calibri"/>
-                <w:noProof/>
-                <w:lang w:val="tr-TR"/>
-              </w:rPr>
-            </w:pPr>
-          </w:p>
-        </w:tc>
-      </w:tr>
-      <w:tr>
-        <w:tblPrEx>
-          <w:tblBorders>
-            <w:top w:val="single" w:sz="4" w:space="0" w:color="auto"/>
-            <w:left w:val="single" w:sz="4" w:space="0" w:color="auto"/>
-            <w:right w:val="single" w:sz="4" w:space="0" w:color="auto"/>
-            <w:insideH w:val="single" w:sz="4" w:space="0" w:color="auto"/>
-            <w:insideV w:val="single" w:sz="4" w:space="0" w:color="auto"/>
-          </w:tblBorders>
-        </w:tblPrEx>
-        <w:tc>
-          <w:tcPr>
-            <w:tcW w:w="10112" w:type="dxa"/>
-            <w:tcBorders>
-              <w:top w:val="single" w:sz="4" w:space="0" w:color="auto"/>
-              <w:left w:val="nil"/>
-              <w:bottom w:val="single" w:sz="4" w:space="0" w:color="auto"/>
-              <w:right w:val="nil"/>
-            </w:tcBorders>
-          </w:tcPr>
-          <w:p>
-            <w:pPr>
-              <w:jc w:val="both"/>
-              <w:rPr>
-                <w:rFonts w:ascii="Calibri" w:hAnsi="Calibri" w:cs="Calibri"/>
-                <w:noProof/>
-                <w:lang w:val="tr-TR"/>
-              </w:rPr>
-            </w:pPr>
-          </w:p>
-          <w:p>
-            <w:pPr>
-              <w:jc w:val="both"/>
-              <w:rPr>
-                <w:rFonts w:ascii="Calibri" w:hAnsi="Calibri" w:cs="Calibri"/>
-                <w:noProof/>
-                <w:lang w:val="tr-TR"/>
-              </w:rPr>
-            </w:pPr>
-          </w:p>
-        </w:tc>
-      </w:tr>
-      <w:tr>
-        <w:tblPrEx>
-          <w:tblBorders>
-            <w:top w:val="single" w:sz="4" w:space="0" w:color="auto"/>
-            <w:left w:val="single" w:sz="4" w:space="0" w:color="auto"/>
-            <w:right w:val="single" w:sz="4" w:space="0" w:color="auto"/>
-            <w:insideH w:val="single" w:sz="4" w:space="0" w:color="auto"/>
-            <w:insideV w:val="single" w:sz="4" w:space="0" w:color="auto"/>
-          </w:tblBorders>
-        </w:tblPrEx>
-        <w:tc>
-          <w:tcPr>
-            <w:tcW w:w="10112" w:type="dxa"/>
-            <w:tcBorders>
-              <w:top w:val="single" w:sz="4" w:space="0" w:color="auto"/>
-              <w:left w:val="nil"/>
-              <w:bottom w:val="single" w:sz="4" w:space="0" w:color="auto"/>
-              <w:right w:val="nil"/>
-            </w:tcBorders>
-          </w:tcPr>
-          <w:p>
-            <w:pPr>
-              <w:jc w:val="both"/>
-              <w:rPr>
-                <w:rFonts w:ascii="Calibri" w:hAnsi="Calibri" w:cs="Calibri"/>
-                <w:noProof/>
-                <w:lang w:val="tr-TR"/>
-              </w:rPr>
-            </w:pPr>
-          </w:p>
-          <w:p>
-            <w:pPr>
-              <w:jc w:val="both"/>
-              <w:rPr>
-                <w:rFonts w:ascii="Calibri" w:hAnsi="Calibri" w:cs="Calibri"/>
-                <w:noProof/>
-                <w:lang w:val="tr-TR"/>
-              </w:rPr>
-            </w:pPr>
-          </w:p>
-        </w:tc>
-      </w:tr>
-      <w:tr>
-        <w:tblPrEx>
-          <w:tblBorders>
-            <w:top w:val="single" w:sz="4" w:space="0" w:color="auto"/>
-            <w:left w:val="single" w:sz="4" w:space="0" w:color="auto"/>
-            <w:right w:val="single" w:sz="4" w:space="0" w:color="auto"/>
-            <w:insideH w:val="single" w:sz="4" w:space="0" w:color="auto"/>
-            <w:insideV w:val="single" w:sz="4" w:space="0" w:color="auto"/>
-          </w:tblBorders>
-        </w:tblPrEx>
-        <w:tc>
-          <w:tcPr>
-            <w:tcW w:w="10112" w:type="dxa"/>
-            <w:tcBorders>
-              <w:top w:val="single" w:sz="4" w:space="0" w:color="auto"/>
-              <w:left w:val="nil"/>
-              <w:bottom w:val="single" w:sz="4" w:space="0" w:color="auto"/>
-              <w:right w:val="nil"/>
-            </w:tcBorders>
-          </w:tcPr>
-          <w:p>
-            <w:pPr>
-              <w:jc w:val="both"/>
-              <w:rPr>
-                <w:rFonts w:ascii="Calibri" w:hAnsi="Calibri" w:cs="Calibri"/>
-                <w:noProof/>
-                <w:lang w:val="tr-TR"/>
-              </w:rPr>
-            </w:pPr>
-          </w:p>
-          <w:p>
-            <w:pPr>
-              <w:jc w:val="both"/>
-              <w:rPr>
-                <w:rFonts w:ascii="Calibri" w:hAnsi="Calibri" w:cs="Calibri"/>
-                <w:noProof/>
-                <w:lang w:val="tr-TR"/>
-              </w:rPr>
-            </w:pPr>
-          </w:p>
-        </w:tc>
-      </w:tr>
-      <w:tr>
-        <w:tblPrEx>
-          <w:tblBorders>
-            <w:top w:val="single" w:sz="4" w:space="0" w:color="auto"/>
-            <w:left w:val="single" w:sz="4" w:space="0" w:color="auto"/>
-            <w:right w:val="single" w:sz="4" w:space="0" w:color="auto"/>
-            <w:insideH w:val="single" w:sz="4" w:space="0" w:color="auto"/>
-            <w:insideV w:val="single" w:sz="4" w:space="0" w:color="auto"/>
-          </w:tblBorders>
-        </w:tblPrEx>
-        <w:tc>
-          <w:tcPr>
-            <w:tcW w:w="10112" w:type="dxa"/>
-            <w:tcBorders>
-              <w:top w:val="single" w:sz="4" w:space="0" w:color="auto"/>
-              <w:left w:val="nil"/>
-              <w:bottom w:val="single" w:sz="4" w:space="0" w:color="auto"/>
-              <w:right w:val="nil"/>
-            </w:tcBorders>
-          </w:tcPr>
-          <w:p>
-            <w:pPr>
-              <w:jc w:val="both"/>
-              <w:rPr>
-                <w:rFonts w:ascii="Calibri" w:hAnsi="Calibri" w:cs="Calibri"/>
-                <w:noProof/>
-                <w:lang w:val="tr-TR"/>
-              </w:rPr>
-            </w:pPr>
-          </w:p>
-          <w:p>
-            <w:pPr>
-              <w:jc w:val="both"/>
-              <w:rPr>
-                <w:rFonts w:ascii="Calibri" w:hAnsi="Calibri" w:cs="Calibri"/>
-                <w:noProof/>
-                <w:lang w:val="tr-TR"/>
-              </w:rPr>
-            </w:pPr>
+              <w:t xml:space="preserve">{{#yetkinlik_suresi}}{{satir}}{{/yetkinlik_suresi}}</w:t>
+            </w:r>
           </w:p>
         </w:tc>
       </w:tr>
@@ -17408,658 +15884,8 @@
           </w:tcPr>
           <w:p>
             <w:r>
-              <w:t xml:space="preserve">{{kompleks_ornekler}}</w:t>
-            </w:r>
-          </w:p>
-        </w:tc>
-      </w:tr>
-      <w:tr>
-        <w:tc>
-          <w:tcPr>
-            <w:tcW w:w="10112" w:type="dxa"/>
-            <w:tcBorders>
-              <w:top w:val="single" w:sz="4" w:space="0" w:color="auto"/>
-              <w:bottom w:val="single" w:sz="4" w:space="0" w:color="auto"/>
-            </w:tcBorders>
-          </w:tcPr>
-          <w:p>
-            <w:pPr>
-              <w:jc w:val="both"/>
-              <w:rPr>
-                <w:rFonts w:ascii="Calibri" w:hAnsi="Calibri" w:cs="Calibri"/>
-                <w:noProof/>
-                <w:lang w:val="tr-TR"/>
-              </w:rPr>
-            </w:pPr>
-          </w:p>
-          <w:p>
-            <w:pPr>
-              <w:jc w:val="both"/>
-              <w:rPr>
-                <w:rFonts w:ascii="Calibri" w:hAnsi="Calibri" w:cs="Calibri"/>
-                <w:noProof/>
-                <w:lang w:val="tr-TR"/>
-              </w:rPr>
-            </w:pPr>
-          </w:p>
-        </w:tc>
-      </w:tr>
-      <w:tr>
-        <w:tc>
-          <w:tcPr>
-            <w:tcW w:w="10112" w:type="dxa"/>
-            <w:tcBorders>
-              <w:top w:val="single" w:sz="4" w:space="0" w:color="auto"/>
-              <w:bottom w:val="single" w:sz="4" w:space="0" w:color="auto"/>
-            </w:tcBorders>
-          </w:tcPr>
-          <w:p>
-            <w:pPr>
-              <w:jc w:val="both"/>
-              <w:rPr>
-                <w:rFonts w:ascii="Calibri" w:hAnsi="Calibri" w:cs="Calibri"/>
-                <w:noProof/>
-                <w:lang w:val="tr-TR"/>
-              </w:rPr>
-            </w:pPr>
-          </w:p>
-          <w:p>
-            <w:pPr>
-              <w:jc w:val="both"/>
-              <w:rPr>
-                <w:rFonts w:ascii="Calibri" w:hAnsi="Calibri" w:cs="Calibri"/>
-                <w:noProof/>
-                <w:lang w:val="tr-TR"/>
-              </w:rPr>
-            </w:pPr>
-          </w:p>
-        </w:tc>
-      </w:tr>
-      <w:tr>
-        <w:tblPrEx>
-          <w:tblBorders>
-            <w:top w:val="single" w:sz="4" w:space="0" w:color="auto"/>
-            <w:left w:val="single" w:sz="4" w:space="0" w:color="auto"/>
-            <w:right w:val="single" w:sz="4" w:space="0" w:color="auto"/>
-            <w:insideH w:val="single" w:sz="4" w:space="0" w:color="auto"/>
-            <w:insideV w:val="single" w:sz="4" w:space="0" w:color="auto"/>
-          </w:tblBorders>
-        </w:tblPrEx>
-        <w:tc>
-          <w:tcPr>
-            <w:tcW w:w="10112" w:type="dxa"/>
-            <w:tcBorders>
-              <w:top w:val="single" w:sz="4" w:space="0" w:color="auto"/>
-              <w:left w:val="nil"/>
-              <w:bottom w:val="single" w:sz="4" w:space="0" w:color="auto"/>
-              <w:right w:val="nil"/>
-            </w:tcBorders>
-          </w:tcPr>
-          <w:p>
-            <w:pPr>
-              <w:jc w:val="both"/>
-              <w:rPr>
-                <w:rFonts w:ascii="Calibri" w:hAnsi="Calibri" w:cs="Calibri"/>
-                <w:noProof/>
-                <w:lang w:val="tr-TR"/>
-              </w:rPr>
-            </w:pPr>
-          </w:p>
-          <w:p>
-            <w:pPr>
-              <w:jc w:val="both"/>
-              <w:rPr>
-                <w:rFonts w:ascii="Calibri" w:hAnsi="Calibri" w:cs="Calibri"/>
-                <w:noProof/>
-                <w:lang w:val="tr-TR"/>
-              </w:rPr>
-            </w:pPr>
-          </w:p>
-        </w:tc>
-      </w:tr>
-      <w:tr>
-        <w:tblPrEx>
-          <w:tblBorders>
-            <w:top w:val="single" w:sz="4" w:space="0" w:color="auto"/>
-            <w:left w:val="single" w:sz="4" w:space="0" w:color="auto"/>
-            <w:right w:val="single" w:sz="4" w:space="0" w:color="auto"/>
-            <w:insideH w:val="single" w:sz="4" w:space="0" w:color="auto"/>
-            <w:insideV w:val="single" w:sz="4" w:space="0" w:color="auto"/>
-          </w:tblBorders>
-        </w:tblPrEx>
-        <w:tc>
-          <w:tcPr>
-            <w:tcW w:w="10112" w:type="dxa"/>
-            <w:tcBorders>
-              <w:top w:val="single" w:sz="4" w:space="0" w:color="auto"/>
-              <w:left w:val="nil"/>
-              <w:bottom w:val="single" w:sz="4" w:space="0" w:color="auto"/>
-              <w:right w:val="nil"/>
-            </w:tcBorders>
-          </w:tcPr>
-          <w:p>
-            <w:pPr>
-              <w:jc w:val="both"/>
-              <w:rPr>
-                <w:rFonts w:ascii="Calibri" w:hAnsi="Calibri" w:cs="Calibri"/>
-                <w:noProof/>
-                <w:lang w:val="tr-TR"/>
-              </w:rPr>
-            </w:pPr>
-          </w:p>
-          <w:p>
-            <w:pPr>
-              <w:jc w:val="both"/>
-              <w:rPr>
-                <w:rFonts w:ascii="Calibri" w:hAnsi="Calibri" w:cs="Calibri"/>
-                <w:noProof/>
-                <w:lang w:val="tr-TR"/>
-              </w:rPr>
-            </w:pPr>
-          </w:p>
-        </w:tc>
-      </w:tr>
-      <w:tr>
-        <w:tblPrEx>
-          <w:tblBorders>
-            <w:top w:val="single" w:sz="4" w:space="0" w:color="auto"/>
-            <w:left w:val="single" w:sz="4" w:space="0" w:color="auto"/>
-            <w:right w:val="single" w:sz="4" w:space="0" w:color="auto"/>
-            <w:insideH w:val="single" w:sz="4" w:space="0" w:color="auto"/>
-            <w:insideV w:val="single" w:sz="4" w:space="0" w:color="auto"/>
-          </w:tblBorders>
-        </w:tblPrEx>
-        <w:tc>
-          <w:tcPr>
-            <w:tcW w:w="10112" w:type="dxa"/>
-            <w:tcBorders>
-              <w:top w:val="single" w:sz="4" w:space="0" w:color="auto"/>
-              <w:left w:val="nil"/>
-              <w:bottom w:val="single" w:sz="4" w:space="0" w:color="auto"/>
-              <w:right w:val="nil"/>
-            </w:tcBorders>
-          </w:tcPr>
-          <w:p>
-            <w:pPr>
-              <w:jc w:val="both"/>
-              <w:rPr>
-                <w:rFonts w:ascii="Calibri" w:hAnsi="Calibri" w:cs="Calibri"/>
-                <w:noProof/>
-                <w:lang w:val="tr-TR"/>
-              </w:rPr>
-            </w:pPr>
-          </w:p>
-          <w:p>
-            <w:pPr>
-              <w:jc w:val="both"/>
-              <w:rPr>
-                <w:rFonts w:ascii="Calibri" w:hAnsi="Calibri" w:cs="Calibri"/>
-                <w:noProof/>
-                <w:lang w:val="tr-TR"/>
-              </w:rPr>
-            </w:pPr>
-          </w:p>
-        </w:tc>
-      </w:tr>
-      <w:tr>
-        <w:tblPrEx>
-          <w:tblBorders>
-            <w:top w:val="single" w:sz="4" w:space="0" w:color="auto"/>
-            <w:left w:val="single" w:sz="4" w:space="0" w:color="auto"/>
-            <w:right w:val="single" w:sz="4" w:space="0" w:color="auto"/>
-            <w:insideH w:val="single" w:sz="4" w:space="0" w:color="auto"/>
-            <w:insideV w:val="single" w:sz="4" w:space="0" w:color="auto"/>
-          </w:tblBorders>
-        </w:tblPrEx>
-        <w:tc>
-          <w:tcPr>
-            <w:tcW w:w="10112" w:type="dxa"/>
-            <w:tcBorders>
-              <w:top w:val="single" w:sz="4" w:space="0" w:color="auto"/>
-              <w:left w:val="nil"/>
-              <w:bottom w:val="single" w:sz="4" w:space="0" w:color="auto"/>
-              <w:right w:val="nil"/>
-            </w:tcBorders>
-          </w:tcPr>
-          <w:p>
-            <w:pPr>
-              <w:jc w:val="both"/>
-              <w:rPr>
-                <w:rFonts w:ascii="Calibri" w:hAnsi="Calibri" w:cs="Calibri"/>
-                <w:noProof/>
-                <w:lang w:val="tr-TR"/>
-              </w:rPr>
-            </w:pPr>
-          </w:p>
-          <w:p>
-            <w:pPr>
-              <w:jc w:val="both"/>
-              <w:rPr>
-                <w:rFonts w:ascii="Calibri" w:hAnsi="Calibri" w:cs="Calibri"/>
-                <w:noProof/>
-                <w:lang w:val="tr-TR"/>
-              </w:rPr>
-            </w:pPr>
-          </w:p>
-        </w:tc>
-      </w:tr>
-      <w:tr>
-        <w:tblPrEx>
-          <w:tblBorders>
-            <w:top w:val="single" w:sz="4" w:space="0" w:color="auto"/>
-            <w:left w:val="single" w:sz="4" w:space="0" w:color="auto"/>
-            <w:right w:val="single" w:sz="4" w:space="0" w:color="auto"/>
-            <w:insideH w:val="single" w:sz="4" w:space="0" w:color="auto"/>
-            <w:insideV w:val="single" w:sz="4" w:space="0" w:color="auto"/>
-          </w:tblBorders>
-        </w:tblPrEx>
-        <w:tc>
-          <w:tcPr>
-            <w:tcW w:w="10112" w:type="dxa"/>
-            <w:tcBorders>
-              <w:top w:val="single" w:sz="4" w:space="0" w:color="auto"/>
-              <w:left w:val="nil"/>
-              <w:bottom w:val="single" w:sz="4" w:space="0" w:color="auto"/>
-              <w:right w:val="nil"/>
-            </w:tcBorders>
-          </w:tcPr>
-          <w:p>
-            <w:pPr>
-              <w:jc w:val="both"/>
-              <w:rPr>
-                <w:rFonts w:ascii="Calibri" w:hAnsi="Calibri" w:cs="Calibri"/>
-                <w:noProof/>
-                <w:lang w:val="tr-TR"/>
-              </w:rPr>
-            </w:pPr>
-          </w:p>
-          <w:p>
-            <w:pPr>
-              <w:jc w:val="both"/>
-              <w:rPr>
-                <w:rFonts w:ascii="Calibri" w:hAnsi="Calibri" w:cs="Calibri"/>
-                <w:noProof/>
-                <w:lang w:val="tr-TR"/>
-              </w:rPr>
-            </w:pPr>
-          </w:p>
-        </w:tc>
-      </w:tr>
-      <w:tr>
-        <w:tblPrEx>
-          <w:tblBorders>
-            <w:top w:val="single" w:sz="4" w:space="0" w:color="auto"/>
-            <w:left w:val="single" w:sz="4" w:space="0" w:color="auto"/>
-            <w:right w:val="single" w:sz="4" w:space="0" w:color="auto"/>
-            <w:insideH w:val="single" w:sz="4" w:space="0" w:color="auto"/>
-            <w:insideV w:val="single" w:sz="4" w:space="0" w:color="auto"/>
-          </w:tblBorders>
-        </w:tblPrEx>
-        <w:tc>
-          <w:tcPr>
-            <w:tcW w:w="10112" w:type="dxa"/>
-            <w:tcBorders>
-              <w:top w:val="single" w:sz="4" w:space="0" w:color="auto"/>
-              <w:left w:val="nil"/>
-              <w:bottom w:val="single" w:sz="4" w:space="0" w:color="auto"/>
-              <w:right w:val="nil"/>
-            </w:tcBorders>
-          </w:tcPr>
-          <w:p>
-            <w:pPr>
-              <w:jc w:val="both"/>
-              <w:rPr>
-                <w:rFonts w:ascii="Calibri" w:hAnsi="Calibri" w:cs="Calibri"/>
-                <w:noProof/>
-                <w:lang w:val="tr-TR"/>
-              </w:rPr>
-            </w:pPr>
-          </w:p>
-          <w:p>
-            <w:pPr>
-              <w:jc w:val="both"/>
-              <w:rPr>
-                <w:rFonts w:ascii="Calibri" w:hAnsi="Calibri" w:cs="Calibri"/>
-                <w:noProof/>
-                <w:lang w:val="tr-TR"/>
-              </w:rPr>
-            </w:pPr>
-          </w:p>
-        </w:tc>
-      </w:tr>
-      <w:tr>
-        <w:tblPrEx>
-          <w:tblBorders>
-            <w:top w:val="single" w:sz="4" w:space="0" w:color="auto"/>
-            <w:left w:val="single" w:sz="4" w:space="0" w:color="auto"/>
-            <w:right w:val="single" w:sz="4" w:space="0" w:color="auto"/>
-            <w:insideH w:val="single" w:sz="4" w:space="0" w:color="auto"/>
-            <w:insideV w:val="single" w:sz="4" w:space="0" w:color="auto"/>
-          </w:tblBorders>
-        </w:tblPrEx>
-        <w:tc>
-          <w:tcPr>
-            <w:tcW w:w="10112" w:type="dxa"/>
-            <w:tcBorders>
-              <w:top w:val="single" w:sz="4" w:space="0" w:color="auto"/>
-              <w:left w:val="nil"/>
-              <w:bottom w:val="single" w:sz="4" w:space="0" w:color="auto"/>
-              <w:right w:val="nil"/>
-            </w:tcBorders>
-          </w:tcPr>
-          <w:p>
-            <w:pPr>
-              <w:jc w:val="both"/>
-              <w:rPr>
-                <w:rFonts w:ascii="Calibri" w:hAnsi="Calibri" w:cs="Calibri"/>
-                <w:noProof/>
-                <w:lang w:val="tr-TR"/>
-              </w:rPr>
-            </w:pPr>
-          </w:p>
-          <w:p>
-            <w:pPr>
-              <w:jc w:val="both"/>
-              <w:rPr>
-                <w:rFonts w:ascii="Calibri" w:hAnsi="Calibri" w:cs="Calibri"/>
-                <w:noProof/>
-                <w:lang w:val="tr-TR"/>
-              </w:rPr>
-            </w:pPr>
-          </w:p>
-        </w:tc>
-      </w:tr>
-      <w:tr>
-        <w:tblPrEx>
-          <w:tblBorders>
-            <w:top w:val="single" w:sz="4" w:space="0" w:color="auto"/>
-            <w:left w:val="single" w:sz="4" w:space="0" w:color="auto"/>
-            <w:right w:val="single" w:sz="4" w:space="0" w:color="auto"/>
-            <w:insideH w:val="single" w:sz="4" w:space="0" w:color="auto"/>
-            <w:insideV w:val="single" w:sz="4" w:space="0" w:color="auto"/>
-          </w:tblBorders>
-        </w:tblPrEx>
-        <w:tc>
-          <w:tcPr>
-            <w:tcW w:w="10112" w:type="dxa"/>
-            <w:tcBorders>
-              <w:top w:val="single" w:sz="4" w:space="0" w:color="auto"/>
-              <w:left w:val="nil"/>
-              <w:bottom w:val="single" w:sz="4" w:space="0" w:color="auto"/>
-              <w:right w:val="nil"/>
-            </w:tcBorders>
-          </w:tcPr>
-          <w:p>
-            <w:pPr>
-              <w:jc w:val="both"/>
-              <w:rPr>
-                <w:rFonts w:ascii="Calibri" w:hAnsi="Calibri" w:cs="Calibri"/>
-                <w:noProof/>
-                <w:lang w:val="tr-TR"/>
-              </w:rPr>
-            </w:pPr>
-          </w:p>
-          <w:p>
-            <w:pPr>
-              <w:jc w:val="both"/>
-              <w:rPr>
-                <w:rFonts w:ascii="Calibri" w:hAnsi="Calibri" w:cs="Calibri"/>
-                <w:noProof/>
-                <w:lang w:val="tr-TR"/>
-              </w:rPr>
-            </w:pPr>
-          </w:p>
-        </w:tc>
-      </w:tr>
-      <w:tr>
-        <w:tblPrEx>
-          <w:tblBorders>
-            <w:top w:val="single" w:sz="4" w:space="0" w:color="auto"/>
-            <w:left w:val="single" w:sz="4" w:space="0" w:color="auto"/>
-            <w:right w:val="single" w:sz="4" w:space="0" w:color="auto"/>
-            <w:insideH w:val="single" w:sz="4" w:space="0" w:color="auto"/>
-            <w:insideV w:val="single" w:sz="4" w:space="0" w:color="auto"/>
-          </w:tblBorders>
-        </w:tblPrEx>
-        <w:tc>
-          <w:tcPr>
-            <w:tcW w:w="10112" w:type="dxa"/>
-            <w:tcBorders>
-              <w:top w:val="single" w:sz="4" w:space="0" w:color="auto"/>
-              <w:left w:val="nil"/>
-              <w:bottom w:val="single" w:sz="4" w:space="0" w:color="auto"/>
-              <w:right w:val="nil"/>
-            </w:tcBorders>
-          </w:tcPr>
-          <w:p>
-            <w:pPr>
-              <w:jc w:val="both"/>
-              <w:rPr>
-                <w:rFonts w:ascii="Calibri" w:hAnsi="Calibri" w:cs="Calibri"/>
-                <w:noProof/>
-                <w:lang w:val="tr-TR"/>
-              </w:rPr>
-            </w:pPr>
-          </w:p>
-          <w:p>
-            <w:pPr>
-              <w:jc w:val="both"/>
-              <w:rPr>
-                <w:rFonts w:ascii="Calibri" w:hAnsi="Calibri" w:cs="Calibri"/>
-                <w:noProof/>
-                <w:lang w:val="tr-TR"/>
-              </w:rPr>
-            </w:pPr>
-          </w:p>
-        </w:tc>
-      </w:tr>
-      <w:tr>
-        <w:tblPrEx>
-          <w:tblBorders>
-            <w:top w:val="single" w:sz="4" w:space="0" w:color="auto"/>
-            <w:left w:val="single" w:sz="4" w:space="0" w:color="auto"/>
-            <w:right w:val="single" w:sz="4" w:space="0" w:color="auto"/>
-            <w:insideH w:val="single" w:sz="4" w:space="0" w:color="auto"/>
-            <w:insideV w:val="single" w:sz="4" w:space="0" w:color="auto"/>
-          </w:tblBorders>
-        </w:tblPrEx>
-        <w:tc>
-          <w:tcPr>
-            <w:tcW w:w="10112" w:type="dxa"/>
-            <w:tcBorders>
-              <w:top w:val="single" w:sz="4" w:space="0" w:color="auto"/>
-              <w:left w:val="nil"/>
-              <w:bottom w:val="single" w:sz="4" w:space="0" w:color="auto"/>
-              <w:right w:val="nil"/>
-            </w:tcBorders>
-          </w:tcPr>
-          <w:p>
-            <w:pPr>
-              <w:jc w:val="both"/>
-              <w:rPr>
-                <w:rFonts w:ascii="Calibri" w:hAnsi="Calibri" w:cs="Calibri"/>
-                <w:noProof/>
-                <w:lang w:val="tr-TR"/>
-              </w:rPr>
-            </w:pPr>
-          </w:p>
-          <w:p>
-            <w:pPr>
-              <w:jc w:val="both"/>
-              <w:rPr>
-                <w:rFonts w:ascii="Calibri" w:hAnsi="Calibri" w:cs="Calibri"/>
-                <w:noProof/>
-                <w:lang w:val="tr-TR"/>
-              </w:rPr>
-            </w:pPr>
-          </w:p>
-        </w:tc>
-      </w:tr>
-      <w:tr>
-        <w:tblPrEx>
-          <w:tblBorders>
-            <w:top w:val="single" w:sz="4" w:space="0" w:color="auto"/>
-            <w:left w:val="single" w:sz="4" w:space="0" w:color="auto"/>
-            <w:right w:val="single" w:sz="4" w:space="0" w:color="auto"/>
-            <w:insideH w:val="single" w:sz="4" w:space="0" w:color="auto"/>
-            <w:insideV w:val="single" w:sz="4" w:space="0" w:color="auto"/>
-          </w:tblBorders>
-        </w:tblPrEx>
-        <w:tc>
-          <w:tcPr>
-            <w:tcW w:w="10112" w:type="dxa"/>
-            <w:tcBorders>
-              <w:top w:val="single" w:sz="4" w:space="0" w:color="auto"/>
-              <w:left w:val="nil"/>
-              <w:bottom w:val="single" w:sz="4" w:space="0" w:color="auto"/>
-              <w:right w:val="nil"/>
-            </w:tcBorders>
-          </w:tcPr>
-          <w:p>
-            <w:pPr>
-              <w:jc w:val="both"/>
-              <w:rPr>
-                <w:rFonts w:ascii="Calibri" w:hAnsi="Calibri" w:cs="Calibri"/>
-                <w:noProof/>
-                <w:lang w:val="tr-TR"/>
-              </w:rPr>
-            </w:pPr>
-          </w:p>
-          <w:p>
-            <w:pPr>
-              <w:jc w:val="both"/>
-              <w:rPr>
-                <w:rFonts w:ascii="Calibri" w:hAnsi="Calibri" w:cs="Calibri"/>
-                <w:noProof/>
-                <w:lang w:val="tr-TR"/>
-              </w:rPr>
-            </w:pPr>
-          </w:p>
-        </w:tc>
-      </w:tr>
-      <w:tr>
-        <w:tblPrEx>
-          <w:tblBorders>
-            <w:top w:val="single" w:sz="4" w:space="0" w:color="auto"/>
-            <w:left w:val="single" w:sz="4" w:space="0" w:color="auto"/>
-            <w:right w:val="single" w:sz="4" w:space="0" w:color="auto"/>
-            <w:insideH w:val="single" w:sz="4" w:space="0" w:color="auto"/>
-            <w:insideV w:val="single" w:sz="4" w:space="0" w:color="auto"/>
-          </w:tblBorders>
-        </w:tblPrEx>
-        <w:tc>
-          <w:tcPr>
-            <w:tcW w:w="10112" w:type="dxa"/>
-            <w:tcBorders>
-              <w:top w:val="single" w:sz="4" w:space="0" w:color="auto"/>
-              <w:left w:val="nil"/>
-              <w:bottom w:val="single" w:sz="4" w:space="0" w:color="auto"/>
-              <w:right w:val="nil"/>
-            </w:tcBorders>
-          </w:tcPr>
-          <w:p>
-            <w:pPr>
-              <w:jc w:val="both"/>
-              <w:rPr>
-                <w:rFonts w:ascii="Calibri" w:hAnsi="Calibri" w:cs="Calibri"/>
-                <w:noProof/>
-                <w:lang w:val="tr-TR"/>
-              </w:rPr>
-            </w:pPr>
-          </w:p>
-          <w:p>
-            <w:pPr>
-              <w:jc w:val="both"/>
-              <w:rPr>
-                <w:rFonts w:ascii="Calibri" w:hAnsi="Calibri" w:cs="Calibri"/>
-                <w:noProof/>
-                <w:lang w:val="tr-TR"/>
-              </w:rPr>
-            </w:pPr>
-          </w:p>
-        </w:tc>
-      </w:tr>
-      <w:tr>
-        <w:tblPrEx>
-          <w:tblBorders>
-            <w:top w:val="single" w:sz="4" w:space="0" w:color="auto"/>
-            <w:left w:val="single" w:sz="4" w:space="0" w:color="auto"/>
-            <w:right w:val="single" w:sz="4" w:space="0" w:color="auto"/>
-            <w:insideH w:val="single" w:sz="4" w:space="0" w:color="auto"/>
-            <w:insideV w:val="single" w:sz="4" w:space="0" w:color="auto"/>
-          </w:tblBorders>
-        </w:tblPrEx>
-        <w:tc>
-          <w:tcPr>
-            <w:tcW w:w="10112" w:type="dxa"/>
-            <w:tcBorders>
-              <w:top w:val="single" w:sz="4" w:space="0" w:color="auto"/>
-              <w:left w:val="nil"/>
-              <w:bottom w:val="single" w:sz="4" w:space="0" w:color="auto"/>
-              <w:right w:val="nil"/>
-            </w:tcBorders>
-          </w:tcPr>
-          <w:p>
-            <w:pPr>
-              <w:jc w:val="both"/>
-              <w:rPr>
-                <w:rFonts w:ascii="Calibri" w:hAnsi="Calibri" w:cs="Calibri"/>
-                <w:noProof/>
-                <w:lang w:val="tr-TR"/>
-              </w:rPr>
-            </w:pPr>
-          </w:p>
-          <w:p>
-            <w:pPr>
-              <w:jc w:val="both"/>
-              <w:rPr>
-                <w:rFonts w:ascii="Calibri" w:hAnsi="Calibri" w:cs="Calibri"/>
-                <w:noProof/>
-                <w:lang w:val="tr-TR"/>
-              </w:rPr>
-            </w:pPr>
-          </w:p>
-        </w:tc>
-      </w:tr>
-      <w:tr>
-        <w:tblPrEx>
-          <w:tblBorders>
-            <w:top w:val="single" w:sz="4" w:space="0" w:color="auto"/>
-            <w:left w:val="single" w:sz="4" w:space="0" w:color="auto"/>
-            <w:right w:val="single" w:sz="4" w:space="0" w:color="auto"/>
-            <w:insideH w:val="single" w:sz="4" w:space="0" w:color="auto"/>
-            <w:insideV w:val="single" w:sz="4" w:space="0" w:color="auto"/>
-          </w:tblBorders>
-        </w:tblPrEx>
-        <w:tc>
-          <w:tcPr>
-            <w:tcW w:w="10112" w:type="dxa"/>
-            <w:tcBorders>
-              <w:top w:val="single" w:sz="4" w:space="0" w:color="auto"/>
-              <w:left w:val="nil"/>
-              <w:bottom w:val="single" w:sz="4" w:space="0" w:color="auto"/>
-              <w:right w:val="nil"/>
-            </w:tcBorders>
-          </w:tcPr>
-          <w:p>
-            <w:pPr>
-              <w:jc w:val="both"/>
-              <w:rPr>
-                <w:rFonts w:ascii="Calibri" w:hAnsi="Calibri" w:cs="Calibri"/>
-                <w:noProof/>
-                <w:lang w:val="tr-TR"/>
-              </w:rPr>
-            </w:pPr>
-          </w:p>
-          <w:p>
-            <w:pPr>
-              <w:jc w:val="both"/>
-              <w:rPr>
-                <w:rFonts w:ascii="Calibri" w:hAnsi="Calibri" w:cs="Calibri"/>
-                <w:noProof/>
-                <w:lang w:val="tr-TR"/>
-              </w:rPr>
-            </w:pPr>
+              <w:t xml:space="preserve">{{#kompleks_ornekler}}{{satir}}{{/kompleks_ornekler}}</w:t>
+            </w:r>
           </w:p>
         </w:tc>
       </w:tr>
@@ -18158,280 +15984,8 @@
           </w:tcPr>
           <w:p>
             <w:r>
-              <w:t xml:space="preserve">{{gelistirilen_metotlar}}</w:t>
-            </w:r>
-          </w:p>
-        </w:tc>
-      </w:tr>
-      <w:tr>
-        <w:tc>
-          <w:tcPr>
-            <w:tcW w:w="10112" w:type="dxa"/>
-            <w:tcBorders>
-              <w:top w:val="single" w:sz="4" w:space="0" w:color="auto"/>
-              <w:bottom w:val="single" w:sz="4" w:space="0" w:color="auto"/>
-            </w:tcBorders>
-          </w:tcPr>
-          <w:p>
-            <w:pPr>
-              <w:jc w:val="both"/>
-              <w:rPr>
-                <w:rFonts w:ascii="Calibri" w:hAnsi="Calibri" w:cs="Calibri"/>
-                <w:noProof/>
-                <w:lang w:val="tr-TR"/>
-              </w:rPr>
-            </w:pPr>
-          </w:p>
-          <w:p>
-            <w:pPr>
-              <w:jc w:val="both"/>
-              <w:rPr>
-                <w:rFonts w:ascii="Calibri" w:hAnsi="Calibri" w:cs="Calibri"/>
-                <w:noProof/>
-                <w:lang w:val="tr-TR"/>
-              </w:rPr>
-            </w:pPr>
-          </w:p>
-        </w:tc>
-      </w:tr>
-      <w:tr>
-        <w:tc>
-          <w:tcPr>
-            <w:tcW w:w="10112" w:type="dxa"/>
-            <w:tcBorders>
-              <w:top w:val="single" w:sz="4" w:space="0" w:color="auto"/>
-              <w:bottom w:val="single" w:sz="4" w:space="0" w:color="auto"/>
-            </w:tcBorders>
-          </w:tcPr>
-          <w:p>
-            <w:pPr>
-              <w:jc w:val="both"/>
-              <w:rPr>
-                <w:rFonts w:ascii="Calibri" w:hAnsi="Calibri" w:cs="Calibri"/>
-                <w:noProof/>
-                <w:lang w:val="tr-TR"/>
-              </w:rPr>
-            </w:pPr>
-          </w:p>
-          <w:p>
-            <w:pPr>
-              <w:jc w:val="both"/>
-              <w:rPr>
-                <w:rFonts w:ascii="Calibri" w:hAnsi="Calibri" w:cs="Calibri"/>
-                <w:noProof/>
-                <w:lang w:val="tr-TR"/>
-              </w:rPr>
-            </w:pPr>
-          </w:p>
-        </w:tc>
-      </w:tr>
-      <w:tr>
-        <w:tblPrEx>
-          <w:tblBorders>
-            <w:top w:val="single" w:sz="4" w:space="0" w:color="auto"/>
-            <w:left w:val="single" w:sz="4" w:space="0" w:color="auto"/>
-            <w:right w:val="single" w:sz="4" w:space="0" w:color="auto"/>
-            <w:insideH w:val="single" w:sz="4" w:space="0" w:color="auto"/>
-            <w:insideV w:val="single" w:sz="4" w:space="0" w:color="auto"/>
-          </w:tblBorders>
-        </w:tblPrEx>
-        <w:tc>
-          <w:tcPr>
-            <w:tcW w:w="10112" w:type="dxa"/>
-            <w:tcBorders>
-              <w:top w:val="single" w:sz="4" w:space="0" w:color="auto"/>
-              <w:left w:val="nil"/>
-              <w:bottom w:val="single" w:sz="4" w:space="0" w:color="auto"/>
-              <w:right w:val="nil"/>
-            </w:tcBorders>
-          </w:tcPr>
-          <w:p>
-            <w:pPr>
-              <w:jc w:val="both"/>
-              <w:rPr>
-                <w:rFonts w:ascii="Calibri" w:hAnsi="Calibri" w:cs="Calibri"/>
-                <w:noProof/>
-                <w:lang w:val="tr-TR"/>
-              </w:rPr>
-            </w:pPr>
-          </w:p>
-          <w:p>
-            <w:pPr>
-              <w:jc w:val="both"/>
-              <w:rPr>
-                <w:rFonts w:ascii="Calibri" w:hAnsi="Calibri" w:cs="Calibri"/>
-                <w:noProof/>
-                <w:lang w:val="tr-TR"/>
-              </w:rPr>
-            </w:pPr>
-          </w:p>
-        </w:tc>
-      </w:tr>
-      <w:tr>
-        <w:tblPrEx>
-          <w:tblBorders>
-            <w:top w:val="single" w:sz="4" w:space="0" w:color="auto"/>
-            <w:left w:val="single" w:sz="4" w:space="0" w:color="auto"/>
-            <w:right w:val="single" w:sz="4" w:space="0" w:color="auto"/>
-            <w:insideH w:val="single" w:sz="4" w:space="0" w:color="auto"/>
-            <w:insideV w:val="single" w:sz="4" w:space="0" w:color="auto"/>
-          </w:tblBorders>
-        </w:tblPrEx>
-        <w:tc>
-          <w:tcPr>
-            <w:tcW w:w="10112" w:type="dxa"/>
-            <w:tcBorders>
-              <w:top w:val="single" w:sz="4" w:space="0" w:color="auto"/>
-              <w:left w:val="nil"/>
-              <w:bottom w:val="single" w:sz="4" w:space="0" w:color="auto"/>
-              <w:right w:val="nil"/>
-            </w:tcBorders>
-          </w:tcPr>
-          <w:p>
-            <w:pPr>
-              <w:jc w:val="both"/>
-              <w:rPr>
-                <w:rFonts w:ascii="Calibri" w:hAnsi="Calibri" w:cs="Calibri"/>
-                <w:noProof/>
-                <w:lang w:val="tr-TR"/>
-              </w:rPr>
-            </w:pPr>
-          </w:p>
-          <w:p>
-            <w:pPr>
-              <w:jc w:val="both"/>
-              <w:rPr>
-                <w:rFonts w:ascii="Calibri" w:hAnsi="Calibri" w:cs="Calibri"/>
-                <w:noProof/>
-                <w:lang w:val="tr-TR"/>
-              </w:rPr>
-            </w:pPr>
-          </w:p>
-        </w:tc>
-      </w:tr>
-      <w:tr>
-        <w:tblPrEx>
-          <w:tblBorders>
-            <w:top w:val="single" w:sz="4" w:space="0" w:color="auto"/>
-            <w:left w:val="single" w:sz="4" w:space="0" w:color="auto"/>
-            <w:right w:val="single" w:sz="4" w:space="0" w:color="auto"/>
-            <w:insideH w:val="single" w:sz="4" w:space="0" w:color="auto"/>
-            <w:insideV w:val="single" w:sz="4" w:space="0" w:color="auto"/>
-          </w:tblBorders>
-        </w:tblPrEx>
-        <w:tc>
-          <w:tcPr>
-            <w:tcW w:w="10112" w:type="dxa"/>
-            <w:tcBorders>
-              <w:top w:val="single" w:sz="4" w:space="0" w:color="auto"/>
-              <w:left w:val="nil"/>
-              <w:bottom w:val="single" w:sz="4" w:space="0" w:color="auto"/>
-              <w:right w:val="nil"/>
-            </w:tcBorders>
-          </w:tcPr>
-          <w:p>
-            <w:pPr>
-              <w:jc w:val="both"/>
-              <w:rPr>
-                <w:rFonts w:ascii="Calibri" w:hAnsi="Calibri" w:cs="Calibri"/>
-                <w:noProof/>
-                <w:lang w:val="tr-TR"/>
-              </w:rPr>
-            </w:pPr>
-          </w:p>
-          <w:p>
-            <w:pPr>
-              <w:jc w:val="both"/>
-              <w:rPr>
-                <w:rFonts w:ascii="Calibri" w:hAnsi="Calibri" w:cs="Calibri"/>
-                <w:noProof/>
-                <w:lang w:val="tr-TR"/>
-              </w:rPr>
-            </w:pPr>
-          </w:p>
-        </w:tc>
-      </w:tr>
-      <w:tr>
-        <w:tblPrEx>
-          <w:tblBorders>
-            <w:top w:val="single" w:sz="4" w:space="0" w:color="auto"/>
-            <w:left w:val="single" w:sz="4" w:space="0" w:color="auto"/>
-            <w:right w:val="single" w:sz="4" w:space="0" w:color="auto"/>
-            <w:insideH w:val="single" w:sz="4" w:space="0" w:color="auto"/>
-            <w:insideV w:val="single" w:sz="4" w:space="0" w:color="auto"/>
-          </w:tblBorders>
-        </w:tblPrEx>
-        <w:tc>
-          <w:tcPr>
-            <w:tcW w:w="10112" w:type="dxa"/>
-            <w:tcBorders>
-              <w:top w:val="single" w:sz="4" w:space="0" w:color="auto"/>
-              <w:left w:val="nil"/>
-              <w:bottom w:val="single" w:sz="4" w:space="0" w:color="auto"/>
-              <w:right w:val="nil"/>
-            </w:tcBorders>
-          </w:tcPr>
-          <w:p>
-            <w:pPr>
-              <w:jc w:val="both"/>
-              <w:rPr>
-                <w:rFonts w:ascii="Calibri" w:hAnsi="Calibri" w:cs="Calibri"/>
-                <w:noProof/>
-                <w:lang w:val="tr-TR"/>
-              </w:rPr>
-            </w:pPr>
-          </w:p>
-          <w:p>
-            <w:pPr>
-              <w:jc w:val="both"/>
-              <w:rPr>
-                <w:rFonts w:ascii="Calibri" w:hAnsi="Calibri" w:cs="Calibri"/>
-                <w:noProof/>
-                <w:lang w:val="tr-TR"/>
-              </w:rPr>
-            </w:pPr>
-          </w:p>
-        </w:tc>
-      </w:tr>
-      <w:tr>
-        <w:tblPrEx>
-          <w:tblBorders>
-            <w:top w:val="single" w:sz="4" w:space="0" w:color="auto"/>
-            <w:left w:val="single" w:sz="4" w:space="0" w:color="auto"/>
-            <w:right w:val="single" w:sz="4" w:space="0" w:color="auto"/>
-            <w:insideH w:val="single" w:sz="4" w:space="0" w:color="auto"/>
-            <w:insideV w:val="single" w:sz="4" w:space="0" w:color="auto"/>
-          </w:tblBorders>
-        </w:tblPrEx>
-        <w:tc>
-          <w:tcPr>
-            <w:tcW w:w="10112" w:type="dxa"/>
-            <w:tcBorders>
-              <w:top w:val="single" w:sz="4" w:space="0" w:color="auto"/>
-              <w:left w:val="nil"/>
-              <w:bottom w:val="single" w:sz="4" w:space="0" w:color="auto"/>
-              <w:right w:val="nil"/>
-            </w:tcBorders>
-          </w:tcPr>
-          <w:p>
-            <w:pPr>
-              <w:jc w:val="both"/>
-              <w:rPr>
-                <w:rFonts w:ascii="Calibri" w:hAnsi="Calibri" w:cs="Calibri"/>
-                <w:noProof/>
-                <w:lang w:val="tr-TR"/>
-              </w:rPr>
-            </w:pPr>
-          </w:p>
-          <w:p>
-            <w:pPr>
-              <w:jc w:val="both"/>
-              <w:rPr>
-                <w:rFonts w:ascii="Calibri" w:hAnsi="Calibri" w:cs="Calibri"/>
-                <w:noProof/>
-                <w:lang w:val="tr-TR"/>
-              </w:rPr>
-            </w:pPr>
+              <w:t xml:space="preserve">{{#gelistirilen_metotlar}}{{satir}}{{/gelistirilen_metotlar}}</w:t>
+            </w:r>
           </w:p>
         </w:tc>
       </w:tr>
@@ -18518,406 +16072,8 @@
           </w:tcPr>
           <w:p>
             <w:r>
-              <w:t xml:space="preserve">{{politika_prosedur}}</w:t>
-            </w:r>
-          </w:p>
-        </w:tc>
-      </w:tr>
-      <w:tr>
-        <w:tc>
-          <w:tcPr>
-            <w:tcW w:w="10112" w:type="dxa"/>
-            <w:tcBorders>
-              <w:top w:val="single" w:sz="4" w:space="0" w:color="auto"/>
-              <w:bottom w:val="single" w:sz="4" w:space="0" w:color="auto"/>
-            </w:tcBorders>
-          </w:tcPr>
-          <w:p>
-            <w:pPr>
-              <w:jc w:val="both"/>
-              <w:rPr>
-                <w:rFonts w:ascii="Calibri" w:hAnsi="Calibri" w:cs="Calibri"/>
-                <w:noProof/>
-                <w:lang w:val="tr-TR"/>
-              </w:rPr>
-            </w:pPr>
-          </w:p>
-          <w:p>
-            <w:pPr>
-              <w:jc w:val="both"/>
-              <w:rPr>
-                <w:rFonts w:ascii="Calibri" w:hAnsi="Calibri" w:cs="Calibri"/>
-                <w:noProof/>
-                <w:lang w:val="tr-TR"/>
-              </w:rPr>
-            </w:pPr>
-          </w:p>
-        </w:tc>
-      </w:tr>
-      <w:tr>
-        <w:tc>
-          <w:tcPr>
-            <w:tcW w:w="10112" w:type="dxa"/>
-            <w:tcBorders>
-              <w:top w:val="single" w:sz="4" w:space="0" w:color="auto"/>
-              <w:bottom w:val="single" w:sz="4" w:space="0" w:color="auto"/>
-            </w:tcBorders>
-          </w:tcPr>
-          <w:p>
-            <w:pPr>
-              <w:jc w:val="both"/>
-              <w:rPr>
-                <w:rFonts w:ascii="Calibri" w:hAnsi="Calibri" w:cs="Calibri"/>
-                <w:noProof/>
-                <w:lang w:val="tr-TR"/>
-              </w:rPr>
-            </w:pPr>
-          </w:p>
-          <w:p>
-            <w:pPr>
-              <w:jc w:val="both"/>
-              <w:rPr>
-                <w:rFonts w:ascii="Calibri" w:hAnsi="Calibri" w:cs="Calibri"/>
-                <w:noProof/>
-                <w:lang w:val="tr-TR"/>
-              </w:rPr>
-            </w:pPr>
-          </w:p>
-        </w:tc>
-      </w:tr>
-      <w:tr>
-        <w:tblPrEx>
-          <w:tblBorders>
-            <w:top w:val="single" w:sz="4" w:space="0" w:color="auto"/>
-            <w:left w:val="single" w:sz="4" w:space="0" w:color="auto"/>
-            <w:right w:val="single" w:sz="4" w:space="0" w:color="auto"/>
-            <w:insideH w:val="single" w:sz="4" w:space="0" w:color="auto"/>
-            <w:insideV w:val="single" w:sz="4" w:space="0" w:color="auto"/>
-          </w:tblBorders>
-        </w:tblPrEx>
-        <w:tc>
-          <w:tcPr>
-            <w:tcW w:w="10112" w:type="dxa"/>
-            <w:tcBorders>
-              <w:top w:val="single" w:sz="4" w:space="0" w:color="auto"/>
-              <w:left w:val="nil"/>
-              <w:bottom w:val="single" w:sz="4" w:space="0" w:color="auto"/>
-              <w:right w:val="nil"/>
-            </w:tcBorders>
-          </w:tcPr>
-          <w:p>
-            <w:pPr>
-              <w:jc w:val="both"/>
-              <w:rPr>
-                <w:rFonts w:ascii="Calibri" w:hAnsi="Calibri" w:cs="Calibri"/>
-                <w:noProof/>
-                <w:lang w:val="tr-TR"/>
-              </w:rPr>
-            </w:pPr>
-          </w:p>
-          <w:p>
-            <w:pPr>
-              <w:jc w:val="both"/>
-              <w:rPr>
-                <w:rFonts w:ascii="Calibri" w:hAnsi="Calibri" w:cs="Calibri"/>
-                <w:noProof/>
-                <w:lang w:val="tr-TR"/>
-              </w:rPr>
-            </w:pPr>
-          </w:p>
-        </w:tc>
-      </w:tr>
-      <w:tr>
-        <w:tblPrEx>
-          <w:tblBorders>
-            <w:top w:val="single" w:sz="4" w:space="0" w:color="auto"/>
-            <w:left w:val="single" w:sz="4" w:space="0" w:color="auto"/>
-            <w:right w:val="single" w:sz="4" w:space="0" w:color="auto"/>
-            <w:insideH w:val="single" w:sz="4" w:space="0" w:color="auto"/>
-            <w:insideV w:val="single" w:sz="4" w:space="0" w:color="auto"/>
-          </w:tblBorders>
-        </w:tblPrEx>
-        <w:tc>
-          <w:tcPr>
-            <w:tcW w:w="10112" w:type="dxa"/>
-            <w:tcBorders>
-              <w:top w:val="single" w:sz="4" w:space="0" w:color="auto"/>
-              <w:left w:val="nil"/>
-              <w:bottom w:val="single" w:sz="4" w:space="0" w:color="auto"/>
-              <w:right w:val="nil"/>
-            </w:tcBorders>
-          </w:tcPr>
-          <w:p>
-            <w:pPr>
-              <w:jc w:val="both"/>
-              <w:rPr>
-                <w:rFonts w:ascii="Calibri" w:hAnsi="Calibri" w:cs="Calibri"/>
-                <w:noProof/>
-                <w:lang w:val="tr-TR"/>
-              </w:rPr>
-            </w:pPr>
-          </w:p>
-          <w:p>
-            <w:pPr>
-              <w:jc w:val="both"/>
-              <w:rPr>
-                <w:rFonts w:ascii="Calibri" w:hAnsi="Calibri" w:cs="Calibri"/>
-                <w:noProof/>
-                <w:lang w:val="tr-TR"/>
-              </w:rPr>
-            </w:pPr>
-          </w:p>
-        </w:tc>
-      </w:tr>
-      <w:tr>
-        <w:tblPrEx>
-          <w:tblBorders>
-            <w:top w:val="single" w:sz="4" w:space="0" w:color="auto"/>
-            <w:left w:val="single" w:sz="4" w:space="0" w:color="auto"/>
-            <w:right w:val="single" w:sz="4" w:space="0" w:color="auto"/>
-            <w:insideH w:val="single" w:sz="4" w:space="0" w:color="auto"/>
-            <w:insideV w:val="single" w:sz="4" w:space="0" w:color="auto"/>
-          </w:tblBorders>
-        </w:tblPrEx>
-        <w:tc>
-          <w:tcPr>
-            <w:tcW w:w="10112" w:type="dxa"/>
-            <w:tcBorders>
-              <w:top w:val="single" w:sz="4" w:space="0" w:color="auto"/>
-              <w:left w:val="nil"/>
-              <w:bottom w:val="single" w:sz="4" w:space="0" w:color="auto"/>
-              <w:right w:val="nil"/>
-            </w:tcBorders>
-          </w:tcPr>
-          <w:p>
-            <w:pPr>
-              <w:jc w:val="both"/>
-              <w:rPr>
-                <w:rFonts w:ascii="Calibri" w:hAnsi="Calibri" w:cs="Calibri"/>
-                <w:noProof/>
-                <w:lang w:val="tr-TR"/>
-              </w:rPr>
-            </w:pPr>
-          </w:p>
-          <w:p>
-            <w:pPr>
-              <w:jc w:val="both"/>
-              <w:rPr>
-                <w:rFonts w:ascii="Calibri" w:hAnsi="Calibri" w:cs="Calibri"/>
-                <w:noProof/>
-                <w:lang w:val="tr-TR"/>
-              </w:rPr>
-            </w:pPr>
-          </w:p>
-        </w:tc>
-      </w:tr>
-      <w:tr>
-        <w:tblPrEx>
-          <w:tblBorders>
-            <w:top w:val="single" w:sz="4" w:space="0" w:color="auto"/>
-            <w:left w:val="single" w:sz="4" w:space="0" w:color="auto"/>
-            <w:right w:val="single" w:sz="4" w:space="0" w:color="auto"/>
-            <w:insideH w:val="single" w:sz="4" w:space="0" w:color="auto"/>
-            <w:insideV w:val="single" w:sz="4" w:space="0" w:color="auto"/>
-          </w:tblBorders>
-        </w:tblPrEx>
-        <w:tc>
-          <w:tcPr>
-            <w:tcW w:w="10112" w:type="dxa"/>
-            <w:tcBorders>
-              <w:top w:val="single" w:sz="4" w:space="0" w:color="auto"/>
-              <w:left w:val="nil"/>
-              <w:bottom w:val="single" w:sz="4" w:space="0" w:color="auto"/>
-              <w:right w:val="nil"/>
-            </w:tcBorders>
-          </w:tcPr>
-          <w:p>
-            <w:pPr>
-              <w:jc w:val="both"/>
-              <w:rPr>
-                <w:rFonts w:ascii="Calibri" w:hAnsi="Calibri" w:cs="Calibri"/>
-                <w:noProof/>
-                <w:lang w:val="tr-TR"/>
-              </w:rPr>
-            </w:pPr>
-          </w:p>
-          <w:p>
-            <w:pPr>
-              <w:jc w:val="both"/>
-              <w:rPr>
-                <w:rFonts w:ascii="Calibri" w:hAnsi="Calibri" w:cs="Calibri"/>
-                <w:noProof/>
-                <w:lang w:val="tr-TR"/>
-              </w:rPr>
-            </w:pPr>
-          </w:p>
-        </w:tc>
-      </w:tr>
-      <w:tr>
-        <w:tblPrEx>
-          <w:tblBorders>
-            <w:top w:val="single" w:sz="4" w:space="0" w:color="auto"/>
-            <w:left w:val="single" w:sz="4" w:space="0" w:color="auto"/>
-            <w:right w:val="single" w:sz="4" w:space="0" w:color="auto"/>
-            <w:insideH w:val="single" w:sz="4" w:space="0" w:color="auto"/>
-            <w:insideV w:val="single" w:sz="4" w:space="0" w:color="auto"/>
-          </w:tblBorders>
-        </w:tblPrEx>
-        <w:tc>
-          <w:tcPr>
-            <w:tcW w:w="10112" w:type="dxa"/>
-            <w:tcBorders>
-              <w:top w:val="single" w:sz="4" w:space="0" w:color="auto"/>
-              <w:left w:val="nil"/>
-              <w:bottom w:val="single" w:sz="4" w:space="0" w:color="auto"/>
-              <w:right w:val="nil"/>
-            </w:tcBorders>
-          </w:tcPr>
-          <w:p>
-            <w:pPr>
-              <w:jc w:val="both"/>
-              <w:rPr>
-                <w:rFonts w:ascii="Calibri" w:hAnsi="Calibri" w:cs="Calibri"/>
-                <w:noProof/>
-                <w:lang w:val="tr-TR"/>
-              </w:rPr>
-            </w:pPr>
-          </w:p>
-          <w:p>
-            <w:pPr>
-              <w:jc w:val="both"/>
-              <w:rPr>
-                <w:rFonts w:ascii="Calibri" w:hAnsi="Calibri" w:cs="Calibri"/>
-                <w:noProof/>
-                <w:lang w:val="tr-TR"/>
-              </w:rPr>
-            </w:pPr>
-          </w:p>
-        </w:tc>
-      </w:tr>
-      <w:tr>
-        <w:tblPrEx>
-          <w:tblBorders>
-            <w:top w:val="single" w:sz="4" w:space="0" w:color="auto"/>
-            <w:left w:val="single" w:sz="4" w:space="0" w:color="auto"/>
-            <w:right w:val="single" w:sz="4" w:space="0" w:color="auto"/>
-            <w:insideH w:val="single" w:sz="4" w:space="0" w:color="auto"/>
-            <w:insideV w:val="single" w:sz="4" w:space="0" w:color="auto"/>
-          </w:tblBorders>
-        </w:tblPrEx>
-        <w:tc>
-          <w:tcPr>
-            <w:tcW w:w="10112" w:type="dxa"/>
-            <w:tcBorders>
-              <w:top w:val="single" w:sz="4" w:space="0" w:color="auto"/>
-              <w:left w:val="nil"/>
-              <w:bottom w:val="single" w:sz="4" w:space="0" w:color="auto"/>
-              <w:right w:val="nil"/>
-            </w:tcBorders>
-          </w:tcPr>
-          <w:p>
-            <w:pPr>
-              <w:jc w:val="both"/>
-              <w:rPr>
-                <w:rFonts w:ascii="Calibri" w:hAnsi="Calibri" w:cs="Calibri"/>
-                <w:noProof/>
-                <w:lang w:val="tr-TR"/>
-              </w:rPr>
-            </w:pPr>
-          </w:p>
-          <w:p>
-            <w:pPr>
-              <w:jc w:val="both"/>
-              <w:rPr>
-                <w:rFonts w:ascii="Calibri" w:hAnsi="Calibri" w:cs="Calibri"/>
-                <w:noProof/>
-                <w:lang w:val="tr-TR"/>
-              </w:rPr>
-            </w:pPr>
-          </w:p>
-        </w:tc>
-      </w:tr>
-      <w:tr>
-        <w:tblPrEx>
-          <w:tblBorders>
-            <w:top w:val="single" w:sz="4" w:space="0" w:color="auto"/>
-            <w:left w:val="single" w:sz="4" w:space="0" w:color="auto"/>
-            <w:right w:val="single" w:sz="4" w:space="0" w:color="auto"/>
-            <w:insideH w:val="single" w:sz="4" w:space="0" w:color="auto"/>
-            <w:insideV w:val="single" w:sz="4" w:space="0" w:color="auto"/>
-          </w:tblBorders>
-        </w:tblPrEx>
-        <w:tc>
-          <w:tcPr>
-            <w:tcW w:w="10112" w:type="dxa"/>
-            <w:tcBorders>
-              <w:top w:val="single" w:sz="4" w:space="0" w:color="auto"/>
-              <w:left w:val="nil"/>
-              <w:bottom w:val="single" w:sz="4" w:space="0" w:color="auto"/>
-              <w:right w:val="nil"/>
-            </w:tcBorders>
-          </w:tcPr>
-          <w:p>
-            <w:pPr>
-              <w:jc w:val="both"/>
-              <w:rPr>
-                <w:rFonts w:ascii="Calibri" w:hAnsi="Calibri" w:cs="Calibri"/>
-                <w:noProof/>
-                <w:lang w:val="tr-TR"/>
-              </w:rPr>
-            </w:pPr>
-          </w:p>
-          <w:p>
-            <w:pPr>
-              <w:jc w:val="both"/>
-              <w:rPr>
-                <w:rFonts w:ascii="Calibri" w:hAnsi="Calibri" w:cs="Calibri"/>
-                <w:noProof/>
-                <w:lang w:val="tr-TR"/>
-              </w:rPr>
-            </w:pPr>
-          </w:p>
-        </w:tc>
-      </w:tr>
-      <w:tr>
-        <w:tblPrEx>
-          <w:tblBorders>
-            <w:top w:val="single" w:sz="4" w:space="0" w:color="auto"/>
-            <w:left w:val="single" w:sz="4" w:space="0" w:color="auto"/>
-            <w:right w:val="single" w:sz="4" w:space="0" w:color="auto"/>
-            <w:insideH w:val="single" w:sz="4" w:space="0" w:color="auto"/>
-            <w:insideV w:val="single" w:sz="4" w:space="0" w:color="auto"/>
-          </w:tblBorders>
-        </w:tblPrEx>
-        <w:tc>
-          <w:tcPr>
-            <w:tcW w:w="10112" w:type="dxa"/>
-            <w:tcBorders>
-              <w:top w:val="single" w:sz="4" w:space="0" w:color="auto"/>
-              <w:left w:val="nil"/>
-              <w:bottom w:val="single" w:sz="4" w:space="0" w:color="auto"/>
-              <w:right w:val="nil"/>
-            </w:tcBorders>
-          </w:tcPr>
-          <w:p>
-            <w:pPr>
-              <w:jc w:val="both"/>
-              <w:rPr>
-                <w:rFonts w:ascii="Calibri" w:hAnsi="Calibri" w:cs="Calibri"/>
-                <w:noProof/>
-                <w:lang w:val="tr-TR"/>
-              </w:rPr>
-            </w:pPr>
-          </w:p>
-          <w:p>
-            <w:pPr>
-              <w:jc w:val="both"/>
-              <w:rPr>
-                <w:rFonts w:ascii="Calibri" w:hAnsi="Calibri" w:cs="Calibri"/>
-                <w:noProof/>
-                <w:lang w:val="tr-TR"/>
-              </w:rPr>
-            </w:pPr>
+              <w:t xml:space="preserve">{{#politika_prosedur}}{{satir}}{{/politika_prosedur}}</w:t>
+            </w:r>
           </w:p>
         </w:tc>
       </w:tr>
@@ -20389,316 +17545,8 @@
           </w:tcPr>
           <w:p>
             <w:r>
-              <w:t xml:space="preserve">{{yonetim_sorumlulugu}}</w:t>
-            </w:r>
-          </w:p>
-        </w:tc>
-      </w:tr>
-      <w:tr>
-        <w:tc>
-          <w:tcPr>
-            <w:tcW w:w="10112" w:type="dxa"/>
-            <w:tcBorders>
-              <w:top w:val="single" w:sz="4" w:space="0" w:color="auto"/>
-              <w:bottom w:val="single" w:sz="4" w:space="0" w:color="auto"/>
-            </w:tcBorders>
-          </w:tcPr>
-          <w:p>
-            <w:pPr>
-              <w:spacing w:line="360" w:lineRule="auto"/>
-              <w:jc w:val="both"/>
-              <w:rPr>
-                <w:rFonts w:ascii="Calibri" w:hAnsi="Calibri" w:cs="Calibri"/>
-                <w:noProof/>
-                <w:lang w:val="tr-TR"/>
-              </w:rPr>
-            </w:pPr>
-          </w:p>
-        </w:tc>
-      </w:tr>
-      <w:tr>
-        <w:tc>
-          <w:tcPr>
-            <w:tcW w:w="10112" w:type="dxa"/>
-            <w:tcBorders>
-              <w:top w:val="single" w:sz="4" w:space="0" w:color="auto"/>
-              <w:bottom w:val="single" w:sz="4" w:space="0" w:color="auto"/>
-            </w:tcBorders>
-          </w:tcPr>
-          <w:p>
-            <w:pPr>
-              <w:spacing w:line="360" w:lineRule="auto"/>
-              <w:jc w:val="both"/>
-              <w:rPr>
-                <w:rFonts w:ascii="Calibri" w:hAnsi="Calibri" w:cs="Calibri"/>
-                <w:noProof/>
-                <w:lang w:val="tr-TR"/>
-              </w:rPr>
-            </w:pPr>
-          </w:p>
-        </w:tc>
-      </w:tr>
-      <w:tr>
-        <w:tblPrEx>
-          <w:tblBorders>
-            <w:top w:val="single" w:sz="4" w:space="0" w:color="auto"/>
-            <w:left w:val="single" w:sz="4" w:space="0" w:color="auto"/>
-            <w:right w:val="single" w:sz="4" w:space="0" w:color="auto"/>
-            <w:insideH w:val="single" w:sz="4" w:space="0" w:color="auto"/>
-            <w:insideV w:val="single" w:sz="4" w:space="0" w:color="auto"/>
-          </w:tblBorders>
-        </w:tblPrEx>
-        <w:tc>
-          <w:tcPr>
-            <w:tcW w:w="10112" w:type="dxa"/>
-            <w:tcBorders>
-              <w:top w:val="single" w:sz="4" w:space="0" w:color="auto"/>
-              <w:left w:val="nil"/>
-              <w:bottom w:val="single" w:sz="4" w:space="0" w:color="auto"/>
-              <w:right w:val="nil"/>
-            </w:tcBorders>
-          </w:tcPr>
-          <w:p>
-            <w:pPr>
-              <w:spacing w:line="360" w:lineRule="auto"/>
-              <w:jc w:val="both"/>
-              <w:rPr>
-                <w:rFonts w:ascii="Calibri" w:hAnsi="Calibri" w:cs="Calibri"/>
-                <w:noProof/>
-                <w:lang w:val="tr-TR"/>
-              </w:rPr>
-            </w:pPr>
-          </w:p>
-        </w:tc>
-      </w:tr>
-      <w:tr>
-        <w:tblPrEx>
-          <w:tblBorders>
-            <w:top w:val="single" w:sz="4" w:space="0" w:color="auto"/>
-            <w:left w:val="single" w:sz="4" w:space="0" w:color="auto"/>
-            <w:right w:val="single" w:sz="4" w:space="0" w:color="auto"/>
-            <w:insideH w:val="single" w:sz="4" w:space="0" w:color="auto"/>
-            <w:insideV w:val="single" w:sz="4" w:space="0" w:color="auto"/>
-          </w:tblBorders>
-        </w:tblPrEx>
-        <w:tc>
-          <w:tcPr>
-            <w:tcW w:w="10112" w:type="dxa"/>
-            <w:tcBorders>
-              <w:top w:val="single" w:sz="4" w:space="0" w:color="auto"/>
-              <w:left w:val="nil"/>
-              <w:bottom w:val="single" w:sz="4" w:space="0" w:color="auto"/>
-              <w:right w:val="nil"/>
-            </w:tcBorders>
-          </w:tcPr>
-          <w:p>
-            <w:pPr>
-              <w:spacing w:line="360" w:lineRule="auto"/>
-              <w:jc w:val="both"/>
-              <w:rPr>
-                <w:rFonts w:ascii="Calibri" w:hAnsi="Calibri" w:cs="Calibri"/>
-                <w:noProof/>
-                <w:lang w:val="tr-TR"/>
-              </w:rPr>
-            </w:pPr>
-          </w:p>
-        </w:tc>
-      </w:tr>
-      <w:tr>
-        <w:tblPrEx>
-          <w:tblBorders>
-            <w:top w:val="single" w:sz="4" w:space="0" w:color="auto"/>
-            <w:left w:val="single" w:sz="4" w:space="0" w:color="auto"/>
-            <w:right w:val="single" w:sz="4" w:space="0" w:color="auto"/>
-            <w:insideH w:val="single" w:sz="4" w:space="0" w:color="auto"/>
-            <w:insideV w:val="single" w:sz="4" w:space="0" w:color="auto"/>
-          </w:tblBorders>
-        </w:tblPrEx>
-        <w:tc>
-          <w:tcPr>
-            <w:tcW w:w="10112" w:type="dxa"/>
-            <w:tcBorders>
-              <w:top w:val="single" w:sz="4" w:space="0" w:color="auto"/>
-              <w:left w:val="nil"/>
-              <w:bottom w:val="single" w:sz="4" w:space="0" w:color="auto"/>
-              <w:right w:val="nil"/>
-            </w:tcBorders>
-          </w:tcPr>
-          <w:p>
-            <w:pPr>
-              <w:spacing w:line="360" w:lineRule="auto"/>
-              <w:jc w:val="both"/>
-              <w:rPr>
-                <w:rFonts w:ascii="Calibri" w:hAnsi="Calibri" w:cs="Calibri"/>
-                <w:noProof/>
-                <w:lang w:val="tr-TR"/>
-              </w:rPr>
-            </w:pPr>
-          </w:p>
-        </w:tc>
-      </w:tr>
-      <w:tr>
-        <w:tblPrEx>
-          <w:tblBorders>
-            <w:top w:val="single" w:sz="4" w:space="0" w:color="auto"/>
-            <w:left w:val="single" w:sz="4" w:space="0" w:color="auto"/>
-            <w:right w:val="single" w:sz="4" w:space="0" w:color="auto"/>
-            <w:insideH w:val="single" w:sz="4" w:space="0" w:color="auto"/>
-            <w:insideV w:val="single" w:sz="4" w:space="0" w:color="auto"/>
-          </w:tblBorders>
-        </w:tblPrEx>
-        <w:tc>
-          <w:tcPr>
-            <w:tcW w:w="10112" w:type="dxa"/>
-            <w:tcBorders>
-              <w:top w:val="single" w:sz="4" w:space="0" w:color="auto"/>
-              <w:left w:val="nil"/>
-              <w:bottom w:val="single" w:sz="4" w:space="0" w:color="auto"/>
-              <w:right w:val="nil"/>
-            </w:tcBorders>
-          </w:tcPr>
-          <w:p>
-            <w:pPr>
-              <w:spacing w:line="360" w:lineRule="auto"/>
-              <w:jc w:val="both"/>
-              <w:rPr>
-                <w:rFonts w:ascii="Calibri" w:hAnsi="Calibri" w:cs="Calibri"/>
-                <w:noProof/>
-                <w:lang w:val="tr-TR"/>
-              </w:rPr>
-            </w:pPr>
-          </w:p>
-        </w:tc>
-      </w:tr>
-      <w:tr>
-        <w:tblPrEx>
-          <w:tblBorders>
-            <w:top w:val="single" w:sz="4" w:space="0" w:color="auto"/>
-            <w:left w:val="single" w:sz="4" w:space="0" w:color="auto"/>
-            <w:right w:val="single" w:sz="4" w:space="0" w:color="auto"/>
-            <w:insideH w:val="single" w:sz="4" w:space="0" w:color="auto"/>
-            <w:insideV w:val="single" w:sz="4" w:space="0" w:color="auto"/>
-          </w:tblBorders>
-        </w:tblPrEx>
-        <w:tc>
-          <w:tcPr>
-            <w:tcW w:w="10112" w:type="dxa"/>
-            <w:tcBorders>
-              <w:top w:val="single" w:sz="4" w:space="0" w:color="auto"/>
-              <w:left w:val="nil"/>
-              <w:bottom w:val="single" w:sz="4" w:space="0" w:color="auto"/>
-              <w:right w:val="nil"/>
-            </w:tcBorders>
-          </w:tcPr>
-          <w:p>
-            <w:pPr>
-              <w:spacing w:line="360" w:lineRule="auto"/>
-              <w:jc w:val="both"/>
-              <w:rPr>
-                <w:rFonts w:ascii="Calibri" w:hAnsi="Calibri" w:cs="Calibri"/>
-                <w:noProof/>
-                <w:lang w:val="tr-TR"/>
-              </w:rPr>
-            </w:pPr>
-          </w:p>
-        </w:tc>
-      </w:tr>
-      <w:tr>
-        <w:tblPrEx>
-          <w:tblBorders>
-            <w:top w:val="single" w:sz="4" w:space="0" w:color="auto"/>
-            <w:left w:val="single" w:sz="4" w:space="0" w:color="auto"/>
-            <w:right w:val="single" w:sz="4" w:space="0" w:color="auto"/>
-            <w:insideH w:val="single" w:sz="4" w:space="0" w:color="auto"/>
-            <w:insideV w:val="single" w:sz="4" w:space="0" w:color="auto"/>
-          </w:tblBorders>
-        </w:tblPrEx>
-        <w:tc>
-          <w:tcPr>
-            <w:tcW w:w="10112" w:type="dxa"/>
-            <w:tcBorders>
-              <w:top w:val="single" w:sz="4" w:space="0" w:color="auto"/>
-              <w:left w:val="nil"/>
-              <w:bottom w:val="single" w:sz="4" w:space="0" w:color="auto"/>
-              <w:right w:val="nil"/>
-            </w:tcBorders>
-          </w:tcPr>
-          <w:p>
-            <w:pPr>
-              <w:spacing w:line="360" w:lineRule="auto"/>
-              <w:jc w:val="both"/>
-              <w:rPr>
-                <w:rFonts w:ascii="Calibri" w:hAnsi="Calibri" w:cs="Calibri"/>
-                <w:noProof/>
-                <w:lang w:val="tr-TR"/>
-              </w:rPr>
-            </w:pPr>
-          </w:p>
-        </w:tc>
-      </w:tr>
-      <w:tr>
-        <w:tblPrEx>
-          <w:tblBorders>
-            <w:top w:val="single" w:sz="4" w:space="0" w:color="auto"/>
-            <w:left w:val="single" w:sz="4" w:space="0" w:color="auto"/>
-            <w:right w:val="single" w:sz="4" w:space="0" w:color="auto"/>
-            <w:insideH w:val="single" w:sz="4" w:space="0" w:color="auto"/>
-            <w:insideV w:val="single" w:sz="4" w:space="0" w:color="auto"/>
-          </w:tblBorders>
-        </w:tblPrEx>
-        <w:tc>
-          <w:tcPr>
-            <w:tcW w:w="10112" w:type="dxa"/>
-            <w:tcBorders>
-              <w:top w:val="single" w:sz="4" w:space="0" w:color="auto"/>
-              <w:left w:val="nil"/>
-              <w:bottom w:val="single" w:sz="4" w:space="0" w:color="auto"/>
-              <w:right w:val="nil"/>
-            </w:tcBorders>
-          </w:tcPr>
-          <w:p>
-            <w:pPr>
-              <w:spacing w:line="360" w:lineRule="auto"/>
-              <w:jc w:val="both"/>
-              <w:rPr>
-                <w:rFonts w:ascii="Calibri" w:hAnsi="Calibri" w:cs="Calibri"/>
-                <w:noProof/>
-                <w:lang w:val="tr-TR"/>
-              </w:rPr>
-            </w:pPr>
-          </w:p>
-        </w:tc>
-      </w:tr>
-      <w:tr>
-        <w:tblPrEx>
-          <w:tblBorders>
-            <w:top w:val="single" w:sz="4" w:space="0" w:color="auto"/>
-            <w:left w:val="single" w:sz="4" w:space="0" w:color="auto"/>
-            <w:right w:val="single" w:sz="4" w:space="0" w:color="auto"/>
-            <w:insideH w:val="single" w:sz="4" w:space="0" w:color="auto"/>
-            <w:insideV w:val="single" w:sz="4" w:space="0" w:color="auto"/>
-          </w:tblBorders>
-        </w:tblPrEx>
-        <w:tc>
-          <w:tcPr>
-            <w:tcW w:w="10112" w:type="dxa"/>
-            <w:tcBorders>
-              <w:top w:val="single" w:sz="4" w:space="0" w:color="auto"/>
-              <w:left w:val="nil"/>
-              <w:bottom w:val="single" w:sz="4" w:space="0" w:color="auto"/>
-              <w:right w:val="nil"/>
-            </w:tcBorders>
-          </w:tcPr>
-          <w:p>
-            <w:pPr>
-              <w:spacing w:line="360" w:lineRule="auto"/>
-              <w:jc w:val="both"/>
-              <w:rPr>
-                <w:rFonts w:ascii="Calibri" w:hAnsi="Calibri" w:cs="Calibri"/>
-                <w:noProof/>
-                <w:lang w:val="tr-TR"/>
-              </w:rPr>
-            </w:pPr>
+              <w:t xml:space="preserve">{{#yonetim_sorumlulugu}}{{satir}}{{/yonetim_sorumlulugu}}</w:t>
+            </w:r>
           </w:p>
         </w:tc>
       </w:tr>
@@ -21180,217 +18028,8 @@
           </w:tcPr>
           <w:p>
             <w:r>
-              <w:t xml:space="preserve">{{harici_isler}}</w:t>
-            </w:r>
-          </w:p>
-        </w:tc>
-      </w:tr>
-      <w:tr>
-        <w:tc>
-          <w:tcPr>
-            <w:tcW w:w="10112" w:type="dxa"/>
-            <w:tcBorders>
-              <w:top w:val="single" w:sz="4" w:space="0" w:color="auto"/>
-              <w:bottom w:val="single" w:sz="4" w:space="0" w:color="auto"/>
-            </w:tcBorders>
-          </w:tcPr>
-          <w:p>
-            <w:pPr>
-              <w:spacing w:line="360" w:lineRule="auto"/>
-              <w:jc w:val="both"/>
-              <w:rPr>
-                <w:rFonts w:ascii="Calibri" w:hAnsi="Calibri" w:cs="Calibri"/>
-                <w:noProof/>
-                <w:lang w:val="tr-TR"/>
-              </w:rPr>
-            </w:pPr>
-          </w:p>
-        </w:tc>
-      </w:tr>
-      <w:tr>
-        <w:tc>
-          <w:tcPr>
-            <w:tcW w:w="10112" w:type="dxa"/>
-            <w:tcBorders>
-              <w:top w:val="single" w:sz="4" w:space="0" w:color="auto"/>
-              <w:bottom w:val="single" w:sz="4" w:space="0" w:color="auto"/>
-            </w:tcBorders>
-          </w:tcPr>
-          <w:p>
-            <w:pPr>
-              <w:spacing w:line="360" w:lineRule="auto"/>
-              <w:jc w:val="both"/>
-              <w:rPr>
-                <w:rFonts w:ascii="Calibri" w:hAnsi="Calibri" w:cs="Calibri"/>
-                <w:noProof/>
-                <w:lang w:val="tr-TR"/>
-              </w:rPr>
-            </w:pPr>
-          </w:p>
-        </w:tc>
-      </w:tr>
-      <w:tr>
-        <w:tblPrEx>
-          <w:tblBorders>
-            <w:top w:val="single" w:sz="4" w:space="0" w:color="auto"/>
-            <w:left w:val="single" w:sz="4" w:space="0" w:color="auto"/>
-            <w:right w:val="single" w:sz="4" w:space="0" w:color="auto"/>
-            <w:insideH w:val="single" w:sz="4" w:space="0" w:color="auto"/>
-            <w:insideV w:val="single" w:sz="4" w:space="0" w:color="auto"/>
-          </w:tblBorders>
-        </w:tblPrEx>
-        <w:tc>
-          <w:tcPr>
-            <w:tcW w:w="10112" w:type="dxa"/>
-            <w:tcBorders>
-              <w:top w:val="single" w:sz="4" w:space="0" w:color="auto"/>
-              <w:left w:val="nil"/>
-              <w:bottom w:val="single" w:sz="4" w:space="0" w:color="auto"/>
-              <w:right w:val="nil"/>
-            </w:tcBorders>
-          </w:tcPr>
-          <w:p>
-            <w:pPr>
-              <w:spacing w:line="360" w:lineRule="auto"/>
-              <w:jc w:val="both"/>
-              <w:rPr>
-                <w:rFonts w:ascii="Calibri" w:hAnsi="Calibri" w:cs="Calibri"/>
-                <w:noProof/>
-                <w:lang w:val="tr-TR"/>
-              </w:rPr>
-            </w:pPr>
-          </w:p>
-        </w:tc>
-      </w:tr>
-      <w:tr>
-        <w:tblPrEx>
-          <w:tblBorders>
-            <w:top w:val="single" w:sz="4" w:space="0" w:color="auto"/>
-            <w:left w:val="single" w:sz="4" w:space="0" w:color="auto"/>
-            <w:right w:val="single" w:sz="4" w:space="0" w:color="auto"/>
-            <w:insideH w:val="single" w:sz="4" w:space="0" w:color="auto"/>
-            <w:insideV w:val="single" w:sz="4" w:space="0" w:color="auto"/>
-          </w:tblBorders>
-        </w:tblPrEx>
-        <w:tc>
-          <w:tcPr>
-            <w:tcW w:w="10112" w:type="dxa"/>
-            <w:tcBorders>
-              <w:top w:val="single" w:sz="4" w:space="0" w:color="auto"/>
-              <w:left w:val="nil"/>
-              <w:bottom w:val="single" w:sz="4" w:space="0" w:color="auto"/>
-              <w:right w:val="nil"/>
-            </w:tcBorders>
-          </w:tcPr>
-          <w:p>
-            <w:pPr>
-              <w:spacing w:line="360" w:lineRule="auto"/>
-              <w:jc w:val="both"/>
-              <w:rPr>
-                <w:rFonts w:ascii="Calibri" w:hAnsi="Calibri" w:cs="Calibri"/>
-                <w:noProof/>
-                <w:lang w:val="tr-TR"/>
-              </w:rPr>
-            </w:pPr>
-          </w:p>
-        </w:tc>
-      </w:tr>
-      <w:tr>
-        <w:tblPrEx>
-          <w:tblBorders>
-            <w:top w:val="single" w:sz="4" w:space="0" w:color="auto"/>
-            <w:left w:val="single" w:sz="4" w:space="0" w:color="auto"/>
-            <w:right w:val="single" w:sz="4" w:space="0" w:color="auto"/>
-            <w:insideH w:val="single" w:sz="4" w:space="0" w:color="auto"/>
-            <w:insideV w:val="single" w:sz="4" w:space="0" w:color="auto"/>
-          </w:tblBorders>
-        </w:tblPrEx>
-        <w:tc>
-          <w:tcPr>
-            <w:tcW w:w="10112" w:type="dxa"/>
-            <w:tcBorders>
-              <w:top w:val="single" w:sz="4" w:space="0" w:color="auto"/>
-              <w:left w:val="nil"/>
-              <w:bottom w:val="single" w:sz="4" w:space="0" w:color="auto"/>
-              <w:right w:val="nil"/>
-            </w:tcBorders>
-          </w:tcPr>
-          <w:p>
-            <w:pPr>
-              <w:spacing w:line="360" w:lineRule="auto"/>
-              <w:jc w:val="both"/>
-              <w:rPr>
-                <w:rFonts w:ascii="Calibri" w:hAnsi="Calibri" w:cs="Calibri"/>
-                <w:noProof/>
-                <w:lang w:val="tr-TR"/>
-              </w:rPr>
-            </w:pPr>
-          </w:p>
-        </w:tc>
-      </w:tr>
-      <w:tr>
-        <w:tblPrEx>
-          <w:tblBorders>
-            <w:top w:val="single" w:sz="4" w:space="0" w:color="auto"/>
-            <w:left w:val="single" w:sz="4" w:space="0" w:color="auto"/>
-            <w:right w:val="single" w:sz="4" w:space="0" w:color="auto"/>
-            <w:insideH w:val="single" w:sz="4" w:space="0" w:color="auto"/>
-            <w:insideV w:val="single" w:sz="4" w:space="0" w:color="auto"/>
-          </w:tblBorders>
-        </w:tblPrEx>
-        <w:tc>
-          <w:tcPr>
-            <w:tcW w:w="10112" w:type="dxa"/>
-            <w:tcBorders>
-              <w:top w:val="single" w:sz="4" w:space="0" w:color="auto"/>
-              <w:left w:val="nil"/>
-              <w:bottom w:val="single" w:sz="4" w:space="0" w:color="auto"/>
-              <w:right w:val="nil"/>
-            </w:tcBorders>
-          </w:tcPr>
-          <w:p>
-            <w:pPr>
-              <w:spacing w:line="360" w:lineRule="auto"/>
-              <w:jc w:val="both"/>
-              <w:rPr>
-                <w:rFonts w:ascii="Calibri" w:hAnsi="Calibri" w:cs="Calibri"/>
-                <w:noProof/>
-                <w:lang w:val="tr-TR"/>
-              </w:rPr>
-            </w:pPr>
-          </w:p>
-        </w:tc>
-      </w:tr>
-      <w:tr>
-        <w:tblPrEx>
-          <w:tblBorders>
-            <w:top w:val="single" w:sz="4" w:space="0" w:color="auto"/>
-            <w:left w:val="single" w:sz="4" w:space="0" w:color="auto"/>
-            <w:right w:val="single" w:sz="4" w:space="0" w:color="auto"/>
-            <w:insideH w:val="single" w:sz="4" w:space="0" w:color="auto"/>
-            <w:insideV w:val="single" w:sz="4" w:space="0" w:color="auto"/>
-          </w:tblBorders>
-        </w:tblPrEx>
-        <w:tc>
-          <w:tcPr>
-            <w:tcW w:w="10112" w:type="dxa"/>
-            <w:tcBorders>
-              <w:top w:val="single" w:sz="4" w:space="0" w:color="auto"/>
-              <w:left w:val="nil"/>
-              <w:bottom w:val="single" w:sz="4" w:space="0" w:color="auto"/>
-              <w:right w:val="nil"/>
-            </w:tcBorders>
-          </w:tcPr>
-          <w:p>
-            <w:pPr>
-              <w:spacing w:line="360" w:lineRule="auto"/>
-              <w:jc w:val="both"/>
-              <w:rPr>
-                <w:rFonts w:ascii="Calibri" w:hAnsi="Calibri" w:cs="Calibri"/>
-                <w:noProof/>
-                <w:lang w:val="tr-TR"/>
-              </w:rPr>
-            </w:pPr>
+              <w:t xml:space="preserve">{{#harici_isler}}{{satir}}{{/harici_isler}}</w:t>
+            </w:r>
           </w:p>
         </w:tc>
       </w:tr>

</xml_diff>

<commit_message>
Form sonundaki imza kaldirildi, tarih alani korundu
</commit_message>
<xml_diff>
--- a/assets/IsAnaliziForm-template.docx
+++ b/assets/IsAnaliziForm-template.docx
@@ -18292,61 +18292,6 @@
         </w:rPr>
         <w:t>TARİH</w:t>
       </w:r>
-      <w:r>
-        <w:rPr>
-          <w:rFonts w:ascii="Calibri" w:hAnsi="Calibri" w:cs="Calibri"/>
-          <w:noProof/>
-          <w:sz w:val="28"/>
-          <w:lang w:val="tr-TR"/>
-        </w:rPr>
-        <w:tab/>
-      </w:r>
-      <w:r>
-        <w:rPr>
-          <w:rFonts w:ascii="Calibri" w:hAnsi="Calibri" w:cs="Calibri"/>
-          <w:noProof/>
-          <w:sz w:val="28"/>
-          <w:lang w:val="tr-TR"/>
-        </w:rPr>
-        <w:tab/>
-      </w:r>
-      <w:r>
-        <w:rPr>
-          <w:rFonts w:ascii="Calibri" w:hAnsi="Calibri" w:cs="Calibri"/>
-          <w:noProof/>
-          <w:sz w:val="28"/>
-          <w:lang w:val="tr-TR"/>
-        </w:rPr>
-        <w:tab/>
-      </w:r>
-      <w:r>
-        <w:rPr>
-          <w:rFonts w:ascii="Calibri" w:hAnsi="Calibri" w:cs="Calibri"/>
-          <w:noProof/>
-          <w:sz w:val="28"/>
-          <w:lang w:val="tr-TR"/>
-        </w:rPr>
-        <w:tab/>
-      </w:r>
-      <w:r>
-        <w:rPr>
-          <w:rFonts w:ascii="Calibri" w:hAnsi="Calibri" w:cs="Calibri"/>
-          <w:noProof/>
-          <w:sz w:val="28"/>
-          <w:lang w:val="tr-TR"/>
-        </w:rPr>
-        <w:tab/>
-      </w:r>
-      <w:r>
-        <w:rPr>
-          <w:rFonts w:ascii="Calibri" w:hAnsi="Calibri" w:cs="Calibri"/>
-          <w:noProof/>
-          <w:sz w:val="28"/>
-          <w:lang w:val="tr-TR"/>
-        </w:rPr>
-        <w:tab/>
-        <w:t>İMZA</w:t>
-      </w:r>
     </w:p>
     <w:tbl>
       <w:tblPr>
@@ -18363,8 +18308,7 @@
         <w:tblLook w:val="01E0" w:firstRow="1" w:lastRow="1" w:firstColumn="1" w:lastColumn="1" w:noHBand="0" w:noVBand="0"/>
       </w:tblPr>
       <w:tblGrid>
-        <w:gridCol w:w="4642"/>
-        <w:gridCol w:w="5470"/>
+        <w:gridCol w:w="10112"/>
       </w:tblGrid>
       <w:tr>
         <w:tc>
@@ -18374,16 +18318,6 @@
           <w:p>
             <w:r>
               <w:t xml:space="preserve">{{imza_tarih}}</w:t>
-            </w:r>
-          </w:p>
-        </w:tc>
-        <w:tc>
-          <w:tcPr>
-            <w:tcW w:w="5470" w:type="dxa"/>
-          </w:tcPr>
-          <w:p>
-            <w:r>
-              <w:t xml:space="preserve">{{imza}}</w:t>
             </w:r>
           </w:p>
         </w:tc>

</xml_diff>

<commit_message>
Yetki isaretleri (X)/() formatinda
</commit_message>
<xml_diff>
--- a/assets/IsAnaliziForm-template.docx
+++ b/assets/IsAnaliziForm-template.docx
@@ -6371,7 +6371,7 @@
         </w:rPr>
       </w:pPr>
       <w:r>
-        <w:t xml:space="preserve">( {{y_is_verme}} ) </w:t>
+        <w:t xml:space="preserve">({{y_is_verme}}) </w:t>
       </w:r>
       <w:r>
         <w:rPr>
@@ -6408,7 +6408,7 @@
         </w:rPr>
       </w:pPr>
       <w:r>
-        <w:t xml:space="preserve">( {{y_kontrol}} ) </w:t>
+        <w:t xml:space="preserve">({{y_kontrol}}) </w:t>
       </w:r>
       <w:r>
         <w:rPr>
@@ -6456,7 +6456,7 @@
         </w:rPr>
       </w:pPr>
       <w:r>
-        <w:t xml:space="preserve">( {{y_vekalet}} ) </w:t>
+        <w:t xml:space="preserve">({{y_vekalet}}) </w:t>
       </w:r>
       <w:r>
         <w:rPr>
@@ -6493,7 +6493,7 @@
         </w:rPr>
       </w:pPr>
       <w:r>
-        <w:t xml:space="preserve">( {{y_ceza}} ) </w:t>
+        <w:t xml:space="preserve">({{y_ceza}}) </w:t>
       </w:r>
       <w:r>
         <w:rPr>
@@ -6530,7 +6530,7 @@
         </w:rPr>
       </w:pPr>
       <w:r>
-        <w:t xml:space="preserve">( {{y_odul}} ) </w:t>
+        <w:t xml:space="preserve">({{y_odul}}) </w:t>
       </w:r>
       <w:r>
         <w:rPr>
@@ -6567,7 +6567,7 @@
         </w:rPr>
       </w:pPr>
       <w:r>
-        <w:t xml:space="preserve">( {{y_gorev_deg}} ) </w:t>
+        <w:t xml:space="preserve">({{y_gorev_deg}}) </w:t>
       </w:r>
       <w:r>
         <w:rPr>
@@ -6604,7 +6604,7 @@
         </w:rPr>
       </w:pPr>
       <w:r>
-        <w:t xml:space="preserve">( {{y_egitim}} ) </w:t>
+        <w:t xml:space="preserve">({{y_egitim}}) </w:t>
       </w:r>
       <w:r>
         <w:rPr>
@@ -6641,7 +6641,7 @@
         </w:rPr>
       </w:pPr>
       <w:r>
-        <w:t xml:space="preserve">( {{y_disiplin}} ) </w:t>
+        <w:t xml:space="preserve">({{y_disiplin}}) </w:t>
       </w:r>
       <w:r>
         <w:rPr>
@@ -6678,7 +6678,7 @@
         </w:rPr>
       </w:pPr>
       <w:r>
-        <w:t xml:space="preserve">( {{y_izin}} ) </w:t>
+        <w:t xml:space="preserve">({{y_izin}}) </w:t>
       </w:r>
       <w:r>
         <w:rPr>
@@ -6715,7 +6715,7 @@
         </w:rPr>
       </w:pPr>
       <w:r>
-        <w:t xml:space="preserve">( {{y_harcama}} ) </w:t>
+        <w:t xml:space="preserve">({{y_harcama}}) </w:t>
       </w:r>
       <w:r>
         <w:rPr>
@@ -6752,7 +6752,7 @@
         </w:rPr>
       </w:pPr>
       <w:r>
-        <w:t xml:space="preserve">( {{y_satinalma}} ) </w:t>
+        <w:t xml:space="preserve">({{y_satinalma}}) </w:t>
       </w:r>
       <w:r>
         <w:rPr>
@@ -6789,7 +6789,7 @@
         </w:rPr>
       </w:pPr>
       <w:r>
-        <w:t xml:space="preserve">( {{y_imza}} ) </w:t>
+        <w:t xml:space="preserve">({{y_imza}}) </w:t>
       </w:r>
       <w:r>
         <w:rPr>
@@ -6826,7 +6826,7 @@
         </w:rPr>
       </w:pPr>
       <w:r>
-        <w:t xml:space="preserve">( {{y_paraf}} ) </w:t>
+        <w:t xml:space="preserve">({{y_paraf}}) </w:t>
       </w:r>
       <w:r>
         <w:rPr>
@@ -6863,7 +6863,7 @@
         </w:rPr>
       </w:pPr>
       <w:r>
-        <w:t xml:space="preserve">( {{y_temsil}} ) </w:t>
+        <w:t xml:space="preserve">({{y_temsil}}) </w:t>
       </w:r>
       <w:r>
         <w:rPr>
@@ -6889,7 +6889,7 @@
         </w:rPr>
       </w:pPr>
       <w:r>
-        <w:t xml:space="preserve">( {{y_diger}} ) </w:t>
+        <w:t xml:space="preserve">({{y_diger}}) </w:t>
       </w:r>
       <w:r>
         <w:rPr>

</xml_diff>

<commit_message>
Raporlama kisileri tablosu dinamik (Ekle/Sil), Word sablonu donguye cevildi
</commit_message>
<xml_diff>
--- a/assets/IsAnaliziForm-template.docx
+++ b/assets/IsAnaliziForm-template.docx
@@ -1786,7 +1786,7 @@
           </w:tcPr>
           <w:p>
             <w:r>
-              <w:t xml:space="preserve">{{diger_kisi_1}}</w:t>
+              <w:t xml:space="preserve">{#diger_iletisim}{kisi}</w:t>
             </w:r>
           </w:p>
         </w:tc>
@@ -1802,140 +1802,7 @@
           </w:tcPr>
           <w:p>
             <w:r>
-              <w:t xml:space="preserve">{{diger_pozisyon_1}}</w:t>
-            </w:r>
-          </w:p>
-        </w:tc>
-      </w:tr>
-      <w:tr>
-        <w:tblPrEx>
-          <w:tblCellMar>
-            <w:top w:w="0" w:type="dxa"/>
-            <w:bottom w:w="0" w:type="dxa"/>
-          </w:tblCellMar>
-        </w:tblPrEx>
-        <w:trPr>
-          <w:trHeight w:val="445"/>
-        </w:trPr>
-        <w:tc>
-          <w:tcPr>
-            <w:tcW w:w="2760" w:type="dxa"/>
-            <w:gridSpan w:val="2"/>
-            <w:vMerge/>
-            <w:tcBorders>
-              <w:left w:val="nil"/>
-              <w:right w:val="nil"/>
-            </w:tcBorders>
-            <w:vAlign w:val="bottom"/>
-          </w:tcPr>
-          <w:p>
-            <w:pPr>
-              <w:rPr>
-                <w:rFonts w:ascii="Calibri" w:hAnsi="Calibri" w:cs="Calibri"/>
-                <w:noProof/>
-                <w:lang w:val="tr-TR"/>
-              </w:rPr>
-            </w:pPr>
-          </w:p>
-        </w:tc>
-        <w:tc>
-          <w:tcPr>
-            <w:tcW w:w="5040" w:type="dxa"/>
-            <w:gridSpan w:val="6"/>
-            <w:tcBorders>
-              <w:top w:val="single" w:sz="4" w:space="0" w:color="auto"/>
-              <w:left w:val="nil"/>
-              <w:bottom w:val="single" w:sz="4" w:space="0" w:color="auto"/>
-              <w:right w:val="nil"/>
-            </w:tcBorders>
-            <w:vAlign w:val="bottom"/>
-          </w:tcPr>
-          <w:p>
-            <w:r>
-              <w:t xml:space="preserve">{{diger_kisi_2}}</w:t>
-            </w:r>
-          </w:p>
-        </w:tc>
-        <w:tc>
-          <w:tcPr>
-            <w:tcW w:w="2388" w:type="dxa"/>
-            <w:tcBorders>
-              <w:top w:val="single" w:sz="4" w:space="0" w:color="auto"/>
-              <w:left w:val="nil"/>
-              <w:bottom w:val="single" w:sz="4" w:space="0" w:color="auto"/>
-              <w:right w:val="nil"/>
-            </w:tcBorders>
-          </w:tcPr>
-          <w:p>
-            <w:r>
-              <w:t xml:space="preserve">{{diger_pozisyon_2}}</w:t>
-            </w:r>
-          </w:p>
-        </w:tc>
-      </w:tr>
-      <w:tr>
-        <w:tblPrEx>
-          <w:tblCellMar>
-            <w:top w:w="0" w:type="dxa"/>
-            <w:bottom w:w="0" w:type="dxa"/>
-          </w:tblCellMar>
-        </w:tblPrEx>
-        <w:trPr>
-          <w:trHeight w:val="468"/>
-        </w:trPr>
-        <w:tc>
-          <w:tcPr>
-            <w:tcW w:w="2760" w:type="dxa"/>
-            <w:gridSpan w:val="2"/>
-            <w:vMerge/>
-            <w:tcBorders>
-              <w:left w:val="nil"/>
-              <w:right w:val="nil"/>
-            </w:tcBorders>
-            <w:vAlign w:val="bottom"/>
-          </w:tcPr>
-          <w:p>
-            <w:pPr>
-              <w:rPr>
-                <w:rFonts w:ascii="Calibri" w:hAnsi="Calibri" w:cs="Calibri"/>
-                <w:noProof/>
-                <w:lang w:val="tr-TR"/>
-              </w:rPr>
-            </w:pPr>
-          </w:p>
-        </w:tc>
-        <w:tc>
-          <w:tcPr>
-            <w:tcW w:w="5040" w:type="dxa"/>
-            <w:gridSpan w:val="6"/>
-            <w:tcBorders>
-              <w:top w:val="single" w:sz="4" w:space="0" w:color="auto"/>
-              <w:left w:val="nil"/>
-              <w:bottom w:val="single" w:sz="4" w:space="0" w:color="auto"/>
-              <w:right w:val="nil"/>
-            </w:tcBorders>
-            <w:vAlign w:val="bottom"/>
-          </w:tcPr>
-          <w:p>
-            <w:r>
-              <w:t xml:space="preserve">{{diger_kisi_3}}</w:t>
-            </w:r>
-          </w:p>
-        </w:tc>
-        <w:tc>
-          <w:tcPr>
-            <w:tcW w:w="2388" w:type="dxa"/>
-            <w:tcBorders>
-              <w:top w:val="single" w:sz="4" w:space="0" w:color="auto"/>
-              <w:left w:val="nil"/>
-              <w:bottom w:val="single" w:sz="4" w:space="0" w:color="auto"/>
-              <w:right w:val="nil"/>
-            </w:tcBorders>
-            <w:vAlign w:val="bottom"/>
-          </w:tcPr>
-          <w:p>
-            <w:r>
-              <w:t xml:space="preserve">{{diger_pozisyon_3}}</w:t>
+              <w:t xml:space="preserve">{pozisyon}{/diger_iletisim}</w:t>
             </w:r>
           </w:p>
         </w:tc>

</xml_diff>

<commit_message>
Sablon: diger_iletisim dongusu tek susludan cift susluya duzeltildi
</commit_message>
<xml_diff>
--- a/assets/IsAnaliziForm-template.docx
+++ b/assets/IsAnaliziForm-template.docx
@@ -1786,7 +1786,7 @@
           </w:tcPr>
           <w:p>
             <w:r>
-              <w:t xml:space="preserve">{#diger_iletisim}{kisi}</w:t>
+              <w:t xml:space="preserve">{{#diger_iletisim}}{{kisi}}</w:t>
             </w:r>
           </w:p>
         </w:tc>
@@ -1802,7 +1802,7 @@
           </w:tcPr>
           <w:p>
             <w:r>
-              <w:t xml:space="preserve">{pozisyon}{/diger_iletisim}</w:t>
+              <w:t xml:space="preserve">{{pozisyon}}{{/diger_iletisim}}</w:t>
             </w:r>
           </w:p>
         </w:tc>

</xml_diff>

<commit_message>
Sablon: cevap cizgileri kaldirildi, Diger aciklamalar kesisim hucresinde, yetki kutulari temizlendi
</commit_message>
<xml_diff>
--- a/assets/IsAnaliziForm-template.docx
+++ b/assets/IsAnaliziForm-template.docx
@@ -3129,9 +3129,7 @@
         <w:tc>
           <w:tcPr>
             <w:tcW w:w="10112" w:type="dxa"/>
-            <w:tcBorders>
-              <w:bottom w:val="single" w:sz="4" w:space="0" w:color="auto"/>
-            </w:tcBorders>
+            <w:tcBorders/>
           </w:tcPr>
           <w:p>
             <w:r>
@@ -3187,9 +3185,7 @@
         <w:tc>
           <w:tcPr>
             <w:tcW w:w="10112" w:type="dxa"/>
-            <w:tcBorders>
-              <w:bottom w:val="single" w:sz="4" w:space="0" w:color="auto"/>
-            </w:tcBorders>
+            <w:tcBorders/>
           </w:tcPr>
           <w:p>
             <w:r>
@@ -6243,17 +6239,6 @@
       <w:r>
         <w:rPr>
           <w:rFonts w:ascii="Calibri" w:hAnsi="Calibri" w:cs="Calibri"/>
-          <w:noProof/>
-          <w:sz w:val="28"/>
-          <w:szCs w:val="28"/>
-        </w:rPr>
-        <w:pict w14:anchorId="397ABDFD">
-          <v:roundrect id="Yuvarlatılmış Dikdörtgen 15" o:spid="_x0000_s1085" style="position:absolute;margin-left:192.8pt;margin-top:2.35pt;width:29.3pt;height:11.7pt;z-index:251651072;visibility:visible" arcsize="10923f" o:gfxdata="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"/>
-        </w:pict>
-      </w:r>
-      <w:r>
-        <w:rPr>
-          <w:rFonts w:ascii="Calibri" w:hAnsi="Calibri" w:cs="Calibri"/>
           <w:color w:val="auto"/>
           <w:sz w:val="28"/>
           <w:szCs w:val="28"/>
@@ -6280,28 +6265,6 @@
       <w:r>
         <w:rPr>
           <w:rFonts w:ascii="Calibri" w:hAnsi="Calibri" w:cs="Calibri"/>
-          <w:noProof/>
-          <w:sz w:val="28"/>
-          <w:szCs w:val="28"/>
-        </w:rPr>
-        <w:pict w14:anchorId="34D76628">
-          <v:roundrect id="Yuvarlatılmış Dikdörtgen 14" o:spid="_x0000_s1084" style="position:absolute;margin-left:192.8pt;margin-top:17.65pt;width:29.3pt;height:11.7pt;z-index:251652096;visibility:visible" arcsize="10923f" o:gfxdata="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"/>
-        </w:pict>
-      </w:r>
-      <w:r>
-        <w:rPr>
-          <w:rFonts w:ascii="Calibri" w:hAnsi="Calibri" w:cs="Calibri"/>
-          <w:noProof/>
-          <w:sz w:val="28"/>
-          <w:szCs w:val="28"/>
-        </w:rPr>
-        <w:pict w14:anchorId="4676DECD">
-          <v:roundrect id="Yuvarlatılmış Dikdörtgen 13" o:spid="_x0000_s1083" style="position:absolute;margin-left:192.8pt;margin-top:.05pt;width:29.3pt;height:11.7pt;z-index:251653120;visibility:visible" arcsize="10923f" o:gfxdata="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"/>
-        </w:pict>
-      </w:r>
-      <w:r>
-        <w:rPr>
-          <w:rFonts w:ascii="Calibri" w:hAnsi="Calibri" w:cs="Calibri"/>
           <w:color w:val="auto"/>
           <w:sz w:val="28"/>
           <w:szCs w:val="28"/>
@@ -6328,17 +6291,6 @@
       <w:r>
         <w:rPr>
           <w:rFonts w:ascii="Calibri" w:hAnsi="Calibri" w:cs="Calibri"/>
-          <w:noProof/>
-          <w:sz w:val="28"/>
-          <w:szCs w:val="28"/>
-        </w:rPr>
-        <w:pict w14:anchorId="594E493F">
-          <v:roundrect id="Yuvarlatılmış Dikdörtgen 12" o:spid="_x0000_s1082" style="position:absolute;margin-left:192.8pt;margin-top:17.85pt;width:29.3pt;height:11.7pt;z-index:251654144;visibility:visible" arcsize="10923f" o:gfxdata="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"/>
-        </w:pict>
-      </w:r>
-      <w:r>
-        <w:rPr>
-          <w:rFonts w:ascii="Calibri" w:hAnsi="Calibri" w:cs="Calibri"/>
           <w:color w:val="auto"/>
           <w:sz w:val="28"/>
           <w:szCs w:val="28"/>
@@ -6365,17 +6317,6 @@
       <w:r>
         <w:rPr>
           <w:rFonts w:ascii="Calibri" w:hAnsi="Calibri" w:cs="Calibri"/>
-          <w:noProof/>
-          <w:sz w:val="28"/>
-          <w:szCs w:val="28"/>
-        </w:rPr>
-        <w:pict w14:anchorId="2B5CC982">
-          <v:roundrect id="Yuvarlatılmış Dikdörtgen 11" o:spid="_x0000_s1081" style="position:absolute;margin-left:192.8pt;margin-top:18.1pt;width:29.3pt;height:11.7pt;z-index:251655168;visibility:visible" arcsize="10923f" o:gfxdata="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"/>
-        </w:pict>
-      </w:r>
-      <w:r>
-        <w:rPr>
-          <w:rFonts w:ascii="Calibri" w:hAnsi="Calibri" w:cs="Calibri"/>
           <w:color w:val="auto"/>
           <w:sz w:val="28"/>
           <w:szCs w:val="28"/>
@@ -6402,17 +6343,6 @@
       <w:r>
         <w:rPr>
           <w:rFonts w:ascii="Calibri" w:hAnsi="Calibri" w:cs="Calibri"/>
-          <w:noProof/>
-          <w:sz w:val="28"/>
-          <w:szCs w:val="28"/>
-        </w:rPr>
-        <w:pict w14:anchorId="21AB4EFA">
-          <v:roundrect id="Yuvarlatılmış Dikdörtgen 10" o:spid="_x0000_s1080" style="position:absolute;margin-left:192.8pt;margin-top:17.8pt;width:29.3pt;height:11.7pt;z-index:251656192;visibility:visible" arcsize="10923f" o:gfxdata="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"/>
-        </w:pict>
-      </w:r>
-      <w:r>
-        <w:rPr>
-          <w:rFonts w:ascii="Calibri" w:hAnsi="Calibri" w:cs="Calibri"/>
           <w:color w:val="auto"/>
           <w:sz w:val="28"/>
           <w:szCs w:val="28"/>
@@ -6439,17 +6369,6 @@
       <w:r>
         <w:rPr>
           <w:rFonts w:ascii="Calibri" w:hAnsi="Calibri" w:cs="Calibri"/>
-          <w:noProof/>
-          <w:sz w:val="28"/>
-          <w:szCs w:val="28"/>
-        </w:rPr>
-        <w:pict w14:anchorId="4401A2FD">
-          <v:roundrect id="Yuvarlatılmış Dikdörtgen 9" o:spid="_x0000_s1079" style="position:absolute;margin-left:192.8pt;margin-top:19.4pt;width:29.3pt;height:11.7pt;z-index:251657216;visibility:visible" arcsize="10923f" o:gfxdata="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"/>
-        </w:pict>
-      </w:r>
-      <w:r>
-        <w:rPr>
-          <w:rFonts w:ascii="Calibri" w:hAnsi="Calibri" w:cs="Calibri"/>
           <w:color w:val="auto"/>
           <w:sz w:val="28"/>
           <w:szCs w:val="28"/>
@@ -6476,17 +6395,6 @@
       <w:r>
         <w:rPr>
           <w:rFonts w:ascii="Calibri" w:hAnsi="Calibri" w:cs="Calibri"/>
-          <w:noProof/>
-          <w:sz w:val="28"/>
-          <w:szCs w:val="28"/>
-        </w:rPr>
-        <w:pict w14:anchorId="0DD69968">
-          <v:roundrect id="Yuvarlatılmış Dikdörtgen 8" o:spid="_x0000_s1078" style="position:absolute;margin-left:192.8pt;margin-top:17.4pt;width:29.3pt;height:11.7pt;z-index:251658240;visibility:visible" arcsize="10923f" o:gfxdata="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"/>
-        </w:pict>
-      </w:r>
-      <w:r>
-        <w:rPr>
-          <w:rFonts w:ascii="Calibri" w:hAnsi="Calibri" w:cs="Calibri"/>
           <w:color w:val="auto"/>
           <w:sz w:val="28"/>
           <w:szCs w:val="28"/>
@@ -6513,17 +6421,6 @@
       <w:r>
         <w:rPr>
           <w:rFonts w:ascii="Calibri" w:hAnsi="Calibri" w:cs="Calibri"/>
-          <w:noProof/>
-          <w:sz w:val="28"/>
-          <w:szCs w:val="28"/>
-        </w:rPr>
-        <w:pict w14:anchorId="7CC7E7EB">
-          <v:roundrect id="Yuvarlatılmış Dikdörtgen 7" o:spid="_x0000_s1077" style="position:absolute;margin-left:192.8pt;margin-top:18.45pt;width:29.3pt;height:11.7pt;z-index:251659264;visibility:visible" arcsize="10923f" o:gfxdata="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"/>
-        </w:pict>
-      </w:r>
-      <w:r>
-        <w:rPr>
-          <w:rFonts w:ascii="Calibri" w:hAnsi="Calibri" w:cs="Calibri"/>
           <w:color w:val="auto"/>
           <w:sz w:val="28"/>
           <w:szCs w:val="28"/>
@@ -6550,17 +6447,6 @@
       <w:r>
         <w:rPr>
           <w:rFonts w:ascii="Calibri" w:hAnsi="Calibri" w:cs="Calibri"/>
-          <w:noProof/>
-          <w:sz w:val="28"/>
-          <w:szCs w:val="28"/>
-        </w:rPr>
-        <w:pict w14:anchorId="1C192AF8">
-          <v:roundrect id="Yuvarlatılmış Dikdörtgen 6" o:spid="_x0000_s1076" style="position:absolute;margin-left:192.8pt;margin-top:17.1pt;width:29.3pt;height:11.7pt;z-index:251660288;visibility:visible" arcsize="10923f" o:gfxdata="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"/>
-        </w:pict>
-      </w:r>
-      <w:r>
-        <w:rPr>
-          <w:rFonts w:ascii="Calibri" w:hAnsi="Calibri" w:cs="Calibri"/>
           <w:color w:val="auto"/>
           <w:sz w:val="28"/>
           <w:szCs w:val="28"/>
@@ -6587,17 +6473,6 @@
       <w:r>
         <w:rPr>
           <w:rFonts w:ascii="Calibri" w:hAnsi="Calibri" w:cs="Calibri"/>
-          <w:noProof/>
-          <w:sz w:val="28"/>
-          <w:szCs w:val="28"/>
-        </w:rPr>
-        <w:pict w14:anchorId="0C9224AB">
-          <v:roundrect id="Yuvarlatılmış Dikdörtgen 5" o:spid="_x0000_s1075" style="position:absolute;margin-left:192.8pt;margin-top:16.45pt;width:29.3pt;height:11.7pt;z-index:251661312;visibility:visible" arcsize="10923f" o:gfxdata="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"/>
-        </w:pict>
-      </w:r>
-      <w:r>
-        <w:rPr>
-          <w:rFonts w:ascii="Calibri" w:hAnsi="Calibri" w:cs="Calibri"/>
           <w:color w:val="auto"/>
           <w:sz w:val="28"/>
           <w:szCs w:val="28"/>
@@ -6624,17 +6499,6 @@
       <w:r>
         <w:rPr>
           <w:rFonts w:ascii="Calibri" w:hAnsi="Calibri" w:cs="Calibri"/>
-          <w:noProof/>
-          <w:sz w:val="28"/>
-          <w:szCs w:val="28"/>
-        </w:rPr>
-        <w:pict w14:anchorId="5D956CEA">
-          <v:roundrect id="Yuvarlatılmış Dikdörtgen 4" o:spid="_x0000_s1074" style="position:absolute;margin-left:192.8pt;margin-top:15.6pt;width:29.3pt;height:11.7pt;z-index:251662336;visibility:visible" arcsize="10923f" o:gfxdata="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"/>
-        </w:pict>
-      </w:r>
-      <w:r>
-        <w:rPr>
-          <w:rFonts w:ascii="Calibri" w:hAnsi="Calibri" w:cs="Calibri"/>
           <w:color w:val="auto"/>
           <w:sz w:val="28"/>
           <w:szCs w:val="28"/>
@@ -6661,17 +6525,6 @@
       <w:r>
         <w:rPr>
           <w:rFonts w:ascii="Calibri" w:hAnsi="Calibri" w:cs="Calibri"/>
-          <w:noProof/>
-          <w:sz w:val="28"/>
-          <w:szCs w:val="28"/>
-        </w:rPr>
-        <w:pict w14:anchorId="48804112">
-          <v:roundrect id="Yuvarlatılmış Dikdörtgen 3" o:spid="_x0000_s1073" style="position:absolute;margin-left:192.8pt;margin-top:18.6pt;width:29.3pt;height:11.7pt;z-index:251663360;visibility:visible" arcsize="10923f" o:gfxdata="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"/>
-        </w:pict>
-      </w:r>
-      <w:r>
-        <w:rPr>
-          <w:rFonts w:ascii="Calibri" w:hAnsi="Calibri" w:cs="Calibri"/>
           <w:color w:val="auto"/>
           <w:sz w:val="28"/>
           <w:szCs w:val="28"/>
@@ -6698,17 +6551,6 @@
       <w:r>
         <w:rPr>
           <w:rFonts w:ascii="Calibri" w:hAnsi="Calibri" w:cs="Calibri"/>
-          <w:noProof/>
-          <w:sz w:val="28"/>
-          <w:szCs w:val="28"/>
-        </w:rPr>
-        <w:pict w14:anchorId="7B4D373D">
-          <v:roundrect id="Yuvarlatılmış Dikdörtgen 2" o:spid="_x0000_s1072" style="position:absolute;margin-left:192.8pt;margin-top:20.5pt;width:29.3pt;height:11.7pt;z-index:251664384;visibility:visible" arcsize="10923f" o:gfxdata="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"/>
-        </w:pict>
-      </w:r>
-      <w:r>
-        <w:rPr>
-          <w:rFonts w:ascii="Calibri" w:hAnsi="Calibri" w:cs="Calibri"/>
           <w:color w:val="auto"/>
           <w:sz w:val="28"/>
           <w:szCs w:val="28"/>
@@ -6757,17 +6599,6 @@
       </w:pPr>
       <w:r>
         <w:t xml:space="preserve">({{y_diger}}) </w:t>
-      </w:r>
-      <w:r>
-        <w:rPr>
-          <w:rFonts w:ascii="Calibri" w:hAnsi="Calibri" w:cs="Calibri"/>
-          <w:noProof/>
-          <w:sz w:val="28"/>
-          <w:szCs w:val="28"/>
-        </w:rPr>
-        <w:pict w14:anchorId="5C4D07FC">
-          <v:roundrect id="Yuvarlatılmış Dikdörtgen 1" o:spid="_x0000_s1071" style="position:absolute;margin-left:192.8pt;margin-top:1.7pt;width:29.3pt;height:11.7pt;z-index:251665408;visibility:visible" arcsize="10923f" o:gfxdata="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"/>
-        </w:pict>
       </w:r>
       <w:r>
         <w:rPr>
@@ -6903,9 +6734,7 @@
         <w:tc>
           <w:tcPr>
             <w:tcW w:w="10112" w:type="dxa"/>
-            <w:tcBorders>
-              <w:bottom w:val="single" w:sz="4" w:space="0" w:color="auto"/>
-            </w:tcBorders>
+            <w:tcBorders/>
           </w:tcPr>
           <w:p>
             <w:r>
@@ -7008,9 +6837,7 @@
         <w:tc>
           <w:tcPr>
             <w:tcW w:w="10112" w:type="dxa"/>
-            <w:tcBorders>
-              <w:bottom w:val="single" w:sz="4" w:space="0" w:color="auto"/>
-            </w:tcBorders>
+            <w:tcBorders/>
           </w:tcPr>
           <w:p>
             <w:r>
@@ -7077,9 +6904,7 @@
         <w:tc>
           <w:tcPr>
             <w:tcW w:w="10112" w:type="dxa"/>
-            <w:tcBorders>
-              <w:bottom w:val="single" w:sz="4" w:space="0" w:color="auto"/>
-            </w:tcBorders>
+            <w:tcBorders/>
           </w:tcPr>
           <w:p>
             <w:r>
@@ -7167,9 +6992,7 @@
         <w:tc>
           <w:tcPr>
             <w:tcW w:w="10112" w:type="dxa"/>
-            <w:tcBorders>
-              <w:bottom w:val="single" w:sz="4" w:space="0" w:color="auto"/>
-            </w:tcBorders>
+            <w:tcBorders/>
           </w:tcPr>
           <w:p>
             <w:r>
@@ -9943,6 +9766,16 @@
           <w:p>
             <w:r>
               <w:t xml:space="preserve">{{m_diger_diger}}</w:t>
+            </w:r>
+          </w:p>
+          <w:p>
+            <w:r>
+              <w:t xml:space="preserve">{{ortam_diger_aciklama}}</w:t>
+            </w:r>
+          </w:p>
+          <w:p>
+            <w:r>
+              <w:t xml:space="preserve">{{faktor_diger_aciklama}}</w:t>
             </w:r>
           </w:p>
         </w:tc>
@@ -15496,9 +15329,7 @@
         <w:tc>
           <w:tcPr>
             <w:tcW w:w="10112" w:type="dxa"/>
-            <w:tcBorders>
-              <w:bottom w:val="single" w:sz="4" w:space="0" w:color="auto"/>
-            </w:tcBorders>
+            <w:tcBorders/>
           </w:tcPr>
           <w:p>
             <w:r>
@@ -15565,9 +15396,7 @@
         <w:tc>
           <w:tcPr>
             <w:tcW w:w="10112" w:type="dxa"/>
-            <w:tcBorders>
-              <w:bottom w:val="single" w:sz="4" w:space="0" w:color="auto"/>
-            </w:tcBorders>
+            <w:tcBorders/>
           </w:tcPr>
           <w:p>
             <w:r>
@@ -15745,9 +15574,7 @@
         <w:tc>
           <w:tcPr>
             <w:tcW w:w="10112" w:type="dxa"/>
-            <w:tcBorders>
-              <w:bottom w:val="single" w:sz="4" w:space="0" w:color="auto"/>
-            </w:tcBorders>
+            <w:tcBorders/>
           </w:tcPr>
           <w:p>
             <w:r>
@@ -15845,9 +15672,7 @@
         <w:tc>
           <w:tcPr>
             <w:tcW w:w="10112" w:type="dxa"/>
-            <w:tcBorders>
-              <w:bottom w:val="single" w:sz="4" w:space="0" w:color="auto"/>
-            </w:tcBorders>
+            <w:tcBorders/>
           </w:tcPr>
           <w:p>
             <w:r>
@@ -15933,9 +15758,7 @@
         <w:tc>
           <w:tcPr>
             <w:tcW w:w="10112" w:type="dxa"/>
-            <w:tcBorders>
-              <w:bottom w:val="single" w:sz="4" w:space="0" w:color="auto"/>
-            </w:tcBorders>
+            <w:tcBorders/>
           </w:tcPr>
           <w:p>
             <w:r>
@@ -17407,7 +17230,6 @@
             <w:tcW w:w="10112" w:type="dxa"/>
             <w:tcBorders>
               <w:top w:val="nil"/>
-              <w:bottom w:val="single" w:sz="4" w:space="0" w:color="auto"/>
             </w:tcBorders>
           </w:tcPr>
           <w:p>
@@ -17890,7 +17712,6 @@
             <w:tcW w:w="10112" w:type="dxa"/>
             <w:tcBorders>
               <w:top w:val="single" w:sz="4" w:space="0" w:color="auto"/>
-              <w:bottom w:val="single" w:sz="4" w:space="0" w:color="auto"/>
             </w:tcBorders>
           </w:tcPr>
           <w:p>

</xml_diff>

<commit_message>
Sablon: 12 bolum basligi tek duzey Baslik 1, 14pt kalin, bos basliklar temiz
</commit_message>
<xml_diff>
--- a/assets/IsAnaliziForm-template.docx
+++ b/assets/IsAnaliziForm-template.docx
@@ -959,7 +959,7 @@
     </w:p>
     <w:p>
       <w:pPr>
-        <w:pStyle w:val="Balk3"/>
+        <w:pStyle w:val="Balk1"/>
         <w:numPr>
           <w:ilvl w:val="0"/>
           <w:numId w:val="27"/>
@@ -968,6 +968,9 @@
           <w:rFonts w:ascii="Times New Roman" w:hAnsi="Times New Roman" w:cs="Times New Roman"/>
           <w:noProof/>
           <w:lang w:val="tr-TR"/>
+          <w:b/>
+          <w:sz w:val="28"/>
+          <w:szCs w:val="28"/>
         </w:rPr>
       </w:pPr>
       <w:r>
@@ -977,6 +980,8 @@
           <w:bCs/>
           <w:noProof/>
           <w:lang w:val="tr-TR"/>
+          <w:sz w:val="28"/>
+          <w:szCs w:val="28"/>
         </w:rPr>
         <w:t>GENE</w:t>
       </w:r>
@@ -987,6 +992,8 @@
           <w:bCs/>
           <w:noProof/>
           <w:lang w:val="tr-TR"/>
+          <w:sz w:val="28"/>
+          <w:szCs w:val="28"/>
         </w:rPr>
         <w:t>L</w:t>
       </w:r>
@@ -997,6 +1004,8 @@
           <w:bCs/>
           <w:noProof/>
           <w:lang w:val="tr-TR"/>
+          <w:sz w:val="28"/>
+          <w:szCs w:val="28"/>
         </w:rPr>
         <w:t xml:space="preserve"> </w:t>
       </w:r>
@@ -1007,6 +1016,8 @@
           <w:bCs/>
           <w:noProof/>
           <w:lang w:val="tr-TR"/>
+          <w:sz w:val="28"/>
+          <w:szCs w:val="28"/>
         </w:rPr>
         <w:t>BİLGİLER</w:t>
       </w:r>
@@ -2384,6 +2395,30 @@
     </w:p>
     <w:p>
       <w:pPr>
+        <w:pStyle w:val="Balk1"/>
+        <w:rPr>
+          <w:rFonts w:ascii="Times New Roman" w:hAnsi="Times New Roman" w:cs="Times New Roman"/>
+          <w:b/>
+          <w:sz w:val="28"/>
+          <w:szCs w:val="28"/>
+          <w:noProof/>
+          <w:lang w:val="tr-TR"/>
+        </w:rPr>
+      </w:pPr>
+      <w:r>
+        <w:rPr>
+          <w:rFonts w:ascii="Times New Roman" w:hAnsi="Times New Roman" w:cs="Times New Roman"/>
+          <w:b/>
+          <w:sz w:val="28"/>
+          <w:szCs w:val="28"/>
+          <w:noProof/>
+          <w:lang w:val="tr-TR"/>
+        </w:rPr>
+        <w:t xml:space="preserve">2. POZİSYON ÖZETİ</w:t>
+      </w:r>
+    </w:p>
+    <w:p>
+      <w:pPr>
         <w:pStyle w:val="GvdeMetniGirintisi"/>
         <w:rPr>
           <w:rFonts w:ascii="Times New Roman" w:hAnsi="Times New Roman" w:cs="Times New Roman"/>
@@ -4046,6 +4081,30 @@
           <w:lang w:val="tr-TR" w:eastAsia="tr-TR"/>
         </w:rPr>
       </w:pPr>
+    </w:p>
+    <w:p>
+      <w:pPr>
+        <w:pStyle w:val="Balk1"/>
+        <w:rPr>
+          <w:rFonts w:ascii="Times New Roman" w:hAnsi="Times New Roman" w:cs="Times New Roman"/>
+          <w:b/>
+          <w:sz w:val="28"/>
+          <w:szCs w:val="28"/>
+          <w:noProof/>
+          <w:lang w:val="tr-TR"/>
+        </w:rPr>
+      </w:pPr>
+      <w:r>
+        <w:rPr>
+          <w:rFonts w:ascii="Times New Roman" w:hAnsi="Times New Roman" w:cs="Times New Roman"/>
+          <w:b/>
+          <w:sz w:val="28"/>
+          <w:szCs w:val="28"/>
+          <w:noProof/>
+          <w:lang w:val="tr-TR"/>
+        </w:rPr>
+        <w:t xml:space="preserve">3. DİĞER BİLGİLER</w:t>
+      </w:r>
     </w:p>
     <w:p>
       <w:pPr>
@@ -6170,7 +6229,7 @@
     </w:tbl>
     <w:p>
       <w:pPr>
-        <w:pStyle w:val="Balk4"/>
+        <w:pStyle w:val="Normal"/>
         <w:rPr>
           <w:rFonts w:ascii="Times New Roman" w:hAnsi="Times New Roman" w:cs="Times New Roman"/>
           <w:noProof/>
@@ -6635,18 +6694,24 @@
     </w:p>
     <w:p>
       <w:pPr>
-        <w:pStyle w:val="Balk4"/>
-        <w:rPr>
-          <w:rFonts w:ascii="Times New Roman" w:hAnsi="Times New Roman" w:cs="Times New Roman"/>
-          <w:noProof/>
-          <w:lang w:val="tr-TR"/>
-        </w:rPr>
-      </w:pPr>
-      <w:r>
-        <w:rPr>
-          <w:rFonts w:ascii="Times New Roman" w:hAnsi="Times New Roman" w:cs="Times New Roman"/>
-          <w:noProof/>
-          <w:lang w:val="tr-TR"/>
+        <w:pStyle w:val="Balk1"/>
+        <w:rPr>
+          <w:rFonts w:ascii="Times New Roman" w:hAnsi="Times New Roman" w:cs="Times New Roman"/>
+          <w:noProof/>
+          <w:lang w:val="tr-TR"/>
+          <w:b/>
+          <w:sz w:val="28"/>
+          <w:szCs w:val="28"/>
+        </w:rPr>
+      </w:pPr>
+      <w:r>
+        <w:rPr>
+          <w:rFonts w:ascii="Times New Roman" w:hAnsi="Times New Roman" w:cs="Times New Roman"/>
+          <w:noProof/>
+          <w:lang w:val="tr-TR"/>
+          <w:b/>
+          <w:sz w:val="28"/>
+          <w:szCs w:val="28"/>
         </w:rPr>
         <w:t>4</w:t>
       </w:r>
@@ -6655,6 +6720,9 @@
           <w:rFonts w:ascii="Times New Roman" w:hAnsi="Times New Roman" w:cs="Times New Roman"/>
           <w:noProof/>
           <w:lang w:val="tr-TR"/>
+          <w:b/>
+          <w:sz w:val="28"/>
+          <w:szCs w:val="28"/>
         </w:rPr>
         <w:t>. BİLGİ ve BECERİ</w:t>
       </w:r>
@@ -7355,7 +7423,7 @@
     </w:tbl>
     <w:p>
       <w:pPr>
-        <w:pStyle w:val="Balk4"/>
+        <w:pStyle w:val="Normal"/>
         <w:rPr>
           <w:rFonts w:ascii="Times New Roman" w:hAnsi="Times New Roman" w:cs="Times New Roman"/>
           <w:bCs w:val="0"/>
@@ -10869,188 +10937,188 @@
     </w:p>
     <w:p>
       <w:pPr>
-        <w:pStyle w:val="Balk4"/>
-        <w:rPr>
-          <w:rFonts w:ascii="Times New Roman" w:hAnsi="Times New Roman" w:cs="Times New Roman"/>
-          <w:noProof/>
-          <w:szCs w:val="24"/>
-          <w:lang w:val="tr-TR"/>
-        </w:rPr>
-      </w:pPr>
-    </w:p>
-    <w:p>
-      <w:pPr>
-        <w:rPr>
-          <w:rFonts w:ascii="Times New Roman" w:hAnsi="Times New Roman" w:cs="Times New Roman"/>
-          <w:sz w:val="24"/>
-          <w:szCs w:val="24"/>
-          <w:lang w:val="tr-TR"/>
-        </w:rPr>
-      </w:pPr>
-    </w:p>
-    <w:p>
-      <w:pPr>
-        <w:rPr>
-          <w:rFonts w:ascii="Times New Roman" w:hAnsi="Times New Roman" w:cs="Times New Roman"/>
-          <w:sz w:val="24"/>
-          <w:szCs w:val="24"/>
-          <w:lang w:val="tr-TR"/>
-        </w:rPr>
-      </w:pPr>
-    </w:p>
-    <w:p>
-      <w:pPr>
-        <w:rPr>
-          <w:rFonts w:ascii="Times New Roman" w:hAnsi="Times New Roman" w:cs="Times New Roman"/>
-          <w:sz w:val="24"/>
-          <w:szCs w:val="24"/>
-          <w:lang w:val="tr-TR"/>
-        </w:rPr>
-      </w:pPr>
-    </w:p>
-    <w:p>
-      <w:pPr>
-        <w:rPr>
-          <w:rFonts w:ascii="Times New Roman" w:hAnsi="Times New Roman" w:cs="Times New Roman"/>
-          <w:sz w:val="24"/>
-          <w:szCs w:val="24"/>
-          <w:lang w:val="tr-TR"/>
-        </w:rPr>
-      </w:pPr>
-    </w:p>
-    <w:p>
-      <w:pPr>
-        <w:rPr>
-          <w:rFonts w:ascii="Times New Roman" w:hAnsi="Times New Roman" w:cs="Times New Roman"/>
-          <w:sz w:val="24"/>
-          <w:szCs w:val="24"/>
-          <w:lang w:val="tr-TR"/>
-        </w:rPr>
-      </w:pPr>
-    </w:p>
-    <w:p>
-      <w:pPr>
-        <w:rPr>
-          <w:rFonts w:ascii="Times New Roman" w:hAnsi="Times New Roman" w:cs="Times New Roman"/>
-          <w:sz w:val="24"/>
-          <w:szCs w:val="24"/>
-          <w:lang w:val="tr-TR"/>
-        </w:rPr>
-      </w:pPr>
-    </w:p>
-    <w:p>
-      <w:pPr>
-        <w:rPr>
-          <w:rFonts w:ascii="Times New Roman" w:hAnsi="Times New Roman" w:cs="Times New Roman"/>
-          <w:sz w:val="24"/>
-          <w:szCs w:val="24"/>
-          <w:lang w:val="tr-TR"/>
-        </w:rPr>
-      </w:pPr>
-    </w:p>
-    <w:p>
-      <w:pPr>
-        <w:rPr>
-          <w:rFonts w:ascii="Times New Roman" w:hAnsi="Times New Roman" w:cs="Times New Roman"/>
-          <w:sz w:val="24"/>
-          <w:szCs w:val="24"/>
-          <w:lang w:val="tr-TR"/>
-        </w:rPr>
-      </w:pPr>
-    </w:p>
-    <w:p>
-      <w:pPr>
-        <w:rPr>
-          <w:rFonts w:ascii="Times New Roman" w:hAnsi="Times New Roman" w:cs="Times New Roman"/>
-          <w:sz w:val="24"/>
-          <w:szCs w:val="24"/>
-          <w:lang w:val="tr-TR"/>
-        </w:rPr>
-      </w:pPr>
-    </w:p>
-    <w:p>
-      <w:pPr>
-        <w:rPr>
-          <w:rFonts w:ascii="Times New Roman" w:hAnsi="Times New Roman" w:cs="Times New Roman"/>
-          <w:sz w:val="24"/>
-          <w:szCs w:val="24"/>
-          <w:lang w:val="tr-TR"/>
-        </w:rPr>
-      </w:pPr>
-    </w:p>
-    <w:p>
-      <w:pPr>
-        <w:rPr>
-          <w:rFonts w:ascii="Times New Roman" w:hAnsi="Times New Roman" w:cs="Times New Roman"/>
-          <w:sz w:val="24"/>
-          <w:szCs w:val="24"/>
-          <w:lang w:val="tr-TR"/>
-        </w:rPr>
-      </w:pPr>
-    </w:p>
-    <w:p>
-      <w:pPr>
-        <w:rPr>
-          <w:rFonts w:ascii="Times New Roman" w:hAnsi="Times New Roman" w:cs="Times New Roman"/>
-          <w:sz w:val="24"/>
-          <w:szCs w:val="24"/>
-          <w:lang w:val="tr-TR"/>
-        </w:rPr>
-      </w:pPr>
-    </w:p>
-    <w:p>
-      <w:pPr>
-        <w:rPr>
-          <w:rFonts w:ascii="Times New Roman" w:hAnsi="Times New Roman" w:cs="Times New Roman"/>
-          <w:sz w:val="24"/>
-          <w:szCs w:val="24"/>
-          <w:lang w:val="tr-TR"/>
-        </w:rPr>
-      </w:pPr>
-    </w:p>
-    <w:p>
-      <w:pPr>
-        <w:rPr>
-          <w:rFonts w:ascii="Times New Roman" w:hAnsi="Times New Roman" w:cs="Times New Roman"/>
-          <w:sz w:val="24"/>
-          <w:szCs w:val="24"/>
-          <w:lang w:val="tr-TR"/>
-        </w:rPr>
-      </w:pPr>
-    </w:p>
-    <w:p>
-      <w:pPr>
-        <w:rPr>
-          <w:rFonts w:ascii="Times New Roman" w:hAnsi="Times New Roman" w:cs="Times New Roman"/>
-          <w:sz w:val="24"/>
-          <w:szCs w:val="24"/>
-          <w:lang w:val="tr-TR"/>
-        </w:rPr>
-      </w:pPr>
-    </w:p>
-    <w:p>
-      <w:pPr>
-        <w:rPr>
-          <w:rFonts w:ascii="Times New Roman" w:hAnsi="Times New Roman" w:cs="Times New Roman"/>
-          <w:sz w:val="24"/>
-          <w:szCs w:val="24"/>
-          <w:lang w:val="tr-TR"/>
-        </w:rPr>
-      </w:pPr>
-    </w:p>
-    <w:p>
-      <w:pPr>
-        <w:rPr>
-          <w:rFonts w:ascii="Times New Roman" w:hAnsi="Times New Roman" w:cs="Times New Roman"/>
-          <w:sz w:val="24"/>
-          <w:szCs w:val="24"/>
-          <w:lang w:val="tr-TR"/>
-        </w:rPr>
-      </w:pPr>
-    </w:p>
-    <w:p>
-      <w:pPr>
-        <w:pStyle w:val="Balk4"/>
+        <w:pStyle w:val="Normal"/>
+        <w:rPr>
+          <w:rFonts w:ascii="Times New Roman" w:hAnsi="Times New Roman" w:cs="Times New Roman"/>
+          <w:noProof/>
+          <w:szCs w:val="24"/>
+          <w:lang w:val="tr-TR"/>
+        </w:rPr>
+      </w:pPr>
+    </w:p>
+    <w:p>
+      <w:pPr>
+        <w:rPr>
+          <w:rFonts w:ascii="Times New Roman" w:hAnsi="Times New Roman" w:cs="Times New Roman"/>
+          <w:sz w:val="24"/>
+          <w:szCs w:val="24"/>
+          <w:lang w:val="tr-TR"/>
+        </w:rPr>
+      </w:pPr>
+    </w:p>
+    <w:p>
+      <w:pPr>
+        <w:rPr>
+          <w:rFonts w:ascii="Times New Roman" w:hAnsi="Times New Roman" w:cs="Times New Roman"/>
+          <w:sz w:val="24"/>
+          <w:szCs w:val="24"/>
+          <w:lang w:val="tr-TR"/>
+        </w:rPr>
+      </w:pPr>
+    </w:p>
+    <w:p>
+      <w:pPr>
+        <w:rPr>
+          <w:rFonts w:ascii="Times New Roman" w:hAnsi="Times New Roman" w:cs="Times New Roman"/>
+          <w:sz w:val="24"/>
+          <w:szCs w:val="24"/>
+          <w:lang w:val="tr-TR"/>
+        </w:rPr>
+      </w:pPr>
+    </w:p>
+    <w:p>
+      <w:pPr>
+        <w:rPr>
+          <w:rFonts w:ascii="Times New Roman" w:hAnsi="Times New Roman" w:cs="Times New Roman"/>
+          <w:sz w:val="24"/>
+          <w:szCs w:val="24"/>
+          <w:lang w:val="tr-TR"/>
+        </w:rPr>
+      </w:pPr>
+    </w:p>
+    <w:p>
+      <w:pPr>
+        <w:rPr>
+          <w:rFonts w:ascii="Times New Roman" w:hAnsi="Times New Roman" w:cs="Times New Roman"/>
+          <w:sz w:val="24"/>
+          <w:szCs w:val="24"/>
+          <w:lang w:val="tr-TR"/>
+        </w:rPr>
+      </w:pPr>
+    </w:p>
+    <w:p>
+      <w:pPr>
+        <w:rPr>
+          <w:rFonts w:ascii="Times New Roman" w:hAnsi="Times New Roman" w:cs="Times New Roman"/>
+          <w:sz w:val="24"/>
+          <w:szCs w:val="24"/>
+          <w:lang w:val="tr-TR"/>
+        </w:rPr>
+      </w:pPr>
+    </w:p>
+    <w:p>
+      <w:pPr>
+        <w:rPr>
+          <w:rFonts w:ascii="Times New Roman" w:hAnsi="Times New Roman" w:cs="Times New Roman"/>
+          <w:sz w:val="24"/>
+          <w:szCs w:val="24"/>
+          <w:lang w:val="tr-TR"/>
+        </w:rPr>
+      </w:pPr>
+    </w:p>
+    <w:p>
+      <w:pPr>
+        <w:rPr>
+          <w:rFonts w:ascii="Times New Roman" w:hAnsi="Times New Roman" w:cs="Times New Roman"/>
+          <w:sz w:val="24"/>
+          <w:szCs w:val="24"/>
+          <w:lang w:val="tr-TR"/>
+        </w:rPr>
+      </w:pPr>
+    </w:p>
+    <w:p>
+      <w:pPr>
+        <w:rPr>
+          <w:rFonts w:ascii="Times New Roman" w:hAnsi="Times New Roman" w:cs="Times New Roman"/>
+          <w:sz w:val="24"/>
+          <w:szCs w:val="24"/>
+          <w:lang w:val="tr-TR"/>
+        </w:rPr>
+      </w:pPr>
+    </w:p>
+    <w:p>
+      <w:pPr>
+        <w:rPr>
+          <w:rFonts w:ascii="Times New Roman" w:hAnsi="Times New Roman" w:cs="Times New Roman"/>
+          <w:sz w:val="24"/>
+          <w:szCs w:val="24"/>
+          <w:lang w:val="tr-TR"/>
+        </w:rPr>
+      </w:pPr>
+    </w:p>
+    <w:p>
+      <w:pPr>
+        <w:rPr>
+          <w:rFonts w:ascii="Times New Roman" w:hAnsi="Times New Roman" w:cs="Times New Roman"/>
+          <w:sz w:val="24"/>
+          <w:szCs w:val="24"/>
+          <w:lang w:val="tr-TR"/>
+        </w:rPr>
+      </w:pPr>
+    </w:p>
+    <w:p>
+      <w:pPr>
+        <w:rPr>
+          <w:rFonts w:ascii="Times New Roman" w:hAnsi="Times New Roman" w:cs="Times New Roman"/>
+          <w:sz w:val="24"/>
+          <w:szCs w:val="24"/>
+          <w:lang w:val="tr-TR"/>
+        </w:rPr>
+      </w:pPr>
+    </w:p>
+    <w:p>
+      <w:pPr>
+        <w:rPr>
+          <w:rFonts w:ascii="Times New Roman" w:hAnsi="Times New Roman" w:cs="Times New Roman"/>
+          <w:sz w:val="24"/>
+          <w:szCs w:val="24"/>
+          <w:lang w:val="tr-TR"/>
+        </w:rPr>
+      </w:pPr>
+    </w:p>
+    <w:p>
+      <w:pPr>
+        <w:rPr>
+          <w:rFonts w:ascii="Times New Roman" w:hAnsi="Times New Roman" w:cs="Times New Roman"/>
+          <w:sz w:val="24"/>
+          <w:szCs w:val="24"/>
+          <w:lang w:val="tr-TR"/>
+        </w:rPr>
+      </w:pPr>
+    </w:p>
+    <w:p>
+      <w:pPr>
+        <w:rPr>
+          <w:rFonts w:ascii="Times New Roman" w:hAnsi="Times New Roman" w:cs="Times New Roman"/>
+          <w:sz w:val="24"/>
+          <w:szCs w:val="24"/>
+          <w:lang w:val="tr-TR"/>
+        </w:rPr>
+      </w:pPr>
+    </w:p>
+    <w:p>
+      <w:pPr>
+        <w:rPr>
+          <w:rFonts w:ascii="Times New Roman" w:hAnsi="Times New Roman" w:cs="Times New Roman"/>
+          <w:sz w:val="24"/>
+          <w:szCs w:val="24"/>
+          <w:lang w:val="tr-TR"/>
+        </w:rPr>
+      </w:pPr>
+    </w:p>
+    <w:p>
+      <w:pPr>
+        <w:rPr>
+          <w:rFonts w:ascii="Times New Roman" w:hAnsi="Times New Roman" w:cs="Times New Roman"/>
+          <w:sz w:val="24"/>
+          <w:szCs w:val="24"/>
+          <w:lang w:val="tr-TR"/>
+        </w:rPr>
+      </w:pPr>
+    </w:p>
+    <w:p>
+      <w:pPr>
+        <w:pStyle w:val="Normal"/>
         <w:rPr>
           <w:rFonts w:ascii="Times New Roman" w:hAnsi="Times New Roman" w:cs="Times New Roman"/>
           <w:szCs w:val="24"/>
@@ -12287,6 +12355,30 @@
     </w:p>
     <w:p>
       <w:pPr>
+        <w:pStyle w:val="Balk1"/>
+        <w:rPr>
+          <w:rFonts w:ascii="Times New Roman" w:hAnsi="Times New Roman" w:cs="Times New Roman"/>
+          <w:b/>
+          <w:sz w:val="28"/>
+          <w:szCs w:val="28"/>
+          <w:noProof/>
+          <w:lang w:val="tr-TR"/>
+        </w:rPr>
+      </w:pPr>
+      <w:r>
+        <w:rPr>
+          <w:rFonts w:ascii="Times New Roman" w:hAnsi="Times New Roman" w:cs="Times New Roman"/>
+          <w:b/>
+          <w:sz w:val="28"/>
+          <w:szCs w:val="28"/>
+          <w:noProof/>
+          <w:lang w:val="tr-TR"/>
+        </w:rPr>
+        <w:t xml:space="preserve">5. İŞİN ANALİZİ</w:t>
+      </w:r>
+    </w:p>
+    <w:p>
+      <w:pPr>
         <w:jc w:val="both"/>
         <w:rPr>
           <w:rFonts w:ascii="Times New Roman" w:hAnsi="Times New Roman" w:cs="Times New Roman"/>
@@ -15224,7 +15316,7 @@
     </w:p>
     <w:p>
       <w:pPr>
-        <w:pStyle w:val="Balk4"/>
+        <w:pStyle w:val="Normal"/>
         <w:rPr>
           <w:rFonts w:ascii="Times New Roman" w:hAnsi="Times New Roman" w:cs="Times New Roman"/>
           <w:noProof/>
@@ -15241,12 +15333,15 @@
     </w:p>
     <w:p>
       <w:pPr>
-        <w:pStyle w:val="Balk4"/>
+        <w:pStyle w:val="Balk1"/>
         <w:rPr>
           <w:rFonts w:ascii="Times New Roman" w:hAnsi="Times New Roman" w:cs="Times New Roman"/>
           <w:bCs w:val="0"/>
           <w:noProof/>
           <w:lang w:val="tr-TR"/>
+          <w:b/>
+          <w:sz w:val="28"/>
+          <w:szCs w:val="28"/>
         </w:rPr>
       </w:pPr>
       <w:r>
@@ -15255,6 +15350,9 @@
           <w:bCs w:val="0"/>
           <w:noProof/>
           <w:lang w:val="tr-TR"/>
+          <w:b/>
+          <w:sz w:val="28"/>
+          <w:szCs w:val="28"/>
         </w:rPr>
         <w:t>6</w:t>
       </w:r>
@@ -15264,6 +15362,9 @@
           <w:bCs w:val="0"/>
           <w:noProof/>
           <w:lang w:val="tr-TR"/>
+          <w:b/>
+          <w:sz w:val="28"/>
+          <w:szCs w:val="28"/>
         </w:rPr>
         <w:t>.  DENEYİM</w:t>
       </w:r>
@@ -15444,18 +15545,24 @@
     </w:p>
     <w:p>
       <w:pPr>
-        <w:pStyle w:val="Balk4"/>
-        <w:rPr>
-          <w:rFonts w:ascii="Times New Roman" w:hAnsi="Times New Roman" w:cs="Times New Roman"/>
-          <w:noProof/>
-          <w:lang w:val="tr-TR"/>
-        </w:rPr>
-      </w:pPr>
-      <w:r>
-        <w:rPr>
-          <w:rFonts w:ascii="Times New Roman" w:hAnsi="Times New Roman" w:cs="Times New Roman"/>
-          <w:noProof/>
-          <w:lang w:val="tr-TR"/>
+        <w:pStyle w:val="Balk1"/>
+        <w:rPr>
+          <w:rFonts w:ascii="Times New Roman" w:hAnsi="Times New Roman" w:cs="Times New Roman"/>
+          <w:noProof/>
+          <w:lang w:val="tr-TR"/>
+          <w:b/>
+          <w:sz w:val="28"/>
+          <w:szCs w:val="28"/>
+        </w:rPr>
+      </w:pPr>
+      <w:r>
+        <w:rPr>
+          <w:rFonts w:ascii="Times New Roman" w:hAnsi="Times New Roman" w:cs="Times New Roman"/>
+          <w:noProof/>
+          <w:lang w:val="tr-TR"/>
+          <w:b/>
+          <w:sz w:val="28"/>
+          <w:szCs w:val="28"/>
         </w:rPr>
         <w:t>7</w:t>
       </w:r>
@@ -15464,6 +15571,9 @@
           <w:rFonts w:ascii="Times New Roman" w:hAnsi="Times New Roman" w:cs="Times New Roman"/>
           <w:noProof/>
           <w:lang w:val="tr-TR"/>
+          <w:b/>
+          <w:sz w:val="28"/>
+          <w:szCs w:val="28"/>
         </w:rPr>
         <w:t>. GÜÇLÜK VE YARATICILIK</w:t>
       </w:r>
@@ -15788,20 +15898,26 @@
     </w:p>
     <w:p>
       <w:pPr>
-        <w:pStyle w:val="Balk9"/>
+        <w:pStyle w:val="Balk1"/>
         <w:ind w:left="0"/>
         <w:jc w:val="left"/>
         <w:rPr>
           <w:rFonts w:ascii="Times New Roman" w:hAnsi="Times New Roman" w:cs="Times New Roman"/>
           <w:noProof/>
           <w:lang w:val="tr-TR"/>
-        </w:rPr>
-      </w:pPr>
-      <w:r>
-        <w:rPr>
-          <w:rFonts w:ascii="Times New Roman" w:hAnsi="Times New Roman" w:cs="Times New Roman"/>
-          <w:noProof/>
-          <w:lang w:val="tr-TR"/>
+          <w:b/>
+          <w:sz w:val="28"/>
+          <w:szCs w:val="28"/>
+        </w:rPr>
+      </w:pPr>
+      <w:r>
+        <w:rPr>
+          <w:rFonts w:ascii="Times New Roman" w:hAnsi="Times New Roman" w:cs="Times New Roman"/>
+          <w:noProof/>
+          <w:lang w:val="tr-TR"/>
+          <w:b/>
+          <w:sz w:val="28"/>
+          <w:szCs w:val="28"/>
         </w:rPr>
         <w:t>8.</w:t>
       </w:r>
@@ -15810,6 +15926,9 @@
           <w:rFonts w:ascii="Times New Roman" w:hAnsi="Times New Roman" w:cs="Times New Roman"/>
           <w:noProof/>
           <w:lang w:val="tr-TR"/>
+          <w:b/>
+          <w:sz w:val="28"/>
+          <w:szCs w:val="28"/>
         </w:rPr>
         <w:t xml:space="preserve"> IÇ VE DIŞ KONTAKLAR</w:t>
       </w:r>
@@ -16355,7 +16474,7 @@
     </w:tbl>
     <w:p>
       <w:pPr>
-        <w:pStyle w:val="Balk4"/>
+        <w:pStyle w:val="Normal"/>
         <w:rPr>
           <w:rFonts w:ascii="Times New Roman" w:hAnsi="Times New Roman" w:cs="Times New Roman"/>
           <w:noProof/>
@@ -16700,7 +16819,7 @@
     </w:tbl>
     <w:p>
       <w:pPr>
-        <w:pStyle w:val="Balk4"/>
+        <w:pStyle w:val="Normal"/>
         <w:rPr>
           <w:rFonts w:ascii="Times New Roman" w:hAnsi="Times New Roman" w:cs="Times New Roman"/>
           <w:noProof/>
@@ -16938,28 +17057,34 @@
     </w:tbl>
     <w:p>
       <w:pPr>
-        <w:pStyle w:val="Balk4"/>
-        <w:rPr>
-          <w:rFonts w:ascii="Times New Roman" w:hAnsi="Times New Roman" w:cs="Times New Roman"/>
-          <w:noProof/>
-          <w:lang w:val="tr-TR"/>
-        </w:rPr>
-      </w:pPr>
-    </w:p>
-    <w:p>
-      <w:pPr>
-        <w:pStyle w:val="Balk4"/>
-        <w:rPr>
-          <w:rFonts w:ascii="Times New Roman" w:hAnsi="Times New Roman" w:cs="Times New Roman"/>
-          <w:noProof/>
-          <w:lang w:val="tr-TR"/>
-        </w:rPr>
-      </w:pPr>
-      <w:r>
-        <w:rPr>
-          <w:rFonts w:ascii="Times New Roman" w:hAnsi="Times New Roman" w:cs="Times New Roman"/>
-          <w:noProof/>
-          <w:lang w:val="tr-TR"/>
+        <w:pStyle w:val="Normal"/>
+        <w:rPr>
+          <w:rFonts w:ascii="Times New Roman" w:hAnsi="Times New Roman" w:cs="Times New Roman"/>
+          <w:noProof/>
+          <w:lang w:val="tr-TR"/>
+        </w:rPr>
+      </w:pPr>
+    </w:p>
+    <w:p>
+      <w:pPr>
+        <w:pStyle w:val="Balk1"/>
+        <w:rPr>
+          <w:rFonts w:ascii="Times New Roman" w:hAnsi="Times New Roman" w:cs="Times New Roman"/>
+          <w:noProof/>
+          <w:lang w:val="tr-TR"/>
+          <w:b/>
+          <w:sz w:val="28"/>
+          <w:szCs w:val="28"/>
+        </w:rPr>
+      </w:pPr>
+      <w:r>
+        <w:rPr>
+          <w:rFonts w:ascii="Times New Roman" w:hAnsi="Times New Roman" w:cs="Times New Roman"/>
+          <w:noProof/>
+          <w:lang w:val="tr-TR"/>
+          <w:b/>
+          <w:sz w:val="28"/>
+          <w:szCs w:val="28"/>
         </w:rPr>
         <w:t>9</w:t>
       </w:r>
@@ -16968,6 +17093,9 @@
           <w:rFonts w:ascii="Times New Roman" w:hAnsi="Times New Roman" w:cs="Times New Roman"/>
           <w:noProof/>
           <w:lang w:val="tr-TR"/>
+          <w:b/>
+          <w:sz w:val="28"/>
+          <w:szCs w:val="28"/>
         </w:rPr>
         <w:t>. LİDERLİK</w:t>
       </w:r>
@@ -17618,20 +17746,26 @@
     </w:p>
     <w:p>
       <w:pPr>
-        <w:pStyle w:val="Balk9"/>
+        <w:pStyle w:val="Balk1"/>
         <w:ind w:left="0"/>
         <w:jc w:val="left"/>
         <w:rPr>
           <w:rFonts w:ascii="Times New Roman" w:hAnsi="Times New Roman" w:cs="Times New Roman"/>
           <w:noProof/>
           <w:lang w:val="tr-TR"/>
-        </w:rPr>
-      </w:pPr>
-      <w:r>
-        <w:rPr>
-          <w:rFonts w:ascii="Times New Roman" w:hAnsi="Times New Roman" w:cs="Times New Roman"/>
-          <w:noProof/>
-          <w:lang w:val="tr-TR"/>
+          <w:b/>
+          <w:sz w:val="28"/>
+          <w:szCs w:val="28"/>
+        </w:rPr>
+      </w:pPr>
+      <w:r>
+        <w:rPr>
+          <w:rFonts w:ascii="Times New Roman" w:hAnsi="Times New Roman" w:cs="Times New Roman"/>
+          <w:noProof/>
+          <w:lang w:val="tr-TR"/>
+          <w:b/>
+          <w:sz w:val="28"/>
+          <w:szCs w:val="28"/>
         </w:rPr>
         <w:t>10</w:t>
       </w:r>
@@ -17640,6 +17774,9 @@
           <w:rFonts w:ascii="Times New Roman" w:hAnsi="Times New Roman" w:cs="Times New Roman"/>
           <w:noProof/>
           <w:lang w:val="tr-TR"/>
+          <w:b/>
+          <w:sz w:val="28"/>
+          <w:szCs w:val="28"/>
         </w:rPr>
         <w:t>. GÖREVİNİZ HARİCİNDEKİ İŞLER</w:t>
       </w:r>
@@ -17745,20 +17882,26 @@
     </w:p>
     <w:p>
       <w:pPr>
-        <w:pStyle w:val="Balk9"/>
+        <w:pStyle w:val="Balk1"/>
         <w:ind w:left="0"/>
         <w:jc w:val="left"/>
         <w:rPr>
           <w:rFonts w:ascii="Times New Roman" w:hAnsi="Times New Roman" w:cs="Times New Roman"/>
           <w:noProof/>
           <w:lang w:val="tr-TR"/>
-        </w:rPr>
-      </w:pPr>
-      <w:r>
-        <w:rPr>
-          <w:rFonts w:ascii="Times New Roman" w:hAnsi="Times New Roman" w:cs="Times New Roman"/>
-          <w:noProof/>
-          <w:lang w:val="tr-TR"/>
+          <w:b/>
+          <w:sz w:val="28"/>
+          <w:szCs w:val="28"/>
+        </w:rPr>
+      </w:pPr>
+      <w:r>
+        <w:rPr>
+          <w:rFonts w:ascii="Times New Roman" w:hAnsi="Times New Roman" w:cs="Times New Roman"/>
+          <w:noProof/>
+          <w:lang w:val="tr-TR"/>
+          <w:b/>
+          <w:sz w:val="28"/>
+          <w:szCs w:val="28"/>
         </w:rPr>
         <w:t>11</w:t>
       </w:r>
@@ -17767,6 +17910,9 @@
           <w:rFonts w:ascii="Times New Roman" w:hAnsi="Times New Roman" w:cs="Times New Roman"/>
           <w:noProof/>
           <w:lang w:val="tr-TR"/>
+          <w:b/>
+          <w:sz w:val="28"/>
+          <w:szCs w:val="28"/>
         </w:rPr>
         <w:t xml:space="preserve">. İŞİNİZİN EN ZOR VE KARMAŞIK YANI NELERDİR? </w:t>
       </w:r>
@@ -17959,21 +18105,26 @@
     </w:p>
     <w:p>
       <w:pPr>
+        <w:pStyle w:val="Balk1"/>
         <w:ind w:left="720"/>
         <w:jc w:val="both"/>
         <w:rPr>
           <w:rFonts w:ascii="Times New Roman" w:hAnsi="Times New Roman" w:cs="Times New Roman"/>
           <w:noProof/>
-          <w:sz w:val="24"/>
-          <w:lang w:val="tr-TR"/>
-        </w:rPr>
-      </w:pPr>
-      <w:r>
-        <w:rPr>
-          <w:rFonts w:ascii="Times New Roman" w:hAnsi="Times New Roman" w:cs="Times New Roman"/>
-          <w:noProof/>
-          <w:sz w:val="24"/>
-          <w:lang w:val="tr-TR"/>
+          <w:lang w:val="tr-TR"/>
+          <w:b/>
+          <w:sz w:val="28"/>
+          <w:szCs w:val="28"/>
+        </w:rPr>
+      </w:pPr>
+      <w:r>
+        <w:rPr>
+          <w:rFonts w:ascii="Times New Roman" w:hAnsi="Times New Roman" w:cs="Times New Roman"/>
+          <w:noProof/>
+          <w:lang w:val="tr-TR"/>
+          <w:b/>
+          <w:sz w:val="28"/>
+          <w:szCs w:val="28"/>
         </w:rPr>
         <w:t>TARİH</w:t>
       </w:r>

</xml_diff>

<commit_message>
Kalan kayan tablolar satir ici oldu, cevaplara 1.5 satir araligi
</commit_message>
<xml_diff>
--- a/assets/IsAnaliziForm-template.docx
+++ b/assets/IsAnaliziForm-template.docx
@@ -14,7 +14,6 @@
     </w:p>
     <w:tbl>
       <w:tblPr>
-        <w:tblpPr w:leftFromText="187" w:rightFromText="187" w:horzAnchor="margin" w:tblpXSpec="center" w:tblpY="2881"/>
         <w:tblW w:w="4000" w:type="pct"/>
         <w:tblBorders>
           <w:left w:val="single" w:sz="18" w:space="0" w:color="4F81BD"/>
@@ -7754,7 +7753,6 @@
     </w:p>
     <w:tbl>
       <w:tblPr>
-        <w:tblpPr w:leftFromText="141" w:rightFromText="141" w:vertAnchor="text" w:tblpY="45"/>
         <w:tblW w:w="11165" w:type="dxa"/>
         <w:tblBorders>
           <w:top w:val="single" w:sz="4" w:space="0" w:color="auto"/>
@@ -7782,6 +7780,9 @@
         <w:gridCol w:w="1814"/>
       </w:tblGrid>
       <w:tr>
+        <w:trPr>
+          <w:tblHeader/>
+        </w:trPr>
         <w:tc>
           <w:tcPr>
             <w:tcW w:w="1668" w:type="dxa"/>
@@ -10686,7 +10687,6 @@
     </w:p>
     <w:tbl>
       <w:tblPr>
-        <w:tblpPr w:leftFromText="141" w:rightFromText="141" w:vertAnchor="text" w:horzAnchor="margin" w:tblpY="8"/>
         <w:tblW w:w="0" w:type="auto"/>
         <w:tblBorders>
           <w:top w:val="single" w:sz="4" w:space="0" w:color="auto"/>
@@ -10704,6 +10704,9 @@
         <w:gridCol w:w="3354"/>
       </w:tblGrid>
       <w:tr>
+        <w:trPr>
+          <w:tblHeader/>
+        </w:trPr>
         <w:tc>
           <w:tcPr>
             <w:tcW w:w="3353" w:type="dxa"/>
@@ -12457,7 +12460,6 @@
     </w:p>
     <w:tbl>
       <w:tblPr>
-        <w:tblpPr w:leftFromText="141" w:rightFromText="141" w:vertAnchor="page" w:horzAnchor="margin" w:tblpY="3043"/>
         <w:tblW w:w="0" w:type="auto"/>
         <w:tblBorders>
           <w:top w:val="single" w:sz="4" w:space="0" w:color="auto"/>
@@ -12475,6 +12477,9 @@
         <w:gridCol w:w="3354"/>
       </w:tblGrid>
       <w:tr>
+        <w:trPr>
+          <w:tblHeader/>
+        </w:trPr>
         <w:tc>
           <w:tcPr>
             <w:tcW w:w="3353" w:type="dxa"/>
@@ -13681,7 +13686,6 @@
     </w:p>
     <w:tbl>
       <w:tblPr>
-        <w:tblpPr w:leftFromText="141" w:rightFromText="141" w:vertAnchor="page" w:horzAnchor="margin" w:tblpY="541"/>
         <w:tblW w:w="0" w:type="auto"/>
         <w:tblBorders>
           <w:top w:val="single" w:sz="4" w:space="0" w:color="auto"/>
@@ -13699,6 +13703,9 @@
         <w:gridCol w:w="3354"/>
       </w:tblGrid>
       <w:tr>
+        <w:trPr>
+          <w:tblHeader/>
+        </w:trPr>
         <w:tc>
           <w:tcPr>
             <w:tcW w:w="3353" w:type="dxa"/>

</xml_diff>

<commit_message>
Tarih formati saglamlasti, form tarihi cizgileri kaldirildi
</commit_message>
<xml_diff>
--- a/assets/IsAnaliziForm-template.docx
+++ b/assets/IsAnaliziForm-template.docx
@@ -879,78 +879,6 @@
           <w:lang w:val="tr-TR"/>
         </w:rPr>
         <w:t>Form Doldurulma TARİHİ</w:t>
-      </w:r>
-      <w:r>
-        <w:rPr>
-          <w:rFonts w:ascii="Times New Roman" w:hAnsi="Times New Roman" w:cs="Times New Roman"/>
-          <w:b/>
-          <w:bCs/>
-          <w:iCs/>
-          <w:noProof/>
-          <w:sz w:val="24"/>
-          <w:lang w:val="tr-TR"/>
-        </w:rPr>
-        <w:t>___</w:t>
-      </w:r>
-      <w:r>
-        <w:rPr>
-          <w:rFonts w:ascii="Times New Roman" w:hAnsi="Times New Roman" w:cs="Times New Roman"/>
-          <w:b/>
-          <w:bCs/>
-          <w:iCs/>
-          <w:noProof/>
-          <w:sz w:val="24"/>
-          <w:lang w:val="tr-TR"/>
-        </w:rPr>
-        <w:t>_</w:t>
-      </w:r>
-      <w:r>
-        <w:rPr>
-          <w:rFonts w:ascii="Times New Roman" w:hAnsi="Times New Roman" w:cs="Times New Roman"/>
-          <w:b/>
-          <w:bCs/>
-          <w:iCs/>
-          <w:noProof/>
-          <w:sz w:val="24"/>
-          <w:lang w:val="tr-TR"/>
-        </w:rPr>
-        <w:t>/___</w:t>
-      </w:r>
-      <w:r>
-        <w:rPr>
-          <w:rFonts w:ascii="Times New Roman" w:hAnsi="Times New Roman" w:cs="Times New Roman"/>
-          <w:b/>
-          <w:bCs/>
-          <w:iCs/>
-          <w:noProof/>
-          <w:sz w:val="24"/>
-          <w:lang w:val="tr-TR"/>
-        </w:rPr>
-        <w:t>_</w:t>
-      </w:r>
-      <w:r>
-        <w:rPr>
-          <w:rFonts w:ascii="Times New Roman" w:hAnsi="Times New Roman" w:cs="Times New Roman"/>
-          <w:b/>
-          <w:bCs/>
-          <w:iCs/>
-          <w:noProof/>
-          <w:sz w:val="24"/>
-          <w:lang w:val="tr-TR"/>
-        </w:rPr>
-        <w:t>/___</w:t>
-      </w:r>
-      <w:r>
-        <w:rPr>
-          <w:rFonts w:ascii="Times New Roman" w:hAnsi="Times New Roman" w:cs="Times New Roman"/>
-          <w:b/>
-          <w:bCs/>
-          <w:iCs/>
-          <w:noProof/>
-          <w:sz w:val="24"/>
-          <w:lang w:val="tr-TR"/>
-        </w:rPr>
-        <w:t>____</w:t>
       </w:r>
       <w:r>
         <w:t xml:space="preserve"> {{form_tarihi}}</w:t>

</xml_diff>

<commit_message>
12. bolum: tarihin yanina imza alani eklendi
</commit_message>
<xml_diff>
--- a/assets/IsAnaliziForm-template.docx
+++ b/assets/IsAnaliziForm-template.docx
@@ -16683,16 +16683,27 @@
         <w:tblLook w:val="01E0" w:firstRow="1" w:lastRow="1" w:firstColumn="1" w:lastColumn="1" w:noHBand="0" w:noVBand="0"/>
       </w:tblPr>
       <w:tblGrid>
-        <w:gridCol w:w="10112"/>
+        <w:gridCol w:w="5056"/>
+        <w:gridCol w:w="5056"/>
       </w:tblGrid>
       <w:tr>
         <w:tc>
           <w:tcPr>
-            <w:tcW w:w="4642" w:type="dxa"/>
-          </w:tcPr>
-          <w:p>
-            <w:r>
-              <w:t xml:space="preserve">{{imza_tarih}}</w:t>
+            <w:tcW w:w="5056" w:type="dxa"/>
+          </w:tcPr>
+          <w:p>
+            <w:r>
+              <w:t xml:space="preserve">Tarih: {{imza_tarih}}</w:t>
+            </w:r>
+          </w:p>
+        </w:tc>
+        <w:tc>
+          <w:tcPr>
+            <w:tcW w:w="5056" w:type="dxa"/>
+          </w:tcPr>
+          <w:p>
+            <w:r>
+              <w:t xml:space="preserve">İmza: {{imza_ad}}</w:t>
             </w:r>
           </w:p>
         </w:tc>

</xml_diff>

<commit_message>
Alt soru basliklari 14pt oldu
</commit_message>
<xml_diff>
--- a/assets/IsAnaliziForm-template.docx
+++ b/assets/IsAnaliziForm-template.docx
@@ -2596,8 +2596,8 @@
                 <w:b/>
                 <w:bCs/>
                 <w:noProof/>
-                <w:sz w:val="22"/>
-                <w:szCs w:val="22"/>
+                <w:sz w:val="28"/>
+                <w:szCs w:val="28"/>
                 <w:u w:val="single"/>
                 <w:lang w:val="tr-TR"/>
               </w:rPr>
@@ -2608,8 +2608,8 @@
                 <w:b/>
                 <w:bCs/>
                 <w:noProof/>
-                <w:sz w:val="22"/>
-                <w:szCs w:val="22"/>
+                <w:sz w:val="28"/>
+                <w:szCs w:val="28"/>
                 <w:u w:val="single"/>
                 <w:lang w:val="tr-TR"/>
               </w:rPr>
@@ -2631,8 +2631,8 @@
                 <w:b/>
                 <w:bCs/>
                 <w:noProof/>
-                <w:sz w:val="22"/>
-                <w:szCs w:val="22"/>
+                <w:sz w:val="28"/>
+                <w:szCs w:val="28"/>
                 <w:u w:val="single"/>
                 <w:lang w:val="tr-TR"/>
               </w:rPr>
@@ -2643,8 +2643,8 @@
                 <w:b/>
                 <w:bCs/>
                 <w:noProof/>
-                <w:sz w:val="22"/>
-                <w:szCs w:val="22"/>
+                <w:sz w:val="28"/>
+                <w:szCs w:val="28"/>
                 <w:u w:val="single"/>
                 <w:lang w:val="tr-TR"/>
               </w:rPr>
@@ -2666,8 +2666,8 @@
                 <w:b/>
                 <w:bCs/>
                 <w:noProof/>
-                <w:sz w:val="22"/>
-                <w:szCs w:val="22"/>
+                <w:sz w:val="28"/>
+                <w:szCs w:val="28"/>
                 <w:u w:val="single"/>
                 <w:lang w:val="tr-TR"/>
               </w:rPr>
@@ -2678,8 +2678,8 @@
                 <w:b/>
                 <w:bCs/>
                 <w:noProof/>
-                <w:sz w:val="22"/>
-                <w:szCs w:val="22"/>
+                <w:sz w:val="28"/>
+                <w:szCs w:val="28"/>
                 <w:u w:val="single"/>
                 <w:lang w:val="tr-TR"/>
               </w:rPr>
@@ -2701,8 +2701,8 @@
                 <w:b/>
                 <w:bCs/>
                 <w:noProof/>
-                <w:sz w:val="22"/>
-                <w:szCs w:val="22"/>
+                <w:sz w:val="28"/>
+                <w:szCs w:val="28"/>
                 <w:u w:val="single"/>
                 <w:lang w:val="tr-TR"/>
               </w:rPr>
@@ -2713,8 +2713,8 @@
                 <w:b/>
                 <w:bCs/>
                 <w:noProof/>
-                <w:sz w:val="22"/>
-                <w:szCs w:val="22"/>
+                <w:sz w:val="28"/>
+                <w:szCs w:val="28"/>
                 <w:u w:val="single"/>
                 <w:lang w:val="tr-TR"/>
               </w:rPr>

</xml_diff>

<commit_message>
Sablon: tablo ve cevap sonrasi bos paragraflar kaldirildi
</commit_message>
<xml_diff>
--- a/assets/IsAnaliziForm-template.docx
+++ b/assets/IsAnaliziForm-template.docx
@@ -1947,27 +1947,6 @@
     </w:tbl>
     <w:p>
       <w:pPr>
-        <w:ind w:left="360"/>
-        <w:jc w:val="both"/>
-        <w:rPr>
-          <w:rFonts w:ascii="Times New Roman" w:hAnsi="Times New Roman" w:cs="Times New Roman"/>
-          <w:noProof/>
-          <w:sz w:val="28"/>
-          <w:lang w:val="tr-TR"/>
-        </w:rPr>
-      </w:pPr>
-      <w:r>
-        <w:rPr>
-          <w:rFonts w:ascii="Times New Roman" w:hAnsi="Times New Roman" w:cs="Times New Roman"/>
-          <w:noProof/>
-          <w:sz w:val="28"/>
-          <w:lang w:val="tr-TR"/>
-        </w:rPr>
-        <w:tab/>
-      </w:r>
-    </w:p>
-    <w:p>
-      <w:pPr>
         <w:spacing w:line="600" w:lineRule="auto"/>
         <w:rPr>
           <w:rFonts w:ascii="Times New Roman" w:hAnsi="Times New Roman" w:cs="Times New Roman"/>
@@ -2153,51 +2132,6 @@
         <w:br/>
         <w:t xml:space="preserve">{{vekalet_edilen}}</w:t>
       </w:r>
-    </w:p>
-    <w:p>
-      <w:pPr>
-        <w:tabs>
-          <w:tab w:val="left" w:pos="426"/>
-          <w:tab w:val="left" w:pos="851"/>
-          <w:tab w:val="left" w:pos="993"/>
-        </w:tabs>
-        <w:rPr>
-          <w:rFonts w:ascii="Times New Roman" w:hAnsi="Times New Roman" w:cs="Times New Roman"/>
-          <w:b/>
-          <w:color w:val="auto"/>
-          <w:lang w:val="tr-TR" w:eastAsia="tr-TR"/>
-        </w:rPr>
-      </w:pPr>
-    </w:p>
-    <w:p>
-      <w:pPr>
-        <w:tabs>
-          <w:tab w:val="left" w:pos="426"/>
-          <w:tab w:val="left" w:pos="851"/>
-          <w:tab w:val="left" w:pos="993"/>
-        </w:tabs>
-        <w:rPr>
-          <w:rFonts w:ascii="Times New Roman" w:hAnsi="Times New Roman" w:cs="Times New Roman"/>
-          <w:b/>
-          <w:color w:val="auto"/>
-          <w:lang w:val="tr-TR" w:eastAsia="tr-TR"/>
-        </w:rPr>
-      </w:pPr>
-    </w:p>
-    <w:p>
-      <w:pPr>
-        <w:tabs>
-          <w:tab w:val="left" w:pos="426"/>
-          <w:tab w:val="left" w:pos="851"/>
-          <w:tab w:val="left" w:pos="993"/>
-        </w:tabs>
-        <w:rPr>
-          <w:rFonts w:ascii="Times New Roman" w:hAnsi="Times New Roman" w:cs="Times New Roman"/>
-          <w:b/>
-          <w:color w:val="auto"/>
-          <w:lang w:val="tr-TR" w:eastAsia="tr-TR"/>
-        </w:rPr>
-      </w:pPr>
     </w:p>
     <w:p>
       <w:pPr>
@@ -2305,16 +2239,6 @@
         <w:br/>
         <w:t xml:space="preserve">{{rol_amaci}}</w:t>
       </w:r>
-    </w:p>
-    <w:p>
-      <w:pPr>
-        <w:pStyle w:val="GvdeMetniGirintisi"/>
-        <w:rPr>
-          <w:rFonts w:ascii="Times New Roman" w:hAnsi="Times New Roman" w:cs="Times New Roman"/>
-          <w:noProof/>
-          <w:lang w:val="tr-TR"/>
-        </w:rPr>
-      </w:pPr>
     </w:p>
     <w:p>
       <w:pPr>
@@ -2803,55 +2727,6 @@
     </w:tbl>
     <w:p>
       <w:pPr>
-        <w:ind w:left="720"/>
-        <w:jc w:val="both"/>
-        <w:rPr>
-          <w:rFonts w:ascii="Times New Roman" w:hAnsi="Times New Roman" w:cs="Times New Roman"/>
-          <w:b/>
-          <w:bCs/>
-          <w:noProof/>
-          <w:lang w:val="tr-TR"/>
-        </w:rPr>
-      </w:pPr>
-    </w:p>
-    <w:p>
-      <w:pPr>
-        <w:ind w:left="720"/>
-        <w:jc w:val="both"/>
-        <w:rPr>
-          <w:rFonts w:ascii="Times New Roman" w:hAnsi="Times New Roman" w:cs="Times New Roman"/>
-          <w:b/>
-          <w:bCs/>
-          <w:noProof/>
-          <w:lang w:val="tr-TR"/>
-        </w:rPr>
-      </w:pPr>
-    </w:p>
-    <w:p>
-      <w:pPr>
-        <w:ind w:left="720"/>
-        <w:jc w:val="both"/>
-        <w:rPr>
-          <w:rFonts w:ascii="Times New Roman" w:hAnsi="Times New Roman" w:cs="Times New Roman"/>
-          <w:b/>
-          <w:bCs/>
-          <w:noProof/>
-          <w:lang w:val="tr-TR"/>
-        </w:rPr>
-      </w:pPr>
-    </w:p>
-    <w:p>
-      <w:pPr>
-        <w:jc w:val="both"/>
-        <w:rPr>
-          <w:rFonts w:ascii="Times New Roman" w:hAnsi="Times New Roman" w:cs="Times New Roman"/>
-          <w:noProof/>
-          <w:lang w:val="tr-TR"/>
-        </w:rPr>
-      </w:pPr>
-    </w:p>
-    <w:p>
-      <w:pPr>
         <w:pStyle w:val="GvdeMetniGirintisi"/>
         <w:rPr>
           <w:rFonts w:ascii="Times New Roman" w:hAnsi="Times New Roman" w:cs="Times New Roman"/>
@@ -2976,13 +2851,36 @@
         </w:tabs>
         <w:rPr>
           <w:rFonts w:ascii="Times New Roman" w:hAnsi="Times New Roman" w:cs="Times New Roman"/>
-          <w:b/>
-          <w:color w:val="auto"/>
-          <w:sz w:val="28"/>
-          <w:szCs w:val="28"/>
-          <w:lang w:val="tr-TR" w:eastAsia="tr-TR"/>
-        </w:rPr>
-      </w:pPr>
+          <w:color w:val="auto"/>
+          <w:sz w:val="28"/>
+          <w:szCs w:val="28"/>
+          <w:lang w:val="tr-TR" w:eastAsia="tr-TR"/>
+        </w:rPr>
+      </w:pPr>
+      <w:r>
+        <w:rPr>
+          <w:rFonts w:ascii="Times New Roman" w:hAnsi="Times New Roman" w:cs="Times New Roman"/>
+          <w:color w:val="auto"/>
+          <w:sz w:val="28"/>
+          <w:szCs w:val="28"/>
+          <w:lang w:val="tr-TR" w:eastAsia="tr-TR"/>
+        </w:rPr>
+        <w:t xml:space="preserve"> 2.4.</w:t>
+      </w:r>
+      <w:r>
+        <w:rPr>
+          <w:rFonts w:ascii="Times New Roman" w:hAnsi="Times New Roman" w:cs="Times New Roman"/>
+          <w:color w:val="auto"/>
+          <w:sz w:val="28"/>
+          <w:szCs w:val="28"/>
+          <w:lang w:val="tr-TR" w:eastAsia="tr-TR"/>
+        </w:rPr>
+        <w:t>Bu faaliyetleri yapmak için hangi girdiler gerekmektedir? Bunları hangi birim/bölüm sağlamaktadır?</w:t>
+      </w:r>
+      <w:r>
+        <w:br/>
+        <w:t xml:space="preserve">{{girdiler_birimler}}</w:t>
+      </w:r>
     </w:p>
     <w:p>
       <w:pPr>
@@ -3007,56 +2905,22 @@
           <w:szCs w:val="28"/>
           <w:lang w:val="tr-TR" w:eastAsia="tr-TR"/>
         </w:rPr>
-        <w:t xml:space="preserve"> 2.4.</w:t>
-      </w:r>
-      <w:r>
-        <w:rPr>
-          <w:rFonts w:ascii="Times New Roman" w:hAnsi="Times New Roman" w:cs="Times New Roman"/>
-          <w:color w:val="auto"/>
-          <w:sz w:val="28"/>
-          <w:szCs w:val="28"/>
-          <w:lang w:val="tr-TR" w:eastAsia="tr-TR"/>
-        </w:rPr>
-        <w:t>Bu faaliyetleri yapmak için hangi girdiler gerekmektedir? Bunları hangi birim/bölüm sağlamaktadır?</w:t>
+        <w:t>2.5.</w:t>
+      </w:r>
+      <w:r>
+        <w:rPr>
+          <w:rFonts w:ascii="Times New Roman" w:hAnsi="Times New Roman" w:cs="Times New Roman"/>
+          <w:color w:val="auto"/>
+          <w:sz w:val="28"/>
+          <w:szCs w:val="28"/>
+          <w:lang w:val="tr-TR" w:eastAsia="tr-TR"/>
+        </w:rPr>
+        <w:t>Bu faaliyetler sonunda hangi çıktılar üretilmektedir ve bunlar nereye gider?</w:t>
       </w:r>
       <w:r>
         <w:br/>
-        <w:t xml:space="preserve">{{girdiler_birimler}}</w:t>
-      </w:r>
-    </w:p>
-    <w:p>
-      <w:pPr>
-        <w:rPr>
-          <w:rFonts w:ascii="Times New Roman" w:hAnsi="Times New Roman" w:cs="Times New Roman"/>
-          <w:b/>
-          <w:color w:val="auto"/>
-          <w:sz w:val="28"/>
-          <w:szCs w:val="28"/>
-          <w:lang w:val="tr-TR" w:eastAsia="tr-TR"/>
-        </w:rPr>
-      </w:pPr>
-    </w:p>
-    <w:p>
-      <w:pPr>
-        <w:rPr>
-          <w:rFonts w:ascii="Times New Roman" w:hAnsi="Times New Roman" w:cs="Times New Roman"/>
-          <w:color w:val="auto"/>
-          <w:sz w:val="28"/>
-          <w:szCs w:val="28"/>
-          <w:lang w:val="tr-TR" w:eastAsia="tr-TR"/>
-        </w:rPr>
-      </w:pPr>
-    </w:p>
-    <w:p>
-      <w:pPr>
-        <w:rPr>
-          <w:rFonts w:ascii="Times New Roman" w:hAnsi="Times New Roman" w:cs="Times New Roman"/>
-          <w:color w:val="auto"/>
-          <w:sz w:val="28"/>
-          <w:szCs w:val="28"/>
-          <w:lang w:val="tr-TR" w:eastAsia="tr-TR"/>
-        </w:rPr>
-      </w:pPr>
+        <w:t xml:space="preserve">{{ciktilar}}</w:t>
+      </w:r>
     </w:p>
     <w:p>
       <w:pPr>
@@ -3081,81 +2945,6 @@
           <w:szCs w:val="28"/>
           <w:lang w:val="tr-TR" w:eastAsia="tr-TR"/>
         </w:rPr>
-        <w:t>2.5.</w:t>
-      </w:r>
-      <w:r>
-        <w:rPr>
-          <w:rFonts w:ascii="Times New Roman" w:hAnsi="Times New Roman" w:cs="Times New Roman"/>
-          <w:color w:val="auto"/>
-          <w:sz w:val="28"/>
-          <w:szCs w:val="28"/>
-          <w:lang w:val="tr-TR" w:eastAsia="tr-TR"/>
-        </w:rPr>
-        <w:t>Bu faaliyetler sonunda hangi çıktılar üretilmektedir ve bunlar nereye gider?</w:t>
-      </w:r>
-      <w:r>
-        <w:br/>
-        <w:t xml:space="preserve">{{ciktilar}}</w:t>
-      </w:r>
-    </w:p>
-    <w:p>
-      <w:pPr>
-        <w:rPr>
-          <w:rFonts w:ascii="Times New Roman" w:hAnsi="Times New Roman" w:cs="Times New Roman"/>
-          <w:color w:val="auto"/>
-          <w:sz w:val="28"/>
-          <w:szCs w:val="28"/>
-          <w:lang w:val="tr-TR" w:eastAsia="tr-TR"/>
-        </w:rPr>
-      </w:pPr>
-    </w:p>
-    <w:p>
-      <w:pPr>
-        <w:rPr>
-          <w:rFonts w:ascii="Times New Roman" w:hAnsi="Times New Roman" w:cs="Times New Roman"/>
-          <w:b/>
-          <w:color w:val="auto"/>
-          <w:sz w:val="28"/>
-          <w:szCs w:val="28"/>
-          <w:lang w:val="tr-TR" w:eastAsia="tr-TR"/>
-        </w:rPr>
-      </w:pPr>
-    </w:p>
-    <w:p>
-      <w:pPr>
-        <w:rPr>
-          <w:rFonts w:ascii="Times New Roman" w:hAnsi="Times New Roman" w:cs="Times New Roman"/>
-          <w:b/>
-          <w:color w:val="auto"/>
-          <w:sz w:val="28"/>
-          <w:szCs w:val="28"/>
-          <w:lang w:val="tr-TR" w:eastAsia="tr-TR"/>
-        </w:rPr>
-      </w:pPr>
-    </w:p>
-    <w:p>
-      <w:pPr>
-        <w:tabs>
-          <w:tab w:val="left" w:pos="426"/>
-          <w:tab w:val="left" w:pos="851"/>
-          <w:tab w:val="left" w:pos="993"/>
-        </w:tabs>
-        <w:rPr>
-          <w:rFonts w:ascii="Times New Roman" w:hAnsi="Times New Roman" w:cs="Times New Roman"/>
-          <w:color w:val="auto"/>
-          <w:sz w:val="28"/>
-          <w:szCs w:val="28"/>
-          <w:lang w:val="tr-TR" w:eastAsia="tr-TR"/>
-        </w:rPr>
-      </w:pPr>
-      <w:r>
-        <w:rPr>
-          <w:rFonts w:ascii="Times New Roman" w:hAnsi="Times New Roman" w:cs="Times New Roman"/>
-          <w:color w:val="auto"/>
-          <w:sz w:val="28"/>
-          <w:szCs w:val="28"/>
-          <w:lang w:val="tr-TR" w:eastAsia="tr-TR"/>
-        </w:rPr>
         <w:t>2.6.</w:t>
       </w:r>
       <w:r>
@@ -3172,42 +2961,6 @@
         <w:br/>
         <w:t xml:space="preserve">{{sistemler}}</w:t>
       </w:r>
-    </w:p>
-    <w:p>
-      <w:pPr>
-        <w:rPr>
-          <w:rFonts w:ascii="Times New Roman" w:hAnsi="Times New Roman" w:cs="Times New Roman"/>
-          <w:b/>
-          <w:color w:val="auto"/>
-          <w:sz w:val="28"/>
-          <w:szCs w:val="28"/>
-          <w:lang w:val="tr-TR" w:eastAsia="tr-TR"/>
-        </w:rPr>
-      </w:pPr>
-    </w:p>
-    <w:p>
-      <w:pPr>
-        <w:rPr>
-          <w:rFonts w:ascii="Times New Roman" w:hAnsi="Times New Roman" w:cs="Times New Roman"/>
-          <w:b/>
-          <w:color w:val="auto"/>
-          <w:sz w:val="28"/>
-          <w:szCs w:val="28"/>
-          <w:lang w:val="tr-TR" w:eastAsia="tr-TR"/>
-        </w:rPr>
-      </w:pPr>
-    </w:p>
-    <w:p>
-      <w:pPr>
-        <w:rPr>
-          <w:rFonts w:ascii="Times New Roman" w:hAnsi="Times New Roman" w:cs="Times New Roman"/>
-          <w:b/>
-          <w:color w:val="auto"/>
-          <w:sz w:val="28"/>
-          <w:szCs w:val="28"/>
-          <w:lang w:val="tr-TR" w:eastAsia="tr-TR"/>
-        </w:rPr>
-      </w:pPr>
     </w:p>
     <w:p>
       <w:pPr>
@@ -3281,66 +3034,6 @@
           <w:tab w:val="left" w:pos="993"/>
         </w:tabs>
         <w:spacing w:line="360" w:lineRule="auto"/>
-        <w:ind w:left="360"/>
-        <w:jc w:val="both"/>
-        <w:rPr>
-          <w:rFonts w:ascii="Times New Roman" w:hAnsi="Times New Roman" w:cs="Times New Roman"/>
-          <w:b/>
-          <w:color w:val="auto"/>
-          <w:sz w:val="28"/>
-          <w:szCs w:val="28"/>
-          <w:lang w:val="tr-TR" w:eastAsia="tr-TR"/>
-        </w:rPr>
-      </w:pPr>
-    </w:p>
-    <w:p>
-      <w:pPr>
-        <w:tabs>
-          <w:tab w:val="left" w:pos="426"/>
-          <w:tab w:val="left" w:pos="851"/>
-          <w:tab w:val="left" w:pos="993"/>
-        </w:tabs>
-        <w:spacing w:line="360" w:lineRule="auto"/>
-        <w:ind w:left="360"/>
-        <w:jc w:val="both"/>
-        <w:rPr>
-          <w:rFonts w:ascii="Times New Roman" w:hAnsi="Times New Roman" w:cs="Times New Roman"/>
-          <w:b/>
-          <w:color w:val="auto"/>
-          <w:sz w:val="28"/>
-          <w:szCs w:val="28"/>
-          <w:lang w:val="tr-TR" w:eastAsia="tr-TR"/>
-        </w:rPr>
-      </w:pPr>
-    </w:p>
-    <w:p>
-      <w:pPr>
-        <w:tabs>
-          <w:tab w:val="left" w:pos="426"/>
-          <w:tab w:val="left" w:pos="851"/>
-          <w:tab w:val="left" w:pos="993"/>
-        </w:tabs>
-        <w:spacing w:line="360" w:lineRule="auto"/>
-        <w:ind w:left="360"/>
-        <w:jc w:val="both"/>
-        <w:rPr>
-          <w:rFonts w:ascii="Times New Roman" w:hAnsi="Times New Roman" w:cs="Times New Roman"/>
-          <w:b/>
-          <w:color w:val="auto"/>
-          <w:sz w:val="28"/>
-          <w:szCs w:val="28"/>
-          <w:lang w:val="tr-TR" w:eastAsia="tr-TR"/>
-        </w:rPr>
-      </w:pPr>
-    </w:p>
-    <w:p>
-      <w:pPr>
-        <w:tabs>
-          <w:tab w:val="left" w:pos="426"/>
-          <w:tab w:val="left" w:pos="851"/>
-          <w:tab w:val="left" w:pos="993"/>
-        </w:tabs>
-        <w:spacing w:line="360" w:lineRule="auto"/>
         <w:jc w:val="both"/>
         <w:rPr>
           <w:rFonts w:ascii="Times New Roman" w:hAnsi="Times New Roman" w:cs="Times New Roman"/>
@@ -3374,26 +3067,6 @@
         <w:br/>
         <w:t xml:space="preserve">{{performans_olcum}}</w:t>
       </w:r>
-    </w:p>
-    <w:p>
-      <w:pPr>
-        <w:tabs>
-          <w:tab w:val="left" w:pos="426"/>
-          <w:tab w:val="left" w:pos="851"/>
-          <w:tab w:val="left" w:pos="993"/>
-        </w:tabs>
-        <w:spacing w:line="360" w:lineRule="auto"/>
-        <w:ind w:left="1440"/>
-        <w:jc w:val="both"/>
-        <w:rPr>
-          <w:rFonts w:ascii="Times New Roman" w:hAnsi="Times New Roman" w:cs="Times New Roman"/>
-          <w:b/>
-          <w:color w:val="auto"/>
-          <w:sz w:val="28"/>
-          <w:szCs w:val="28"/>
-          <w:lang w:val="tr-TR" w:eastAsia="tr-TR"/>
-        </w:rPr>
-      </w:pPr>
     </w:p>
     <w:p>
       <w:pPr>
@@ -3446,66 +3119,6 @@
           <w:tab w:val="left" w:pos="993"/>
         </w:tabs>
         <w:spacing w:line="360" w:lineRule="auto"/>
-        <w:ind w:left="1440"/>
-        <w:jc w:val="both"/>
-        <w:rPr>
-          <w:rFonts w:ascii="Times New Roman" w:hAnsi="Times New Roman" w:cs="Times New Roman"/>
-          <w:b/>
-          <w:color w:val="auto"/>
-          <w:sz w:val="28"/>
-          <w:szCs w:val="28"/>
-          <w:lang w:val="tr-TR" w:eastAsia="tr-TR"/>
-        </w:rPr>
-      </w:pPr>
-    </w:p>
-    <w:p>
-      <w:pPr>
-        <w:tabs>
-          <w:tab w:val="left" w:pos="426"/>
-          <w:tab w:val="left" w:pos="851"/>
-          <w:tab w:val="left" w:pos="993"/>
-        </w:tabs>
-        <w:spacing w:line="360" w:lineRule="auto"/>
-        <w:ind w:left="1440"/>
-        <w:jc w:val="both"/>
-        <w:rPr>
-          <w:rFonts w:ascii="Times New Roman" w:hAnsi="Times New Roman" w:cs="Times New Roman"/>
-          <w:b/>
-          <w:color w:val="auto"/>
-          <w:sz w:val="28"/>
-          <w:szCs w:val="28"/>
-          <w:lang w:val="tr-TR" w:eastAsia="tr-TR"/>
-        </w:rPr>
-      </w:pPr>
-    </w:p>
-    <w:p>
-      <w:pPr>
-        <w:tabs>
-          <w:tab w:val="left" w:pos="426"/>
-          <w:tab w:val="left" w:pos="851"/>
-          <w:tab w:val="left" w:pos="993"/>
-        </w:tabs>
-        <w:spacing w:line="360" w:lineRule="auto"/>
-        <w:ind w:left="1440"/>
-        <w:jc w:val="both"/>
-        <w:rPr>
-          <w:rFonts w:ascii="Times New Roman" w:hAnsi="Times New Roman" w:cs="Times New Roman"/>
-          <w:b/>
-          <w:color w:val="auto"/>
-          <w:sz w:val="28"/>
-          <w:szCs w:val="28"/>
-          <w:lang w:val="tr-TR" w:eastAsia="tr-TR"/>
-        </w:rPr>
-      </w:pPr>
-    </w:p>
-    <w:p>
-      <w:pPr>
-        <w:tabs>
-          <w:tab w:val="left" w:pos="426"/>
-          <w:tab w:val="left" w:pos="851"/>
-          <w:tab w:val="left" w:pos="993"/>
-        </w:tabs>
-        <w:spacing w:line="360" w:lineRule="auto"/>
         <w:ind w:left="720"/>
         <w:jc w:val="both"/>
         <w:rPr>
@@ -3562,39 +3175,6 @@
         <w:br/>
         <w:t xml:space="preserve">{{performans_gostergeleri}}</w:t>
       </w:r>
-    </w:p>
-    <w:p>
-      <w:pPr>
-        <w:rPr>
-          <w:rFonts w:ascii="Times New Roman" w:hAnsi="Times New Roman" w:cs="Times New Roman"/>
-          <w:color w:val="auto"/>
-          <w:sz w:val="28"/>
-          <w:szCs w:val="28"/>
-          <w:lang w:val="tr-TR" w:eastAsia="tr-TR"/>
-        </w:rPr>
-      </w:pPr>
-    </w:p>
-    <w:p>
-      <w:pPr>
-        <w:rPr>
-          <w:rFonts w:ascii="Times New Roman" w:hAnsi="Times New Roman" w:cs="Times New Roman"/>
-          <w:color w:val="auto"/>
-          <w:sz w:val="28"/>
-          <w:szCs w:val="28"/>
-          <w:lang w:val="tr-TR" w:eastAsia="tr-TR"/>
-        </w:rPr>
-      </w:pPr>
-    </w:p>
-    <w:p>
-      <w:pPr>
-        <w:rPr>
-          <w:rFonts w:ascii="Times New Roman" w:hAnsi="Times New Roman" w:cs="Times New Roman"/>
-          <w:color w:val="auto"/>
-          <w:sz w:val="28"/>
-          <w:szCs w:val="28"/>
-          <w:lang w:val="tr-TR" w:eastAsia="tr-TR"/>
-        </w:rPr>
-      </w:pPr>
     </w:p>
     <w:p>
       <w:pPr>
@@ -3716,17 +3296,6 @@
         <w:br/>
         <w:t xml:space="preserve">{{hazirlanan_dokumanlar}}</w:t>
       </w:r>
-    </w:p>
-    <w:p>
-      <w:pPr>
-        <w:rPr>
-          <w:rFonts w:ascii="Times New Roman" w:hAnsi="Times New Roman" w:cs="Times New Roman"/>
-          <w:color w:val="auto"/>
-          <w:sz w:val="28"/>
-          <w:szCs w:val="28"/>
-          <w:lang w:val="tr-TR" w:eastAsia="tr-TR"/>
-        </w:rPr>
-      </w:pPr>
     </w:p>
     <w:p>
       <w:pPr>
@@ -4237,42 +3806,6 @@
     </w:tbl>
     <w:p>
       <w:pPr>
-        <w:rPr>
-          <w:rFonts w:ascii="Times New Roman" w:hAnsi="Times New Roman" w:cs="Times New Roman"/>
-          <w:color w:val="auto"/>
-          <w:lang w:val="tr-TR" w:eastAsia="tr-TR"/>
-        </w:rPr>
-      </w:pPr>
-    </w:p>
-    <w:p>
-      <w:pPr>
-        <w:rPr>
-          <w:rFonts w:ascii="Times New Roman" w:hAnsi="Times New Roman" w:cs="Times New Roman"/>
-          <w:color w:val="auto"/>
-          <w:lang w:val="tr-TR" w:eastAsia="tr-TR"/>
-        </w:rPr>
-      </w:pPr>
-    </w:p>
-    <w:p>
-      <w:pPr>
-        <w:rPr>
-          <w:rFonts w:ascii="Times New Roman" w:hAnsi="Times New Roman" w:cs="Times New Roman"/>
-          <w:color w:val="auto"/>
-          <w:lang w:val="tr-TR" w:eastAsia="tr-TR"/>
-        </w:rPr>
-      </w:pPr>
-    </w:p>
-    <w:p>
-      <w:pPr>
-        <w:rPr>
-          <w:rFonts w:ascii="Times New Roman" w:hAnsi="Times New Roman" w:cs="Times New Roman"/>
-          <w:color w:val="auto"/>
-          <w:lang w:val="tr-TR" w:eastAsia="tr-TR"/>
-        </w:rPr>
-      </w:pPr>
-    </w:p>
-    <w:p>
-      <w:pPr>
         <w:numPr>
           <w:ilvl w:val="2"/>
           <w:numId w:val="23"/>
@@ -4596,26 +4129,6 @@
     </w:tbl>
     <w:p>
       <w:pPr>
-        <w:rPr>
-          <w:rFonts w:ascii="Times New Roman" w:hAnsi="Times New Roman" w:cs="Times New Roman"/>
-          <w:sz w:val="28"/>
-          <w:szCs w:val="28"/>
-          <w:lang w:val="tr-TR"/>
-        </w:rPr>
-      </w:pPr>
-    </w:p>
-    <w:p>
-      <w:pPr>
-        <w:rPr>
-          <w:rFonts w:ascii="Times New Roman" w:hAnsi="Times New Roman" w:cs="Times New Roman"/>
-          <w:sz w:val="28"/>
-          <w:szCs w:val="28"/>
-          <w:lang w:val="tr-TR"/>
-        </w:rPr>
-      </w:pPr>
-    </w:p>
-    <w:p>
-      <w:pPr>
         <w:numPr>
           <w:ilvl w:val="1"/>
           <w:numId w:val="23"/>
@@ -4878,17 +4391,6 @@
     </w:tbl>
     <w:p>
       <w:pPr>
-        <w:rPr>
-          <w:rFonts w:ascii="Times New Roman" w:hAnsi="Times New Roman" w:cs="Times New Roman"/>
-          <w:color w:val="auto"/>
-          <w:sz w:val="28"/>
-          <w:szCs w:val="28"/>
-          <w:lang w:val="tr-TR" w:eastAsia="tr-TR"/>
-        </w:rPr>
-      </w:pPr>
-    </w:p>
-    <w:p>
-      <w:pPr>
         <w:numPr>
           <w:ilvl w:val="1"/>
           <w:numId w:val="24"/>
@@ -5232,28 +4734,6 @@
         </w:tc>
       </w:tr>
     </w:tbl>
-    <w:p>
-      <w:pPr>
-        <w:rPr>
-          <w:rFonts w:ascii="Times New Roman" w:hAnsi="Times New Roman" w:cs="Times New Roman"/>
-          <w:color w:val="auto"/>
-          <w:sz w:val="28"/>
-          <w:szCs w:val="28"/>
-          <w:lang w:val="tr-TR" w:eastAsia="tr-TR"/>
-        </w:rPr>
-      </w:pPr>
-    </w:p>
-    <w:p>
-      <w:pPr>
-        <w:rPr>
-          <w:rFonts w:ascii="Times New Roman" w:hAnsi="Times New Roman" w:cs="Times New Roman"/>
-          <w:color w:val="auto"/>
-          <w:sz w:val="28"/>
-          <w:szCs w:val="28"/>
-          <w:lang w:val="tr-TR" w:eastAsia="tr-TR"/>
-        </w:rPr>
-      </w:pPr>
-    </w:p>
     <w:p>
       <w:pPr>
         <w:numPr>
@@ -5744,17 +5224,6 @@
     </w:tbl>
     <w:p>
       <w:pPr>
-        <w:pStyle w:val="Normal"/>
-        <w:rPr>
-          <w:rFonts w:ascii="Times New Roman" w:hAnsi="Times New Roman" w:cs="Times New Roman"/>
-          <w:noProof/>
-          <w:szCs w:val="28"/>
-          <w:lang w:val="tr-TR"/>
-        </w:rPr>
-      </w:pPr>
-    </w:p>
-    <w:p>
-      <w:pPr>
         <w:numPr>
           <w:ilvl w:val="1"/>
           <w:numId w:val="24"/>
@@ -6329,17 +5798,6 @@
     </w:tbl>
     <w:p>
       <w:pPr>
-        <w:jc w:val="both"/>
-        <w:rPr>
-          <w:rFonts w:ascii="Times New Roman" w:hAnsi="Times New Roman" w:cs="Times New Roman"/>
-          <w:noProof/>
-          <w:sz w:val="28"/>
-          <w:lang w:val="tr-TR"/>
-        </w:rPr>
-      </w:pPr>
-    </w:p>
-    <w:p>
-      <w:pPr>
         <w:ind w:left="720"/>
         <w:jc w:val="both"/>
         <w:rPr>
@@ -6432,17 +5890,6 @@
     </w:tbl>
     <w:p>
       <w:pPr>
-        <w:jc w:val="both"/>
-        <w:rPr>
-          <w:rFonts w:ascii="Times New Roman" w:hAnsi="Times New Roman" w:cs="Times New Roman"/>
-          <w:noProof/>
-          <w:sz w:val="28"/>
-          <w:lang w:val="tr-TR"/>
-        </w:rPr>
-      </w:pPr>
-    </w:p>
-    <w:p>
-      <w:pPr>
         <w:ind w:left="720"/>
         <w:jc w:val="both"/>
         <w:rPr>
@@ -6507,39 +5954,6 @@
           <w:lang w:val="tr-TR"/>
         </w:rPr>
       </w:pPr>
-    </w:p>
-    <w:p>
-      <w:pPr>
-        <w:jc w:val="both"/>
-        <w:rPr>
-          <w:rFonts w:ascii="Times New Roman" w:hAnsi="Times New Roman" w:cs="Times New Roman"/>
-          <w:noProof/>
-          <w:sz w:val="28"/>
-          <w:lang w:val="tr-TR"/>
-        </w:rPr>
-      </w:pPr>
-    </w:p>
-    <w:p>
-      <w:pPr>
-        <w:jc w:val="both"/>
-        <w:rPr>
-          <w:rFonts w:ascii="Times New Roman" w:hAnsi="Times New Roman" w:cs="Times New Roman"/>
-          <w:noProof/>
-          <w:sz w:val="28"/>
-          <w:lang w:val="tr-TR"/>
-        </w:rPr>
-      </w:pPr>
-    </w:p>
-    <w:p>
-      <w:pPr>
-        <w:jc w:val="both"/>
-        <w:rPr>
-          <w:rFonts w:ascii="Times New Roman" w:hAnsi="Times New Roman" w:cs="Times New Roman"/>
-          <w:noProof/>
-          <w:sz w:val="28"/>
-          <w:lang w:val="tr-TR"/>
-        </w:rPr>
-      </w:pPr>
       <w:r>
         <w:rPr>
           <w:rFonts w:ascii="Times New Roman" w:hAnsi="Times New Roman" w:cs="Times New Roman"/>
@@ -6587,19 +6001,6 @@
     </w:tbl>
     <w:p>
       <w:pPr>
-        <w:ind w:left="360"/>
-        <w:jc w:val="both"/>
-        <w:rPr>
-          <w:rFonts w:ascii="Times New Roman" w:hAnsi="Times New Roman" w:cs="Times New Roman"/>
-          <w:noProof/>
-          <w:sz w:val="28"/>
-          <w:szCs w:val="28"/>
-          <w:lang w:val="tr-TR"/>
-        </w:rPr>
-      </w:pPr>
-    </w:p>
-    <w:p>
-      <w:pPr>
         <w:jc w:val="both"/>
         <w:rPr>
           <w:rFonts w:ascii="Times New Roman" w:hAnsi="Times New Roman" w:cs="Times New Roman"/>
@@ -6938,18 +6339,6 @@
     </w:tbl>
     <w:p>
       <w:pPr>
-        <w:pStyle w:val="Normal"/>
-        <w:rPr>
-          <w:rFonts w:ascii="Times New Roman" w:hAnsi="Times New Roman" w:cs="Times New Roman"/>
-          <w:bCs w:val="0"/>
-          <w:noProof/>
-          <w:szCs w:val="28"/>
-          <w:lang w:val="tr-TR"/>
-        </w:rPr>
-      </w:pPr>
-    </w:p>
-    <w:p>
-      <w:pPr>
         <w:tabs>
           <w:tab w:val="left" w:pos="567"/>
         </w:tabs>
@@ -7035,42 +6424,6 @@
     </w:p>
     <w:p>
       <w:pPr>
-        <w:jc w:val="both"/>
-        <w:rPr>
-          <w:rFonts w:ascii="Times New Roman" w:hAnsi="Times New Roman" w:cs="Times New Roman"/>
-          <w:b/>
-          <w:color w:val="auto"/>
-          <w:sz w:val="28"/>
-          <w:szCs w:val="28"/>
-          <w:lang w:val="tr-TR" w:eastAsia="tr-TR"/>
-        </w:rPr>
-      </w:pPr>
-    </w:p>
-    <w:p>
-      <w:pPr>
-        <w:rPr>
-          <w:rFonts w:ascii="Times New Roman" w:hAnsi="Times New Roman" w:cs="Times New Roman"/>
-          <w:color w:val="auto"/>
-          <w:sz w:val="28"/>
-          <w:szCs w:val="28"/>
-          <w:lang w:val="tr-TR" w:eastAsia="tr-TR"/>
-        </w:rPr>
-      </w:pPr>
-    </w:p>
-    <w:p>
-      <w:pPr>
-        <w:rPr>
-          <w:rFonts w:ascii="Times New Roman" w:hAnsi="Times New Roman" w:cs="Times New Roman"/>
-          <w:b/>
-          <w:color w:val="auto"/>
-          <w:sz w:val="28"/>
-          <w:szCs w:val="28"/>
-          <w:lang w:val="tr-TR" w:eastAsia="tr-TR"/>
-        </w:rPr>
-      </w:pPr>
-    </w:p>
-    <w:p>
-      <w:pPr>
         <w:rPr>
           <w:rFonts w:ascii="Times New Roman" w:hAnsi="Times New Roman" w:cs="Times New Roman"/>
           <w:color w:val="auto"/>
@@ -7254,18 +6607,6 @@
         <w:br/>
         <w:t xml:space="preserve">{{sosyal_sorunlar}}</w:t>
       </w:r>
-    </w:p>
-    <w:p>
-      <w:pPr>
-        <w:rPr>
-          <w:rFonts w:ascii="Times New Roman" w:hAnsi="Times New Roman" w:cs="Times New Roman"/>
-          <w:b/>
-          <w:color w:val="auto"/>
-          <w:sz w:val="28"/>
-          <w:szCs w:val="28"/>
-          <w:lang w:val="tr-TR" w:eastAsia="tr-TR"/>
-        </w:rPr>
-      </w:pPr>
     </w:p>
     <w:tbl>
       <w:tblPr>
@@ -9368,18 +8709,6 @@
     </w:tbl>
     <w:p>
       <w:pPr>
-        <w:spacing w:line="360" w:lineRule="auto"/>
-        <w:jc w:val="both"/>
-        <w:rPr>
-          <w:rFonts w:ascii="Times New Roman" w:hAnsi="Times New Roman" w:cs="Times New Roman"/>
-          <w:b/>
-          <w:color w:val="auto"/>
-          <w:lang w:val="tr-TR" w:eastAsia="tr-TR"/>
-        </w:rPr>
-      </w:pPr>
-    </w:p>
-    <w:p>
-      <w:pPr>
         <w:rPr>
           <w:rFonts w:ascii="Times New Roman" w:hAnsi="Times New Roman" w:cs="Times New Roman"/>
           <w:color w:val="auto"/>
@@ -10069,50 +9398,6 @@
     </w:tbl>
     <w:p>
       <w:pPr>
-        <w:rPr>
-          <w:rFonts w:ascii="Times New Roman" w:hAnsi="Times New Roman" w:cs="Times New Roman"/>
-          <w:color w:val="auto"/>
-          <w:sz w:val="28"/>
-          <w:szCs w:val="28"/>
-          <w:lang w:val="tr-TR" w:eastAsia="tr-TR"/>
-        </w:rPr>
-      </w:pPr>
-    </w:p>
-    <w:p>
-      <w:pPr>
-        <w:rPr>
-          <w:rFonts w:ascii="Times New Roman" w:hAnsi="Times New Roman" w:cs="Times New Roman"/>
-          <w:color w:val="auto"/>
-          <w:sz w:val="28"/>
-          <w:szCs w:val="28"/>
-          <w:lang w:val="tr-TR" w:eastAsia="tr-TR"/>
-        </w:rPr>
-      </w:pPr>
-    </w:p>
-    <w:p>
-      <w:pPr>
-        <w:rPr>
-          <w:rFonts w:ascii="Times New Roman" w:hAnsi="Times New Roman" w:cs="Times New Roman"/>
-          <w:color w:val="auto"/>
-          <w:sz w:val="28"/>
-          <w:szCs w:val="28"/>
-          <w:lang w:val="tr-TR" w:eastAsia="tr-TR"/>
-        </w:rPr>
-      </w:pPr>
-    </w:p>
-    <w:p>
-      <w:pPr>
-        <w:rPr>
-          <w:rFonts w:ascii="Times New Roman" w:hAnsi="Times New Roman" w:cs="Times New Roman"/>
-          <w:color w:val="auto"/>
-          <w:sz w:val="28"/>
-          <w:szCs w:val="28"/>
-          <w:lang w:val="tr-TR" w:eastAsia="tr-TR"/>
-        </w:rPr>
-      </w:pPr>
-    </w:p>
-    <w:p>
-      <w:pPr>
         <w:spacing w:line="360" w:lineRule="auto"/>
         <w:rPr>
           <w:rFonts w:ascii="Times New Roman" w:hAnsi="Times New Roman" w:cs="Times New Roman"/>
@@ -10353,50 +9638,6 @@
         </w:tc>
       </w:tr>
     </w:tbl>
-    <w:p>
-      <w:pPr>
-        <w:rPr>
-          <w:rFonts w:ascii="Times New Roman" w:hAnsi="Times New Roman" w:cs="Times New Roman"/>
-          <w:color w:val="auto"/>
-          <w:sz w:val="28"/>
-          <w:szCs w:val="28"/>
-          <w:lang w:val="tr-TR" w:eastAsia="tr-TR"/>
-        </w:rPr>
-      </w:pPr>
-    </w:p>
-    <w:p>
-      <w:pPr>
-        <w:rPr>
-          <w:rFonts w:ascii="Times New Roman" w:hAnsi="Times New Roman" w:cs="Times New Roman"/>
-          <w:color w:val="auto"/>
-          <w:sz w:val="28"/>
-          <w:szCs w:val="28"/>
-          <w:lang w:val="tr-TR" w:eastAsia="tr-TR"/>
-        </w:rPr>
-      </w:pPr>
-    </w:p>
-    <w:p>
-      <w:pPr>
-        <w:rPr>
-          <w:rFonts w:ascii="Times New Roman" w:hAnsi="Times New Roman" w:cs="Times New Roman"/>
-          <w:color w:val="auto"/>
-          <w:sz w:val="28"/>
-          <w:szCs w:val="28"/>
-          <w:lang w:val="tr-TR" w:eastAsia="tr-TR"/>
-        </w:rPr>
-      </w:pPr>
-    </w:p>
-    <w:p>
-      <w:pPr>
-        <w:rPr>
-          <w:rFonts w:ascii="Times New Roman" w:hAnsi="Times New Roman" w:cs="Times New Roman"/>
-          <w:color w:val="auto"/>
-          <w:sz w:val="28"/>
-          <w:szCs w:val="28"/>
-          <w:lang w:val="tr-TR" w:eastAsia="tr-TR"/>
-        </w:rPr>
-      </w:pPr>
-    </w:p>
     <w:p>
       <w:pPr>
         <w:tabs>
@@ -11333,17 +10574,6 @@
     </w:tbl>
     <w:p>
       <w:pPr>
-        <w:ind w:left="360"/>
-        <w:jc w:val="both"/>
-        <w:rPr>
-          <w:rFonts w:ascii="Times New Roman" w:hAnsi="Times New Roman" w:cs="Times New Roman"/>
-          <w:color w:val="auto"/>
-          <w:lang w:val="tr-TR" w:eastAsia="tr-TR"/>
-        </w:rPr>
-      </w:pPr>
-    </w:p>
-    <w:p>
-      <w:pPr>
         <w:tabs>
           <w:tab w:val="left" w:pos="426"/>
           <w:tab w:val="left" w:pos="709"/>
@@ -11398,43 +10628,6 @@
           <w:lang w:val="tr-TR" w:eastAsia="tr-TR"/>
         </w:rPr>
       </w:pPr>
-    </w:p>
-    <w:p>
-      <w:pPr>
-        <w:ind w:left="360"/>
-        <w:jc w:val="both"/>
-        <w:rPr>
-          <w:rFonts w:ascii="Times New Roman" w:hAnsi="Times New Roman" w:cs="Times New Roman"/>
-          <w:b/>
-          <w:color w:val="auto"/>
-          <w:lang w:val="tr-TR" w:eastAsia="tr-TR"/>
-        </w:rPr>
-      </w:pPr>
-    </w:p>
-    <w:p>
-      <w:pPr>
-        <w:ind w:left="360"/>
-        <w:jc w:val="both"/>
-        <w:rPr>
-          <w:rFonts w:ascii="Times New Roman" w:hAnsi="Times New Roman" w:cs="Times New Roman"/>
-          <w:b/>
-          <w:color w:val="auto"/>
-          <w:lang w:val="tr-TR" w:eastAsia="tr-TR"/>
-        </w:rPr>
-      </w:pPr>
-    </w:p>
-    <w:p>
-      <w:pPr>
-        <w:jc w:val="both"/>
-        <w:rPr>
-          <w:rFonts w:ascii="Times New Roman" w:hAnsi="Times New Roman" w:cs="Times New Roman"/>
-          <w:b/>
-          <w:color w:val="auto"/>
-          <w:sz w:val="28"/>
-          <w:szCs w:val="28"/>
-          <w:lang w:val="tr-TR" w:eastAsia="tr-TR"/>
-        </w:rPr>
-      </w:pPr>
       <w:r>
         <w:rPr>
           <w:rFonts w:ascii="Times New Roman" w:hAnsi="Times New Roman" w:cs="Times New Roman"/>
@@ -11474,45 +10667,6 @@
           <w:lang w:val="tr-TR" w:eastAsia="tr-TR"/>
         </w:rPr>
       </w:pPr>
-    </w:p>
-    <w:p>
-      <w:pPr>
-        <w:jc w:val="both"/>
-        <w:rPr>
-          <w:rFonts w:ascii="Times New Roman" w:hAnsi="Times New Roman" w:cs="Times New Roman"/>
-          <w:b/>
-          <w:color w:val="auto"/>
-          <w:sz w:val="28"/>
-          <w:szCs w:val="28"/>
-          <w:lang w:val="tr-TR" w:eastAsia="tr-TR"/>
-        </w:rPr>
-      </w:pPr>
-    </w:p>
-    <w:p>
-      <w:pPr>
-        <w:jc w:val="both"/>
-        <w:rPr>
-          <w:rFonts w:ascii="Times New Roman" w:hAnsi="Times New Roman" w:cs="Times New Roman"/>
-          <w:b/>
-          <w:color w:val="auto"/>
-          <w:sz w:val="28"/>
-          <w:szCs w:val="28"/>
-          <w:lang w:val="tr-TR" w:eastAsia="tr-TR"/>
-        </w:rPr>
-      </w:pPr>
-    </w:p>
-    <w:p>
-      <w:pPr>
-        <w:jc w:val="both"/>
-        <w:rPr>
-          <w:rFonts w:ascii="Times New Roman" w:hAnsi="Times New Roman" w:cs="Times New Roman"/>
-          <w:b/>
-          <w:color w:val="auto"/>
-          <w:sz w:val="28"/>
-          <w:szCs w:val="28"/>
-          <w:lang w:val="tr-TR" w:eastAsia="tr-TR"/>
-        </w:rPr>
-      </w:pPr>
       <w:r>
         <w:rPr>
           <w:rFonts w:ascii="Times New Roman" w:hAnsi="Times New Roman" w:cs="Times New Roman"/>
@@ -11539,31 +10693,6 @@
         <w:br/>
         <w:t xml:space="preserve">{{aciklama_yararli}}</w:t>
       </w:r>
-    </w:p>
-    <w:p>
-      <w:pPr>
-        <w:jc w:val="both"/>
-        <w:rPr>
-          <w:rFonts w:ascii="Times New Roman" w:hAnsi="Times New Roman" w:cs="Times New Roman"/>
-          <w:b/>
-          <w:color w:val="auto"/>
-          <w:sz w:val="28"/>
-          <w:szCs w:val="28"/>
-          <w:lang w:val="tr-TR" w:eastAsia="tr-TR"/>
-        </w:rPr>
-      </w:pPr>
-    </w:p>
-    <w:p>
-      <w:pPr>
-        <w:jc w:val="both"/>
-        <w:rPr>
-          <w:rFonts w:ascii="Times New Roman" w:hAnsi="Times New Roman" w:cs="Times New Roman"/>
-          <w:color w:val="auto"/>
-          <w:sz w:val="28"/>
-          <w:szCs w:val="28"/>
-          <w:lang w:val="tr-TR" w:eastAsia="tr-TR"/>
-        </w:rPr>
-      </w:pPr>
     </w:p>
     <w:p>
       <w:pPr>
@@ -11899,50 +11028,6 @@
     </w:tbl>
     <w:p>
       <w:pPr>
-        <w:rPr>
-          <w:rFonts w:ascii="Times New Roman" w:hAnsi="Times New Roman" w:cs="Times New Roman"/>
-          <w:color w:val="auto"/>
-          <w:sz w:val="28"/>
-          <w:szCs w:val="28"/>
-          <w:lang w:val="tr-TR" w:eastAsia="tr-TR"/>
-        </w:rPr>
-      </w:pPr>
-    </w:p>
-    <w:p>
-      <w:pPr>
-        <w:rPr>
-          <w:rFonts w:ascii="Times New Roman" w:hAnsi="Times New Roman" w:cs="Times New Roman"/>
-          <w:color w:val="auto"/>
-          <w:sz w:val="28"/>
-          <w:szCs w:val="28"/>
-          <w:lang w:val="tr-TR" w:eastAsia="tr-TR"/>
-        </w:rPr>
-      </w:pPr>
-    </w:p>
-    <w:p>
-      <w:pPr>
-        <w:rPr>
-          <w:rFonts w:ascii="Times New Roman" w:hAnsi="Times New Roman" w:cs="Times New Roman"/>
-          <w:color w:val="auto"/>
-          <w:sz w:val="28"/>
-          <w:szCs w:val="28"/>
-          <w:lang w:val="tr-TR" w:eastAsia="tr-TR"/>
-        </w:rPr>
-      </w:pPr>
-    </w:p>
-    <w:p>
-      <w:pPr>
-        <w:rPr>
-          <w:rFonts w:ascii="Times New Roman" w:hAnsi="Times New Roman" w:cs="Times New Roman"/>
-          <w:color w:val="auto"/>
-          <w:sz w:val="28"/>
-          <w:szCs w:val="28"/>
-          <w:lang w:val="tr-TR" w:eastAsia="tr-TR"/>
-        </w:rPr>
-      </w:pPr>
-    </w:p>
-    <w:p>
-      <w:pPr>
         <w:jc w:val="both"/>
         <w:rPr>
           <w:rFonts w:ascii="Times New Roman" w:hAnsi="Times New Roman" w:cs="Times New Roman"/>
@@ -12022,41 +11107,6 @@
         <w:br/>
         <w:t xml:space="preserve">{{yapilamayan_isler}}</w:t>
       </w:r>
-    </w:p>
-    <w:p>
-      <w:pPr>
-        <w:jc w:val="both"/>
-        <w:rPr>
-          <w:rFonts w:ascii="Times New Roman" w:hAnsi="Times New Roman" w:cs="Times New Roman"/>
-          <w:color w:val="auto"/>
-          <w:sz w:val="28"/>
-          <w:szCs w:val="28"/>
-          <w:lang w:val="tr-TR" w:eastAsia="tr-TR"/>
-        </w:rPr>
-      </w:pPr>
-    </w:p>
-    <w:p>
-      <w:pPr>
-        <w:jc w:val="both"/>
-        <w:rPr>
-          <w:rFonts w:ascii="Times New Roman" w:hAnsi="Times New Roman" w:cs="Times New Roman"/>
-          <w:color w:val="auto"/>
-          <w:sz w:val="28"/>
-          <w:szCs w:val="28"/>
-          <w:lang w:val="tr-TR" w:eastAsia="tr-TR"/>
-        </w:rPr>
-      </w:pPr>
-    </w:p>
-    <w:p>
-      <w:pPr>
-        <w:rPr>
-          <w:rFonts w:ascii="Times New Roman" w:hAnsi="Times New Roman" w:cs="Times New Roman"/>
-          <w:color w:val="auto"/>
-          <w:sz w:val="28"/>
-          <w:szCs w:val="28"/>
-          <w:lang w:val="tr-TR" w:eastAsia="tr-TR"/>
-        </w:rPr>
-      </w:pPr>
     </w:p>
     <w:p>
       <w:pPr>
@@ -12278,54 +11328,6 @@
         </w:tc>
       </w:tr>
     </w:tbl>
-    <w:p>
-      <w:pPr>
-        <w:rPr>
-          <w:rFonts w:ascii="Times New Roman" w:hAnsi="Times New Roman" w:cs="Times New Roman"/>
-          <w:b/>
-          <w:color w:val="auto"/>
-          <w:sz w:val="28"/>
-          <w:szCs w:val="28"/>
-          <w:lang w:val="tr-TR" w:eastAsia="tr-TR"/>
-        </w:rPr>
-      </w:pPr>
-    </w:p>
-    <w:p>
-      <w:pPr>
-        <w:rPr>
-          <w:rFonts w:ascii="Times New Roman" w:hAnsi="Times New Roman" w:cs="Times New Roman"/>
-          <w:b/>
-          <w:color w:val="auto"/>
-          <w:sz w:val="28"/>
-          <w:szCs w:val="28"/>
-          <w:lang w:val="tr-TR" w:eastAsia="tr-TR"/>
-        </w:rPr>
-      </w:pPr>
-    </w:p>
-    <w:p>
-      <w:pPr>
-        <w:rPr>
-          <w:rFonts w:ascii="Times New Roman" w:hAnsi="Times New Roman" w:cs="Times New Roman"/>
-          <w:b/>
-          <w:color w:val="auto"/>
-          <w:sz w:val="28"/>
-          <w:szCs w:val="28"/>
-          <w:lang w:val="tr-TR" w:eastAsia="tr-TR"/>
-        </w:rPr>
-      </w:pPr>
-    </w:p>
-    <w:p>
-      <w:pPr>
-        <w:rPr>
-          <w:rFonts w:ascii="Times New Roman" w:hAnsi="Times New Roman" w:cs="Times New Roman"/>
-          <w:b/>
-          <w:color w:val="auto"/>
-          <w:sz w:val="28"/>
-          <w:szCs w:val="28"/>
-          <w:lang w:val="tr-TR" w:eastAsia="tr-TR"/>
-        </w:rPr>
-      </w:pPr>
-    </w:p>
     <w:tbl>
       <w:tblPr>
         <w:tblW w:w="0" w:type="auto"/>
@@ -12514,62 +11516,6 @@
         <w:jc w:val="both"/>
         <w:rPr>
           <w:rFonts w:ascii="Times New Roman" w:hAnsi="Times New Roman" w:cs="Times New Roman"/>
-          <w:b/>
-          <w:color w:val="auto"/>
-          <w:sz w:val="28"/>
-          <w:szCs w:val="28"/>
-          <w:lang w:val="tr-TR" w:eastAsia="tr-TR"/>
-        </w:rPr>
-      </w:pPr>
-    </w:p>
-    <w:p>
-      <w:pPr>
-        <w:spacing w:line="360" w:lineRule="auto"/>
-        <w:jc w:val="both"/>
-        <w:rPr>
-          <w:rFonts w:ascii="Times New Roman" w:hAnsi="Times New Roman" w:cs="Times New Roman"/>
-          <w:b/>
-          <w:color w:val="auto"/>
-          <w:sz w:val="28"/>
-          <w:szCs w:val="28"/>
-          <w:lang w:val="tr-TR" w:eastAsia="tr-TR"/>
-        </w:rPr>
-      </w:pPr>
-    </w:p>
-    <w:p>
-      <w:pPr>
-        <w:spacing w:line="360" w:lineRule="auto"/>
-        <w:jc w:val="both"/>
-        <w:rPr>
-          <w:rFonts w:ascii="Times New Roman" w:hAnsi="Times New Roman" w:cs="Times New Roman"/>
-          <w:b/>
-          <w:color w:val="auto"/>
-          <w:sz w:val="28"/>
-          <w:szCs w:val="28"/>
-          <w:lang w:val="tr-TR" w:eastAsia="tr-TR"/>
-        </w:rPr>
-      </w:pPr>
-    </w:p>
-    <w:p>
-      <w:pPr>
-        <w:spacing w:line="360" w:lineRule="auto"/>
-        <w:jc w:val="both"/>
-        <w:rPr>
-          <w:rFonts w:ascii="Times New Roman" w:hAnsi="Times New Roman" w:cs="Times New Roman"/>
-          <w:b/>
-          <w:color w:val="auto"/>
-          <w:sz w:val="28"/>
-          <w:szCs w:val="28"/>
-          <w:lang w:val="tr-TR" w:eastAsia="tr-TR"/>
-        </w:rPr>
-      </w:pPr>
-    </w:p>
-    <w:p>
-      <w:pPr>
-        <w:spacing w:line="360" w:lineRule="auto"/>
-        <w:jc w:val="both"/>
-        <w:rPr>
-          <w:rFonts w:ascii="Times New Roman" w:hAnsi="Times New Roman" w:cs="Times New Roman"/>
           <w:color w:val="auto"/>
           <w:sz w:val="28"/>
           <w:szCs w:val="28"/>
@@ -12775,34 +11721,6 @@
         </w:tc>
       </w:tr>
     </w:tbl>
-    <w:p>
-      <w:pPr>
-        <w:spacing w:line="360" w:lineRule="auto"/>
-        <w:jc w:val="both"/>
-        <w:rPr>
-          <w:rFonts w:ascii="Times New Roman" w:hAnsi="Times New Roman" w:cs="Times New Roman"/>
-          <w:b/>
-          <w:color w:val="auto"/>
-          <w:sz w:val="28"/>
-          <w:szCs w:val="28"/>
-          <w:lang w:val="tr-TR" w:eastAsia="tr-TR"/>
-        </w:rPr>
-      </w:pPr>
-    </w:p>
-    <w:p>
-      <w:pPr>
-        <w:spacing w:line="360" w:lineRule="auto"/>
-        <w:jc w:val="both"/>
-        <w:rPr>
-          <w:rFonts w:ascii="Times New Roman" w:hAnsi="Times New Roman" w:cs="Times New Roman"/>
-          <w:b/>
-          <w:color w:val="auto"/>
-          <w:sz w:val="28"/>
-          <w:szCs w:val="28"/>
-          <w:lang w:val="tr-TR" w:eastAsia="tr-TR"/>
-        </w:rPr>
-      </w:pPr>
-    </w:p>
     <w:p>
       <w:pPr>
         <w:spacing w:line="360" w:lineRule="auto"/>
@@ -13027,54 +11945,6 @@
     </w:tbl>
     <w:p>
       <w:pPr>
-        <w:rPr>
-          <w:rFonts w:ascii="Times New Roman" w:hAnsi="Times New Roman" w:cs="Times New Roman"/>
-          <w:b/>
-          <w:color w:val="auto"/>
-          <w:sz w:val="28"/>
-          <w:szCs w:val="28"/>
-          <w:lang w:val="tr-TR" w:eastAsia="tr-TR"/>
-        </w:rPr>
-      </w:pPr>
-    </w:p>
-    <w:p>
-      <w:pPr>
-        <w:rPr>
-          <w:rFonts w:ascii="Times New Roman" w:hAnsi="Times New Roman" w:cs="Times New Roman"/>
-          <w:b/>
-          <w:color w:val="auto"/>
-          <w:sz w:val="28"/>
-          <w:szCs w:val="28"/>
-          <w:lang w:val="tr-TR" w:eastAsia="tr-TR"/>
-        </w:rPr>
-      </w:pPr>
-    </w:p>
-    <w:p>
-      <w:pPr>
-        <w:rPr>
-          <w:rFonts w:ascii="Times New Roman" w:hAnsi="Times New Roman" w:cs="Times New Roman"/>
-          <w:b/>
-          <w:color w:val="auto"/>
-          <w:sz w:val="28"/>
-          <w:szCs w:val="28"/>
-          <w:lang w:val="tr-TR" w:eastAsia="tr-TR"/>
-        </w:rPr>
-      </w:pPr>
-    </w:p>
-    <w:p>
-      <w:pPr>
-        <w:rPr>
-          <w:rFonts w:ascii="Times New Roman" w:hAnsi="Times New Roman" w:cs="Times New Roman"/>
-          <w:b/>
-          <w:color w:val="auto"/>
-          <w:sz w:val="28"/>
-          <w:szCs w:val="28"/>
-          <w:lang w:val="tr-TR" w:eastAsia="tr-TR"/>
-        </w:rPr>
-      </w:pPr>
-    </w:p>
-    <w:p>
-      <w:pPr>
         <w:numPr>
           <w:ilvl w:val="1"/>
           <w:numId w:val="26"/>
@@ -13346,45 +12216,6 @@
     </w:p>
     <w:p>
       <w:pPr>
-        <w:ind w:left="360"/>
-        <w:jc w:val="both"/>
-        <w:rPr>
-          <w:rFonts w:ascii="Times New Roman" w:hAnsi="Times New Roman" w:cs="Times New Roman"/>
-          <w:color w:val="auto"/>
-          <w:sz w:val="28"/>
-          <w:szCs w:val="28"/>
-          <w:lang w:val="tr-TR" w:eastAsia="tr-TR"/>
-        </w:rPr>
-      </w:pPr>
-    </w:p>
-    <w:p>
-      <w:pPr>
-        <w:ind w:left="360"/>
-        <w:jc w:val="both"/>
-        <w:rPr>
-          <w:rFonts w:ascii="Times New Roman" w:hAnsi="Times New Roman" w:cs="Times New Roman"/>
-          <w:color w:val="auto"/>
-          <w:sz w:val="28"/>
-          <w:szCs w:val="28"/>
-          <w:lang w:val="tr-TR" w:eastAsia="tr-TR"/>
-        </w:rPr>
-      </w:pPr>
-    </w:p>
-    <w:p>
-      <w:pPr>
-        <w:ind w:left="360"/>
-        <w:jc w:val="both"/>
-        <w:rPr>
-          <w:rFonts w:ascii="Times New Roman" w:hAnsi="Times New Roman" w:cs="Times New Roman"/>
-          <w:color w:val="auto"/>
-          <w:sz w:val="28"/>
-          <w:szCs w:val="28"/>
-          <w:lang w:val="tr-TR" w:eastAsia="tr-TR"/>
-        </w:rPr>
-      </w:pPr>
-    </w:p>
-    <w:p>
-      <w:pPr>
         <w:numPr>
           <w:ilvl w:val="1"/>
           <w:numId w:val="26"/>
@@ -13425,44 +12256,6 @@
         <w:br/>
         <w:t xml:space="preserve">{{kac_kisi}}</w:t>
       </w:r>
-    </w:p>
-    <w:p>
-      <w:pPr>
-        <w:jc w:val="both"/>
-        <w:rPr>
-          <w:rFonts w:ascii="Times New Roman" w:hAnsi="Times New Roman" w:cs="Times New Roman"/>
-          <w:b/>
-          <w:color w:val="auto"/>
-          <w:sz w:val="28"/>
-          <w:szCs w:val="28"/>
-          <w:lang w:val="tr-TR" w:eastAsia="tr-TR"/>
-        </w:rPr>
-      </w:pPr>
-    </w:p>
-    <w:p>
-      <w:pPr>
-        <w:jc w:val="both"/>
-        <w:rPr>
-          <w:rFonts w:ascii="Times New Roman" w:hAnsi="Times New Roman" w:cs="Times New Roman"/>
-          <w:b/>
-          <w:color w:val="auto"/>
-          <w:sz w:val="28"/>
-          <w:szCs w:val="28"/>
-          <w:lang w:val="tr-TR" w:eastAsia="tr-TR"/>
-        </w:rPr>
-      </w:pPr>
-    </w:p>
-    <w:p>
-      <w:pPr>
-        <w:rPr>
-          <w:rFonts w:ascii="Times New Roman" w:hAnsi="Times New Roman" w:cs="Times New Roman"/>
-          <w:b/>
-          <w:color w:val="auto"/>
-          <w:sz w:val="28"/>
-          <w:szCs w:val="28"/>
-          <w:lang w:val="tr-TR" w:eastAsia="tr-TR"/>
-        </w:rPr>
-      </w:pPr>
     </w:p>
     <w:p>
       <w:pPr>
@@ -13500,46 +12293,6 @@
     </w:p>
     <w:p>
       <w:pPr>
-        <w:spacing w:line="360" w:lineRule="auto"/>
-        <w:jc w:val="both"/>
-        <w:rPr>
-          <w:rFonts w:ascii="Times New Roman" w:hAnsi="Times New Roman" w:cs="Times New Roman"/>
-          <w:b/>
-          <w:color w:val="auto"/>
-          <w:sz w:val="28"/>
-          <w:szCs w:val="28"/>
-          <w:lang w:val="tr-TR" w:eastAsia="tr-TR"/>
-        </w:rPr>
-      </w:pPr>
-    </w:p>
-    <w:p>
-      <w:pPr>
-        <w:spacing w:line="360" w:lineRule="auto"/>
-        <w:jc w:val="both"/>
-        <w:rPr>
-          <w:rFonts w:ascii="Times New Roman" w:hAnsi="Times New Roman" w:cs="Times New Roman"/>
-          <w:color w:val="auto"/>
-          <w:sz w:val="28"/>
-          <w:szCs w:val="28"/>
-          <w:lang w:val="tr-TR" w:eastAsia="tr-TR"/>
-        </w:rPr>
-      </w:pPr>
-    </w:p>
-    <w:p>
-      <w:pPr>
-        <w:spacing w:line="360" w:lineRule="auto"/>
-        <w:jc w:val="both"/>
-        <w:rPr>
-          <w:rFonts w:ascii="Times New Roman" w:hAnsi="Times New Roman" w:cs="Times New Roman"/>
-          <w:color w:val="auto"/>
-          <w:sz w:val="28"/>
-          <w:szCs w:val="28"/>
-          <w:lang w:val="tr-TR" w:eastAsia="tr-TR"/>
-        </w:rPr>
-      </w:pPr>
-    </w:p>
-    <w:p>
-      <w:pPr>
         <w:numPr>
           <w:ilvl w:val="1"/>
           <w:numId w:val="26"/>
@@ -13573,45 +12326,6 @@
     </w:p>
     <w:p>
       <w:pPr>
-        <w:spacing w:line="360" w:lineRule="auto"/>
-        <w:jc w:val="both"/>
-        <w:rPr>
-          <w:rFonts w:ascii="Times New Roman" w:hAnsi="Times New Roman" w:cs="Times New Roman"/>
-          <w:color w:val="auto"/>
-          <w:sz w:val="28"/>
-          <w:szCs w:val="28"/>
-          <w:lang w:val="tr-TR" w:eastAsia="tr-TR"/>
-        </w:rPr>
-      </w:pPr>
-    </w:p>
-    <w:p>
-      <w:pPr>
-        <w:spacing w:line="360" w:lineRule="auto"/>
-        <w:jc w:val="both"/>
-        <w:rPr>
-          <w:rFonts w:ascii="Times New Roman" w:hAnsi="Times New Roman" w:cs="Times New Roman"/>
-          <w:color w:val="auto"/>
-          <w:sz w:val="28"/>
-          <w:szCs w:val="28"/>
-          <w:lang w:val="tr-TR" w:eastAsia="tr-TR"/>
-        </w:rPr>
-      </w:pPr>
-    </w:p>
-    <w:p>
-      <w:pPr>
-        <w:spacing w:line="360" w:lineRule="auto"/>
-        <w:jc w:val="both"/>
-        <w:rPr>
-          <w:rFonts w:ascii="Times New Roman" w:hAnsi="Times New Roman" w:cs="Times New Roman"/>
-          <w:color w:val="auto"/>
-          <w:sz w:val="28"/>
-          <w:szCs w:val="28"/>
-          <w:lang w:val="tr-TR" w:eastAsia="tr-TR"/>
-        </w:rPr>
-      </w:pPr>
-    </w:p>
-    <w:p>
-      <w:pPr>
         <w:numPr>
           <w:ilvl w:val="1"/>
           <w:numId w:val="26"/>
@@ -13645,46 +12359,6 @@
     </w:p>
     <w:p>
       <w:pPr>
-        <w:spacing w:line="360" w:lineRule="auto"/>
-        <w:jc w:val="both"/>
-        <w:rPr>
-          <w:rFonts w:ascii="Times New Roman" w:hAnsi="Times New Roman" w:cs="Times New Roman"/>
-          <w:b/>
-          <w:color w:val="auto"/>
-          <w:sz w:val="28"/>
-          <w:szCs w:val="28"/>
-          <w:lang w:val="tr-TR" w:eastAsia="tr-TR"/>
-        </w:rPr>
-      </w:pPr>
-    </w:p>
-    <w:p>
-      <w:pPr>
-        <w:spacing w:line="360" w:lineRule="auto"/>
-        <w:jc w:val="both"/>
-        <w:rPr>
-          <w:rFonts w:ascii="Times New Roman" w:hAnsi="Times New Roman" w:cs="Times New Roman"/>
-          <w:b/>
-          <w:color w:val="auto"/>
-          <w:sz w:val="28"/>
-          <w:szCs w:val="28"/>
-          <w:lang w:val="tr-TR" w:eastAsia="tr-TR"/>
-        </w:rPr>
-      </w:pPr>
-    </w:p>
-    <w:p>
-      <w:pPr>
-        <w:rPr>
-          <w:rFonts w:ascii="Times New Roman" w:hAnsi="Times New Roman" w:cs="Times New Roman"/>
-          <w:b/>
-          <w:color w:val="auto"/>
-          <w:sz w:val="28"/>
-          <w:szCs w:val="28"/>
-          <w:lang w:val="tr-TR" w:eastAsia="tr-TR"/>
-        </w:rPr>
-      </w:pPr>
-    </w:p>
-    <w:p>
-      <w:pPr>
         <w:numPr>
           <w:ilvl w:val="1"/>
           <w:numId w:val="26"/>
@@ -13718,19 +12392,6 @@
     </w:p>
     <w:p>
       <w:pPr>
-        <w:spacing w:line="360" w:lineRule="auto"/>
-        <w:jc w:val="both"/>
-        <w:rPr>
-          <w:rFonts w:ascii="Times New Roman" w:hAnsi="Times New Roman" w:cs="Times New Roman"/>
-          <w:color w:val="auto"/>
-          <w:sz w:val="28"/>
-          <w:szCs w:val="28"/>
-          <w:lang w:val="tr-TR" w:eastAsia="tr-TR"/>
-        </w:rPr>
-      </w:pPr>
-    </w:p>
-    <w:p>
-      <w:pPr>
         <w:numPr>
           <w:ilvl w:val="1"/>
           <w:numId w:val="26"/>
@@ -13761,47 +12422,6 @@
         <w:br/>
         <w:t xml:space="preserve">{{iyilestirme_engelleri}}</w:t>
       </w:r>
-    </w:p>
-    <w:p>
-      <w:pPr>
-        <w:pStyle w:val="ListeParagraf"/>
-        <w:rPr>
-          <w:rFonts w:ascii="Times New Roman" w:hAnsi="Times New Roman" w:cs="Times New Roman"/>
-          <w:b/>
-          <w:color w:val="auto"/>
-          <w:sz w:val="28"/>
-          <w:szCs w:val="28"/>
-          <w:lang w:val="tr-TR" w:eastAsia="tr-TR"/>
-        </w:rPr>
-      </w:pPr>
-    </w:p>
-    <w:p>
-      <w:pPr>
-        <w:spacing w:line="360" w:lineRule="auto"/>
-        <w:ind w:left="360"/>
-        <w:jc w:val="both"/>
-        <w:rPr>
-          <w:rFonts w:ascii="Times New Roman" w:hAnsi="Times New Roman" w:cs="Times New Roman"/>
-          <w:b/>
-          <w:color w:val="auto"/>
-          <w:sz w:val="28"/>
-          <w:szCs w:val="28"/>
-          <w:lang w:val="tr-TR" w:eastAsia="tr-TR"/>
-        </w:rPr>
-      </w:pPr>
-    </w:p>
-    <w:p>
-      <w:pPr>
-        <w:spacing w:line="360" w:lineRule="auto"/>
-        <w:jc w:val="both"/>
-        <w:rPr>
-          <w:rFonts w:ascii="Times New Roman" w:hAnsi="Times New Roman" w:cs="Times New Roman"/>
-          <w:color w:val="auto"/>
-          <w:sz w:val="28"/>
-          <w:szCs w:val="28"/>
-          <w:lang w:val="tr-TR" w:eastAsia="tr-TR"/>
-        </w:rPr>
-      </w:pPr>
     </w:p>
     <w:p>
       <w:pPr>
@@ -13981,17 +12601,6 @@
     </w:tbl>
     <w:p>
       <w:pPr>
-        <w:jc w:val="both"/>
-        <w:rPr>
-          <w:rFonts w:ascii="Times New Roman" w:hAnsi="Times New Roman" w:cs="Times New Roman"/>
-          <w:noProof/>
-          <w:sz w:val="28"/>
-          <w:lang w:val="tr-TR"/>
-        </w:rPr>
-      </w:pPr>
-    </w:p>
-    <w:p>
-      <w:pPr>
         <w:ind w:left="360"/>
         <w:jc w:val="both"/>
         <w:rPr>
@@ -14048,42 +12657,6 @@
     </w:tbl>
     <w:p>
       <w:pPr>
-        <w:ind w:left="720"/>
-        <w:jc w:val="both"/>
-        <w:rPr>
-          <w:rFonts w:ascii="Times New Roman" w:hAnsi="Times New Roman" w:cs="Times New Roman"/>
-          <w:noProof/>
-          <w:sz w:val="28"/>
-          <w:lang w:val="tr-TR"/>
-        </w:rPr>
-      </w:pPr>
-    </w:p>
-    <w:p>
-      <w:pPr>
-        <w:ind w:left="720"/>
-        <w:jc w:val="both"/>
-        <w:rPr>
-          <w:rFonts w:ascii="Times New Roman" w:hAnsi="Times New Roman" w:cs="Times New Roman"/>
-          <w:noProof/>
-          <w:sz w:val="28"/>
-          <w:lang w:val="tr-TR"/>
-        </w:rPr>
-      </w:pPr>
-    </w:p>
-    <w:p>
-      <w:pPr>
-        <w:ind w:left="720"/>
-        <w:jc w:val="both"/>
-        <w:rPr>
-          <w:rFonts w:ascii="Times New Roman" w:hAnsi="Times New Roman" w:cs="Times New Roman"/>
-          <w:noProof/>
-          <w:sz w:val="28"/>
-          <w:lang w:val="tr-TR"/>
-        </w:rPr>
-      </w:pPr>
-    </w:p>
-    <w:p>
-      <w:pPr>
         <w:pStyle w:val="Balk1"/>
         <w:rPr>
           <w:rFonts w:ascii="Times New Roman" w:hAnsi="Times New Roman" w:cs="Times New Roman"/>
@@ -14235,30 +12808,6 @@
     </w:tbl>
     <w:p>
       <w:pPr>
-        <w:ind w:left="720"/>
-        <w:jc w:val="both"/>
-        <w:rPr>
-          <w:rFonts w:ascii="Times New Roman" w:hAnsi="Times New Roman" w:cs="Times New Roman"/>
-          <w:noProof/>
-          <w:sz w:val="28"/>
-          <w:lang w:val="tr-TR"/>
-        </w:rPr>
-      </w:pPr>
-    </w:p>
-    <w:p>
-      <w:pPr>
-        <w:ind w:left="720"/>
-        <w:jc w:val="both"/>
-        <w:rPr>
-          <w:rFonts w:ascii="Times New Roman" w:hAnsi="Times New Roman" w:cs="Times New Roman"/>
-          <w:noProof/>
-          <w:sz w:val="28"/>
-          <w:lang w:val="tr-TR"/>
-        </w:rPr>
-      </w:pPr>
-    </w:p>
-    <w:p>
-      <w:pPr>
         <w:ind w:left="720" w:hanging="360"/>
         <w:jc w:val="both"/>
         <w:rPr>
@@ -14333,24 +12882,6 @@
     </w:tbl>
     <w:p>
       <w:pPr>
-        <w:rPr>
-          <w:rFonts w:ascii="Times New Roman" w:hAnsi="Times New Roman" w:cs="Times New Roman"/>
-          <w:noProof/>
-          <w:lang w:val="tr-TR"/>
-        </w:rPr>
-      </w:pPr>
-    </w:p>
-    <w:p>
-      <w:pPr>
-        <w:rPr>
-          <w:rFonts w:ascii="Times New Roman" w:hAnsi="Times New Roman" w:cs="Times New Roman"/>
-          <w:noProof/>
-          <w:lang w:val="tr-TR"/>
-        </w:rPr>
-      </w:pPr>
-    </w:p>
-    <w:p>
-      <w:pPr>
         <w:ind w:left="720" w:hanging="360"/>
         <w:jc w:val="both"/>
         <w:rPr>
@@ -14417,24 +12948,6 @@
         </w:tc>
       </w:tr>
     </w:tbl>
-    <w:p>
-      <w:pPr>
-        <w:rPr>
-          <w:rFonts w:ascii="Times New Roman" w:hAnsi="Times New Roman" w:cs="Times New Roman"/>
-          <w:noProof/>
-          <w:lang w:val="tr-TR"/>
-        </w:rPr>
-      </w:pPr>
-    </w:p>
-    <w:p>
-      <w:pPr>
-        <w:rPr>
-          <w:rFonts w:ascii="Times New Roman" w:hAnsi="Times New Roman" w:cs="Times New Roman"/>
-          <w:noProof/>
-          <w:lang w:val="tr-TR"/>
-        </w:rPr>
-      </w:pPr>
-    </w:p>
     <w:p>
       <w:pPr>
         <w:pStyle w:val="Balk1"/>
@@ -14766,30 +13279,6 @@
     </w:tbl>
     <w:p>
       <w:pPr>
-        <w:jc w:val="both"/>
-        <w:rPr>
-          <w:rFonts w:ascii="Times New Roman" w:hAnsi="Times New Roman" w:cs="Times New Roman"/>
-          <w:b/>
-          <w:bCs/>
-          <w:noProof/>
-          <w:sz w:val="28"/>
-          <w:lang w:val="tr-TR"/>
-        </w:rPr>
-      </w:pPr>
-      <w:r>
-        <w:rPr>
-          <w:rFonts w:ascii="Times New Roman" w:hAnsi="Times New Roman" w:cs="Times New Roman"/>
-          <w:b/>
-          <w:bCs/>
-          <w:noProof/>
-          <w:sz w:val="28"/>
-          <w:lang w:val="tr-TR"/>
-        </w:rPr>
-        <w:t xml:space="preserve">            </w:t>
-      </w:r>
-    </w:p>
-    <w:p>
-      <w:pPr>
         <w:ind w:left="720" w:hanging="360"/>
         <w:jc w:val="both"/>
         <w:rPr>
@@ -15013,23 +13502,6 @@
     </w:tbl>
     <w:p>
       <w:pPr>
-        <w:pStyle w:val="Normal"/>
-        <w:rPr>
-          <w:rFonts w:ascii="Times New Roman" w:hAnsi="Times New Roman" w:cs="Times New Roman"/>
-          <w:noProof/>
-          <w:lang w:val="tr-TR"/>
-        </w:rPr>
-      </w:pPr>
-    </w:p>
-    <w:p>
-      <w:pPr>
-        <w:rPr>
-          <w:lang w:val="tr-TR"/>
-        </w:rPr>
-      </w:pPr>
-    </w:p>
-    <w:p>
-      <w:pPr>
         <w:ind w:left="720" w:hanging="360"/>
         <w:jc w:val="both"/>
         <w:rPr>
@@ -15145,18 +13617,6 @@
         </w:rPr>
         <w:tab/>
       </w:r>
-    </w:p>
-    <w:p>
-      <w:pPr>
-        <w:ind w:left="720"/>
-        <w:jc w:val="both"/>
-        <w:rPr>
-          <w:rFonts w:ascii="Times New Roman" w:hAnsi="Times New Roman" w:cs="Times New Roman"/>
-          <w:noProof/>
-          <w:sz w:val="28"/>
-          <w:lang w:val="tr-TR"/>
-        </w:rPr>
-      </w:pPr>
     </w:p>
     <w:p>
       <w:pPr>
@@ -15358,28 +13818,6 @@
     </w:tbl>
     <w:p>
       <w:pPr>
-        <w:pStyle w:val="Normal"/>
-        <w:rPr>
-          <w:rFonts w:ascii="Times New Roman" w:hAnsi="Times New Roman" w:cs="Times New Roman"/>
-          <w:noProof/>
-          <w:lang w:val="tr-TR"/>
-        </w:rPr>
-      </w:pPr>
-    </w:p>
-    <w:p>
-      <w:pPr>
-        <w:ind w:left="720"/>
-        <w:jc w:val="both"/>
-        <w:rPr>
-          <w:rFonts w:ascii="Times New Roman" w:hAnsi="Times New Roman" w:cs="Times New Roman"/>
-          <w:noProof/>
-          <w:sz w:val="28"/>
-          <w:lang w:val="tr-TR"/>
-        </w:rPr>
-      </w:pPr>
-    </w:p>
-    <w:p>
-      <w:pPr>
         <w:ind w:left="720" w:hanging="360"/>
         <w:jc w:val="both"/>
         <w:rPr>
@@ -15596,16 +14034,6 @@
     </w:tbl>
     <w:p>
       <w:pPr>
-        <w:pStyle w:val="Normal"/>
-        <w:rPr>
-          <w:rFonts w:ascii="Times New Roman" w:hAnsi="Times New Roman" w:cs="Times New Roman"/>
-          <w:noProof/>
-          <w:lang w:val="tr-TR"/>
-        </w:rPr>
-      </w:pPr>
-    </w:p>
-    <w:p>
-      <w:pPr>
         <w:pStyle w:val="Balk1"/>
         <w:rPr>
           <w:rFonts w:ascii="Times New Roman" w:hAnsi="Times New Roman" w:cs="Times New Roman"/>
@@ -15767,18 +14195,6 @@
         <w:tab/>
         <w:t>(Eğer cevabınız hayır ise aşağıdaki maddeleri geçiniz)</w:t>
       </w:r>
-    </w:p>
-    <w:p>
-      <w:pPr>
-        <w:ind w:left="720"/>
-        <w:jc w:val="both"/>
-        <w:rPr>
-          <w:rFonts w:ascii="Times New Roman" w:hAnsi="Times New Roman" w:cs="Times New Roman"/>
-          <w:noProof/>
-          <w:sz w:val="28"/>
-          <w:lang w:val="tr-TR"/>
-        </w:rPr>
-      </w:pPr>
     </w:p>
     <w:p>
       <w:pPr>
@@ -15917,17 +14333,6 @@
           <w:lang w:val="tr-TR"/>
         </w:rPr>
       </w:pPr>
-    </w:p>
-    <w:p>
-      <w:pPr>
-        <w:jc w:val="both"/>
-        <w:rPr>
-          <w:rFonts w:ascii="Times New Roman" w:hAnsi="Times New Roman" w:cs="Times New Roman"/>
-          <w:noProof/>
-          <w:sz w:val="28"/>
-          <w:lang w:val="tr-TR"/>
-        </w:rPr>
-      </w:pPr>
       <w:r>
         <w:rPr>
           <w:rFonts w:ascii="Times New Roman" w:hAnsi="Times New Roman" w:cs="Times New Roman"/>
@@ -16056,17 +14461,6 @@
         <w:br/>
         <w:t xml:space="preserve">{{dolayli_sayi}}</w:t>
       </w:r>
-    </w:p>
-    <w:p>
-      <w:pPr>
-        <w:jc w:val="both"/>
-        <w:rPr>
-          <w:rFonts w:ascii="Times New Roman" w:hAnsi="Times New Roman" w:cs="Times New Roman"/>
-          <w:noProof/>
-          <w:sz w:val="28"/>
-          <w:lang w:val="tr-TR"/>
-        </w:rPr>
-      </w:pPr>
     </w:p>
     <w:p>
       <w:pPr>
@@ -16264,27 +14658,6 @@
     </w:tbl>
     <w:p>
       <w:pPr>
-        <w:ind w:left="720"/>
-        <w:jc w:val="both"/>
-        <w:rPr>
-          <w:rFonts w:ascii="Times New Roman" w:hAnsi="Times New Roman" w:cs="Times New Roman"/>
-          <w:noProof/>
-          <w:sz w:val="28"/>
-          <w:lang w:val="tr-TR"/>
-        </w:rPr>
-      </w:pPr>
-    </w:p>
-    <w:p>
-      <w:pPr>
-        <w:rPr>
-          <w:rFonts w:ascii="Times New Roman" w:hAnsi="Times New Roman" w:cs="Times New Roman"/>
-          <w:noProof/>
-          <w:lang w:val="tr-TR"/>
-        </w:rPr>
-      </w:pPr>
-    </w:p>
-    <w:p>
-      <w:pPr>
         <w:pStyle w:val="Balk1"/>
         <w:ind w:left="0"/>
         <w:jc w:val="left"/>
@@ -16398,27 +14771,6 @@
         </w:tc>
       </w:tr>
     </w:tbl>
-    <w:p>
-      <w:pPr>
-        <w:ind w:left="720"/>
-        <w:jc w:val="both"/>
-        <w:rPr>
-          <w:rFonts w:ascii="Times New Roman" w:hAnsi="Times New Roman" w:cs="Times New Roman"/>
-          <w:noProof/>
-          <w:sz w:val="28"/>
-          <w:lang w:val="tr-TR"/>
-        </w:rPr>
-      </w:pPr>
-    </w:p>
-    <w:p>
-      <w:pPr>
-        <w:rPr>
-          <w:rFonts w:ascii="Times New Roman" w:hAnsi="Times New Roman" w:cs="Times New Roman"/>
-          <w:noProof/>
-          <w:lang w:val="tr-TR"/>
-        </w:rPr>
-      </w:pPr>
-    </w:p>
     <w:p>
       <w:pPr>
         <w:pStyle w:val="Balk1"/>
@@ -16620,30 +14972,6 @@
     </w:tbl>
     <w:p>
       <w:pPr>
-        <w:ind w:left="720"/>
-        <w:jc w:val="both"/>
-        <w:rPr>
-          <w:rFonts w:ascii="Times New Roman" w:hAnsi="Times New Roman" w:cs="Times New Roman"/>
-          <w:noProof/>
-          <w:sz w:val="28"/>
-          <w:lang w:val="tr-TR"/>
-        </w:rPr>
-      </w:pPr>
-    </w:p>
-    <w:p>
-      <w:pPr>
-        <w:ind w:left="720"/>
-        <w:jc w:val="both"/>
-        <w:rPr>
-          <w:rFonts w:ascii="Times New Roman" w:hAnsi="Times New Roman" w:cs="Times New Roman"/>
-          <w:noProof/>
-          <w:sz w:val="28"/>
-          <w:lang w:val="tr-TR"/>
-        </w:rPr>
-      </w:pPr>
-    </w:p>
-    <w:p>
-      <w:pPr>
         <w:pStyle w:val="Balk1"/>
         <w:ind w:left="720"/>
         <w:jc w:val="both"/>
@@ -16709,17 +15037,6 @@
         </w:tc>
       </w:tr>
     </w:tbl>
-    <w:p>
-      <w:pPr>
-        <w:jc w:val="both"/>
-        <w:rPr>
-          <w:rFonts w:ascii="Times New Roman" w:hAnsi="Times New Roman" w:cs="Times New Roman"/>
-          <w:noProof/>
-          <w:sz w:val="28"/>
-          <w:lang w:val="tr-TR"/>
-        </w:rPr>
-      </w:pPr>
-    </w:p>
     <w:sectPr>
       <w:footerReference w:type="even" r:id="rId8"/>
       <w:footerReference w:type="default" r:id="rId9"/>

</xml_diff>

<commit_message>
Revert "Sablon: tablo ve cevap sonrasi bos paragraflar kaldirildi"
This reverts commit ff6a76bd018f408edef815bc14bae2fa1bc65eda.
</commit_message>
<xml_diff>
--- a/assets/IsAnaliziForm-template.docx
+++ b/assets/IsAnaliziForm-template.docx
@@ -1947,6 +1947,27 @@
     </w:tbl>
     <w:p>
       <w:pPr>
+        <w:ind w:left="360"/>
+        <w:jc w:val="both"/>
+        <w:rPr>
+          <w:rFonts w:ascii="Times New Roman" w:hAnsi="Times New Roman" w:cs="Times New Roman"/>
+          <w:noProof/>
+          <w:sz w:val="28"/>
+          <w:lang w:val="tr-TR"/>
+        </w:rPr>
+      </w:pPr>
+      <w:r>
+        <w:rPr>
+          <w:rFonts w:ascii="Times New Roman" w:hAnsi="Times New Roman" w:cs="Times New Roman"/>
+          <w:noProof/>
+          <w:sz w:val="28"/>
+          <w:lang w:val="tr-TR"/>
+        </w:rPr>
+        <w:tab/>
+      </w:r>
+    </w:p>
+    <w:p>
+      <w:pPr>
         <w:spacing w:line="600" w:lineRule="auto"/>
         <w:rPr>
           <w:rFonts w:ascii="Times New Roman" w:hAnsi="Times New Roman" w:cs="Times New Roman"/>
@@ -2132,6 +2153,51 @@
         <w:br/>
         <w:t xml:space="preserve">{{vekalet_edilen}}</w:t>
       </w:r>
+    </w:p>
+    <w:p>
+      <w:pPr>
+        <w:tabs>
+          <w:tab w:val="left" w:pos="426"/>
+          <w:tab w:val="left" w:pos="851"/>
+          <w:tab w:val="left" w:pos="993"/>
+        </w:tabs>
+        <w:rPr>
+          <w:rFonts w:ascii="Times New Roman" w:hAnsi="Times New Roman" w:cs="Times New Roman"/>
+          <w:b/>
+          <w:color w:val="auto"/>
+          <w:lang w:val="tr-TR" w:eastAsia="tr-TR"/>
+        </w:rPr>
+      </w:pPr>
+    </w:p>
+    <w:p>
+      <w:pPr>
+        <w:tabs>
+          <w:tab w:val="left" w:pos="426"/>
+          <w:tab w:val="left" w:pos="851"/>
+          <w:tab w:val="left" w:pos="993"/>
+        </w:tabs>
+        <w:rPr>
+          <w:rFonts w:ascii="Times New Roman" w:hAnsi="Times New Roman" w:cs="Times New Roman"/>
+          <w:b/>
+          <w:color w:val="auto"/>
+          <w:lang w:val="tr-TR" w:eastAsia="tr-TR"/>
+        </w:rPr>
+      </w:pPr>
+    </w:p>
+    <w:p>
+      <w:pPr>
+        <w:tabs>
+          <w:tab w:val="left" w:pos="426"/>
+          <w:tab w:val="left" w:pos="851"/>
+          <w:tab w:val="left" w:pos="993"/>
+        </w:tabs>
+        <w:rPr>
+          <w:rFonts w:ascii="Times New Roman" w:hAnsi="Times New Roman" w:cs="Times New Roman"/>
+          <w:b/>
+          <w:color w:val="auto"/>
+          <w:lang w:val="tr-TR" w:eastAsia="tr-TR"/>
+        </w:rPr>
+      </w:pPr>
     </w:p>
     <w:p>
       <w:pPr>
@@ -2239,6 +2305,16 @@
         <w:br/>
         <w:t xml:space="preserve">{{rol_amaci}}</w:t>
       </w:r>
+    </w:p>
+    <w:p>
+      <w:pPr>
+        <w:pStyle w:val="GvdeMetniGirintisi"/>
+        <w:rPr>
+          <w:rFonts w:ascii="Times New Roman" w:hAnsi="Times New Roman" w:cs="Times New Roman"/>
+          <w:noProof/>
+          <w:lang w:val="tr-TR"/>
+        </w:rPr>
+      </w:pPr>
     </w:p>
     <w:p>
       <w:pPr>
@@ -2727,6 +2803,55 @@
     </w:tbl>
     <w:p>
       <w:pPr>
+        <w:ind w:left="720"/>
+        <w:jc w:val="both"/>
+        <w:rPr>
+          <w:rFonts w:ascii="Times New Roman" w:hAnsi="Times New Roman" w:cs="Times New Roman"/>
+          <w:b/>
+          <w:bCs/>
+          <w:noProof/>
+          <w:lang w:val="tr-TR"/>
+        </w:rPr>
+      </w:pPr>
+    </w:p>
+    <w:p>
+      <w:pPr>
+        <w:ind w:left="720"/>
+        <w:jc w:val="both"/>
+        <w:rPr>
+          <w:rFonts w:ascii="Times New Roman" w:hAnsi="Times New Roman" w:cs="Times New Roman"/>
+          <w:b/>
+          <w:bCs/>
+          <w:noProof/>
+          <w:lang w:val="tr-TR"/>
+        </w:rPr>
+      </w:pPr>
+    </w:p>
+    <w:p>
+      <w:pPr>
+        <w:ind w:left="720"/>
+        <w:jc w:val="both"/>
+        <w:rPr>
+          <w:rFonts w:ascii="Times New Roman" w:hAnsi="Times New Roman" w:cs="Times New Roman"/>
+          <w:b/>
+          <w:bCs/>
+          <w:noProof/>
+          <w:lang w:val="tr-TR"/>
+        </w:rPr>
+      </w:pPr>
+    </w:p>
+    <w:p>
+      <w:pPr>
+        <w:jc w:val="both"/>
+        <w:rPr>
+          <w:rFonts w:ascii="Times New Roman" w:hAnsi="Times New Roman" w:cs="Times New Roman"/>
+          <w:noProof/>
+          <w:lang w:val="tr-TR"/>
+        </w:rPr>
+      </w:pPr>
+    </w:p>
+    <w:p>
+      <w:pPr>
         <w:pStyle w:val="GvdeMetniGirintisi"/>
         <w:rPr>
           <w:rFonts w:ascii="Times New Roman" w:hAnsi="Times New Roman" w:cs="Times New Roman"/>
@@ -2851,36 +2976,13 @@
         </w:tabs>
         <w:rPr>
           <w:rFonts w:ascii="Times New Roman" w:hAnsi="Times New Roman" w:cs="Times New Roman"/>
-          <w:color w:val="auto"/>
-          <w:sz w:val="28"/>
-          <w:szCs w:val="28"/>
-          <w:lang w:val="tr-TR" w:eastAsia="tr-TR"/>
-        </w:rPr>
-      </w:pPr>
-      <w:r>
-        <w:rPr>
-          <w:rFonts w:ascii="Times New Roman" w:hAnsi="Times New Roman" w:cs="Times New Roman"/>
-          <w:color w:val="auto"/>
-          <w:sz w:val="28"/>
-          <w:szCs w:val="28"/>
-          <w:lang w:val="tr-TR" w:eastAsia="tr-TR"/>
-        </w:rPr>
-        <w:t xml:space="preserve"> 2.4.</w:t>
-      </w:r>
-      <w:r>
-        <w:rPr>
-          <w:rFonts w:ascii="Times New Roman" w:hAnsi="Times New Roman" w:cs="Times New Roman"/>
-          <w:color w:val="auto"/>
-          <w:sz w:val="28"/>
-          <w:szCs w:val="28"/>
-          <w:lang w:val="tr-TR" w:eastAsia="tr-TR"/>
-        </w:rPr>
-        <w:t>Bu faaliyetleri yapmak için hangi girdiler gerekmektedir? Bunları hangi birim/bölüm sağlamaktadır?</w:t>
-      </w:r>
-      <w:r>
-        <w:br/>
-        <w:t xml:space="preserve">{{girdiler_birimler}}</w:t>
-      </w:r>
+          <w:b/>
+          <w:color w:val="auto"/>
+          <w:sz w:val="28"/>
+          <w:szCs w:val="28"/>
+          <w:lang w:val="tr-TR" w:eastAsia="tr-TR"/>
+        </w:rPr>
+      </w:pPr>
     </w:p>
     <w:p>
       <w:pPr>
@@ -2905,22 +3007,56 @@
           <w:szCs w:val="28"/>
           <w:lang w:val="tr-TR" w:eastAsia="tr-TR"/>
         </w:rPr>
-        <w:t>2.5.</w:t>
-      </w:r>
-      <w:r>
-        <w:rPr>
-          <w:rFonts w:ascii="Times New Roman" w:hAnsi="Times New Roman" w:cs="Times New Roman"/>
-          <w:color w:val="auto"/>
-          <w:sz w:val="28"/>
-          <w:szCs w:val="28"/>
-          <w:lang w:val="tr-TR" w:eastAsia="tr-TR"/>
-        </w:rPr>
-        <w:t>Bu faaliyetler sonunda hangi çıktılar üretilmektedir ve bunlar nereye gider?</w:t>
+        <w:t xml:space="preserve"> 2.4.</w:t>
+      </w:r>
+      <w:r>
+        <w:rPr>
+          <w:rFonts w:ascii="Times New Roman" w:hAnsi="Times New Roman" w:cs="Times New Roman"/>
+          <w:color w:val="auto"/>
+          <w:sz w:val="28"/>
+          <w:szCs w:val="28"/>
+          <w:lang w:val="tr-TR" w:eastAsia="tr-TR"/>
+        </w:rPr>
+        <w:t>Bu faaliyetleri yapmak için hangi girdiler gerekmektedir? Bunları hangi birim/bölüm sağlamaktadır?</w:t>
       </w:r>
       <w:r>
         <w:br/>
-        <w:t xml:space="preserve">{{ciktilar}}</w:t>
-      </w:r>
+        <w:t xml:space="preserve">{{girdiler_birimler}}</w:t>
+      </w:r>
+    </w:p>
+    <w:p>
+      <w:pPr>
+        <w:rPr>
+          <w:rFonts w:ascii="Times New Roman" w:hAnsi="Times New Roman" w:cs="Times New Roman"/>
+          <w:b/>
+          <w:color w:val="auto"/>
+          <w:sz w:val="28"/>
+          <w:szCs w:val="28"/>
+          <w:lang w:val="tr-TR" w:eastAsia="tr-TR"/>
+        </w:rPr>
+      </w:pPr>
+    </w:p>
+    <w:p>
+      <w:pPr>
+        <w:rPr>
+          <w:rFonts w:ascii="Times New Roman" w:hAnsi="Times New Roman" w:cs="Times New Roman"/>
+          <w:color w:val="auto"/>
+          <w:sz w:val="28"/>
+          <w:szCs w:val="28"/>
+          <w:lang w:val="tr-TR" w:eastAsia="tr-TR"/>
+        </w:rPr>
+      </w:pPr>
+    </w:p>
+    <w:p>
+      <w:pPr>
+        <w:rPr>
+          <w:rFonts w:ascii="Times New Roman" w:hAnsi="Times New Roman" w:cs="Times New Roman"/>
+          <w:color w:val="auto"/>
+          <w:sz w:val="28"/>
+          <w:szCs w:val="28"/>
+          <w:lang w:val="tr-TR" w:eastAsia="tr-TR"/>
+        </w:rPr>
+      </w:pPr>
     </w:p>
     <w:p>
       <w:pPr>
@@ -2945,6 +3081,81 @@
           <w:szCs w:val="28"/>
           <w:lang w:val="tr-TR" w:eastAsia="tr-TR"/>
         </w:rPr>
+        <w:t>2.5.</w:t>
+      </w:r>
+      <w:r>
+        <w:rPr>
+          <w:rFonts w:ascii="Times New Roman" w:hAnsi="Times New Roman" w:cs="Times New Roman"/>
+          <w:color w:val="auto"/>
+          <w:sz w:val="28"/>
+          <w:szCs w:val="28"/>
+          <w:lang w:val="tr-TR" w:eastAsia="tr-TR"/>
+        </w:rPr>
+        <w:t>Bu faaliyetler sonunda hangi çıktılar üretilmektedir ve bunlar nereye gider?</w:t>
+      </w:r>
+      <w:r>
+        <w:br/>
+        <w:t xml:space="preserve">{{ciktilar}}</w:t>
+      </w:r>
+    </w:p>
+    <w:p>
+      <w:pPr>
+        <w:rPr>
+          <w:rFonts w:ascii="Times New Roman" w:hAnsi="Times New Roman" w:cs="Times New Roman"/>
+          <w:color w:val="auto"/>
+          <w:sz w:val="28"/>
+          <w:szCs w:val="28"/>
+          <w:lang w:val="tr-TR" w:eastAsia="tr-TR"/>
+        </w:rPr>
+      </w:pPr>
+    </w:p>
+    <w:p>
+      <w:pPr>
+        <w:rPr>
+          <w:rFonts w:ascii="Times New Roman" w:hAnsi="Times New Roman" w:cs="Times New Roman"/>
+          <w:b/>
+          <w:color w:val="auto"/>
+          <w:sz w:val="28"/>
+          <w:szCs w:val="28"/>
+          <w:lang w:val="tr-TR" w:eastAsia="tr-TR"/>
+        </w:rPr>
+      </w:pPr>
+    </w:p>
+    <w:p>
+      <w:pPr>
+        <w:rPr>
+          <w:rFonts w:ascii="Times New Roman" w:hAnsi="Times New Roman" w:cs="Times New Roman"/>
+          <w:b/>
+          <w:color w:val="auto"/>
+          <w:sz w:val="28"/>
+          <w:szCs w:val="28"/>
+          <w:lang w:val="tr-TR" w:eastAsia="tr-TR"/>
+        </w:rPr>
+      </w:pPr>
+    </w:p>
+    <w:p>
+      <w:pPr>
+        <w:tabs>
+          <w:tab w:val="left" w:pos="426"/>
+          <w:tab w:val="left" w:pos="851"/>
+          <w:tab w:val="left" w:pos="993"/>
+        </w:tabs>
+        <w:rPr>
+          <w:rFonts w:ascii="Times New Roman" w:hAnsi="Times New Roman" w:cs="Times New Roman"/>
+          <w:color w:val="auto"/>
+          <w:sz w:val="28"/>
+          <w:szCs w:val="28"/>
+          <w:lang w:val="tr-TR" w:eastAsia="tr-TR"/>
+        </w:rPr>
+      </w:pPr>
+      <w:r>
+        <w:rPr>
+          <w:rFonts w:ascii="Times New Roman" w:hAnsi="Times New Roman" w:cs="Times New Roman"/>
+          <w:color w:val="auto"/>
+          <w:sz w:val="28"/>
+          <w:szCs w:val="28"/>
+          <w:lang w:val="tr-TR" w:eastAsia="tr-TR"/>
+        </w:rPr>
         <w:t>2.6.</w:t>
       </w:r>
       <w:r>
@@ -2961,6 +3172,42 @@
         <w:br/>
         <w:t xml:space="preserve">{{sistemler}}</w:t>
       </w:r>
+    </w:p>
+    <w:p>
+      <w:pPr>
+        <w:rPr>
+          <w:rFonts w:ascii="Times New Roman" w:hAnsi="Times New Roman" w:cs="Times New Roman"/>
+          <w:b/>
+          <w:color w:val="auto"/>
+          <w:sz w:val="28"/>
+          <w:szCs w:val="28"/>
+          <w:lang w:val="tr-TR" w:eastAsia="tr-TR"/>
+        </w:rPr>
+      </w:pPr>
+    </w:p>
+    <w:p>
+      <w:pPr>
+        <w:rPr>
+          <w:rFonts w:ascii="Times New Roman" w:hAnsi="Times New Roman" w:cs="Times New Roman"/>
+          <w:b/>
+          <w:color w:val="auto"/>
+          <w:sz w:val="28"/>
+          <w:szCs w:val="28"/>
+          <w:lang w:val="tr-TR" w:eastAsia="tr-TR"/>
+        </w:rPr>
+      </w:pPr>
+    </w:p>
+    <w:p>
+      <w:pPr>
+        <w:rPr>
+          <w:rFonts w:ascii="Times New Roman" w:hAnsi="Times New Roman" w:cs="Times New Roman"/>
+          <w:b/>
+          <w:color w:val="auto"/>
+          <w:sz w:val="28"/>
+          <w:szCs w:val="28"/>
+          <w:lang w:val="tr-TR" w:eastAsia="tr-TR"/>
+        </w:rPr>
+      </w:pPr>
     </w:p>
     <w:p>
       <w:pPr>
@@ -3034,6 +3281,66 @@
           <w:tab w:val="left" w:pos="993"/>
         </w:tabs>
         <w:spacing w:line="360" w:lineRule="auto"/>
+        <w:ind w:left="360"/>
+        <w:jc w:val="both"/>
+        <w:rPr>
+          <w:rFonts w:ascii="Times New Roman" w:hAnsi="Times New Roman" w:cs="Times New Roman"/>
+          <w:b/>
+          <w:color w:val="auto"/>
+          <w:sz w:val="28"/>
+          <w:szCs w:val="28"/>
+          <w:lang w:val="tr-TR" w:eastAsia="tr-TR"/>
+        </w:rPr>
+      </w:pPr>
+    </w:p>
+    <w:p>
+      <w:pPr>
+        <w:tabs>
+          <w:tab w:val="left" w:pos="426"/>
+          <w:tab w:val="left" w:pos="851"/>
+          <w:tab w:val="left" w:pos="993"/>
+        </w:tabs>
+        <w:spacing w:line="360" w:lineRule="auto"/>
+        <w:ind w:left="360"/>
+        <w:jc w:val="both"/>
+        <w:rPr>
+          <w:rFonts w:ascii="Times New Roman" w:hAnsi="Times New Roman" w:cs="Times New Roman"/>
+          <w:b/>
+          <w:color w:val="auto"/>
+          <w:sz w:val="28"/>
+          <w:szCs w:val="28"/>
+          <w:lang w:val="tr-TR" w:eastAsia="tr-TR"/>
+        </w:rPr>
+      </w:pPr>
+    </w:p>
+    <w:p>
+      <w:pPr>
+        <w:tabs>
+          <w:tab w:val="left" w:pos="426"/>
+          <w:tab w:val="left" w:pos="851"/>
+          <w:tab w:val="left" w:pos="993"/>
+        </w:tabs>
+        <w:spacing w:line="360" w:lineRule="auto"/>
+        <w:ind w:left="360"/>
+        <w:jc w:val="both"/>
+        <w:rPr>
+          <w:rFonts w:ascii="Times New Roman" w:hAnsi="Times New Roman" w:cs="Times New Roman"/>
+          <w:b/>
+          <w:color w:val="auto"/>
+          <w:sz w:val="28"/>
+          <w:szCs w:val="28"/>
+          <w:lang w:val="tr-TR" w:eastAsia="tr-TR"/>
+        </w:rPr>
+      </w:pPr>
+    </w:p>
+    <w:p>
+      <w:pPr>
+        <w:tabs>
+          <w:tab w:val="left" w:pos="426"/>
+          <w:tab w:val="left" w:pos="851"/>
+          <w:tab w:val="left" w:pos="993"/>
+        </w:tabs>
+        <w:spacing w:line="360" w:lineRule="auto"/>
         <w:jc w:val="both"/>
         <w:rPr>
           <w:rFonts w:ascii="Times New Roman" w:hAnsi="Times New Roman" w:cs="Times New Roman"/>
@@ -3067,6 +3374,26 @@
         <w:br/>
         <w:t xml:space="preserve">{{performans_olcum}}</w:t>
       </w:r>
+    </w:p>
+    <w:p>
+      <w:pPr>
+        <w:tabs>
+          <w:tab w:val="left" w:pos="426"/>
+          <w:tab w:val="left" w:pos="851"/>
+          <w:tab w:val="left" w:pos="993"/>
+        </w:tabs>
+        <w:spacing w:line="360" w:lineRule="auto"/>
+        <w:ind w:left="1440"/>
+        <w:jc w:val="both"/>
+        <w:rPr>
+          <w:rFonts w:ascii="Times New Roman" w:hAnsi="Times New Roman" w:cs="Times New Roman"/>
+          <w:b/>
+          <w:color w:val="auto"/>
+          <w:sz w:val="28"/>
+          <w:szCs w:val="28"/>
+          <w:lang w:val="tr-TR" w:eastAsia="tr-TR"/>
+        </w:rPr>
+      </w:pPr>
     </w:p>
     <w:p>
       <w:pPr>
@@ -3119,6 +3446,66 @@
           <w:tab w:val="left" w:pos="993"/>
         </w:tabs>
         <w:spacing w:line="360" w:lineRule="auto"/>
+        <w:ind w:left="1440"/>
+        <w:jc w:val="both"/>
+        <w:rPr>
+          <w:rFonts w:ascii="Times New Roman" w:hAnsi="Times New Roman" w:cs="Times New Roman"/>
+          <w:b/>
+          <w:color w:val="auto"/>
+          <w:sz w:val="28"/>
+          <w:szCs w:val="28"/>
+          <w:lang w:val="tr-TR" w:eastAsia="tr-TR"/>
+        </w:rPr>
+      </w:pPr>
+    </w:p>
+    <w:p>
+      <w:pPr>
+        <w:tabs>
+          <w:tab w:val="left" w:pos="426"/>
+          <w:tab w:val="left" w:pos="851"/>
+          <w:tab w:val="left" w:pos="993"/>
+        </w:tabs>
+        <w:spacing w:line="360" w:lineRule="auto"/>
+        <w:ind w:left="1440"/>
+        <w:jc w:val="both"/>
+        <w:rPr>
+          <w:rFonts w:ascii="Times New Roman" w:hAnsi="Times New Roman" w:cs="Times New Roman"/>
+          <w:b/>
+          <w:color w:val="auto"/>
+          <w:sz w:val="28"/>
+          <w:szCs w:val="28"/>
+          <w:lang w:val="tr-TR" w:eastAsia="tr-TR"/>
+        </w:rPr>
+      </w:pPr>
+    </w:p>
+    <w:p>
+      <w:pPr>
+        <w:tabs>
+          <w:tab w:val="left" w:pos="426"/>
+          <w:tab w:val="left" w:pos="851"/>
+          <w:tab w:val="left" w:pos="993"/>
+        </w:tabs>
+        <w:spacing w:line="360" w:lineRule="auto"/>
+        <w:ind w:left="1440"/>
+        <w:jc w:val="both"/>
+        <w:rPr>
+          <w:rFonts w:ascii="Times New Roman" w:hAnsi="Times New Roman" w:cs="Times New Roman"/>
+          <w:b/>
+          <w:color w:val="auto"/>
+          <w:sz w:val="28"/>
+          <w:szCs w:val="28"/>
+          <w:lang w:val="tr-TR" w:eastAsia="tr-TR"/>
+        </w:rPr>
+      </w:pPr>
+    </w:p>
+    <w:p>
+      <w:pPr>
+        <w:tabs>
+          <w:tab w:val="left" w:pos="426"/>
+          <w:tab w:val="left" w:pos="851"/>
+          <w:tab w:val="left" w:pos="993"/>
+        </w:tabs>
+        <w:spacing w:line="360" w:lineRule="auto"/>
         <w:ind w:left="720"/>
         <w:jc w:val="both"/>
         <w:rPr>
@@ -3175,6 +3562,39 @@
         <w:br/>
         <w:t xml:space="preserve">{{performans_gostergeleri}}</w:t>
       </w:r>
+    </w:p>
+    <w:p>
+      <w:pPr>
+        <w:rPr>
+          <w:rFonts w:ascii="Times New Roman" w:hAnsi="Times New Roman" w:cs="Times New Roman"/>
+          <w:color w:val="auto"/>
+          <w:sz w:val="28"/>
+          <w:szCs w:val="28"/>
+          <w:lang w:val="tr-TR" w:eastAsia="tr-TR"/>
+        </w:rPr>
+      </w:pPr>
+    </w:p>
+    <w:p>
+      <w:pPr>
+        <w:rPr>
+          <w:rFonts w:ascii="Times New Roman" w:hAnsi="Times New Roman" w:cs="Times New Roman"/>
+          <w:color w:val="auto"/>
+          <w:sz w:val="28"/>
+          <w:szCs w:val="28"/>
+          <w:lang w:val="tr-TR" w:eastAsia="tr-TR"/>
+        </w:rPr>
+      </w:pPr>
+    </w:p>
+    <w:p>
+      <w:pPr>
+        <w:rPr>
+          <w:rFonts w:ascii="Times New Roman" w:hAnsi="Times New Roman" w:cs="Times New Roman"/>
+          <w:color w:val="auto"/>
+          <w:sz w:val="28"/>
+          <w:szCs w:val="28"/>
+          <w:lang w:val="tr-TR" w:eastAsia="tr-TR"/>
+        </w:rPr>
+      </w:pPr>
     </w:p>
     <w:p>
       <w:pPr>
@@ -3296,6 +3716,17 @@
         <w:br/>
         <w:t xml:space="preserve">{{hazirlanan_dokumanlar}}</w:t>
       </w:r>
+    </w:p>
+    <w:p>
+      <w:pPr>
+        <w:rPr>
+          <w:rFonts w:ascii="Times New Roman" w:hAnsi="Times New Roman" w:cs="Times New Roman"/>
+          <w:color w:val="auto"/>
+          <w:sz w:val="28"/>
+          <w:szCs w:val="28"/>
+          <w:lang w:val="tr-TR" w:eastAsia="tr-TR"/>
+        </w:rPr>
+      </w:pPr>
     </w:p>
     <w:p>
       <w:pPr>
@@ -3806,6 +4237,42 @@
     </w:tbl>
     <w:p>
       <w:pPr>
+        <w:rPr>
+          <w:rFonts w:ascii="Times New Roman" w:hAnsi="Times New Roman" w:cs="Times New Roman"/>
+          <w:color w:val="auto"/>
+          <w:lang w:val="tr-TR" w:eastAsia="tr-TR"/>
+        </w:rPr>
+      </w:pPr>
+    </w:p>
+    <w:p>
+      <w:pPr>
+        <w:rPr>
+          <w:rFonts w:ascii="Times New Roman" w:hAnsi="Times New Roman" w:cs="Times New Roman"/>
+          <w:color w:val="auto"/>
+          <w:lang w:val="tr-TR" w:eastAsia="tr-TR"/>
+        </w:rPr>
+      </w:pPr>
+    </w:p>
+    <w:p>
+      <w:pPr>
+        <w:rPr>
+          <w:rFonts w:ascii="Times New Roman" w:hAnsi="Times New Roman" w:cs="Times New Roman"/>
+          <w:color w:val="auto"/>
+          <w:lang w:val="tr-TR" w:eastAsia="tr-TR"/>
+        </w:rPr>
+      </w:pPr>
+    </w:p>
+    <w:p>
+      <w:pPr>
+        <w:rPr>
+          <w:rFonts w:ascii="Times New Roman" w:hAnsi="Times New Roman" w:cs="Times New Roman"/>
+          <w:color w:val="auto"/>
+          <w:lang w:val="tr-TR" w:eastAsia="tr-TR"/>
+        </w:rPr>
+      </w:pPr>
+    </w:p>
+    <w:p>
+      <w:pPr>
         <w:numPr>
           <w:ilvl w:val="2"/>
           <w:numId w:val="23"/>
@@ -4129,6 +4596,26 @@
     </w:tbl>
     <w:p>
       <w:pPr>
+        <w:rPr>
+          <w:rFonts w:ascii="Times New Roman" w:hAnsi="Times New Roman" w:cs="Times New Roman"/>
+          <w:sz w:val="28"/>
+          <w:szCs w:val="28"/>
+          <w:lang w:val="tr-TR"/>
+        </w:rPr>
+      </w:pPr>
+    </w:p>
+    <w:p>
+      <w:pPr>
+        <w:rPr>
+          <w:rFonts w:ascii="Times New Roman" w:hAnsi="Times New Roman" w:cs="Times New Roman"/>
+          <w:sz w:val="28"/>
+          <w:szCs w:val="28"/>
+          <w:lang w:val="tr-TR"/>
+        </w:rPr>
+      </w:pPr>
+    </w:p>
+    <w:p>
+      <w:pPr>
         <w:numPr>
           <w:ilvl w:val="1"/>
           <w:numId w:val="23"/>
@@ -4391,6 +4878,17 @@
     </w:tbl>
     <w:p>
       <w:pPr>
+        <w:rPr>
+          <w:rFonts w:ascii="Times New Roman" w:hAnsi="Times New Roman" w:cs="Times New Roman"/>
+          <w:color w:val="auto"/>
+          <w:sz w:val="28"/>
+          <w:szCs w:val="28"/>
+          <w:lang w:val="tr-TR" w:eastAsia="tr-TR"/>
+        </w:rPr>
+      </w:pPr>
+    </w:p>
+    <w:p>
+      <w:pPr>
         <w:numPr>
           <w:ilvl w:val="1"/>
           <w:numId w:val="24"/>
@@ -4734,6 +5232,28 @@
         </w:tc>
       </w:tr>
     </w:tbl>
+    <w:p>
+      <w:pPr>
+        <w:rPr>
+          <w:rFonts w:ascii="Times New Roman" w:hAnsi="Times New Roman" w:cs="Times New Roman"/>
+          <w:color w:val="auto"/>
+          <w:sz w:val="28"/>
+          <w:szCs w:val="28"/>
+          <w:lang w:val="tr-TR" w:eastAsia="tr-TR"/>
+        </w:rPr>
+      </w:pPr>
+    </w:p>
+    <w:p>
+      <w:pPr>
+        <w:rPr>
+          <w:rFonts w:ascii="Times New Roman" w:hAnsi="Times New Roman" w:cs="Times New Roman"/>
+          <w:color w:val="auto"/>
+          <w:sz w:val="28"/>
+          <w:szCs w:val="28"/>
+          <w:lang w:val="tr-TR" w:eastAsia="tr-TR"/>
+        </w:rPr>
+      </w:pPr>
+    </w:p>
     <w:p>
       <w:pPr>
         <w:numPr>
@@ -5224,6 +5744,17 @@
     </w:tbl>
     <w:p>
       <w:pPr>
+        <w:pStyle w:val="Normal"/>
+        <w:rPr>
+          <w:rFonts w:ascii="Times New Roman" w:hAnsi="Times New Roman" w:cs="Times New Roman"/>
+          <w:noProof/>
+          <w:szCs w:val="28"/>
+          <w:lang w:val="tr-TR"/>
+        </w:rPr>
+      </w:pPr>
+    </w:p>
+    <w:p>
+      <w:pPr>
         <w:numPr>
           <w:ilvl w:val="1"/>
           <w:numId w:val="24"/>
@@ -5798,6 +6329,17 @@
     </w:tbl>
     <w:p>
       <w:pPr>
+        <w:jc w:val="both"/>
+        <w:rPr>
+          <w:rFonts w:ascii="Times New Roman" w:hAnsi="Times New Roman" w:cs="Times New Roman"/>
+          <w:noProof/>
+          <w:sz w:val="28"/>
+          <w:lang w:val="tr-TR"/>
+        </w:rPr>
+      </w:pPr>
+    </w:p>
+    <w:p>
+      <w:pPr>
         <w:ind w:left="720"/>
         <w:jc w:val="both"/>
         <w:rPr>
@@ -5890,6 +6432,17 @@
     </w:tbl>
     <w:p>
       <w:pPr>
+        <w:jc w:val="both"/>
+        <w:rPr>
+          <w:rFonts w:ascii="Times New Roman" w:hAnsi="Times New Roman" w:cs="Times New Roman"/>
+          <w:noProof/>
+          <w:sz w:val="28"/>
+          <w:lang w:val="tr-TR"/>
+        </w:rPr>
+      </w:pPr>
+    </w:p>
+    <w:p>
+      <w:pPr>
         <w:ind w:left="720"/>
         <w:jc w:val="both"/>
         <w:rPr>
@@ -5954,6 +6507,39 @@
           <w:lang w:val="tr-TR"/>
         </w:rPr>
       </w:pPr>
+    </w:p>
+    <w:p>
+      <w:pPr>
+        <w:jc w:val="both"/>
+        <w:rPr>
+          <w:rFonts w:ascii="Times New Roman" w:hAnsi="Times New Roman" w:cs="Times New Roman"/>
+          <w:noProof/>
+          <w:sz w:val="28"/>
+          <w:lang w:val="tr-TR"/>
+        </w:rPr>
+      </w:pPr>
+    </w:p>
+    <w:p>
+      <w:pPr>
+        <w:jc w:val="both"/>
+        <w:rPr>
+          <w:rFonts w:ascii="Times New Roman" w:hAnsi="Times New Roman" w:cs="Times New Roman"/>
+          <w:noProof/>
+          <w:sz w:val="28"/>
+          <w:lang w:val="tr-TR"/>
+        </w:rPr>
+      </w:pPr>
+    </w:p>
+    <w:p>
+      <w:pPr>
+        <w:jc w:val="both"/>
+        <w:rPr>
+          <w:rFonts w:ascii="Times New Roman" w:hAnsi="Times New Roman" w:cs="Times New Roman"/>
+          <w:noProof/>
+          <w:sz w:val="28"/>
+          <w:lang w:val="tr-TR"/>
+        </w:rPr>
+      </w:pPr>
       <w:r>
         <w:rPr>
           <w:rFonts w:ascii="Times New Roman" w:hAnsi="Times New Roman" w:cs="Times New Roman"/>
@@ -6001,6 +6587,19 @@
     </w:tbl>
     <w:p>
       <w:pPr>
+        <w:ind w:left="360"/>
+        <w:jc w:val="both"/>
+        <w:rPr>
+          <w:rFonts w:ascii="Times New Roman" w:hAnsi="Times New Roman" w:cs="Times New Roman"/>
+          <w:noProof/>
+          <w:sz w:val="28"/>
+          <w:szCs w:val="28"/>
+          <w:lang w:val="tr-TR"/>
+        </w:rPr>
+      </w:pPr>
+    </w:p>
+    <w:p>
+      <w:pPr>
         <w:jc w:val="both"/>
         <w:rPr>
           <w:rFonts w:ascii="Times New Roman" w:hAnsi="Times New Roman" w:cs="Times New Roman"/>
@@ -6339,6 +6938,18 @@
     </w:tbl>
     <w:p>
       <w:pPr>
+        <w:pStyle w:val="Normal"/>
+        <w:rPr>
+          <w:rFonts w:ascii="Times New Roman" w:hAnsi="Times New Roman" w:cs="Times New Roman"/>
+          <w:bCs w:val="0"/>
+          <w:noProof/>
+          <w:szCs w:val="28"/>
+          <w:lang w:val="tr-TR"/>
+        </w:rPr>
+      </w:pPr>
+    </w:p>
+    <w:p>
+      <w:pPr>
         <w:tabs>
           <w:tab w:val="left" w:pos="567"/>
         </w:tabs>
@@ -6424,6 +7035,42 @@
     </w:p>
     <w:p>
       <w:pPr>
+        <w:jc w:val="both"/>
+        <w:rPr>
+          <w:rFonts w:ascii="Times New Roman" w:hAnsi="Times New Roman" w:cs="Times New Roman"/>
+          <w:b/>
+          <w:color w:val="auto"/>
+          <w:sz w:val="28"/>
+          <w:szCs w:val="28"/>
+          <w:lang w:val="tr-TR" w:eastAsia="tr-TR"/>
+        </w:rPr>
+      </w:pPr>
+    </w:p>
+    <w:p>
+      <w:pPr>
+        <w:rPr>
+          <w:rFonts w:ascii="Times New Roman" w:hAnsi="Times New Roman" w:cs="Times New Roman"/>
+          <w:color w:val="auto"/>
+          <w:sz w:val="28"/>
+          <w:szCs w:val="28"/>
+          <w:lang w:val="tr-TR" w:eastAsia="tr-TR"/>
+        </w:rPr>
+      </w:pPr>
+    </w:p>
+    <w:p>
+      <w:pPr>
+        <w:rPr>
+          <w:rFonts w:ascii="Times New Roman" w:hAnsi="Times New Roman" w:cs="Times New Roman"/>
+          <w:b/>
+          <w:color w:val="auto"/>
+          <w:sz w:val="28"/>
+          <w:szCs w:val="28"/>
+          <w:lang w:val="tr-TR" w:eastAsia="tr-TR"/>
+        </w:rPr>
+      </w:pPr>
+    </w:p>
+    <w:p>
+      <w:pPr>
         <w:rPr>
           <w:rFonts w:ascii="Times New Roman" w:hAnsi="Times New Roman" w:cs="Times New Roman"/>
           <w:color w:val="auto"/>
@@ -6607,6 +7254,18 @@
         <w:br/>
         <w:t xml:space="preserve">{{sosyal_sorunlar}}</w:t>
       </w:r>
+    </w:p>
+    <w:p>
+      <w:pPr>
+        <w:rPr>
+          <w:rFonts w:ascii="Times New Roman" w:hAnsi="Times New Roman" w:cs="Times New Roman"/>
+          <w:b/>
+          <w:color w:val="auto"/>
+          <w:sz w:val="28"/>
+          <w:szCs w:val="28"/>
+          <w:lang w:val="tr-TR" w:eastAsia="tr-TR"/>
+        </w:rPr>
+      </w:pPr>
     </w:p>
     <w:tbl>
       <w:tblPr>
@@ -8709,6 +9368,18 @@
     </w:tbl>
     <w:p>
       <w:pPr>
+        <w:spacing w:line="360" w:lineRule="auto"/>
+        <w:jc w:val="both"/>
+        <w:rPr>
+          <w:rFonts w:ascii="Times New Roman" w:hAnsi="Times New Roman" w:cs="Times New Roman"/>
+          <w:b/>
+          <w:color w:val="auto"/>
+          <w:lang w:val="tr-TR" w:eastAsia="tr-TR"/>
+        </w:rPr>
+      </w:pPr>
+    </w:p>
+    <w:p>
+      <w:pPr>
         <w:rPr>
           <w:rFonts w:ascii="Times New Roman" w:hAnsi="Times New Roman" w:cs="Times New Roman"/>
           <w:color w:val="auto"/>
@@ -9398,6 +10069,50 @@
     </w:tbl>
     <w:p>
       <w:pPr>
+        <w:rPr>
+          <w:rFonts w:ascii="Times New Roman" w:hAnsi="Times New Roman" w:cs="Times New Roman"/>
+          <w:color w:val="auto"/>
+          <w:sz w:val="28"/>
+          <w:szCs w:val="28"/>
+          <w:lang w:val="tr-TR" w:eastAsia="tr-TR"/>
+        </w:rPr>
+      </w:pPr>
+    </w:p>
+    <w:p>
+      <w:pPr>
+        <w:rPr>
+          <w:rFonts w:ascii="Times New Roman" w:hAnsi="Times New Roman" w:cs="Times New Roman"/>
+          <w:color w:val="auto"/>
+          <w:sz w:val="28"/>
+          <w:szCs w:val="28"/>
+          <w:lang w:val="tr-TR" w:eastAsia="tr-TR"/>
+        </w:rPr>
+      </w:pPr>
+    </w:p>
+    <w:p>
+      <w:pPr>
+        <w:rPr>
+          <w:rFonts w:ascii="Times New Roman" w:hAnsi="Times New Roman" w:cs="Times New Roman"/>
+          <w:color w:val="auto"/>
+          <w:sz w:val="28"/>
+          <w:szCs w:val="28"/>
+          <w:lang w:val="tr-TR" w:eastAsia="tr-TR"/>
+        </w:rPr>
+      </w:pPr>
+    </w:p>
+    <w:p>
+      <w:pPr>
+        <w:rPr>
+          <w:rFonts w:ascii="Times New Roman" w:hAnsi="Times New Roman" w:cs="Times New Roman"/>
+          <w:color w:val="auto"/>
+          <w:sz w:val="28"/>
+          <w:szCs w:val="28"/>
+          <w:lang w:val="tr-TR" w:eastAsia="tr-TR"/>
+        </w:rPr>
+      </w:pPr>
+    </w:p>
+    <w:p>
+      <w:pPr>
         <w:spacing w:line="360" w:lineRule="auto"/>
         <w:rPr>
           <w:rFonts w:ascii="Times New Roman" w:hAnsi="Times New Roman" w:cs="Times New Roman"/>
@@ -9638,6 +10353,50 @@
         </w:tc>
       </w:tr>
     </w:tbl>
+    <w:p>
+      <w:pPr>
+        <w:rPr>
+          <w:rFonts w:ascii="Times New Roman" w:hAnsi="Times New Roman" w:cs="Times New Roman"/>
+          <w:color w:val="auto"/>
+          <w:sz w:val="28"/>
+          <w:szCs w:val="28"/>
+          <w:lang w:val="tr-TR" w:eastAsia="tr-TR"/>
+        </w:rPr>
+      </w:pPr>
+    </w:p>
+    <w:p>
+      <w:pPr>
+        <w:rPr>
+          <w:rFonts w:ascii="Times New Roman" w:hAnsi="Times New Roman" w:cs="Times New Roman"/>
+          <w:color w:val="auto"/>
+          <w:sz w:val="28"/>
+          <w:szCs w:val="28"/>
+          <w:lang w:val="tr-TR" w:eastAsia="tr-TR"/>
+        </w:rPr>
+      </w:pPr>
+    </w:p>
+    <w:p>
+      <w:pPr>
+        <w:rPr>
+          <w:rFonts w:ascii="Times New Roman" w:hAnsi="Times New Roman" w:cs="Times New Roman"/>
+          <w:color w:val="auto"/>
+          <w:sz w:val="28"/>
+          <w:szCs w:val="28"/>
+          <w:lang w:val="tr-TR" w:eastAsia="tr-TR"/>
+        </w:rPr>
+      </w:pPr>
+    </w:p>
+    <w:p>
+      <w:pPr>
+        <w:rPr>
+          <w:rFonts w:ascii="Times New Roman" w:hAnsi="Times New Roman" w:cs="Times New Roman"/>
+          <w:color w:val="auto"/>
+          <w:sz w:val="28"/>
+          <w:szCs w:val="28"/>
+          <w:lang w:val="tr-TR" w:eastAsia="tr-TR"/>
+        </w:rPr>
+      </w:pPr>
+    </w:p>
     <w:p>
       <w:pPr>
         <w:tabs>
@@ -10574,6 +11333,17 @@
     </w:tbl>
     <w:p>
       <w:pPr>
+        <w:ind w:left="360"/>
+        <w:jc w:val="both"/>
+        <w:rPr>
+          <w:rFonts w:ascii="Times New Roman" w:hAnsi="Times New Roman" w:cs="Times New Roman"/>
+          <w:color w:val="auto"/>
+          <w:lang w:val="tr-TR" w:eastAsia="tr-TR"/>
+        </w:rPr>
+      </w:pPr>
+    </w:p>
+    <w:p>
+      <w:pPr>
         <w:tabs>
           <w:tab w:val="left" w:pos="426"/>
           <w:tab w:val="left" w:pos="709"/>
@@ -10628,6 +11398,43 @@
           <w:lang w:val="tr-TR" w:eastAsia="tr-TR"/>
         </w:rPr>
       </w:pPr>
+    </w:p>
+    <w:p>
+      <w:pPr>
+        <w:ind w:left="360"/>
+        <w:jc w:val="both"/>
+        <w:rPr>
+          <w:rFonts w:ascii="Times New Roman" w:hAnsi="Times New Roman" w:cs="Times New Roman"/>
+          <w:b/>
+          <w:color w:val="auto"/>
+          <w:lang w:val="tr-TR" w:eastAsia="tr-TR"/>
+        </w:rPr>
+      </w:pPr>
+    </w:p>
+    <w:p>
+      <w:pPr>
+        <w:ind w:left="360"/>
+        <w:jc w:val="both"/>
+        <w:rPr>
+          <w:rFonts w:ascii="Times New Roman" w:hAnsi="Times New Roman" w:cs="Times New Roman"/>
+          <w:b/>
+          <w:color w:val="auto"/>
+          <w:lang w:val="tr-TR" w:eastAsia="tr-TR"/>
+        </w:rPr>
+      </w:pPr>
+    </w:p>
+    <w:p>
+      <w:pPr>
+        <w:jc w:val="both"/>
+        <w:rPr>
+          <w:rFonts w:ascii="Times New Roman" w:hAnsi="Times New Roman" w:cs="Times New Roman"/>
+          <w:b/>
+          <w:color w:val="auto"/>
+          <w:sz w:val="28"/>
+          <w:szCs w:val="28"/>
+          <w:lang w:val="tr-TR" w:eastAsia="tr-TR"/>
+        </w:rPr>
+      </w:pPr>
       <w:r>
         <w:rPr>
           <w:rFonts w:ascii="Times New Roman" w:hAnsi="Times New Roman" w:cs="Times New Roman"/>
@@ -10667,6 +11474,45 @@
           <w:lang w:val="tr-TR" w:eastAsia="tr-TR"/>
         </w:rPr>
       </w:pPr>
+    </w:p>
+    <w:p>
+      <w:pPr>
+        <w:jc w:val="both"/>
+        <w:rPr>
+          <w:rFonts w:ascii="Times New Roman" w:hAnsi="Times New Roman" w:cs="Times New Roman"/>
+          <w:b/>
+          <w:color w:val="auto"/>
+          <w:sz w:val="28"/>
+          <w:szCs w:val="28"/>
+          <w:lang w:val="tr-TR" w:eastAsia="tr-TR"/>
+        </w:rPr>
+      </w:pPr>
+    </w:p>
+    <w:p>
+      <w:pPr>
+        <w:jc w:val="both"/>
+        <w:rPr>
+          <w:rFonts w:ascii="Times New Roman" w:hAnsi="Times New Roman" w:cs="Times New Roman"/>
+          <w:b/>
+          <w:color w:val="auto"/>
+          <w:sz w:val="28"/>
+          <w:szCs w:val="28"/>
+          <w:lang w:val="tr-TR" w:eastAsia="tr-TR"/>
+        </w:rPr>
+      </w:pPr>
+    </w:p>
+    <w:p>
+      <w:pPr>
+        <w:jc w:val="both"/>
+        <w:rPr>
+          <w:rFonts w:ascii="Times New Roman" w:hAnsi="Times New Roman" w:cs="Times New Roman"/>
+          <w:b/>
+          <w:color w:val="auto"/>
+          <w:sz w:val="28"/>
+          <w:szCs w:val="28"/>
+          <w:lang w:val="tr-TR" w:eastAsia="tr-TR"/>
+        </w:rPr>
+      </w:pPr>
       <w:r>
         <w:rPr>
           <w:rFonts w:ascii="Times New Roman" w:hAnsi="Times New Roman" w:cs="Times New Roman"/>
@@ -10693,6 +11539,31 @@
         <w:br/>
         <w:t xml:space="preserve">{{aciklama_yararli}}</w:t>
       </w:r>
+    </w:p>
+    <w:p>
+      <w:pPr>
+        <w:jc w:val="both"/>
+        <w:rPr>
+          <w:rFonts w:ascii="Times New Roman" w:hAnsi="Times New Roman" w:cs="Times New Roman"/>
+          <w:b/>
+          <w:color w:val="auto"/>
+          <w:sz w:val="28"/>
+          <w:szCs w:val="28"/>
+          <w:lang w:val="tr-TR" w:eastAsia="tr-TR"/>
+        </w:rPr>
+      </w:pPr>
+    </w:p>
+    <w:p>
+      <w:pPr>
+        <w:jc w:val="both"/>
+        <w:rPr>
+          <w:rFonts w:ascii="Times New Roman" w:hAnsi="Times New Roman" w:cs="Times New Roman"/>
+          <w:color w:val="auto"/>
+          <w:sz w:val="28"/>
+          <w:szCs w:val="28"/>
+          <w:lang w:val="tr-TR" w:eastAsia="tr-TR"/>
+        </w:rPr>
+      </w:pPr>
     </w:p>
     <w:p>
       <w:pPr>
@@ -11028,6 +11899,50 @@
     </w:tbl>
     <w:p>
       <w:pPr>
+        <w:rPr>
+          <w:rFonts w:ascii="Times New Roman" w:hAnsi="Times New Roman" w:cs="Times New Roman"/>
+          <w:color w:val="auto"/>
+          <w:sz w:val="28"/>
+          <w:szCs w:val="28"/>
+          <w:lang w:val="tr-TR" w:eastAsia="tr-TR"/>
+        </w:rPr>
+      </w:pPr>
+    </w:p>
+    <w:p>
+      <w:pPr>
+        <w:rPr>
+          <w:rFonts w:ascii="Times New Roman" w:hAnsi="Times New Roman" w:cs="Times New Roman"/>
+          <w:color w:val="auto"/>
+          <w:sz w:val="28"/>
+          <w:szCs w:val="28"/>
+          <w:lang w:val="tr-TR" w:eastAsia="tr-TR"/>
+        </w:rPr>
+      </w:pPr>
+    </w:p>
+    <w:p>
+      <w:pPr>
+        <w:rPr>
+          <w:rFonts w:ascii="Times New Roman" w:hAnsi="Times New Roman" w:cs="Times New Roman"/>
+          <w:color w:val="auto"/>
+          <w:sz w:val="28"/>
+          <w:szCs w:val="28"/>
+          <w:lang w:val="tr-TR" w:eastAsia="tr-TR"/>
+        </w:rPr>
+      </w:pPr>
+    </w:p>
+    <w:p>
+      <w:pPr>
+        <w:rPr>
+          <w:rFonts w:ascii="Times New Roman" w:hAnsi="Times New Roman" w:cs="Times New Roman"/>
+          <w:color w:val="auto"/>
+          <w:sz w:val="28"/>
+          <w:szCs w:val="28"/>
+          <w:lang w:val="tr-TR" w:eastAsia="tr-TR"/>
+        </w:rPr>
+      </w:pPr>
+    </w:p>
+    <w:p>
+      <w:pPr>
         <w:jc w:val="both"/>
         <w:rPr>
           <w:rFonts w:ascii="Times New Roman" w:hAnsi="Times New Roman" w:cs="Times New Roman"/>
@@ -11107,6 +12022,41 @@
         <w:br/>
         <w:t xml:space="preserve">{{yapilamayan_isler}}</w:t>
       </w:r>
+    </w:p>
+    <w:p>
+      <w:pPr>
+        <w:jc w:val="both"/>
+        <w:rPr>
+          <w:rFonts w:ascii="Times New Roman" w:hAnsi="Times New Roman" w:cs="Times New Roman"/>
+          <w:color w:val="auto"/>
+          <w:sz w:val="28"/>
+          <w:szCs w:val="28"/>
+          <w:lang w:val="tr-TR" w:eastAsia="tr-TR"/>
+        </w:rPr>
+      </w:pPr>
+    </w:p>
+    <w:p>
+      <w:pPr>
+        <w:jc w:val="both"/>
+        <w:rPr>
+          <w:rFonts w:ascii="Times New Roman" w:hAnsi="Times New Roman" w:cs="Times New Roman"/>
+          <w:color w:val="auto"/>
+          <w:sz w:val="28"/>
+          <w:szCs w:val="28"/>
+          <w:lang w:val="tr-TR" w:eastAsia="tr-TR"/>
+        </w:rPr>
+      </w:pPr>
+    </w:p>
+    <w:p>
+      <w:pPr>
+        <w:rPr>
+          <w:rFonts w:ascii="Times New Roman" w:hAnsi="Times New Roman" w:cs="Times New Roman"/>
+          <w:color w:val="auto"/>
+          <w:sz w:val="28"/>
+          <w:szCs w:val="28"/>
+          <w:lang w:val="tr-TR" w:eastAsia="tr-TR"/>
+        </w:rPr>
+      </w:pPr>
     </w:p>
     <w:p>
       <w:pPr>
@@ -11328,6 +12278,54 @@
         </w:tc>
       </w:tr>
     </w:tbl>
+    <w:p>
+      <w:pPr>
+        <w:rPr>
+          <w:rFonts w:ascii="Times New Roman" w:hAnsi="Times New Roman" w:cs="Times New Roman"/>
+          <w:b/>
+          <w:color w:val="auto"/>
+          <w:sz w:val="28"/>
+          <w:szCs w:val="28"/>
+          <w:lang w:val="tr-TR" w:eastAsia="tr-TR"/>
+        </w:rPr>
+      </w:pPr>
+    </w:p>
+    <w:p>
+      <w:pPr>
+        <w:rPr>
+          <w:rFonts w:ascii="Times New Roman" w:hAnsi="Times New Roman" w:cs="Times New Roman"/>
+          <w:b/>
+          <w:color w:val="auto"/>
+          <w:sz w:val="28"/>
+          <w:szCs w:val="28"/>
+          <w:lang w:val="tr-TR" w:eastAsia="tr-TR"/>
+        </w:rPr>
+      </w:pPr>
+    </w:p>
+    <w:p>
+      <w:pPr>
+        <w:rPr>
+          <w:rFonts w:ascii="Times New Roman" w:hAnsi="Times New Roman" w:cs="Times New Roman"/>
+          <w:b/>
+          <w:color w:val="auto"/>
+          <w:sz w:val="28"/>
+          <w:szCs w:val="28"/>
+          <w:lang w:val="tr-TR" w:eastAsia="tr-TR"/>
+        </w:rPr>
+      </w:pPr>
+    </w:p>
+    <w:p>
+      <w:pPr>
+        <w:rPr>
+          <w:rFonts w:ascii="Times New Roman" w:hAnsi="Times New Roman" w:cs="Times New Roman"/>
+          <w:b/>
+          <w:color w:val="auto"/>
+          <w:sz w:val="28"/>
+          <w:szCs w:val="28"/>
+          <w:lang w:val="tr-TR" w:eastAsia="tr-TR"/>
+        </w:rPr>
+      </w:pPr>
+    </w:p>
     <w:tbl>
       <w:tblPr>
         <w:tblW w:w="0" w:type="auto"/>
@@ -11516,6 +12514,62 @@
         <w:jc w:val="both"/>
         <w:rPr>
           <w:rFonts w:ascii="Times New Roman" w:hAnsi="Times New Roman" w:cs="Times New Roman"/>
+          <w:b/>
+          <w:color w:val="auto"/>
+          <w:sz w:val="28"/>
+          <w:szCs w:val="28"/>
+          <w:lang w:val="tr-TR" w:eastAsia="tr-TR"/>
+        </w:rPr>
+      </w:pPr>
+    </w:p>
+    <w:p>
+      <w:pPr>
+        <w:spacing w:line="360" w:lineRule="auto"/>
+        <w:jc w:val="both"/>
+        <w:rPr>
+          <w:rFonts w:ascii="Times New Roman" w:hAnsi="Times New Roman" w:cs="Times New Roman"/>
+          <w:b/>
+          <w:color w:val="auto"/>
+          <w:sz w:val="28"/>
+          <w:szCs w:val="28"/>
+          <w:lang w:val="tr-TR" w:eastAsia="tr-TR"/>
+        </w:rPr>
+      </w:pPr>
+    </w:p>
+    <w:p>
+      <w:pPr>
+        <w:spacing w:line="360" w:lineRule="auto"/>
+        <w:jc w:val="both"/>
+        <w:rPr>
+          <w:rFonts w:ascii="Times New Roman" w:hAnsi="Times New Roman" w:cs="Times New Roman"/>
+          <w:b/>
+          <w:color w:val="auto"/>
+          <w:sz w:val="28"/>
+          <w:szCs w:val="28"/>
+          <w:lang w:val="tr-TR" w:eastAsia="tr-TR"/>
+        </w:rPr>
+      </w:pPr>
+    </w:p>
+    <w:p>
+      <w:pPr>
+        <w:spacing w:line="360" w:lineRule="auto"/>
+        <w:jc w:val="both"/>
+        <w:rPr>
+          <w:rFonts w:ascii="Times New Roman" w:hAnsi="Times New Roman" w:cs="Times New Roman"/>
+          <w:b/>
+          <w:color w:val="auto"/>
+          <w:sz w:val="28"/>
+          <w:szCs w:val="28"/>
+          <w:lang w:val="tr-TR" w:eastAsia="tr-TR"/>
+        </w:rPr>
+      </w:pPr>
+    </w:p>
+    <w:p>
+      <w:pPr>
+        <w:spacing w:line="360" w:lineRule="auto"/>
+        <w:jc w:val="both"/>
+        <w:rPr>
+          <w:rFonts w:ascii="Times New Roman" w:hAnsi="Times New Roman" w:cs="Times New Roman"/>
           <w:color w:val="auto"/>
           <w:sz w:val="28"/>
           <w:szCs w:val="28"/>
@@ -11721,6 +12775,34 @@
         </w:tc>
       </w:tr>
     </w:tbl>
+    <w:p>
+      <w:pPr>
+        <w:spacing w:line="360" w:lineRule="auto"/>
+        <w:jc w:val="both"/>
+        <w:rPr>
+          <w:rFonts w:ascii="Times New Roman" w:hAnsi="Times New Roman" w:cs="Times New Roman"/>
+          <w:b/>
+          <w:color w:val="auto"/>
+          <w:sz w:val="28"/>
+          <w:szCs w:val="28"/>
+          <w:lang w:val="tr-TR" w:eastAsia="tr-TR"/>
+        </w:rPr>
+      </w:pPr>
+    </w:p>
+    <w:p>
+      <w:pPr>
+        <w:spacing w:line="360" w:lineRule="auto"/>
+        <w:jc w:val="both"/>
+        <w:rPr>
+          <w:rFonts w:ascii="Times New Roman" w:hAnsi="Times New Roman" w:cs="Times New Roman"/>
+          <w:b/>
+          <w:color w:val="auto"/>
+          <w:sz w:val="28"/>
+          <w:szCs w:val="28"/>
+          <w:lang w:val="tr-TR" w:eastAsia="tr-TR"/>
+        </w:rPr>
+      </w:pPr>
+    </w:p>
     <w:p>
       <w:pPr>
         <w:spacing w:line="360" w:lineRule="auto"/>
@@ -11945,6 +13027,54 @@
     </w:tbl>
     <w:p>
       <w:pPr>
+        <w:rPr>
+          <w:rFonts w:ascii="Times New Roman" w:hAnsi="Times New Roman" w:cs="Times New Roman"/>
+          <w:b/>
+          <w:color w:val="auto"/>
+          <w:sz w:val="28"/>
+          <w:szCs w:val="28"/>
+          <w:lang w:val="tr-TR" w:eastAsia="tr-TR"/>
+        </w:rPr>
+      </w:pPr>
+    </w:p>
+    <w:p>
+      <w:pPr>
+        <w:rPr>
+          <w:rFonts w:ascii="Times New Roman" w:hAnsi="Times New Roman" w:cs="Times New Roman"/>
+          <w:b/>
+          <w:color w:val="auto"/>
+          <w:sz w:val="28"/>
+          <w:szCs w:val="28"/>
+          <w:lang w:val="tr-TR" w:eastAsia="tr-TR"/>
+        </w:rPr>
+      </w:pPr>
+    </w:p>
+    <w:p>
+      <w:pPr>
+        <w:rPr>
+          <w:rFonts w:ascii="Times New Roman" w:hAnsi="Times New Roman" w:cs="Times New Roman"/>
+          <w:b/>
+          <w:color w:val="auto"/>
+          <w:sz w:val="28"/>
+          <w:szCs w:val="28"/>
+          <w:lang w:val="tr-TR" w:eastAsia="tr-TR"/>
+        </w:rPr>
+      </w:pPr>
+    </w:p>
+    <w:p>
+      <w:pPr>
+        <w:rPr>
+          <w:rFonts w:ascii="Times New Roman" w:hAnsi="Times New Roman" w:cs="Times New Roman"/>
+          <w:b/>
+          <w:color w:val="auto"/>
+          <w:sz w:val="28"/>
+          <w:szCs w:val="28"/>
+          <w:lang w:val="tr-TR" w:eastAsia="tr-TR"/>
+        </w:rPr>
+      </w:pPr>
+    </w:p>
+    <w:p>
+      <w:pPr>
         <w:numPr>
           <w:ilvl w:val="1"/>
           <w:numId w:val="26"/>
@@ -12216,6 +13346,45 @@
     </w:p>
     <w:p>
       <w:pPr>
+        <w:ind w:left="360"/>
+        <w:jc w:val="both"/>
+        <w:rPr>
+          <w:rFonts w:ascii="Times New Roman" w:hAnsi="Times New Roman" w:cs="Times New Roman"/>
+          <w:color w:val="auto"/>
+          <w:sz w:val="28"/>
+          <w:szCs w:val="28"/>
+          <w:lang w:val="tr-TR" w:eastAsia="tr-TR"/>
+        </w:rPr>
+      </w:pPr>
+    </w:p>
+    <w:p>
+      <w:pPr>
+        <w:ind w:left="360"/>
+        <w:jc w:val="both"/>
+        <w:rPr>
+          <w:rFonts w:ascii="Times New Roman" w:hAnsi="Times New Roman" w:cs="Times New Roman"/>
+          <w:color w:val="auto"/>
+          <w:sz w:val="28"/>
+          <w:szCs w:val="28"/>
+          <w:lang w:val="tr-TR" w:eastAsia="tr-TR"/>
+        </w:rPr>
+      </w:pPr>
+    </w:p>
+    <w:p>
+      <w:pPr>
+        <w:ind w:left="360"/>
+        <w:jc w:val="both"/>
+        <w:rPr>
+          <w:rFonts w:ascii="Times New Roman" w:hAnsi="Times New Roman" w:cs="Times New Roman"/>
+          <w:color w:val="auto"/>
+          <w:sz w:val="28"/>
+          <w:szCs w:val="28"/>
+          <w:lang w:val="tr-TR" w:eastAsia="tr-TR"/>
+        </w:rPr>
+      </w:pPr>
+    </w:p>
+    <w:p>
+      <w:pPr>
         <w:numPr>
           <w:ilvl w:val="1"/>
           <w:numId w:val="26"/>
@@ -12256,6 +13425,44 @@
         <w:br/>
         <w:t xml:space="preserve">{{kac_kisi}}</w:t>
       </w:r>
+    </w:p>
+    <w:p>
+      <w:pPr>
+        <w:jc w:val="both"/>
+        <w:rPr>
+          <w:rFonts w:ascii="Times New Roman" w:hAnsi="Times New Roman" w:cs="Times New Roman"/>
+          <w:b/>
+          <w:color w:val="auto"/>
+          <w:sz w:val="28"/>
+          <w:szCs w:val="28"/>
+          <w:lang w:val="tr-TR" w:eastAsia="tr-TR"/>
+        </w:rPr>
+      </w:pPr>
+    </w:p>
+    <w:p>
+      <w:pPr>
+        <w:jc w:val="both"/>
+        <w:rPr>
+          <w:rFonts w:ascii="Times New Roman" w:hAnsi="Times New Roman" w:cs="Times New Roman"/>
+          <w:b/>
+          <w:color w:val="auto"/>
+          <w:sz w:val="28"/>
+          <w:szCs w:val="28"/>
+          <w:lang w:val="tr-TR" w:eastAsia="tr-TR"/>
+        </w:rPr>
+      </w:pPr>
+    </w:p>
+    <w:p>
+      <w:pPr>
+        <w:rPr>
+          <w:rFonts w:ascii="Times New Roman" w:hAnsi="Times New Roman" w:cs="Times New Roman"/>
+          <w:b/>
+          <w:color w:val="auto"/>
+          <w:sz w:val="28"/>
+          <w:szCs w:val="28"/>
+          <w:lang w:val="tr-TR" w:eastAsia="tr-TR"/>
+        </w:rPr>
+      </w:pPr>
     </w:p>
     <w:p>
       <w:pPr>
@@ -12293,6 +13500,46 @@
     </w:p>
     <w:p>
       <w:pPr>
+        <w:spacing w:line="360" w:lineRule="auto"/>
+        <w:jc w:val="both"/>
+        <w:rPr>
+          <w:rFonts w:ascii="Times New Roman" w:hAnsi="Times New Roman" w:cs="Times New Roman"/>
+          <w:b/>
+          <w:color w:val="auto"/>
+          <w:sz w:val="28"/>
+          <w:szCs w:val="28"/>
+          <w:lang w:val="tr-TR" w:eastAsia="tr-TR"/>
+        </w:rPr>
+      </w:pPr>
+    </w:p>
+    <w:p>
+      <w:pPr>
+        <w:spacing w:line="360" w:lineRule="auto"/>
+        <w:jc w:val="both"/>
+        <w:rPr>
+          <w:rFonts w:ascii="Times New Roman" w:hAnsi="Times New Roman" w:cs="Times New Roman"/>
+          <w:color w:val="auto"/>
+          <w:sz w:val="28"/>
+          <w:szCs w:val="28"/>
+          <w:lang w:val="tr-TR" w:eastAsia="tr-TR"/>
+        </w:rPr>
+      </w:pPr>
+    </w:p>
+    <w:p>
+      <w:pPr>
+        <w:spacing w:line="360" w:lineRule="auto"/>
+        <w:jc w:val="both"/>
+        <w:rPr>
+          <w:rFonts w:ascii="Times New Roman" w:hAnsi="Times New Roman" w:cs="Times New Roman"/>
+          <w:color w:val="auto"/>
+          <w:sz w:val="28"/>
+          <w:szCs w:val="28"/>
+          <w:lang w:val="tr-TR" w:eastAsia="tr-TR"/>
+        </w:rPr>
+      </w:pPr>
+    </w:p>
+    <w:p>
+      <w:pPr>
         <w:numPr>
           <w:ilvl w:val="1"/>
           <w:numId w:val="26"/>
@@ -12326,6 +13573,45 @@
     </w:p>
     <w:p>
       <w:pPr>
+        <w:spacing w:line="360" w:lineRule="auto"/>
+        <w:jc w:val="both"/>
+        <w:rPr>
+          <w:rFonts w:ascii="Times New Roman" w:hAnsi="Times New Roman" w:cs="Times New Roman"/>
+          <w:color w:val="auto"/>
+          <w:sz w:val="28"/>
+          <w:szCs w:val="28"/>
+          <w:lang w:val="tr-TR" w:eastAsia="tr-TR"/>
+        </w:rPr>
+      </w:pPr>
+    </w:p>
+    <w:p>
+      <w:pPr>
+        <w:spacing w:line="360" w:lineRule="auto"/>
+        <w:jc w:val="both"/>
+        <w:rPr>
+          <w:rFonts w:ascii="Times New Roman" w:hAnsi="Times New Roman" w:cs="Times New Roman"/>
+          <w:color w:val="auto"/>
+          <w:sz w:val="28"/>
+          <w:szCs w:val="28"/>
+          <w:lang w:val="tr-TR" w:eastAsia="tr-TR"/>
+        </w:rPr>
+      </w:pPr>
+    </w:p>
+    <w:p>
+      <w:pPr>
+        <w:spacing w:line="360" w:lineRule="auto"/>
+        <w:jc w:val="both"/>
+        <w:rPr>
+          <w:rFonts w:ascii="Times New Roman" w:hAnsi="Times New Roman" w:cs="Times New Roman"/>
+          <w:color w:val="auto"/>
+          <w:sz w:val="28"/>
+          <w:szCs w:val="28"/>
+          <w:lang w:val="tr-TR" w:eastAsia="tr-TR"/>
+        </w:rPr>
+      </w:pPr>
+    </w:p>
+    <w:p>
+      <w:pPr>
         <w:numPr>
           <w:ilvl w:val="1"/>
           <w:numId w:val="26"/>
@@ -12359,6 +13645,46 @@
     </w:p>
     <w:p>
       <w:pPr>
+        <w:spacing w:line="360" w:lineRule="auto"/>
+        <w:jc w:val="both"/>
+        <w:rPr>
+          <w:rFonts w:ascii="Times New Roman" w:hAnsi="Times New Roman" w:cs="Times New Roman"/>
+          <w:b/>
+          <w:color w:val="auto"/>
+          <w:sz w:val="28"/>
+          <w:szCs w:val="28"/>
+          <w:lang w:val="tr-TR" w:eastAsia="tr-TR"/>
+        </w:rPr>
+      </w:pPr>
+    </w:p>
+    <w:p>
+      <w:pPr>
+        <w:spacing w:line="360" w:lineRule="auto"/>
+        <w:jc w:val="both"/>
+        <w:rPr>
+          <w:rFonts w:ascii="Times New Roman" w:hAnsi="Times New Roman" w:cs="Times New Roman"/>
+          <w:b/>
+          <w:color w:val="auto"/>
+          <w:sz w:val="28"/>
+          <w:szCs w:val="28"/>
+          <w:lang w:val="tr-TR" w:eastAsia="tr-TR"/>
+        </w:rPr>
+      </w:pPr>
+    </w:p>
+    <w:p>
+      <w:pPr>
+        <w:rPr>
+          <w:rFonts w:ascii="Times New Roman" w:hAnsi="Times New Roman" w:cs="Times New Roman"/>
+          <w:b/>
+          <w:color w:val="auto"/>
+          <w:sz w:val="28"/>
+          <w:szCs w:val="28"/>
+          <w:lang w:val="tr-TR" w:eastAsia="tr-TR"/>
+        </w:rPr>
+      </w:pPr>
+    </w:p>
+    <w:p>
+      <w:pPr>
         <w:numPr>
           <w:ilvl w:val="1"/>
           <w:numId w:val="26"/>
@@ -12392,6 +13718,19 @@
     </w:p>
     <w:p>
       <w:pPr>
+        <w:spacing w:line="360" w:lineRule="auto"/>
+        <w:jc w:val="both"/>
+        <w:rPr>
+          <w:rFonts w:ascii="Times New Roman" w:hAnsi="Times New Roman" w:cs="Times New Roman"/>
+          <w:color w:val="auto"/>
+          <w:sz w:val="28"/>
+          <w:szCs w:val="28"/>
+          <w:lang w:val="tr-TR" w:eastAsia="tr-TR"/>
+        </w:rPr>
+      </w:pPr>
+    </w:p>
+    <w:p>
+      <w:pPr>
         <w:numPr>
           <w:ilvl w:val="1"/>
           <w:numId w:val="26"/>
@@ -12422,6 +13761,47 @@
         <w:br/>
         <w:t xml:space="preserve">{{iyilestirme_engelleri}}</w:t>
       </w:r>
+    </w:p>
+    <w:p>
+      <w:pPr>
+        <w:pStyle w:val="ListeParagraf"/>
+        <w:rPr>
+          <w:rFonts w:ascii="Times New Roman" w:hAnsi="Times New Roman" w:cs="Times New Roman"/>
+          <w:b/>
+          <w:color w:val="auto"/>
+          <w:sz w:val="28"/>
+          <w:szCs w:val="28"/>
+          <w:lang w:val="tr-TR" w:eastAsia="tr-TR"/>
+        </w:rPr>
+      </w:pPr>
+    </w:p>
+    <w:p>
+      <w:pPr>
+        <w:spacing w:line="360" w:lineRule="auto"/>
+        <w:ind w:left="360"/>
+        <w:jc w:val="both"/>
+        <w:rPr>
+          <w:rFonts w:ascii="Times New Roman" w:hAnsi="Times New Roman" w:cs="Times New Roman"/>
+          <w:b/>
+          <w:color w:val="auto"/>
+          <w:sz w:val="28"/>
+          <w:szCs w:val="28"/>
+          <w:lang w:val="tr-TR" w:eastAsia="tr-TR"/>
+        </w:rPr>
+      </w:pPr>
+    </w:p>
+    <w:p>
+      <w:pPr>
+        <w:spacing w:line="360" w:lineRule="auto"/>
+        <w:jc w:val="both"/>
+        <w:rPr>
+          <w:rFonts w:ascii="Times New Roman" w:hAnsi="Times New Roman" w:cs="Times New Roman"/>
+          <w:color w:val="auto"/>
+          <w:sz w:val="28"/>
+          <w:szCs w:val="28"/>
+          <w:lang w:val="tr-TR" w:eastAsia="tr-TR"/>
+        </w:rPr>
+      </w:pPr>
     </w:p>
     <w:p>
       <w:pPr>
@@ -12601,6 +13981,17 @@
     </w:tbl>
     <w:p>
       <w:pPr>
+        <w:jc w:val="both"/>
+        <w:rPr>
+          <w:rFonts w:ascii="Times New Roman" w:hAnsi="Times New Roman" w:cs="Times New Roman"/>
+          <w:noProof/>
+          <w:sz w:val="28"/>
+          <w:lang w:val="tr-TR"/>
+        </w:rPr>
+      </w:pPr>
+    </w:p>
+    <w:p>
+      <w:pPr>
         <w:ind w:left="360"/>
         <w:jc w:val="both"/>
         <w:rPr>
@@ -12657,6 +14048,42 @@
     </w:tbl>
     <w:p>
       <w:pPr>
+        <w:ind w:left="720"/>
+        <w:jc w:val="both"/>
+        <w:rPr>
+          <w:rFonts w:ascii="Times New Roman" w:hAnsi="Times New Roman" w:cs="Times New Roman"/>
+          <w:noProof/>
+          <w:sz w:val="28"/>
+          <w:lang w:val="tr-TR"/>
+        </w:rPr>
+      </w:pPr>
+    </w:p>
+    <w:p>
+      <w:pPr>
+        <w:ind w:left="720"/>
+        <w:jc w:val="both"/>
+        <w:rPr>
+          <w:rFonts w:ascii="Times New Roman" w:hAnsi="Times New Roman" w:cs="Times New Roman"/>
+          <w:noProof/>
+          <w:sz w:val="28"/>
+          <w:lang w:val="tr-TR"/>
+        </w:rPr>
+      </w:pPr>
+    </w:p>
+    <w:p>
+      <w:pPr>
+        <w:ind w:left="720"/>
+        <w:jc w:val="both"/>
+        <w:rPr>
+          <w:rFonts w:ascii="Times New Roman" w:hAnsi="Times New Roman" w:cs="Times New Roman"/>
+          <w:noProof/>
+          <w:sz w:val="28"/>
+          <w:lang w:val="tr-TR"/>
+        </w:rPr>
+      </w:pPr>
+    </w:p>
+    <w:p>
+      <w:pPr>
         <w:pStyle w:val="Balk1"/>
         <w:rPr>
           <w:rFonts w:ascii="Times New Roman" w:hAnsi="Times New Roman" w:cs="Times New Roman"/>
@@ -12808,6 +14235,30 @@
     </w:tbl>
     <w:p>
       <w:pPr>
+        <w:ind w:left="720"/>
+        <w:jc w:val="both"/>
+        <w:rPr>
+          <w:rFonts w:ascii="Times New Roman" w:hAnsi="Times New Roman" w:cs="Times New Roman"/>
+          <w:noProof/>
+          <w:sz w:val="28"/>
+          <w:lang w:val="tr-TR"/>
+        </w:rPr>
+      </w:pPr>
+    </w:p>
+    <w:p>
+      <w:pPr>
+        <w:ind w:left="720"/>
+        <w:jc w:val="both"/>
+        <w:rPr>
+          <w:rFonts w:ascii="Times New Roman" w:hAnsi="Times New Roman" w:cs="Times New Roman"/>
+          <w:noProof/>
+          <w:sz w:val="28"/>
+          <w:lang w:val="tr-TR"/>
+        </w:rPr>
+      </w:pPr>
+    </w:p>
+    <w:p>
+      <w:pPr>
         <w:ind w:left="720" w:hanging="360"/>
         <w:jc w:val="both"/>
         <w:rPr>
@@ -12882,6 +14333,24 @@
     </w:tbl>
     <w:p>
       <w:pPr>
+        <w:rPr>
+          <w:rFonts w:ascii="Times New Roman" w:hAnsi="Times New Roman" w:cs="Times New Roman"/>
+          <w:noProof/>
+          <w:lang w:val="tr-TR"/>
+        </w:rPr>
+      </w:pPr>
+    </w:p>
+    <w:p>
+      <w:pPr>
+        <w:rPr>
+          <w:rFonts w:ascii="Times New Roman" w:hAnsi="Times New Roman" w:cs="Times New Roman"/>
+          <w:noProof/>
+          <w:lang w:val="tr-TR"/>
+        </w:rPr>
+      </w:pPr>
+    </w:p>
+    <w:p>
+      <w:pPr>
         <w:ind w:left="720" w:hanging="360"/>
         <w:jc w:val="both"/>
         <w:rPr>
@@ -12948,6 +14417,24 @@
         </w:tc>
       </w:tr>
     </w:tbl>
+    <w:p>
+      <w:pPr>
+        <w:rPr>
+          <w:rFonts w:ascii="Times New Roman" w:hAnsi="Times New Roman" w:cs="Times New Roman"/>
+          <w:noProof/>
+          <w:lang w:val="tr-TR"/>
+        </w:rPr>
+      </w:pPr>
+    </w:p>
+    <w:p>
+      <w:pPr>
+        <w:rPr>
+          <w:rFonts w:ascii="Times New Roman" w:hAnsi="Times New Roman" w:cs="Times New Roman"/>
+          <w:noProof/>
+          <w:lang w:val="tr-TR"/>
+        </w:rPr>
+      </w:pPr>
+    </w:p>
     <w:p>
       <w:pPr>
         <w:pStyle w:val="Balk1"/>
@@ -13279,6 +14766,30 @@
     </w:tbl>
     <w:p>
       <w:pPr>
+        <w:jc w:val="both"/>
+        <w:rPr>
+          <w:rFonts w:ascii="Times New Roman" w:hAnsi="Times New Roman" w:cs="Times New Roman"/>
+          <w:b/>
+          <w:bCs/>
+          <w:noProof/>
+          <w:sz w:val="28"/>
+          <w:lang w:val="tr-TR"/>
+        </w:rPr>
+      </w:pPr>
+      <w:r>
+        <w:rPr>
+          <w:rFonts w:ascii="Times New Roman" w:hAnsi="Times New Roman" w:cs="Times New Roman"/>
+          <w:b/>
+          <w:bCs/>
+          <w:noProof/>
+          <w:sz w:val="28"/>
+          <w:lang w:val="tr-TR"/>
+        </w:rPr>
+        <w:t xml:space="preserve">            </w:t>
+      </w:r>
+    </w:p>
+    <w:p>
+      <w:pPr>
         <w:ind w:left="720" w:hanging="360"/>
         <w:jc w:val="both"/>
         <w:rPr>
@@ -13502,6 +15013,23 @@
     </w:tbl>
     <w:p>
       <w:pPr>
+        <w:pStyle w:val="Normal"/>
+        <w:rPr>
+          <w:rFonts w:ascii="Times New Roman" w:hAnsi="Times New Roman" w:cs="Times New Roman"/>
+          <w:noProof/>
+          <w:lang w:val="tr-TR"/>
+        </w:rPr>
+      </w:pPr>
+    </w:p>
+    <w:p>
+      <w:pPr>
+        <w:rPr>
+          <w:lang w:val="tr-TR"/>
+        </w:rPr>
+      </w:pPr>
+    </w:p>
+    <w:p>
+      <w:pPr>
         <w:ind w:left="720" w:hanging="360"/>
         <w:jc w:val="both"/>
         <w:rPr>
@@ -13617,6 +15145,18 @@
         </w:rPr>
         <w:tab/>
       </w:r>
+    </w:p>
+    <w:p>
+      <w:pPr>
+        <w:ind w:left="720"/>
+        <w:jc w:val="both"/>
+        <w:rPr>
+          <w:rFonts w:ascii="Times New Roman" w:hAnsi="Times New Roman" w:cs="Times New Roman"/>
+          <w:noProof/>
+          <w:sz w:val="28"/>
+          <w:lang w:val="tr-TR"/>
+        </w:rPr>
+      </w:pPr>
     </w:p>
     <w:p>
       <w:pPr>
@@ -13818,6 +15358,28 @@
     </w:tbl>
     <w:p>
       <w:pPr>
+        <w:pStyle w:val="Normal"/>
+        <w:rPr>
+          <w:rFonts w:ascii="Times New Roman" w:hAnsi="Times New Roman" w:cs="Times New Roman"/>
+          <w:noProof/>
+          <w:lang w:val="tr-TR"/>
+        </w:rPr>
+      </w:pPr>
+    </w:p>
+    <w:p>
+      <w:pPr>
+        <w:ind w:left="720"/>
+        <w:jc w:val="both"/>
+        <w:rPr>
+          <w:rFonts w:ascii="Times New Roman" w:hAnsi="Times New Roman" w:cs="Times New Roman"/>
+          <w:noProof/>
+          <w:sz w:val="28"/>
+          <w:lang w:val="tr-TR"/>
+        </w:rPr>
+      </w:pPr>
+    </w:p>
+    <w:p>
+      <w:pPr>
         <w:ind w:left="720" w:hanging="360"/>
         <w:jc w:val="both"/>
         <w:rPr>
@@ -14034,6 +15596,16 @@
     </w:tbl>
     <w:p>
       <w:pPr>
+        <w:pStyle w:val="Normal"/>
+        <w:rPr>
+          <w:rFonts w:ascii="Times New Roman" w:hAnsi="Times New Roman" w:cs="Times New Roman"/>
+          <w:noProof/>
+          <w:lang w:val="tr-TR"/>
+        </w:rPr>
+      </w:pPr>
+    </w:p>
+    <w:p>
+      <w:pPr>
         <w:pStyle w:val="Balk1"/>
         <w:rPr>
           <w:rFonts w:ascii="Times New Roman" w:hAnsi="Times New Roman" w:cs="Times New Roman"/>
@@ -14195,6 +15767,18 @@
         <w:tab/>
         <w:t>(Eğer cevabınız hayır ise aşağıdaki maddeleri geçiniz)</w:t>
       </w:r>
+    </w:p>
+    <w:p>
+      <w:pPr>
+        <w:ind w:left="720"/>
+        <w:jc w:val="both"/>
+        <w:rPr>
+          <w:rFonts w:ascii="Times New Roman" w:hAnsi="Times New Roman" w:cs="Times New Roman"/>
+          <w:noProof/>
+          <w:sz w:val="28"/>
+          <w:lang w:val="tr-TR"/>
+        </w:rPr>
+      </w:pPr>
     </w:p>
     <w:p>
       <w:pPr>
@@ -14333,6 +15917,17 @@
           <w:lang w:val="tr-TR"/>
         </w:rPr>
       </w:pPr>
+    </w:p>
+    <w:p>
+      <w:pPr>
+        <w:jc w:val="both"/>
+        <w:rPr>
+          <w:rFonts w:ascii="Times New Roman" w:hAnsi="Times New Roman" w:cs="Times New Roman"/>
+          <w:noProof/>
+          <w:sz w:val="28"/>
+          <w:lang w:val="tr-TR"/>
+        </w:rPr>
+      </w:pPr>
       <w:r>
         <w:rPr>
           <w:rFonts w:ascii="Times New Roman" w:hAnsi="Times New Roman" w:cs="Times New Roman"/>
@@ -14461,6 +16056,17 @@
         <w:br/>
         <w:t xml:space="preserve">{{dolayli_sayi}}</w:t>
       </w:r>
+    </w:p>
+    <w:p>
+      <w:pPr>
+        <w:jc w:val="both"/>
+        <w:rPr>
+          <w:rFonts w:ascii="Times New Roman" w:hAnsi="Times New Roman" w:cs="Times New Roman"/>
+          <w:noProof/>
+          <w:sz w:val="28"/>
+          <w:lang w:val="tr-TR"/>
+        </w:rPr>
+      </w:pPr>
     </w:p>
     <w:p>
       <w:pPr>
@@ -14658,6 +16264,27 @@
     </w:tbl>
     <w:p>
       <w:pPr>
+        <w:ind w:left="720"/>
+        <w:jc w:val="both"/>
+        <w:rPr>
+          <w:rFonts w:ascii="Times New Roman" w:hAnsi="Times New Roman" w:cs="Times New Roman"/>
+          <w:noProof/>
+          <w:sz w:val="28"/>
+          <w:lang w:val="tr-TR"/>
+        </w:rPr>
+      </w:pPr>
+    </w:p>
+    <w:p>
+      <w:pPr>
+        <w:rPr>
+          <w:rFonts w:ascii="Times New Roman" w:hAnsi="Times New Roman" w:cs="Times New Roman"/>
+          <w:noProof/>
+          <w:lang w:val="tr-TR"/>
+        </w:rPr>
+      </w:pPr>
+    </w:p>
+    <w:p>
+      <w:pPr>
         <w:pStyle w:val="Balk1"/>
         <w:ind w:left="0"/>
         <w:jc w:val="left"/>
@@ -14771,6 +16398,27 @@
         </w:tc>
       </w:tr>
     </w:tbl>
+    <w:p>
+      <w:pPr>
+        <w:ind w:left="720"/>
+        <w:jc w:val="both"/>
+        <w:rPr>
+          <w:rFonts w:ascii="Times New Roman" w:hAnsi="Times New Roman" w:cs="Times New Roman"/>
+          <w:noProof/>
+          <w:sz w:val="28"/>
+          <w:lang w:val="tr-TR"/>
+        </w:rPr>
+      </w:pPr>
+    </w:p>
+    <w:p>
+      <w:pPr>
+        <w:rPr>
+          <w:rFonts w:ascii="Times New Roman" w:hAnsi="Times New Roman" w:cs="Times New Roman"/>
+          <w:noProof/>
+          <w:lang w:val="tr-TR"/>
+        </w:rPr>
+      </w:pPr>
+    </w:p>
     <w:p>
       <w:pPr>
         <w:pStyle w:val="Balk1"/>
@@ -14972,6 +16620,30 @@
     </w:tbl>
     <w:p>
       <w:pPr>
+        <w:ind w:left="720"/>
+        <w:jc w:val="both"/>
+        <w:rPr>
+          <w:rFonts w:ascii="Times New Roman" w:hAnsi="Times New Roman" w:cs="Times New Roman"/>
+          <w:noProof/>
+          <w:sz w:val="28"/>
+          <w:lang w:val="tr-TR"/>
+        </w:rPr>
+      </w:pPr>
+    </w:p>
+    <w:p>
+      <w:pPr>
+        <w:ind w:left="720"/>
+        <w:jc w:val="both"/>
+        <w:rPr>
+          <w:rFonts w:ascii="Times New Roman" w:hAnsi="Times New Roman" w:cs="Times New Roman"/>
+          <w:noProof/>
+          <w:sz w:val="28"/>
+          <w:lang w:val="tr-TR"/>
+        </w:rPr>
+      </w:pPr>
+    </w:p>
+    <w:p>
+      <w:pPr>
         <w:pStyle w:val="Balk1"/>
         <w:ind w:left="720"/>
         <w:jc w:val="both"/>
@@ -15037,6 +16709,17 @@
         </w:tc>
       </w:tr>
     </w:tbl>
+    <w:p>
+      <w:pPr>
+        <w:jc w:val="both"/>
+        <w:rPr>
+          <w:rFonts w:ascii="Times New Roman" w:hAnsi="Times New Roman" w:cs="Times New Roman"/>
+          <w:noProof/>
+          <w:sz w:val="28"/>
+          <w:lang w:val="tr-TR"/>
+        </w:rPr>
+      </w:pPr>
+    </w:p>
     <w:sectPr>
       <w:footerReference w:type="even" r:id="rId8"/>
       <w:footerReference w:type="default" r:id="rId9"/>

</xml_diff>

<commit_message>
Tablolardaki doldurulan alanlar 12pt oldu
</commit_message>
<xml_diff>
--- a/assets/IsAnaliziForm-template.docx
+++ b/assets/IsAnaliziForm-template.docx
@@ -1053,6 +1053,10 @@
           </w:tcPr>
           <w:p>
             <w:r>
+              <w:rPr>
+                <w:sz w:val="24"/>
+                <w:szCs w:val="24"/>
+              </w:rPr>
               <w:t xml:space="preserve">{{personel_ismi}}</w:t>
             </w:r>
           </w:p>
@@ -1162,6 +1166,10 @@
           </w:tcPr>
           <w:p>
             <w:r>
+              <w:rPr>
+                <w:sz w:val="24"/>
+                <w:szCs w:val="24"/>
+              </w:rPr>
               <w:t xml:space="preserve">{{unvan_pozisyon}}</w:t>
             </w:r>
           </w:p>
@@ -1264,6 +1272,10 @@
           </w:tcPr>
           <w:p>
             <w:r>
+              <w:rPr>
+                <w:sz w:val="24"/>
+                <w:szCs w:val="24"/>
+              </w:rPr>
               <w:t xml:space="preserve">{{bolum}}</w:t>
             </w:r>
           </w:p>
@@ -1312,6 +1324,10 @@
           </w:tcPr>
           <w:p>
             <w:r>
+              <w:rPr>
+                <w:sz w:val="24"/>
+                <w:szCs w:val="24"/>
+              </w:rPr>
               <w:t xml:space="preserve">{{departman}}</w:t>
             </w:r>
           </w:p>
@@ -1371,6 +1387,10 @@
           </w:tcPr>
           <w:p>
             <w:r>
+              <w:rPr>
+                <w:sz w:val="24"/>
+                <w:szCs w:val="24"/>
+              </w:rPr>
               <w:t xml:space="preserve">{{ust_amir_ismi}}</w:t>
             </w:r>
           </w:p>
@@ -1430,6 +1450,10 @@
           </w:tcPr>
           <w:p>
             <w:r>
+              <w:rPr>
+                <w:sz w:val="24"/>
+                <w:szCs w:val="24"/>
+              </w:rPr>
               <w:t xml:space="preserve">{{ust_amir_pozisyonu}}</w:t>
             </w:r>
           </w:p>
@@ -1489,6 +1513,10 @@
           </w:tcPr>
           <w:p>
             <w:r>
+              <w:rPr>
+                <w:sz w:val="24"/>
+                <w:szCs w:val="24"/>
+              </w:rPr>
               <w:t xml:space="preserve">{{ust_amir_bolum}}</w:t>
             </w:r>
           </w:p>
@@ -1545,6 +1573,10 @@
           </w:tcPr>
           <w:p>
             <w:r>
+              <w:rPr>
+                <w:sz w:val="24"/>
+                <w:szCs w:val="24"/>
+              </w:rPr>
               <w:t xml:space="preserve">{{ust_amir_departman}}</w:t>
             </w:r>
           </w:p>
@@ -1724,6 +1756,10 @@
           </w:tcPr>
           <w:p>
             <w:r>
+              <w:rPr>
+                <w:sz w:val="24"/>
+                <w:szCs w:val="24"/>
+              </w:rPr>
               <w:t xml:space="preserve">{{#diger_iletisim}}{{kisi}}</w:t>
             </w:r>
           </w:p>
@@ -1740,6 +1776,10 @@
           </w:tcPr>
           <w:p>
             <w:r>
+              <w:rPr>
+                <w:sz w:val="24"/>
+                <w:szCs w:val="24"/>
+              </w:rPr>
               <w:t xml:space="preserve">{{pozisyon}}{{/diger_iletisim}}</w:t>
             </w:r>
           </w:p>
@@ -1840,6 +1880,10 @@
           </w:tcPr>
           <w:p>
             <w:r>
+              <w:rPr>
+                <w:sz w:val="24"/>
+                <w:szCs w:val="24"/>
+              </w:rPr>
               <w:t xml:space="preserve">{{calisma_yil}}</w:t>
             </w:r>
           </w:p>
@@ -1887,6 +1931,10 @@
           </w:tcPr>
           <w:p>
             <w:r>
+              <w:rPr>
+                <w:sz w:val="24"/>
+                <w:szCs w:val="24"/>
+              </w:rPr>
               <w:t xml:space="preserve">{{calisma_ay}}</w:t>
             </w:r>
           </w:p>
@@ -2734,6 +2782,10 @@
           </w:tcPr>
           <w:p>
             <w:r>
+              <w:rPr>
+                <w:sz w:val="24"/>
+                <w:szCs w:val="24"/>
+              </w:rPr>
               <w:t xml:space="preserve">{{#gorevler}}{{gorev}}</w:t>
             </w:r>
           </w:p>
@@ -2745,6 +2797,10 @@
           </w:tcPr>
           <w:p>
             <w:r>
+              <w:rPr>
+                <w:sz w:val="24"/>
+                <w:szCs w:val="24"/>
+              </w:rPr>
               <w:t xml:space="preserve">{{yuzde}}</w:t>
             </w:r>
           </w:p>
@@ -2755,6 +2811,10 @@
           </w:tcPr>
           <w:p>
             <w:r>
+              <w:rPr>
+                <w:sz w:val="24"/>
+                <w:szCs w:val="24"/>
+              </w:rPr>
               <w:t xml:space="preserve">{{sa}}</w:t>
             </w:r>
           </w:p>
@@ -2765,6 +2825,10 @@
           </w:tcPr>
           <w:p>
             <w:r>
+              <w:rPr>
+                <w:sz w:val="24"/>
+                <w:szCs w:val="24"/>
+              </w:rPr>
               <w:t xml:space="preserve">{{gunluk}}</w:t>
             </w:r>
           </w:p>
@@ -2775,6 +2839,10 @@
           </w:tcPr>
           <w:p>
             <w:r>
+              <w:rPr>
+                <w:sz w:val="24"/>
+                <w:szCs w:val="24"/>
+              </w:rPr>
               <w:t xml:space="preserve">{{belirli}}</w:t>
             </w:r>
           </w:p>
@@ -2785,6 +2853,10 @@
           </w:tcPr>
           <w:p>
             <w:r>
+              <w:rPr>
+                <w:sz w:val="24"/>
+                <w:szCs w:val="24"/>
+              </w:rPr>
               <w:t xml:space="preserve">{{duzensiz}}</w:t>
             </w:r>
           </w:p>
@@ -2795,6 +2867,10 @@
           </w:tcPr>
           <w:p>
             <w:r>
+              <w:rPr>
+                <w:sz w:val="24"/>
+                <w:szCs w:val="24"/>
+              </w:rPr>
               <w:t xml:space="preserve">{{adet}}{{/gorevler}}</w:t>
             </w:r>
           </w:p>
@@ -2905,6 +2981,10 @@
           </w:tcPr>
           <w:p>
             <w:r>
+              <w:rPr>
+                <w:sz w:val="24"/>
+                <w:szCs w:val="24"/>
+              </w:rPr>
               <w:t xml:space="preserve">{{#mevcut_yetkiler}}{{satir}}{{/mevcut_yetkiler}}</w:t>
             </w:r>
           </w:p>
@@ -2961,6 +3041,10 @@
           </w:tcPr>
           <w:p>
             <w:r>
+              <w:rPr>
+                <w:sz w:val="24"/>
+                <w:szCs w:val="24"/>
+              </w:rPr>
               <w:t xml:space="preserve">{{#gereken_yetkiler}}{{satir}}{{/gereken_yetkiler}}</w:t>
             </w:r>
           </w:p>
@@ -4165,6 +4249,10 @@
           </w:tcPr>
           <w:p>
             <w:r>
+              <w:rPr>
+                <w:sz w:val="24"/>
+                <w:szCs w:val="24"/>
+              </w:rPr>
               <w:t xml:space="preserve">{{#gelen_belgeler}}{{belge}}</w:t>
             </w:r>
           </w:p>
@@ -4181,6 +4269,10 @@
           </w:tcPr>
           <w:p>
             <w:r>
+              <w:rPr>
+                <w:sz w:val="24"/>
+                <w:szCs w:val="24"/>
+              </w:rPr>
               <w:t xml:space="preserve">{{bolum}}</w:t>
             </w:r>
           </w:p>
@@ -4197,6 +4289,10 @@
           </w:tcPr>
           <w:p>
             <w:r>
+              <w:rPr>
+                <w:sz w:val="24"/>
+                <w:szCs w:val="24"/>
+              </w:rPr>
               <w:t xml:space="preserve">{{islem}}</w:t>
             </w:r>
           </w:p>
@@ -4213,6 +4309,10 @@
           </w:tcPr>
           <w:p>
             <w:r>
+              <w:rPr>
+                <w:sz w:val="24"/>
+                <w:szCs w:val="24"/>
+              </w:rPr>
               <w:t xml:space="preserve">{{siklik}}</w:t>
             </w:r>
           </w:p>
@@ -4229,6 +4329,10 @@
           </w:tcPr>
           <w:p>
             <w:r>
+              <w:rPr>
+                <w:sz w:val="24"/>
+                <w:szCs w:val="24"/>
+              </w:rPr>
               <w:t xml:space="preserve">{{sure}}{{/gelen_belgeler}}</w:t>
             </w:r>
           </w:p>
@@ -4540,6 +4644,10 @@
           </w:tcPr>
           <w:p>
             <w:r>
+              <w:rPr>
+                <w:sz w:val="24"/>
+                <w:szCs w:val="24"/>
+              </w:rPr>
               <w:t xml:space="preserve">{{#giden_belgeler}}{{belge}}</w:t>
             </w:r>
           </w:p>
@@ -4556,6 +4664,10 @@
           </w:tcPr>
           <w:p>
             <w:r>
+              <w:rPr>
+                <w:sz w:val="24"/>
+                <w:szCs w:val="24"/>
+              </w:rPr>
               <w:t xml:space="preserve">{{yer_amac}}</w:t>
             </w:r>
           </w:p>
@@ -4572,6 +4684,10 @@
           </w:tcPr>
           <w:p>
             <w:r>
+              <w:rPr>
+                <w:sz w:val="24"/>
+                <w:szCs w:val="24"/>
+              </w:rPr>
               <w:t xml:space="preserve">{{siklik}}</w:t>
             </w:r>
           </w:p>
@@ -4588,6 +4704,10 @@
           </w:tcPr>
           <w:p>
             <w:r>
+              <w:rPr>
+                <w:sz w:val="24"/>
+                <w:szCs w:val="24"/>
+              </w:rPr>
               <w:t xml:space="preserve">{{sure}}{{/giden_belgeler}}</w:t>
             </w:r>
           </w:p>
@@ -4838,6 +4958,10 @@
           </w:tcPr>
           <w:p>
             <w:r>
+              <w:rPr>
+                <w:sz w:val="24"/>
+                <w:szCs w:val="24"/>
+              </w:rPr>
               <w:t xml:space="preserve">{{#is_kontrolleri}}{{tur}}</w:t>
             </w:r>
           </w:p>
@@ -4854,6 +4978,10 @@
           </w:tcPr>
           <w:p>
             <w:r>
+              <w:rPr>
+                <w:sz w:val="24"/>
+                <w:szCs w:val="24"/>
+              </w:rPr>
               <w:t xml:space="preserve">{{siklik}}</w:t>
             </w:r>
           </w:p>
@@ -4870,6 +4998,10 @@
           </w:tcPr>
           <w:p>
             <w:r>
+              <w:rPr>
+                <w:sz w:val="24"/>
+                <w:szCs w:val="24"/>
+              </w:rPr>
               <w:t xml:space="preserve">{{sure}}{{/is_kontrolleri}}</w:t>
             </w:r>
           </w:p>
@@ -5139,6 +5271,10 @@
           </w:tcPr>
           <w:p>
             <w:r>
+              <w:rPr>
+                <w:sz w:val="24"/>
+                <w:szCs w:val="24"/>
+              </w:rPr>
               <w:t xml:space="preserve">{{caba_zihinsel_yuzde}}</w:t>
             </w:r>
           </w:p>
@@ -5155,6 +5291,10 @@
           </w:tcPr>
           <w:p>
             <w:r>
+              <w:rPr>
+                <w:sz w:val="24"/>
+                <w:szCs w:val="24"/>
+              </w:rPr>
               <w:t xml:space="preserve">{{caba_zihinsel_aciklama}}</w:t>
             </w:r>
           </w:p>
@@ -5210,6 +5350,10 @@
           </w:tcPr>
           <w:p>
             <w:r>
+              <w:rPr>
+                <w:sz w:val="24"/>
+                <w:szCs w:val="24"/>
+              </w:rPr>
               <w:t xml:space="preserve">{{caba_fiziksel_yuzde}}</w:t>
             </w:r>
           </w:p>
@@ -5226,6 +5370,10 @@
           </w:tcPr>
           <w:p>
             <w:r>
+              <w:rPr>
+                <w:sz w:val="24"/>
+                <w:szCs w:val="24"/>
+              </w:rPr>
               <w:t xml:space="preserve">{{caba_fiziksel_aciklama}}</w:t>
             </w:r>
           </w:p>
@@ -5656,6 +5804,10 @@
           </w:tcPr>
           <w:p>
             <w:r>
+              <w:rPr>
+                <w:sz w:val="24"/>
+                <w:szCs w:val="24"/>
+              </w:rPr>
               <w:t xml:space="preserve">{{#kontrol_tablosu}}{{is}}</w:t>
             </w:r>
           </w:p>
@@ -5672,6 +5824,10 @@
           </w:tcPr>
           <w:p>
             <w:r>
+              <w:rPr>
+                <w:sz w:val="24"/>
+                <w:szCs w:val="24"/>
+              </w:rPr>
               <w:t xml:space="preserve">{{amac}}</w:t>
             </w:r>
           </w:p>
@@ -5688,6 +5844,10 @@
           </w:tcPr>
           <w:p>
             <w:r>
+              <w:rPr>
+                <w:sz w:val="24"/>
+                <w:szCs w:val="24"/>
+              </w:rPr>
               <w:t xml:space="preserve">{{kontrol}}</w:t>
             </w:r>
           </w:p>
@@ -5704,6 +5864,10 @@
           </w:tcPr>
           <w:p>
             <w:r>
+              <w:rPr>
+                <w:sz w:val="24"/>
+                <w:szCs w:val="24"/>
+              </w:rPr>
               <w:t xml:space="preserve">{{paraf}}</w:t>
             </w:r>
           </w:p>
@@ -5720,6 +5884,10 @@
           </w:tcPr>
           <w:p>
             <w:r>
+              <w:rPr>
+                <w:sz w:val="24"/>
+                <w:szCs w:val="24"/>
+              </w:rPr>
               <w:t xml:space="preserve">{{imza}}</w:t>
             </w:r>
           </w:p>
@@ -5736,6 +5904,10 @@
           </w:tcPr>
           <w:p>
             <w:r>
+              <w:rPr>
+                <w:sz w:val="24"/>
+                <w:szCs w:val="24"/>
+              </w:rPr>
               <w:t xml:space="preserve">{{makam}}{{/kontrol_tablosu}}</w:t>
             </w:r>
           </w:p>
@@ -6321,6 +6493,10 @@
           </w:tcPr>
           <w:p>
             <w:r>
+              <w:rPr>
+                <w:sz w:val="24"/>
+                <w:szCs w:val="24"/>
+              </w:rPr>
               <w:t xml:space="preserve">{{#egitim}}{{satir}}{{/egitim}}</w:t>
             </w:r>
           </w:p>
@@ -6424,6 +6600,10 @@
           </w:tcPr>
           <w:p>
             <w:r>
+              <w:rPr>
+                <w:sz w:val="24"/>
+                <w:szCs w:val="24"/>
+              </w:rPr>
               <w:t xml:space="preserve">{{#lisans_sertifikalar}}{{satir}}{{/lisans_sertifikalar}}</w:t>
             </w:r>
           </w:p>
@@ -6491,6 +6671,10 @@
           </w:tcPr>
           <w:p>
             <w:r>
+              <w:rPr>
+                <w:sz w:val="24"/>
+                <w:szCs w:val="24"/>
+              </w:rPr>
               <w:t xml:space="preserve">{{#diger_bilgi_beceri}}{{satir}}{{/diger_bilgi_beceri}}</w:t>
             </w:r>
           </w:p>
@@ -6579,6 +6763,10 @@
           </w:tcPr>
           <w:p>
             <w:r>
+              <w:rPr>
+                <w:sz w:val="24"/>
+                <w:szCs w:val="24"/>
+              </w:rPr>
               <w:t xml:space="preserve">{{#araclar}}{{satir}}{{/araclar}}</w:t>
             </w:r>
           </w:p>
@@ -6776,6 +6964,10 @@
               <w:t xml:space="preserve">Ofis Ortamında  Masa Başında            % </w:t>
             </w:r>
             <w:r>
+              <w:rPr>
+                <w:sz w:val="24"/>
+                <w:szCs w:val="24"/>
+              </w:rPr>
               <w:t xml:space="preserve"> {{yuzde_masa}}</w:t>
             </w:r>
           </w:p>
@@ -6825,6 +7017,10 @@
               <w:t xml:space="preserve">Ofis Ortamında Bölümler Arasında     % </w:t>
             </w:r>
             <w:r>
+              <w:rPr>
+                <w:sz w:val="24"/>
+                <w:szCs w:val="24"/>
+              </w:rPr>
               <w:t xml:space="preserve"> {{yuzde_bolumler}}</w:t>
             </w:r>
           </w:p>
@@ -6874,6 +7070,10 @@
               <w:t xml:space="preserve">Ofis Ortamı Dışında Mobil                  % </w:t>
             </w:r>
             <w:r>
+              <w:rPr>
+                <w:sz w:val="24"/>
+                <w:szCs w:val="24"/>
+              </w:rPr>
               <w:t xml:space="preserve"> {{yuzde_mobil}}</w:t>
             </w:r>
           </w:p>
@@ -7886,6 +8086,10 @@
           </w:tcPr>
           <w:p>
             <w:r>
+              <w:rPr>
+                <w:sz w:val="24"/>
+                <w:szCs w:val="24"/>
+              </w:rPr>
               <w:t xml:space="preserve">{{m_buro_gurultu}}</w:t>
             </w:r>
           </w:p>
@@ -7902,6 +8106,10 @@
           </w:tcPr>
           <w:p>
             <w:r>
+              <w:rPr>
+                <w:sz w:val="24"/>
+                <w:szCs w:val="24"/>
+              </w:rPr>
               <w:t xml:space="preserve">{{m_buro_aydinlatma}}</w:t>
             </w:r>
           </w:p>
@@ -7918,6 +8126,10 @@
           </w:tcPr>
           <w:p>
             <w:r>
+              <w:rPr>
+                <w:sz w:val="24"/>
+                <w:szCs w:val="24"/>
+              </w:rPr>
               <w:t xml:space="preserve">{{m_buro_sicak}}</w:t>
             </w:r>
           </w:p>
@@ -7934,6 +8146,10 @@
           </w:tcPr>
           <w:p>
             <w:r>
+              <w:rPr>
+                <w:sz w:val="24"/>
+                <w:szCs w:val="24"/>
+              </w:rPr>
               <w:t xml:space="preserve">{{m_buro_soguk}}</w:t>
             </w:r>
           </w:p>
@@ -7950,6 +8166,10 @@
           </w:tcPr>
           <w:p>
             <w:r>
+              <w:rPr>
+                <w:sz w:val="24"/>
+                <w:szCs w:val="24"/>
+              </w:rPr>
               <w:t xml:space="preserve">{{m_buro_nem}}</w:t>
             </w:r>
           </w:p>
@@ -7966,6 +8186,10 @@
           </w:tcPr>
           <w:p>
             <w:r>
+              <w:rPr>
+                <w:sz w:val="24"/>
+                <w:szCs w:val="24"/>
+              </w:rPr>
               <w:t xml:space="preserve">{{m_buro_toz}}</w:t>
             </w:r>
           </w:p>
@@ -7982,6 +8206,10 @@
           </w:tcPr>
           <w:p>
             <w:r>
+              <w:rPr>
+                <w:sz w:val="24"/>
+                <w:szCs w:val="24"/>
+              </w:rPr>
               <w:t xml:space="preserve">{{m_buro_koku}}</w:t>
             </w:r>
           </w:p>
@@ -7998,6 +8226,10 @@
           </w:tcPr>
           <w:p>
             <w:r>
+              <w:rPr>
+                <w:sz w:val="24"/>
+                <w:szCs w:val="24"/>
+              </w:rPr>
               <w:t xml:space="preserve">{{m_buro_ergonomi}}</w:t>
             </w:r>
           </w:p>
@@ -8014,6 +8246,10 @@
           </w:tcPr>
           <w:p>
             <w:r>
+              <w:rPr>
+                <w:sz w:val="24"/>
+                <w:szCs w:val="24"/>
+              </w:rPr>
               <w:t xml:space="preserve">{{m_buro_havalandirma}}</w:t>
             </w:r>
           </w:p>
@@ -8030,6 +8266,10 @@
           </w:tcPr>
           <w:p>
             <w:r>
+              <w:rPr>
+                <w:sz w:val="24"/>
+                <w:szCs w:val="24"/>
+              </w:rPr>
               <w:t xml:space="preserve">{{m_buro_kimyasal}}</w:t>
             </w:r>
           </w:p>
@@ -8046,6 +8286,10 @@
           </w:tcPr>
           <w:p>
             <w:r>
+              <w:rPr>
+                <w:sz w:val="24"/>
+                <w:szCs w:val="24"/>
+              </w:rPr>
               <w:t xml:space="preserve">{{m_buro_diger}}</w:t>
             </w:r>
           </w:p>
@@ -8100,6 +8344,10 @@
           </w:tcPr>
           <w:p>
             <w:r>
+              <w:rPr>
+                <w:sz w:val="24"/>
+                <w:szCs w:val="24"/>
+              </w:rPr>
               <w:t xml:space="preserve">{{m_atolye_gurultu}}</w:t>
             </w:r>
           </w:p>
@@ -8116,6 +8364,10 @@
           </w:tcPr>
           <w:p>
             <w:r>
+              <w:rPr>
+                <w:sz w:val="24"/>
+                <w:szCs w:val="24"/>
+              </w:rPr>
               <w:t xml:space="preserve">{{m_atolye_aydinlatma}}</w:t>
             </w:r>
           </w:p>
@@ -8132,6 +8384,10 @@
           </w:tcPr>
           <w:p>
             <w:r>
+              <w:rPr>
+                <w:sz w:val="24"/>
+                <w:szCs w:val="24"/>
+              </w:rPr>
               <w:t xml:space="preserve">{{m_atolye_sicak}}</w:t>
             </w:r>
           </w:p>
@@ -8148,6 +8404,10 @@
           </w:tcPr>
           <w:p>
             <w:r>
+              <w:rPr>
+                <w:sz w:val="24"/>
+                <w:szCs w:val="24"/>
+              </w:rPr>
               <w:t xml:space="preserve">{{m_atolye_soguk}}</w:t>
             </w:r>
           </w:p>
@@ -8164,6 +8424,10 @@
           </w:tcPr>
           <w:p>
             <w:r>
+              <w:rPr>
+                <w:sz w:val="24"/>
+                <w:szCs w:val="24"/>
+              </w:rPr>
               <w:t xml:space="preserve">{{m_atolye_nem}}</w:t>
             </w:r>
           </w:p>
@@ -8180,6 +8444,10 @@
           </w:tcPr>
           <w:p>
             <w:r>
+              <w:rPr>
+                <w:sz w:val="24"/>
+                <w:szCs w:val="24"/>
+              </w:rPr>
               <w:t xml:space="preserve">{{m_atolye_toz}}</w:t>
             </w:r>
           </w:p>
@@ -8196,6 +8464,10 @@
           </w:tcPr>
           <w:p>
             <w:r>
+              <w:rPr>
+                <w:sz w:val="24"/>
+                <w:szCs w:val="24"/>
+              </w:rPr>
               <w:t xml:space="preserve">{{m_atolye_koku}}</w:t>
             </w:r>
           </w:p>
@@ -8212,6 +8484,10 @@
           </w:tcPr>
           <w:p>
             <w:r>
+              <w:rPr>
+                <w:sz w:val="24"/>
+                <w:szCs w:val="24"/>
+              </w:rPr>
               <w:t xml:space="preserve">{{m_atolye_ergonomi}}</w:t>
             </w:r>
           </w:p>
@@ -8228,6 +8504,10 @@
           </w:tcPr>
           <w:p>
             <w:r>
+              <w:rPr>
+                <w:sz w:val="24"/>
+                <w:szCs w:val="24"/>
+              </w:rPr>
               <w:t xml:space="preserve">{{m_atolye_havalandirma}}</w:t>
             </w:r>
           </w:p>
@@ -8244,6 +8524,10 @@
           </w:tcPr>
           <w:p>
             <w:r>
+              <w:rPr>
+                <w:sz w:val="24"/>
+                <w:szCs w:val="24"/>
+              </w:rPr>
               <w:t xml:space="preserve">{{m_atolye_kimyasal}}</w:t>
             </w:r>
           </w:p>
@@ -8260,6 +8544,10 @@
           </w:tcPr>
           <w:p>
             <w:r>
+              <w:rPr>
+                <w:sz w:val="24"/>
+                <w:szCs w:val="24"/>
+              </w:rPr>
               <w:t xml:space="preserve">{{m_atolye_diger}}</w:t>
             </w:r>
           </w:p>
@@ -8314,6 +8602,10 @@
           </w:tcPr>
           <w:p>
             <w:r>
+              <w:rPr>
+                <w:sz w:val="24"/>
+                <w:szCs w:val="24"/>
+              </w:rPr>
               <w:t xml:space="preserve">{{m_dis_gurultu}}</w:t>
             </w:r>
           </w:p>
@@ -8330,6 +8622,10 @@
           </w:tcPr>
           <w:p>
             <w:r>
+              <w:rPr>
+                <w:sz w:val="24"/>
+                <w:szCs w:val="24"/>
+              </w:rPr>
               <w:t xml:space="preserve">{{m_dis_aydinlatma}}</w:t>
             </w:r>
           </w:p>
@@ -8346,6 +8642,10 @@
           </w:tcPr>
           <w:p>
             <w:r>
+              <w:rPr>
+                <w:sz w:val="24"/>
+                <w:szCs w:val="24"/>
+              </w:rPr>
               <w:t xml:space="preserve">{{m_dis_sicak}}</w:t>
             </w:r>
           </w:p>
@@ -8362,6 +8662,10 @@
           </w:tcPr>
           <w:p>
             <w:r>
+              <w:rPr>
+                <w:sz w:val="24"/>
+                <w:szCs w:val="24"/>
+              </w:rPr>
               <w:t xml:space="preserve">{{m_dis_soguk}}</w:t>
             </w:r>
           </w:p>
@@ -8378,6 +8682,10 @@
           </w:tcPr>
           <w:p>
             <w:r>
+              <w:rPr>
+                <w:sz w:val="24"/>
+                <w:szCs w:val="24"/>
+              </w:rPr>
               <w:t xml:space="preserve">{{m_dis_nem}}</w:t>
             </w:r>
           </w:p>
@@ -8394,6 +8702,10 @@
           </w:tcPr>
           <w:p>
             <w:r>
+              <w:rPr>
+                <w:sz w:val="24"/>
+                <w:szCs w:val="24"/>
+              </w:rPr>
               <w:t xml:space="preserve">{{m_dis_toz}}</w:t>
             </w:r>
           </w:p>
@@ -8410,6 +8722,10 @@
           </w:tcPr>
           <w:p>
             <w:r>
+              <w:rPr>
+                <w:sz w:val="24"/>
+                <w:szCs w:val="24"/>
+              </w:rPr>
               <w:t xml:space="preserve">{{m_dis_koku}}</w:t>
             </w:r>
           </w:p>
@@ -8426,6 +8742,10 @@
           </w:tcPr>
           <w:p>
             <w:r>
+              <w:rPr>
+                <w:sz w:val="24"/>
+                <w:szCs w:val="24"/>
+              </w:rPr>
               <w:t xml:space="preserve">{{m_dis_ergonomi}}</w:t>
             </w:r>
           </w:p>
@@ -8442,6 +8762,10 @@
           </w:tcPr>
           <w:p>
             <w:r>
+              <w:rPr>
+                <w:sz w:val="24"/>
+                <w:szCs w:val="24"/>
+              </w:rPr>
               <w:t xml:space="preserve">{{m_dis_havalandirma}}</w:t>
             </w:r>
           </w:p>
@@ -8458,6 +8782,10 @@
           </w:tcPr>
           <w:p>
             <w:r>
+              <w:rPr>
+                <w:sz w:val="24"/>
+                <w:szCs w:val="24"/>
+              </w:rPr>
               <w:t xml:space="preserve">{{m_dis_kimyasal}}</w:t>
             </w:r>
           </w:p>
@@ -8474,6 +8802,10 @@
           </w:tcPr>
           <w:p>
             <w:r>
+              <w:rPr>
+                <w:sz w:val="24"/>
+                <w:szCs w:val="24"/>
+              </w:rPr>
               <w:t xml:space="preserve">{{m_dis_diger}}</w:t>
             </w:r>
           </w:p>
@@ -8528,6 +8860,10 @@
           </w:tcPr>
           <w:p>
             <w:r>
+              <w:rPr>
+                <w:sz w:val="24"/>
+                <w:szCs w:val="24"/>
+              </w:rPr>
               <w:t xml:space="preserve">{{m_lab_gurultu}}</w:t>
             </w:r>
           </w:p>
@@ -8544,6 +8880,10 @@
           </w:tcPr>
           <w:p>
             <w:r>
+              <w:rPr>
+                <w:sz w:val="24"/>
+                <w:szCs w:val="24"/>
+              </w:rPr>
               <w:t xml:space="preserve">{{m_lab_aydinlatma}}</w:t>
             </w:r>
           </w:p>
@@ -8560,6 +8900,10 @@
           </w:tcPr>
           <w:p>
             <w:r>
+              <w:rPr>
+                <w:sz w:val="24"/>
+                <w:szCs w:val="24"/>
+              </w:rPr>
               <w:t xml:space="preserve">{{m_lab_sicak}}</w:t>
             </w:r>
           </w:p>
@@ -8576,6 +8920,10 @@
           </w:tcPr>
           <w:p>
             <w:r>
+              <w:rPr>
+                <w:sz w:val="24"/>
+                <w:szCs w:val="24"/>
+              </w:rPr>
               <w:t xml:space="preserve">{{m_lab_soguk}}</w:t>
             </w:r>
           </w:p>
@@ -8592,6 +8940,10 @@
           </w:tcPr>
           <w:p>
             <w:r>
+              <w:rPr>
+                <w:sz w:val="24"/>
+                <w:szCs w:val="24"/>
+              </w:rPr>
               <w:t xml:space="preserve">{{m_lab_nem}}</w:t>
             </w:r>
           </w:p>
@@ -8608,6 +8960,10 @@
           </w:tcPr>
           <w:p>
             <w:r>
+              <w:rPr>
+                <w:sz w:val="24"/>
+                <w:szCs w:val="24"/>
+              </w:rPr>
               <w:t xml:space="preserve">{{m_lab_toz}}</w:t>
             </w:r>
           </w:p>
@@ -8624,6 +8980,10 @@
           </w:tcPr>
           <w:p>
             <w:r>
+              <w:rPr>
+                <w:sz w:val="24"/>
+                <w:szCs w:val="24"/>
+              </w:rPr>
               <w:t xml:space="preserve">{{m_lab_koku}}</w:t>
             </w:r>
           </w:p>
@@ -8640,6 +9000,10 @@
           </w:tcPr>
           <w:p>
             <w:r>
+              <w:rPr>
+                <w:sz w:val="24"/>
+                <w:szCs w:val="24"/>
+              </w:rPr>
               <w:t xml:space="preserve">{{m_lab_ergonomi}}</w:t>
             </w:r>
           </w:p>
@@ -8656,6 +9020,10 @@
           </w:tcPr>
           <w:p>
             <w:r>
+              <w:rPr>
+                <w:sz w:val="24"/>
+                <w:szCs w:val="24"/>
+              </w:rPr>
               <w:t xml:space="preserve">{{m_lab_havalandirma}}</w:t>
             </w:r>
           </w:p>
@@ -8672,6 +9040,10 @@
           </w:tcPr>
           <w:p>
             <w:r>
+              <w:rPr>
+                <w:sz w:val="24"/>
+                <w:szCs w:val="24"/>
+              </w:rPr>
               <w:t xml:space="preserve">{{m_lab_kimyasal}}</w:t>
             </w:r>
           </w:p>
@@ -8688,6 +9060,10 @@
           </w:tcPr>
           <w:p>
             <w:r>
+              <w:rPr>
+                <w:sz w:val="24"/>
+                <w:szCs w:val="24"/>
+              </w:rPr>
               <w:t xml:space="preserve">{{m_lab_diger}}</w:t>
             </w:r>
           </w:p>
@@ -8742,6 +9118,10 @@
           </w:tcPr>
           <w:p>
             <w:r>
+              <w:rPr>
+                <w:sz w:val="24"/>
+                <w:szCs w:val="24"/>
+              </w:rPr>
               <w:t xml:space="preserve">{{m_depo_gurultu}}</w:t>
             </w:r>
           </w:p>
@@ -8758,6 +9138,10 @@
           </w:tcPr>
           <w:p>
             <w:r>
+              <w:rPr>
+                <w:sz w:val="24"/>
+                <w:szCs w:val="24"/>
+              </w:rPr>
               <w:t xml:space="preserve">{{m_depo_aydinlatma}}</w:t>
             </w:r>
           </w:p>
@@ -8774,6 +9158,10 @@
           </w:tcPr>
           <w:p>
             <w:r>
+              <w:rPr>
+                <w:sz w:val="24"/>
+                <w:szCs w:val="24"/>
+              </w:rPr>
               <w:t xml:space="preserve">{{m_depo_sicak}}</w:t>
             </w:r>
           </w:p>
@@ -8790,6 +9178,10 @@
           </w:tcPr>
           <w:p>
             <w:r>
+              <w:rPr>
+                <w:sz w:val="24"/>
+                <w:szCs w:val="24"/>
+              </w:rPr>
               <w:t xml:space="preserve">{{m_depo_soguk}}</w:t>
             </w:r>
           </w:p>
@@ -8806,6 +9198,10 @@
           </w:tcPr>
           <w:p>
             <w:r>
+              <w:rPr>
+                <w:sz w:val="24"/>
+                <w:szCs w:val="24"/>
+              </w:rPr>
               <w:t xml:space="preserve">{{m_depo_nem}}</w:t>
             </w:r>
           </w:p>
@@ -8822,6 +9218,10 @@
           </w:tcPr>
           <w:p>
             <w:r>
+              <w:rPr>
+                <w:sz w:val="24"/>
+                <w:szCs w:val="24"/>
+              </w:rPr>
               <w:t xml:space="preserve">{{m_depo_toz}}</w:t>
             </w:r>
           </w:p>
@@ -8838,6 +9238,10 @@
           </w:tcPr>
           <w:p>
             <w:r>
+              <w:rPr>
+                <w:sz w:val="24"/>
+                <w:szCs w:val="24"/>
+              </w:rPr>
               <w:t xml:space="preserve">{{m_depo_koku}}</w:t>
             </w:r>
           </w:p>
@@ -8854,6 +9258,10 @@
           </w:tcPr>
           <w:p>
             <w:r>
+              <w:rPr>
+                <w:sz w:val="24"/>
+                <w:szCs w:val="24"/>
+              </w:rPr>
               <w:t xml:space="preserve">{{m_depo_ergonomi}}</w:t>
             </w:r>
           </w:p>
@@ -8870,6 +9278,10 @@
           </w:tcPr>
           <w:p>
             <w:r>
+              <w:rPr>
+                <w:sz w:val="24"/>
+                <w:szCs w:val="24"/>
+              </w:rPr>
               <w:t xml:space="preserve">{{m_depo_havalandirma}}</w:t>
             </w:r>
           </w:p>
@@ -8886,6 +9298,10 @@
           </w:tcPr>
           <w:p>
             <w:r>
+              <w:rPr>
+                <w:sz w:val="24"/>
+                <w:szCs w:val="24"/>
+              </w:rPr>
               <w:t xml:space="preserve">{{m_depo_kimyasal}}</w:t>
             </w:r>
           </w:p>
@@ -8902,6 +9318,10 @@
           </w:tcPr>
           <w:p>
             <w:r>
+              <w:rPr>
+                <w:sz w:val="24"/>
+                <w:szCs w:val="24"/>
+              </w:rPr>
               <w:t xml:space="preserve">{{m_depo_diger}}</w:t>
             </w:r>
           </w:p>
@@ -8956,6 +9376,10 @@
           </w:tcPr>
           <w:p>
             <w:r>
+              <w:rPr>
+                <w:sz w:val="24"/>
+                <w:szCs w:val="24"/>
+              </w:rPr>
               <w:t xml:space="preserve">{{m_pc_gurultu}}</w:t>
             </w:r>
           </w:p>
@@ -8972,6 +9396,10 @@
           </w:tcPr>
           <w:p>
             <w:r>
+              <w:rPr>
+                <w:sz w:val="24"/>
+                <w:szCs w:val="24"/>
+              </w:rPr>
               <w:t xml:space="preserve">{{m_pc_aydinlatma}}</w:t>
             </w:r>
           </w:p>
@@ -8988,6 +9416,10 @@
           </w:tcPr>
           <w:p>
             <w:r>
+              <w:rPr>
+                <w:sz w:val="24"/>
+                <w:szCs w:val="24"/>
+              </w:rPr>
               <w:t xml:space="preserve">{{m_pc_sicak}}</w:t>
             </w:r>
           </w:p>
@@ -9004,6 +9436,10 @@
           </w:tcPr>
           <w:p>
             <w:r>
+              <w:rPr>
+                <w:sz w:val="24"/>
+                <w:szCs w:val="24"/>
+              </w:rPr>
               <w:t xml:space="preserve">{{m_pc_soguk}}</w:t>
             </w:r>
           </w:p>
@@ -9020,6 +9456,10 @@
           </w:tcPr>
           <w:p>
             <w:r>
+              <w:rPr>
+                <w:sz w:val="24"/>
+                <w:szCs w:val="24"/>
+              </w:rPr>
               <w:t xml:space="preserve">{{m_pc_nem}}</w:t>
             </w:r>
           </w:p>
@@ -9036,6 +9476,10 @@
           </w:tcPr>
           <w:p>
             <w:r>
+              <w:rPr>
+                <w:sz w:val="24"/>
+                <w:szCs w:val="24"/>
+              </w:rPr>
               <w:t xml:space="preserve">{{m_pc_toz}}</w:t>
             </w:r>
           </w:p>
@@ -9052,6 +9496,10 @@
           </w:tcPr>
           <w:p>
             <w:r>
+              <w:rPr>
+                <w:sz w:val="24"/>
+                <w:szCs w:val="24"/>
+              </w:rPr>
               <w:t xml:space="preserve">{{m_pc_koku}}</w:t>
             </w:r>
           </w:p>
@@ -9068,6 +9516,10 @@
           </w:tcPr>
           <w:p>
             <w:r>
+              <w:rPr>
+                <w:sz w:val="24"/>
+                <w:szCs w:val="24"/>
+              </w:rPr>
               <w:t xml:space="preserve">{{m_pc_ergonomi}}</w:t>
             </w:r>
           </w:p>
@@ -9084,6 +9536,10 @@
           </w:tcPr>
           <w:p>
             <w:r>
+              <w:rPr>
+                <w:sz w:val="24"/>
+                <w:szCs w:val="24"/>
+              </w:rPr>
               <w:t xml:space="preserve">{{m_pc_havalandirma}}</w:t>
             </w:r>
           </w:p>
@@ -9100,6 +9556,10 @@
           </w:tcPr>
           <w:p>
             <w:r>
+              <w:rPr>
+                <w:sz w:val="24"/>
+                <w:szCs w:val="24"/>
+              </w:rPr>
               <w:t xml:space="preserve">{{m_pc_kimyasal}}</w:t>
             </w:r>
           </w:p>
@@ -9116,6 +9576,10 @@
           </w:tcPr>
           <w:p>
             <w:r>
+              <w:rPr>
+                <w:sz w:val="24"/>
+                <w:szCs w:val="24"/>
+              </w:rPr>
               <w:t xml:space="preserve">{{m_pc_diger}}</w:t>
             </w:r>
           </w:p>
@@ -9190,6 +9654,10 @@
           </w:tcPr>
           <w:p>
             <w:r>
+              <w:rPr>
+                <w:sz w:val="24"/>
+                <w:szCs w:val="24"/>
+              </w:rPr>
               <w:t xml:space="preserve">{{m_diger_gurultu}}</w:t>
             </w:r>
           </w:p>
@@ -9206,6 +9674,10 @@
           </w:tcPr>
           <w:p>
             <w:r>
+              <w:rPr>
+                <w:sz w:val="24"/>
+                <w:szCs w:val="24"/>
+              </w:rPr>
               <w:t xml:space="preserve">{{m_diger_aydinlatma}}</w:t>
             </w:r>
           </w:p>
@@ -9222,6 +9694,10 @@
           </w:tcPr>
           <w:p>
             <w:r>
+              <w:rPr>
+                <w:sz w:val="24"/>
+                <w:szCs w:val="24"/>
+              </w:rPr>
               <w:t xml:space="preserve">{{m_diger_sicak}}</w:t>
             </w:r>
           </w:p>
@@ -9238,6 +9714,10 @@
           </w:tcPr>
           <w:p>
             <w:r>
+              <w:rPr>
+                <w:sz w:val="24"/>
+                <w:szCs w:val="24"/>
+              </w:rPr>
               <w:t xml:space="preserve">{{m_diger_soguk}}</w:t>
             </w:r>
           </w:p>
@@ -9254,6 +9734,10 @@
           </w:tcPr>
           <w:p>
             <w:r>
+              <w:rPr>
+                <w:sz w:val="24"/>
+                <w:szCs w:val="24"/>
+              </w:rPr>
               <w:t xml:space="preserve">{{m_diger_nem}}</w:t>
             </w:r>
           </w:p>
@@ -9270,6 +9754,10 @@
           </w:tcPr>
           <w:p>
             <w:r>
+              <w:rPr>
+                <w:sz w:val="24"/>
+                <w:szCs w:val="24"/>
+              </w:rPr>
               <w:t xml:space="preserve">{{m_diger_toz}}</w:t>
             </w:r>
           </w:p>
@@ -9286,6 +9774,10 @@
           </w:tcPr>
           <w:p>
             <w:r>
+              <w:rPr>
+                <w:sz w:val="24"/>
+                <w:szCs w:val="24"/>
+              </w:rPr>
               <w:t xml:space="preserve">{{m_diger_koku}}</w:t>
             </w:r>
           </w:p>
@@ -9302,6 +9794,10 @@
           </w:tcPr>
           <w:p>
             <w:r>
+              <w:rPr>
+                <w:sz w:val="24"/>
+                <w:szCs w:val="24"/>
+              </w:rPr>
               <w:t xml:space="preserve">{{m_diger_ergonomi}}</w:t>
             </w:r>
           </w:p>
@@ -9318,6 +9814,10 @@
           </w:tcPr>
           <w:p>
             <w:r>
+              <w:rPr>
+                <w:sz w:val="24"/>
+                <w:szCs w:val="24"/>
+              </w:rPr>
               <w:t xml:space="preserve">{{m_diger_havalandirma}}</w:t>
             </w:r>
           </w:p>
@@ -9334,6 +9834,10 @@
           </w:tcPr>
           <w:p>
             <w:r>
+              <w:rPr>
+                <w:sz w:val="24"/>
+                <w:szCs w:val="24"/>
+              </w:rPr>
               <w:t xml:space="preserve">{{m_diger_kimyasal}}</w:t>
             </w:r>
           </w:p>
@@ -9350,16 +9854,28 @@
           </w:tcPr>
           <w:p>
             <w:r>
+              <w:rPr>
+                <w:sz w:val="24"/>
+                <w:szCs w:val="24"/>
+              </w:rPr>
               <w:t xml:space="preserve">{{m_diger_diger}}</w:t>
             </w:r>
           </w:p>
           <w:p>
             <w:r>
+              <w:rPr>
+                <w:sz w:val="24"/>
+                <w:szCs w:val="24"/>
+              </w:rPr>
               <w:t xml:space="preserve">{{ortam_diger_aciklama}}</w:t>
             </w:r>
           </w:p>
           <w:p>
             <w:r>
+              <w:rPr>
+                <w:sz w:val="24"/>
+                <w:szCs w:val="24"/>
+              </w:rPr>
               <w:t xml:space="preserve">{{faktor_diger_aciklama}}</w:t>
             </w:r>
           </w:p>
@@ -9645,6 +10161,10 @@
           </w:tcPr>
           <w:p>
             <w:r>
+              <w:rPr>
+                <w:sz w:val="24"/>
+                <w:szCs w:val="24"/>
+              </w:rPr>
               <w:t xml:space="preserve">{{r_kaza_yok}}</w:t>
             </w:r>
           </w:p>
@@ -9664,6 +10184,10 @@
           </w:tcPr>
           <w:p>
             <w:r>
+              <w:rPr>
+                <w:sz w:val="24"/>
+                <w:szCs w:val="24"/>
+              </w:rPr>
               <w:t xml:space="preserve">{{r_kaza_s_dusuk}}</w:t>
             </w:r>
           </w:p>
@@ -9683,6 +10207,10 @@
           </w:tcPr>
           <w:p>
             <w:r>
+              <w:rPr>
+                <w:sz w:val="24"/>
+                <w:szCs w:val="24"/>
+              </w:rPr>
               <w:t xml:space="preserve">{{r_kaza_s_orta}}</w:t>
             </w:r>
           </w:p>
@@ -9702,6 +10230,10 @@
           </w:tcPr>
           <w:p>
             <w:r>
+              <w:rPr>
+                <w:sz w:val="24"/>
+                <w:szCs w:val="24"/>
+              </w:rPr>
               <w:t xml:space="preserve">{{r_kaza_s_yuksek}}</w:t>
             </w:r>
           </w:p>
@@ -9721,6 +10253,10 @@
           </w:tcPr>
           <w:p>
             <w:r>
+              <w:rPr>
+                <w:sz w:val="24"/>
+                <w:szCs w:val="24"/>
+              </w:rPr>
               <w:t xml:space="preserve">{{r_kaza_f_dusuk}}</w:t>
             </w:r>
           </w:p>
@@ -9740,6 +10276,10 @@
           </w:tcPr>
           <w:p>
             <w:r>
+              <w:rPr>
+                <w:sz w:val="24"/>
+                <w:szCs w:val="24"/>
+              </w:rPr>
               <w:t xml:space="preserve">{{r_kaza_f_orta}}</w:t>
             </w:r>
           </w:p>
@@ -9759,6 +10299,10 @@
           </w:tcPr>
           <w:p>
             <w:r>
+              <w:rPr>
+                <w:sz w:val="24"/>
+                <w:szCs w:val="24"/>
+              </w:rPr>
               <w:t xml:space="preserve">{{r_kaza_f_yuksek}}</w:t>
             </w:r>
           </w:p>
@@ -9814,6 +10358,10 @@
           </w:tcPr>
           <w:p>
             <w:r>
+              <w:rPr>
+                <w:sz w:val="24"/>
+                <w:szCs w:val="24"/>
+              </w:rPr>
               <w:t xml:space="preserve">{{r_trafik_yok}}</w:t>
             </w:r>
           </w:p>
@@ -9830,6 +10378,10 @@
           </w:tcPr>
           <w:p>
             <w:r>
+              <w:rPr>
+                <w:sz w:val="24"/>
+                <w:szCs w:val="24"/>
+              </w:rPr>
               <w:t xml:space="preserve">{{r_trafik_s_dusuk}}</w:t>
             </w:r>
           </w:p>
@@ -9846,6 +10398,10 @@
           </w:tcPr>
           <w:p>
             <w:r>
+              <w:rPr>
+                <w:sz w:val="24"/>
+                <w:szCs w:val="24"/>
+              </w:rPr>
               <w:t xml:space="preserve">{{r_trafik_s_orta}}</w:t>
             </w:r>
           </w:p>
@@ -9862,6 +10418,10 @@
           </w:tcPr>
           <w:p>
             <w:r>
+              <w:rPr>
+                <w:sz w:val="24"/>
+                <w:szCs w:val="24"/>
+              </w:rPr>
               <w:t xml:space="preserve">{{r_trafik_s_yuksek}}</w:t>
             </w:r>
           </w:p>
@@ -9878,6 +10438,10 @@
           </w:tcPr>
           <w:p>
             <w:r>
+              <w:rPr>
+                <w:sz w:val="24"/>
+                <w:szCs w:val="24"/>
+              </w:rPr>
               <w:t xml:space="preserve">{{r_trafik_f_dusuk}}</w:t>
             </w:r>
           </w:p>
@@ -9894,6 +10458,10 @@
           </w:tcPr>
           <w:p>
             <w:r>
+              <w:rPr>
+                <w:sz w:val="24"/>
+                <w:szCs w:val="24"/>
+              </w:rPr>
               <w:t xml:space="preserve">{{r_trafik_f_orta}}</w:t>
             </w:r>
           </w:p>
@@ -9910,6 +10478,10 @@
           </w:tcPr>
           <w:p>
             <w:r>
+              <w:rPr>
+                <w:sz w:val="24"/>
+                <w:szCs w:val="24"/>
+              </w:rPr>
               <w:t xml:space="preserve">{{r_trafik_f_yuksek}}</w:t>
             </w:r>
           </w:p>
@@ -9965,6 +10537,10 @@
           </w:tcPr>
           <w:p>
             <w:r>
+              <w:rPr>
+                <w:sz w:val="24"/>
+                <w:szCs w:val="24"/>
+              </w:rPr>
               <w:t xml:space="preserve">{{r_meslek_yok}}</w:t>
             </w:r>
           </w:p>
@@ -9981,6 +10557,10 @@
           </w:tcPr>
           <w:p>
             <w:r>
+              <w:rPr>
+                <w:sz w:val="24"/>
+                <w:szCs w:val="24"/>
+              </w:rPr>
               <w:t xml:space="preserve">{{r_meslek_s_dusuk}}</w:t>
             </w:r>
           </w:p>
@@ -9997,6 +10577,10 @@
           </w:tcPr>
           <w:p>
             <w:r>
+              <w:rPr>
+                <w:sz w:val="24"/>
+                <w:szCs w:val="24"/>
+              </w:rPr>
               <w:t xml:space="preserve">{{r_meslek_s_orta}}</w:t>
             </w:r>
           </w:p>
@@ -10013,6 +10597,10 @@
           </w:tcPr>
           <w:p>
             <w:r>
+              <w:rPr>
+                <w:sz w:val="24"/>
+                <w:szCs w:val="24"/>
+              </w:rPr>
               <w:t xml:space="preserve">{{r_meslek_s_yuksek}}</w:t>
             </w:r>
           </w:p>
@@ -10029,6 +10617,10 @@
           </w:tcPr>
           <w:p>
             <w:r>
+              <w:rPr>
+                <w:sz w:val="24"/>
+                <w:szCs w:val="24"/>
+              </w:rPr>
               <w:t xml:space="preserve">{{r_meslek_f_dusuk}}</w:t>
             </w:r>
           </w:p>
@@ -10045,6 +10637,10 @@
           </w:tcPr>
           <w:p>
             <w:r>
+              <w:rPr>
+                <w:sz w:val="24"/>
+                <w:szCs w:val="24"/>
+              </w:rPr>
               <w:t xml:space="preserve">{{r_meslek_f_orta}}</w:t>
             </w:r>
           </w:p>
@@ -10061,6 +10657,10 @@
           </w:tcPr>
           <w:p>
             <w:r>
+              <w:rPr>
+                <w:sz w:val="24"/>
+                <w:szCs w:val="24"/>
+              </w:rPr>
               <w:t xml:space="preserve">{{r_meslek_f_yuksek}}</w:t>
             </w:r>
           </w:p>
@@ -10315,6 +10915,10 @@
           </w:tcPr>
           <w:p>
             <w:r>
+              <w:rPr>
+                <w:sz w:val="24"/>
+                <w:szCs w:val="24"/>
+              </w:rPr>
               <w:t xml:space="preserve">{{#gizli_bilgiler}}{{konu}}</w:t>
             </w:r>
           </w:p>
@@ -10331,6 +10935,10 @@
           </w:tcPr>
           <w:p>
             <w:r>
+              <w:rPr>
+                <w:sz w:val="24"/>
+                <w:szCs w:val="24"/>
+              </w:rPr>
               <w:t xml:space="preserve">{{siklik}}</w:t>
             </w:r>
           </w:p>
@@ -10347,6 +10955,10 @@
           </w:tcPr>
           <w:p>
             <w:r>
+              <w:rPr>
+                <w:sz w:val="24"/>
+                <w:szCs w:val="24"/>
+              </w:rPr>
               <w:t xml:space="preserve">{{sakinca}}{{/gizli_bilgiler}}</w:t>
             </w:r>
           </w:p>
@@ -11182,6 +11794,10 @@
           </w:tcPr>
           <w:p>
             <w:r>
+              <w:rPr>
+                <w:sz w:val="24"/>
+                <w:szCs w:val="24"/>
+              </w:rPr>
               <w:t xml:space="preserve">{{#olasi_hatalar}}{{hata}}</w:t>
             </w:r>
           </w:p>
@@ -11200,6 +11816,10 @@
           </w:tcPr>
           <w:p>
             <w:r>
+              <w:rPr>
+                <w:sz w:val="24"/>
+                <w:szCs w:val="24"/>
+              </w:rPr>
               <w:t xml:space="preserve">{{kendisi}}</w:t>
             </w:r>
           </w:p>
@@ -11218,6 +11838,10 @@
           </w:tcPr>
           <w:p>
             <w:r>
+              <w:rPr>
+                <w:sz w:val="24"/>
+                <w:szCs w:val="24"/>
+              </w:rPr>
               <w:t xml:space="preserve">{{esit}}</w:t>
             </w:r>
           </w:p>
@@ -11236,6 +11860,10 @@
           </w:tcPr>
           <w:p>
             <w:r>
+              <w:rPr>
+                <w:sz w:val="24"/>
+                <w:szCs w:val="24"/>
+              </w:rPr>
               <w:t xml:space="preserve">{{ust}}</w:t>
             </w:r>
           </w:p>
@@ -11254,6 +11882,10 @@
           </w:tcPr>
           <w:p>
             <w:r>
+              <w:rPr>
+                <w:sz w:val="24"/>
+                <w:szCs w:val="24"/>
+              </w:rPr>
               <w:t xml:space="preserve">{{birim}}</w:t>
             </w:r>
           </w:p>
@@ -11272,6 +11904,10 @@
           </w:tcPr>
           <w:p>
             <w:r>
+              <w:rPr>
+                <w:sz w:val="24"/>
+                <w:szCs w:val="24"/>
+              </w:rPr>
               <w:t xml:space="preserve">{{disi}}</w:t>
             </w:r>
           </w:p>
@@ -11289,6 +11925,10 @@
           </w:tcPr>
           <w:p>
             <w:r>
+              <w:rPr>
+                <w:sz w:val="24"/>
+                <w:szCs w:val="24"/>
+              </w:rPr>
               <w:t xml:space="preserve">{{sorun}}</w:t>
             </w:r>
           </w:p>
@@ -11307,6 +11947,10 @@
           </w:tcPr>
           <w:p>
             <w:r>
+              <w:rPr>
+                <w:sz w:val="24"/>
+                <w:szCs w:val="24"/>
+              </w:rPr>
               <w:t xml:space="preserve">{{gevet}}</w:t>
             </w:r>
           </w:p>
@@ -11325,6 +11969,10 @@
           </w:tcPr>
           <w:p>
             <w:r>
+              <w:rPr>
+                <w:sz w:val="24"/>
+                <w:szCs w:val="24"/>
+              </w:rPr>
               <w:t xml:space="preserve">{{ghayir}}{{/olasi_hatalar}}</w:t>
             </w:r>
           </w:p>
@@ -11859,6 +12507,10 @@
           </w:tcPr>
           <w:p>
             <w:r>
+              <w:rPr>
+                <w:sz w:val="24"/>
+                <w:szCs w:val="24"/>
+              </w:rPr>
               <w:t xml:space="preserve">{{#yapilmamasi}}{{is}}</w:t>
             </w:r>
           </w:p>
@@ -11875,6 +12527,10 @@
           </w:tcPr>
           <w:p>
             <w:r>
+              <w:rPr>
+                <w:sz w:val="24"/>
+                <w:szCs w:val="24"/>
+              </w:rPr>
               <w:t xml:space="preserve">{{neden}}</w:t>
             </w:r>
           </w:p>
@@ -11891,6 +12547,10 @@
           </w:tcPr>
           <w:p>
             <w:r>
+              <w:rPr>
+                <w:sz w:val="24"/>
+                <w:szCs w:val="24"/>
+              </w:rPr>
               <w:t xml:space="preserve">{{kadro}}{{/yapilmamasi}}</w:t>
             </w:r>
           </w:p>
@@ -12256,6 +12916,10 @@
           </w:tcPr>
           <w:p>
             <w:r>
+              <w:rPr>
+                <w:sz w:val="24"/>
+                <w:szCs w:val="24"/>
+              </w:rPr>
               <w:t xml:space="preserve">{{#yeni_hizmetler}}{{hizmet}}</w:t>
             </w:r>
           </w:p>
@@ -12272,6 +12936,10 @@
           </w:tcPr>
           <w:p>
             <w:r>
+              <w:rPr>
+                <w:sz w:val="24"/>
+                <w:szCs w:val="24"/>
+              </w:rPr>
               <w:t xml:space="preserve">{{neden}}{{/yeni_hizmetler}}</w:t>
             </w:r>
           </w:p>
@@ -12470,6 +13138,10 @@
           </w:tcPr>
           <w:p>
             <w:r>
+              <w:rPr>
+                <w:sz w:val="24"/>
+                <w:szCs w:val="24"/>
+              </w:rPr>
               <w:t xml:space="preserve">{{#mevcut_kadro_isleri}}{{is}}</w:t>
             </w:r>
           </w:p>
@@ -12486,6 +13158,10 @@
           </w:tcPr>
           <w:p>
             <w:r>
+              <w:rPr>
+                <w:sz w:val="24"/>
+                <w:szCs w:val="24"/>
+              </w:rPr>
               <w:t xml:space="preserve">{{neden}}</w:t>
             </w:r>
           </w:p>
@@ -12502,6 +13178,10 @@
           </w:tcPr>
           <w:p>
             <w:r>
+              <w:rPr>
+                <w:sz w:val="24"/>
+                <w:szCs w:val="24"/>
+              </w:rPr>
               <w:t xml:space="preserve">{{kadro}}{{/mevcut_kadro_isleri}}</w:t>
             </w:r>
           </w:p>
@@ -12753,6 +13433,10 @@
           </w:tcPr>
           <w:p>
             <w:r>
+              <w:rPr>
+                <w:sz w:val="24"/>
+                <w:szCs w:val="24"/>
+              </w:rPr>
               <w:t xml:space="preserve">{{#birim_yapilmamasi}}{{hizmet}}</w:t>
             </w:r>
           </w:p>
@@ -12769,6 +13453,10 @@
           </w:tcPr>
           <w:p>
             <w:r>
+              <w:rPr>
+                <w:sz w:val="24"/>
+                <w:szCs w:val="24"/>
+              </w:rPr>
               <w:t xml:space="preserve">{{neden}}{{/birim_yapilmamasi}}</w:t>
             </w:r>
           </w:p>
@@ -12987,6 +13675,10 @@
           </w:tcPr>
           <w:p>
             <w:r>
+              <w:rPr>
+                <w:sz w:val="24"/>
+                <w:szCs w:val="24"/>
+              </w:rPr>
               <w:t xml:space="preserve">{{#koordinasyon}}{{faaliyet}}</w:t>
             </w:r>
           </w:p>
@@ -13003,6 +13695,10 @@
           </w:tcPr>
           <w:p>
             <w:r>
+              <w:rPr>
+                <w:sz w:val="24"/>
+                <w:szCs w:val="24"/>
+              </w:rPr>
               <w:t xml:space="preserve">{{neden}}</w:t>
             </w:r>
           </w:p>
@@ -13019,6 +13715,10 @@
           </w:tcPr>
           <w:p>
             <w:r>
+              <w:rPr>
+                <w:sz w:val="24"/>
+                <w:szCs w:val="24"/>
+              </w:rPr>
               <w:t xml:space="preserve">{{cozum}}{{/koordinasyon}}</w:t>
             </w:r>
           </w:p>
@@ -13973,6 +14673,10 @@
           </w:tcPr>
           <w:p>
             <w:r>
+              <w:rPr>
+                <w:sz w:val="24"/>
+                <w:szCs w:val="24"/>
+              </w:rPr>
               <w:t xml:space="preserve">{{#yeni_deneyim}}{{satir}}{{/yeni_deneyim}}</w:t>
             </w:r>
           </w:p>
@@ -14040,6 +14744,10 @@
           </w:tcPr>
           <w:p>
             <w:r>
+              <w:rPr>
+                <w:sz w:val="24"/>
+                <w:szCs w:val="24"/>
+              </w:rPr>
               <w:t xml:space="preserve">{{#yetkinlik_suresi}}{{satir}}{{/yetkinlik_suresi}}</w:t>
             </w:r>
           </w:p>
@@ -14227,6 +14935,10 @@
           </w:tcPr>
           <w:p>
             <w:r>
+              <w:rPr>
+                <w:sz w:val="24"/>
+                <w:szCs w:val="24"/>
+              </w:rPr>
               <w:t xml:space="preserve">{{#kompleks_ornekler}}{{satir}}{{/kompleks_ornekler}}</w:t>
             </w:r>
           </w:p>
@@ -14325,6 +15037,10 @@
           </w:tcPr>
           <w:p>
             <w:r>
+              <w:rPr>
+                <w:sz w:val="24"/>
+                <w:szCs w:val="24"/>
+              </w:rPr>
               <w:t xml:space="preserve">{{#gelistirilen_metotlar}}{{satir}}{{/gelistirilen_metotlar}}</w:t>
             </w:r>
           </w:p>
@@ -14411,6 +15127,10 @@
           </w:tcPr>
           <w:p>
             <w:r>
+              <w:rPr>
+                <w:sz w:val="24"/>
+                <w:szCs w:val="24"/>
+              </w:rPr>
               <w:t xml:space="preserve">{{#politika_prosedur}}{{satir}}{{/politika_prosedur}}</w:t>
             </w:r>
           </w:p>
@@ -14738,6 +15458,10 @@
           </w:tcPr>
           <w:p>
             <w:r>
+              <w:rPr>
+                <w:sz w:val="24"/>
+                <w:szCs w:val="24"/>
+              </w:rPr>
               <w:t xml:space="preserve">{{#ic_kontaklar}}{{kisi}}</w:t>
             </w:r>
           </w:p>
@@ -14748,6 +15472,10 @@
           </w:tcPr>
           <w:p>
             <w:r>
+              <w:rPr>
+                <w:sz w:val="24"/>
+                <w:szCs w:val="24"/>
+              </w:rPr>
               <w:t xml:space="preserve">{{konu}}</w:t>
             </w:r>
           </w:p>
@@ -14758,6 +15486,10 @@
           </w:tcPr>
           <w:p>
             <w:r>
+              <w:rPr>
+                <w:sz w:val="24"/>
+                <w:szCs w:val="24"/>
+              </w:rPr>
               <w:t xml:space="preserve">{{siklik}}{{/ic_kontaklar}}</w:t>
             </w:r>
           </w:p>
@@ -14985,6 +15717,10 @@
           </w:tcPr>
           <w:p>
             <w:r>
+              <w:rPr>
+                <w:sz w:val="24"/>
+                <w:szCs w:val="24"/>
+              </w:rPr>
               <w:t xml:space="preserve">{{#dis_kontaklar}}{{kisi}}</w:t>
             </w:r>
           </w:p>
@@ -14995,6 +15731,10 @@
           </w:tcPr>
           <w:p>
             <w:r>
+              <w:rPr>
+                <w:sz w:val="24"/>
+                <w:szCs w:val="24"/>
+              </w:rPr>
               <w:t xml:space="preserve">{{konu}}</w:t>
             </w:r>
           </w:p>
@@ -15005,6 +15745,10 @@
           </w:tcPr>
           <w:p>
             <w:r>
+              <w:rPr>
+                <w:sz w:val="24"/>
+                <w:szCs w:val="24"/>
+              </w:rPr>
               <w:t xml:space="preserve">{{siklik}}{{/dis_kontaklar}}</w:t>
             </w:r>
           </w:p>
@@ -15330,6 +16074,10 @@
           </w:tcPr>
           <w:p>
             <w:r>
+              <w:rPr>
+                <w:sz w:val="24"/>
+                <w:szCs w:val="24"/>
+              </w:rPr>
               <w:t xml:space="preserve">{{#bilgi_problemleri}}{{nereden}}</w:t>
             </w:r>
           </w:p>
@@ -15340,6 +16088,10 @@
           </w:tcPr>
           <w:p>
             <w:r>
+              <w:rPr>
+                <w:sz w:val="24"/>
+                <w:szCs w:val="24"/>
+              </w:rPr>
               <w:t xml:space="preserve">{{bilgi}}</w:t>
             </w:r>
           </w:p>
@@ -15350,6 +16102,10 @@
           </w:tcPr>
           <w:p>
             <w:r>
+              <w:rPr>
+                <w:sz w:val="24"/>
+                <w:szCs w:val="24"/>
+              </w:rPr>
               <w:t xml:space="preserve">{{problem}}{{/bilgi_problemleri}}</w:t>
             </w:r>
           </w:p>
@@ -15568,6 +16324,10 @@
           </w:tcPr>
           <w:p>
             <w:r>
+              <w:rPr>
+                <w:sz w:val="24"/>
+                <w:szCs w:val="24"/>
+              </w:rPr>
               <w:t xml:space="preserve">{{#etkilenenler}}{{is}}</w:t>
             </w:r>
           </w:p>
@@ -15578,6 +16338,10 @@
           </w:tcPr>
           <w:p>
             <w:r>
+              <w:rPr>
+                <w:sz w:val="24"/>
+                <w:szCs w:val="24"/>
+              </w:rPr>
               <w:t xml:space="preserve">{{bolum}}</w:t>
             </w:r>
           </w:p>
@@ -15588,6 +16352,10 @@
           </w:tcPr>
           <w:p>
             <w:r>
+              <w:rPr>
+                <w:sz w:val="24"/>
+                <w:szCs w:val="24"/>
+              </w:rPr>
               <w:t xml:space="preserve">{{nasil}}{{/etkilenenler}}</w:t>
             </w:r>
           </w:p>
@@ -15901,6 +16669,10 @@
           </w:tcPr>
           <w:p>
             <w:r>
+              <w:rPr>
+                <w:sz w:val="24"/>
+                <w:szCs w:val="24"/>
+              </w:rPr>
               <w:t xml:space="preserve">{{#yonetim_sorumlulugu}}{{satir}}{{/yonetim_sorumlulugu}}</w:t>
             </w:r>
           </w:p>
@@ -16246,6 +17018,10 @@
           </w:tcPr>
           <w:p>
             <w:r>
+              <w:rPr>
+                <w:sz w:val="24"/>
+                <w:szCs w:val="24"/>
+              </w:rPr>
               <w:t xml:space="preserve">{{#personel_unvanlar}}{{unvan}}</w:t>
             </w:r>
           </w:p>
@@ -16256,6 +17032,10 @@
           </w:tcPr>
           <w:p>
             <w:r>
+              <w:rPr>
+                <w:sz w:val="24"/>
+                <w:szCs w:val="24"/>
+              </w:rPr>
               <w:t xml:space="preserve">{{sayi}}{{/personel_unvanlar}}</w:t>
             </w:r>
           </w:p>
@@ -16392,6 +17172,10 @@
           </w:tcPr>
           <w:p>
             <w:r>
+              <w:rPr>
+                <w:sz w:val="24"/>
+                <w:szCs w:val="24"/>
+              </w:rPr>
               <w:t xml:space="preserve">{{#harici_isler}}{{satir}}{{/harici_isler}}</w:t>
             </w:r>
           </w:p>
@@ -16598,6 +17382,10 @@
           </w:tcPr>
           <w:p>
             <w:r>
+              <w:rPr>
+                <w:sz w:val="24"/>
+                <w:szCs w:val="24"/>
+              </w:rPr>
               <w:t xml:space="preserve">{{#zor_yanlar}}{{konu}}</w:t>
             </w:r>
           </w:p>
@@ -16612,6 +17400,10 @@
           </w:tcPr>
           <w:p>
             <w:r>
+              <w:rPr>
+                <w:sz w:val="24"/>
+                <w:szCs w:val="24"/>
+              </w:rPr>
               <w:t xml:space="preserve">{{neden}}{{/zor_yanlar}}</w:t>
             </w:r>
           </w:p>
@@ -16693,7 +17485,14 @@
           </w:tcPr>
           <w:p>
             <w:r>
-              <w:t xml:space="preserve">Tarih: {{imza_tarih}}</w:t>
+              <w:t xml:space="preserve">Tarih: </w:t>
+            </w:r>
+            <w:r>
+              <w:rPr>
+                <w:sz w:val="24"/>
+                <w:szCs w:val="24"/>
+              </w:rPr>
+              <w:t>{{imza_tarih}}</w:t>
             </w:r>
           </w:p>
         </w:tc>
@@ -16703,7 +17502,14 @@
           </w:tcPr>
           <w:p>
             <w:r>
-              <w:t xml:space="preserve">İmza: {{imza_ad}}</w:t>
+              <w:t xml:space="preserve">İmza: </w:t>
+            </w:r>
+            <w:r>
+              <w:rPr>
+                <w:sz w:val="24"/>
+                <w:szCs w:val="24"/>
+              </w:rPr>
+              <w:t>{{imza_ad}}</w:t>
             </w:r>
           </w:p>
         </w:tc>

</xml_diff>

<commit_message>
Talimat govdesi sabit 12pt oldu
</commit_message>
<xml_diff>
--- a/assets/IsAnaliziForm-template.docx
+++ b/assets/IsAnaliziForm-template.docx
@@ -189,6 +189,8 @@
         <w:rPr>
           <w:rFonts w:ascii="Times New Roman" w:hAnsi="Times New Roman" w:cs="Times New Roman"/>
           <w:noProof/>
+          <w:sz w:val="24"/>
+          <w:szCs w:val="24"/>
           <w:lang w:val="tr-TR"/>
         </w:rPr>
         <w:t>Şirketlerde optimum organizasyon yapısının belirlenebilmesi için çalışanlar ve yapılan işler, bölüm, birim ve departman gibi çeşitli gruplara ayrılmışlardır. Şirket faaliyetlerinin etkinliği açısından bu grupların sınırlarının çizilmesi, özelliklerinin bilinmesi ve görevlerinin tanımlanması, Şirketin hedeflerine ulaşmaları ve İnsan Kaynakları Sistemlerinin bu doğrultuda yapılandırılmalarında kritik bir önem taşımaktadır. Bunun için her birimde gerçekleştirilen işler, pozisyonların gereklilikleri (yetkinlik ve yeterlilikleri), departmanların birbirleri ile olan yatay ve dikey ilişkilerinin net olarak ortaya konması gerekmektedir.</w:t>
@@ -197,6 +199,8 @@
         <w:rPr>
           <w:rFonts w:ascii="Times New Roman" w:hAnsi="Times New Roman" w:cs="Times New Roman"/>
           <w:noProof/>
+          <w:sz w:val="24"/>
+          <w:szCs w:val="24"/>
           <w:lang w:val="tr-TR"/>
         </w:rPr>
         <w:t xml:space="preserve"> İnsan Kaynakları açısından önemli olan bu çalışmanın adı “İş Analizi Çalışması”dır.</w:t>
@@ -229,6 +233,8 @@
           <w:rFonts w:ascii="Times New Roman" w:hAnsi="Times New Roman" w:cs="Times New Roman"/>
           <w:b/>
           <w:noProof/>
+          <w:sz w:val="24"/>
+          <w:szCs w:val="24"/>
           <w:lang w:val="tr-TR"/>
         </w:rPr>
         <w:t>İş Analizi bir işin unsurları ile onun çeşitli faktörler bakımından içinde bulunduğu durumu ve öteki işlerden farklılığını ortaya koyan bilimsel ve teknik bir çalışmadır. Diğer bir deyişle iş analizi bir işin içeriğinin, gerekliliklerinin niçin ve nasıl yapıldığının, saptanması işlemi olarak tanımlanabilir.</w:t>
@@ -259,6 +265,8 @@
         <w:rPr>
           <w:rFonts w:ascii="Times New Roman" w:hAnsi="Times New Roman" w:cs="Times New Roman"/>
           <w:noProof/>
+          <w:sz w:val="24"/>
+          <w:szCs w:val="24"/>
           <w:lang w:val="tr-TR"/>
         </w:rPr>
         <w:t>İş Analizinin amaçları şunlardır;</w:t>
@@ -292,6 +300,8 @@
         <w:rPr>
           <w:rFonts w:ascii="Times New Roman" w:hAnsi="Times New Roman" w:cs="Times New Roman"/>
           <w:noProof/>
+          <w:sz w:val="24"/>
+          <w:szCs w:val="24"/>
           <w:lang w:val="tr-TR"/>
         </w:rPr>
         <w:t xml:space="preserve">Gelecekte duyulabilecek çalışan ihtiyacını ve bu çalışanların ihtiyaçlarını saptayarak insan kaynakları planlamasına yardımcı olmak. </w:t>
@@ -315,6 +325,8 @@
         <w:rPr>
           <w:rFonts w:ascii="Times New Roman" w:hAnsi="Times New Roman" w:cs="Times New Roman"/>
           <w:noProof/>
+          <w:sz w:val="24"/>
+          <w:szCs w:val="24"/>
           <w:lang w:val="tr-TR"/>
         </w:rPr>
         <w:t xml:space="preserve">İşe alımdaki açık ve kesin kriterleri oluşturmak. </w:t>
@@ -338,6 +350,8 @@
         <w:rPr>
           <w:rFonts w:ascii="Times New Roman" w:hAnsi="Times New Roman" w:cs="Times New Roman"/>
           <w:noProof/>
+          <w:sz w:val="24"/>
+          <w:szCs w:val="24"/>
           <w:lang w:val="tr-TR"/>
         </w:rPr>
         <w:t xml:space="preserve">Şu andaki ya da gelecekte ortaya çıkabilecek eğitim ihtiyacını tespit etmek. </w:t>
@@ -361,6 +375,8 @@
         <w:rPr>
           <w:rFonts w:ascii="Times New Roman" w:hAnsi="Times New Roman" w:cs="Times New Roman"/>
           <w:noProof/>
+          <w:sz w:val="24"/>
+          <w:szCs w:val="24"/>
           <w:lang w:val="tr-TR"/>
         </w:rPr>
         <w:t xml:space="preserve">Performans standartlarını belirlemek. </w:t>
@@ -384,6 +400,8 @@
         <w:rPr>
           <w:rFonts w:ascii="Times New Roman" w:hAnsi="Times New Roman" w:cs="Times New Roman"/>
           <w:noProof/>
+          <w:sz w:val="24"/>
+          <w:szCs w:val="24"/>
           <w:lang w:val="tr-TR"/>
         </w:rPr>
         <w:t xml:space="preserve">Kariyer planının sağlıklı bir şekilde yapılmasını sağlamak. </w:t>
@@ -407,6 +425,8 @@
         <w:rPr>
           <w:rFonts w:ascii="Times New Roman" w:hAnsi="Times New Roman" w:cs="Times New Roman"/>
           <w:noProof/>
+          <w:sz w:val="24"/>
+          <w:szCs w:val="24"/>
           <w:lang w:val="tr-TR"/>
         </w:rPr>
         <w:t xml:space="preserve">Olumsuz çalışma koşullarını ortadan kaldırmak. </w:t>
@@ -430,6 +450,8 @@
         <w:rPr>
           <w:rFonts w:ascii="Times New Roman" w:hAnsi="Times New Roman" w:cs="Times New Roman"/>
           <w:noProof/>
+          <w:sz w:val="24"/>
+          <w:szCs w:val="24"/>
           <w:lang w:val="tr-TR"/>
         </w:rPr>
         <w:t xml:space="preserve">İş değerlemesi için her bir işin göreceli önemini ortaya koymayı sağlayacak temel bilgilere ulaşmak. </w:t>
@@ -462,6 +484,8 @@
           <w:rFonts w:ascii="Times New Roman" w:hAnsi="Times New Roman" w:cs="Times New Roman"/>
           <w:iCs/>
           <w:noProof/>
+          <w:sz w:val="24"/>
+          <w:szCs w:val="24"/>
           <w:lang w:val="tr-TR"/>
         </w:rPr>
         <w:t xml:space="preserve">Ekli 12 sayfalık formda, size işinizle ilgili bazı sorular sorulmaktadır. Bu sorular size kişisel olarak değerlendirmeye değil, amaç işinizin </w:t>
@@ -471,6 +495,8 @@
           <w:rFonts w:ascii="Times New Roman" w:hAnsi="Times New Roman" w:cs="Times New Roman"/>
           <w:iCs/>
           <w:noProof/>
+          <w:sz w:val="24"/>
+          <w:szCs w:val="24"/>
           <w:lang w:val="tr-TR"/>
         </w:rPr>
         <w:t>yapılması için gerekli olan nitelikleri ve işinizin hangi koşullarda yapıldığını analiz etmeye yöneliktir.</w:t>
@@ -502,6 +528,8 @@
           <w:rFonts w:ascii="Times New Roman" w:hAnsi="Times New Roman" w:cs="Times New Roman"/>
           <w:iCs/>
           <w:noProof/>
+          <w:sz w:val="24"/>
+          <w:szCs w:val="24"/>
           <w:lang w:val="tr-TR"/>
         </w:rPr>
         <w:t>Bu soruları yanıtlarken;</w:t>
@@ -536,6 +564,8 @@
         <w:rPr>
           <w:rFonts w:ascii="Times New Roman" w:hAnsi="Times New Roman" w:cs="Times New Roman"/>
           <w:noProof/>
+          <w:sz w:val="24"/>
+          <w:szCs w:val="24"/>
           <w:lang w:val="tr-TR"/>
         </w:rPr>
         <w:t>İşinizi yaparken gün içerisinde karşılaştığınız tüm farklı olay ve durumları düşünerek yanıtlayınız.</w:t>
@@ -559,6 +589,8 @@
         <w:rPr>
           <w:rFonts w:ascii="Times New Roman" w:hAnsi="Times New Roman" w:cs="Times New Roman"/>
           <w:noProof/>
+          <w:sz w:val="24"/>
+          <w:szCs w:val="24"/>
           <w:lang w:val="tr-TR"/>
         </w:rPr>
         <w:t>İşinizi en iyi bilen sizsiniz… İşi daha iyi yapabilmeniz için ne tür iyileştirmeler gerektiğini belirtiniz.</w:t>
@@ -582,6 +614,8 @@
         <w:rPr>
           <w:rFonts w:ascii="Times New Roman" w:hAnsi="Times New Roman" w:cs="Times New Roman"/>
           <w:noProof/>
+          <w:sz w:val="24"/>
+          <w:szCs w:val="24"/>
           <w:lang w:val="tr-TR"/>
         </w:rPr>
         <w:t>İç ve dış müşterilerinizle olan bilgi alış verişi önemlidir. Bunları detaylandırınız.</w:t>
@@ -605,6 +639,8 @@
         <w:rPr>
           <w:rFonts w:ascii="Times New Roman" w:hAnsi="Times New Roman" w:cs="Times New Roman"/>
           <w:noProof/>
+          <w:sz w:val="24"/>
+          <w:szCs w:val="24"/>
           <w:lang w:val="tr-TR"/>
         </w:rPr>
         <w:t xml:space="preserve">Olabildiğince somut ve ölçülebilir parametreler kullanarak yanıt veriniz. Örneğin zaman, adet, kişi, </w:t>
@@ -613,6 +649,8 @@
         <w:rPr>
           <w:rFonts w:ascii="Times New Roman" w:hAnsi="Times New Roman" w:cs="Times New Roman"/>
           <w:noProof/>
+          <w:sz w:val="24"/>
+          <w:szCs w:val="24"/>
           <w:lang w:val="tr-TR"/>
         </w:rPr>
         <w:t>kurum adı vs</w:t>
@@ -621,6 +659,8 @@
         <w:rPr>
           <w:rFonts w:ascii="Times New Roman" w:hAnsi="Times New Roman" w:cs="Times New Roman"/>
           <w:noProof/>
+          <w:sz w:val="24"/>
+          <w:szCs w:val="24"/>
           <w:lang w:val="tr-TR"/>
         </w:rPr>
         <w:t>.</w:t>
@@ -644,6 +684,8 @@
         <w:rPr>
           <w:rFonts w:ascii="Times New Roman" w:hAnsi="Times New Roman" w:cs="Times New Roman"/>
           <w:noProof/>
+          <w:sz w:val="24"/>
+          <w:szCs w:val="24"/>
           <w:lang w:val="tr-TR"/>
         </w:rPr>
         <w:t>Formun doldurulması için belirli bir sure tanımlanmamıştır. Önemli olan en doğru detayları forma aktarabilmektir. Dolayısıyla acele etmeyiniz, gerekiyorsa mesai saatleri dışında sakin bir zamanda doldurunuz.</w:t>
@@ -667,6 +709,8 @@
         <w:rPr>
           <w:rFonts w:ascii="Times New Roman" w:hAnsi="Times New Roman" w:cs="Times New Roman"/>
           <w:noProof/>
+          <w:sz w:val="24"/>
+          <w:szCs w:val="24"/>
           <w:lang w:val="tr-TR"/>
         </w:rPr>
         <w:t>Formu doldurduktan sonra imzalayarak İnsan Kaynakları Departmanına teslim ediniz.</w:t>
@@ -693,6 +737,8 @@
         <w:rPr>
           <w:rFonts w:ascii="Times New Roman" w:hAnsi="Times New Roman" w:cs="Times New Roman"/>
           <w:noProof/>
+          <w:sz w:val="24"/>
+          <w:szCs w:val="24"/>
           <w:lang w:val="tr-TR"/>
         </w:rPr>
         <w:t>Bu çalışmanın ikinci safhasında İnsan Kaynakları Departmanından bir görevli, analizi tamamlayabilmek amacıyla</w:t>
@@ -702,6 +748,8 @@
           <w:rFonts w:ascii="Times New Roman" w:hAnsi="Times New Roman" w:cs="Times New Roman"/>
           <w:iCs/>
           <w:noProof/>
+          <w:sz w:val="24"/>
+          <w:szCs w:val="24"/>
           <w:lang w:val="tr-TR"/>
         </w:rPr>
         <w:t xml:space="preserve"> sizinle sohbet edecektir.</w:t>
@@ -837,7 +885,8 @@
           <w:i/>
           <w:iCs/>
           <w:noProof/>
-          <w:sz w:val="28"/>
+          <w:sz w:val="24"/>
+          <w:szCs w:val="24"/>
           <w:lang w:val="tr-TR"/>
         </w:rPr>
         <w:t>Lütfen yukarıdaki hatırlatmaları dikkate alarak formu doldurunuz.</w:t>
@@ -876,11 +925,17 @@
           <w:bCs/>
           <w:iCs/>
           <w:noProof/>
+          <w:sz w:val="24"/>
+          <w:szCs w:val="24"/>
           <w:lang w:val="tr-TR"/>
         </w:rPr>
         <w:t>Form Doldurulma TARİHİ</w:t>
       </w:r>
       <w:r>
+        <w:rPr>
+          <w:sz w:val="24"/>
+          <w:szCs w:val="24"/>
+        </w:rPr>
         <w:t xml:space="preserve"> {{form_tarihi}}</w:t>
       </w:r>
     </w:p>

</xml_diff>

<commit_message>
8. bolum tablolarina baslik satiri eklendi
</commit_message>
<xml_diff>
--- a/assets/IsAnaliziForm-template.docx
+++ b/assets/IsAnaliziForm-template.docx
@@ -15507,6 +15507,120 @@
         <w:gridCol w:w="2192"/>
       </w:tblGrid>
       <w:tr>
+        <w:trPr>
+          <w:tblHeader/>
+          <w:cantSplit/>
+        </w:trPr>
+        <w:tc>
+          <w:tcPr>
+            <w:tcW w:w="2818" w:type="dxa"/>
+            <w:tcBorders>
+              <w:top w:val="single" w:sz="4" w:space="0" w:color="auto"/>
+              <w:left w:val="single" w:sz="4" w:space="0" w:color="auto"/>
+              <w:bottom w:val="single" w:sz="4" w:space="0" w:color="auto"/>
+              <w:right w:val="single" w:sz="4" w:space="0" w:color="auto"/>
+            </w:tcBorders>
+            <w:vAlign w:val="center"/>
+          </w:tcPr>
+          <w:p>
+            <w:pPr>
+              <w:jc w:val="center"/>
+              <w:rPr>
+                <w:rFonts w:ascii="Times New Roman" w:hAnsi="Times New Roman" w:cs="Times New Roman"/>
+                <w:b/>
+                <w:color w:val="auto"/>
+                <w:sz w:val="28"/>
+                <w:szCs w:val="28"/>
+                <w:lang w:val="tr-TR" w:eastAsia="tr-TR"/>
+              </w:rPr>
+            </w:pPr>
+            <w:r>
+              <w:rPr>
+                <w:rFonts w:ascii="Times New Roman" w:hAnsi="Times New Roman" w:cs="Times New Roman"/>
+                <w:b/>
+                <w:color w:val="auto"/>
+                <w:sz w:val="28"/>
+                <w:szCs w:val="28"/>
+                <w:lang w:val="tr-TR" w:eastAsia="tr-TR"/>
+              </w:rPr>
+              <w:t>Kiminle</w:t>
+            </w:r>
+          </w:p>
+        </w:tc>
+        <w:tc>
+          <w:tcPr>
+            <w:tcW w:w="5102" w:type="dxa"/>
+            <w:tcBorders>
+              <w:top w:val="single" w:sz="4" w:space="0" w:color="auto"/>
+              <w:left w:val="single" w:sz="4" w:space="0" w:color="auto"/>
+              <w:bottom w:val="single" w:sz="4" w:space="0" w:color="auto"/>
+              <w:right w:val="single" w:sz="4" w:space="0" w:color="auto"/>
+            </w:tcBorders>
+            <w:vAlign w:val="center"/>
+          </w:tcPr>
+          <w:p>
+            <w:pPr>
+              <w:jc w:val="center"/>
+              <w:rPr>
+                <w:rFonts w:ascii="Times New Roman" w:hAnsi="Times New Roman" w:cs="Times New Roman"/>
+                <w:b/>
+                <w:color w:val="auto"/>
+                <w:sz w:val="28"/>
+                <w:szCs w:val="28"/>
+                <w:lang w:val="tr-TR" w:eastAsia="tr-TR"/>
+              </w:rPr>
+            </w:pPr>
+            <w:r>
+              <w:rPr>
+                <w:rFonts w:ascii="Times New Roman" w:hAnsi="Times New Roman" w:cs="Times New Roman"/>
+                <w:b/>
+                <w:color w:val="auto"/>
+                <w:sz w:val="28"/>
+                <w:szCs w:val="28"/>
+                <w:lang w:val="tr-TR" w:eastAsia="tr-TR"/>
+              </w:rPr>
+              <w:t>Görüşülecek Konu</w:t>
+            </w:r>
+          </w:p>
+        </w:tc>
+        <w:tc>
+          <w:tcPr>
+            <w:tcW w:w="2192" w:type="dxa"/>
+            <w:tcBorders>
+              <w:top w:val="single" w:sz="4" w:space="0" w:color="auto"/>
+              <w:left w:val="single" w:sz="4" w:space="0" w:color="auto"/>
+              <w:bottom w:val="single" w:sz="4" w:space="0" w:color="auto"/>
+              <w:right w:val="single" w:sz="4" w:space="0" w:color="auto"/>
+            </w:tcBorders>
+            <w:vAlign w:val="center"/>
+          </w:tcPr>
+          <w:p>
+            <w:pPr>
+              <w:jc w:val="center"/>
+              <w:rPr>
+                <w:rFonts w:ascii="Times New Roman" w:hAnsi="Times New Roman" w:cs="Times New Roman"/>
+                <w:b/>
+                <w:color w:val="auto"/>
+                <w:sz w:val="28"/>
+                <w:szCs w:val="28"/>
+                <w:lang w:val="tr-TR" w:eastAsia="tr-TR"/>
+              </w:rPr>
+            </w:pPr>
+            <w:r>
+              <w:rPr>
+                <w:rFonts w:ascii="Times New Roman" w:hAnsi="Times New Roman" w:cs="Times New Roman"/>
+                <w:b/>
+                <w:color w:val="auto"/>
+                <w:sz w:val="28"/>
+                <w:szCs w:val="28"/>
+                <w:lang w:val="tr-TR" w:eastAsia="tr-TR"/>
+              </w:rPr>
+              <w:t>Sıklık</w:t>
+            </w:r>
+          </w:p>
+        </w:tc>
+      </w:tr>
+      <w:tr>
         <w:tc>
           <w:tcPr>
             <w:tcW w:w="2818" w:type="dxa"/>
@@ -15766,6 +15880,120 @@
         <w:gridCol w:w="2192"/>
       </w:tblGrid>
       <w:tr>
+        <w:trPr>
+          <w:tblHeader/>
+          <w:cantSplit/>
+        </w:trPr>
+        <w:tc>
+          <w:tcPr>
+            <w:tcW w:w="2818" w:type="dxa"/>
+            <w:tcBorders>
+              <w:top w:val="single" w:sz="4" w:space="0" w:color="auto"/>
+              <w:left w:val="single" w:sz="4" w:space="0" w:color="auto"/>
+              <w:bottom w:val="single" w:sz="4" w:space="0" w:color="auto"/>
+              <w:right w:val="single" w:sz="4" w:space="0" w:color="auto"/>
+            </w:tcBorders>
+            <w:vAlign w:val="center"/>
+          </w:tcPr>
+          <w:p>
+            <w:pPr>
+              <w:jc w:val="center"/>
+              <w:rPr>
+                <w:rFonts w:ascii="Times New Roman" w:hAnsi="Times New Roman" w:cs="Times New Roman"/>
+                <w:b/>
+                <w:color w:val="auto"/>
+                <w:sz w:val="28"/>
+                <w:szCs w:val="28"/>
+                <w:lang w:val="tr-TR" w:eastAsia="tr-TR"/>
+              </w:rPr>
+            </w:pPr>
+            <w:r>
+              <w:rPr>
+                <w:rFonts w:ascii="Times New Roman" w:hAnsi="Times New Roman" w:cs="Times New Roman"/>
+                <w:b/>
+                <w:color w:val="auto"/>
+                <w:sz w:val="28"/>
+                <w:szCs w:val="28"/>
+                <w:lang w:val="tr-TR" w:eastAsia="tr-TR"/>
+              </w:rPr>
+              <w:t>Kiminle</w:t>
+            </w:r>
+          </w:p>
+        </w:tc>
+        <w:tc>
+          <w:tcPr>
+            <w:tcW w:w="5102" w:type="dxa"/>
+            <w:tcBorders>
+              <w:top w:val="single" w:sz="4" w:space="0" w:color="auto"/>
+              <w:left w:val="single" w:sz="4" w:space="0" w:color="auto"/>
+              <w:bottom w:val="single" w:sz="4" w:space="0" w:color="auto"/>
+              <w:right w:val="single" w:sz="4" w:space="0" w:color="auto"/>
+            </w:tcBorders>
+            <w:vAlign w:val="center"/>
+          </w:tcPr>
+          <w:p>
+            <w:pPr>
+              <w:jc w:val="center"/>
+              <w:rPr>
+                <w:rFonts w:ascii="Times New Roman" w:hAnsi="Times New Roman" w:cs="Times New Roman"/>
+                <w:b/>
+                <w:color w:val="auto"/>
+                <w:sz w:val="28"/>
+                <w:szCs w:val="28"/>
+                <w:lang w:val="tr-TR" w:eastAsia="tr-TR"/>
+              </w:rPr>
+            </w:pPr>
+            <w:r>
+              <w:rPr>
+                <w:rFonts w:ascii="Times New Roman" w:hAnsi="Times New Roman" w:cs="Times New Roman"/>
+                <w:b/>
+                <w:color w:val="auto"/>
+                <w:sz w:val="28"/>
+                <w:szCs w:val="28"/>
+                <w:lang w:val="tr-TR" w:eastAsia="tr-TR"/>
+              </w:rPr>
+              <w:t>Görüşülecek Konu</w:t>
+            </w:r>
+          </w:p>
+        </w:tc>
+        <w:tc>
+          <w:tcPr>
+            <w:tcW w:w="2192" w:type="dxa"/>
+            <w:tcBorders>
+              <w:top w:val="single" w:sz="4" w:space="0" w:color="auto"/>
+              <w:left w:val="single" w:sz="4" w:space="0" w:color="auto"/>
+              <w:bottom w:val="single" w:sz="4" w:space="0" w:color="auto"/>
+              <w:right w:val="single" w:sz="4" w:space="0" w:color="auto"/>
+            </w:tcBorders>
+            <w:vAlign w:val="center"/>
+          </w:tcPr>
+          <w:p>
+            <w:pPr>
+              <w:jc w:val="center"/>
+              <w:rPr>
+                <w:rFonts w:ascii="Times New Roman" w:hAnsi="Times New Roman" w:cs="Times New Roman"/>
+                <w:b/>
+                <w:color w:val="auto"/>
+                <w:sz w:val="28"/>
+                <w:szCs w:val="28"/>
+                <w:lang w:val="tr-TR" w:eastAsia="tr-TR"/>
+              </w:rPr>
+            </w:pPr>
+            <w:r>
+              <w:rPr>
+                <w:rFonts w:ascii="Times New Roman" w:hAnsi="Times New Roman" w:cs="Times New Roman"/>
+                <w:b/>
+                <w:color w:val="auto"/>
+                <w:sz w:val="28"/>
+                <w:szCs w:val="28"/>
+                <w:lang w:val="tr-TR" w:eastAsia="tr-TR"/>
+              </w:rPr>
+              <w:t>Sıklık</w:t>
+            </w:r>
+          </w:p>
+        </w:tc>
+      </w:tr>
+      <w:tr>
         <w:tc>
           <w:tcPr>
             <w:tcW w:w="2818" w:type="dxa"/>
@@ -16123,6 +16351,120 @@
         <w:gridCol w:w="2912"/>
       </w:tblGrid>
       <w:tr>
+        <w:trPr>
+          <w:tblHeader/>
+          <w:cantSplit/>
+        </w:trPr>
+        <w:tc>
+          <w:tcPr>
+            <w:tcW w:w="2818" w:type="dxa"/>
+            <w:tcBorders>
+              <w:top w:val="single" w:sz="4" w:space="0" w:color="auto"/>
+              <w:left w:val="single" w:sz="4" w:space="0" w:color="auto"/>
+              <w:bottom w:val="single" w:sz="4" w:space="0" w:color="auto"/>
+              <w:right w:val="single" w:sz="4" w:space="0" w:color="auto"/>
+            </w:tcBorders>
+            <w:vAlign w:val="center"/>
+          </w:tcPr>
+          <w:p>
+            <w:pPr>
+              <w:jc w:val="center"/>
+              <w:rPr>
+                <w:rFonts w:ascii="Times New Roman" w:hAnsi="Times New Roman" w:cs="Times New Roman"/>
+                <w:b/>
+                <w:color w:val="auto"/>
+                <w:sz w:val="28"/>
+                <w:szCs w:val="28"/>
+                <w:lang w:val="tr-TR" w:eastAsia="tr-TR"/>
+              </w:rPr>
+            </w:pPr>
+            <w:r>
+              <w:rPr>
+                <w:rFonts w:ascii="Times New Roman" w:hAnsi="Times New Roman" w:cs="Times New Roman"/>
+                <w:b/>
+                <w:color w:val="auto"/>
+                <w:sz w:val="28"/>
+                <w:szCs w:val="28"/>
+                <w:lang w:val="tr-TR" w:eastAsia="tr-TR"/>
+              </w:rPr>
+              <w:t>Nereden</w:t>
+            </w:r>
+          </w:p>
+        </w:tc>
+        <w:tc>
+          <w:tcPr>
+            <w:tcW w:w="4382" w:type="dxa"/>
+            <w:tcBorders>
+              <w:top w:val="single" w:sz="4" w:space="0" w:color="auto"/>
+              <w:left w:val="single" w:sz="4" w:space="0" w:color="auto"/>
+              <w:bottom w:val="single" w:sz="4" w:space="0" w:color="auto"/>
+              <w:right w:val="single" w:sz="4" w:space="0" w:color="auto"/>
+            </w:tcBorders>
+            <w:vAlign w:val="center"/>
+          </w:tcPr>
+          <w:p>
+            <w:pPr>
+              <w:jc w:val="center"/>
+              <w:rPr>
+                <w:rFonts w:ascii="Times New Roman" w:hAnsi="Times New Roman" w:cs="Times New Roman"/>
+                <w:b/>
+                <w:color w:val="auto"/>
+                <w:sz w:val="28"/>
+                <w:szCs w:val="28"/>
+                <w:lang w:val="tr-TR" w:eastAsia="tr-TR"/>
+              </w:rPr>
+            </w:pPr>
+            <w:r>
+              <w:rPr>
+                <w:rFonts w:ascii="Times New Roman" w:hAnsi="Times New Roman" w:cs="Times New Roman"/>
+                <w:b/>
+                <w:color w:val="auto"/>
+                <w:sz w:val="28"/>
+                <w:szCs w:val="28"/>
+                <w:lang w:val="tr-TR" w:eastAsia="tr-TR"/>
+              </w:rPr>
+              <w:t>Hangi Bilgi</w:t>
+            </w:r>
+          </w:p>
+        </w:tc>
+        <w:tc>
+          <w:tcPr>
+            <w:tcW w:w="2912" w:type="dxa"/>
+            <w:tcBorders>
+              <w:top w:val="single" w:sz="4" w:space="0" w:color="auto"/>
+              <w:left w:val="single" w:sz="4" w:space="0" w:color="auto"/>
+              <w:bottom w:val="single" w:sz="4" w:space="0" w:color="auto"/>
+              <w:right w:val="single" w:sz="4" w:space="0" w:color="auto"/>
+            </w:tcBorders>
+            <w:vAlign w:val="center"/>
+          </w:tcPr>
+          <w:p>
+            <w:pPr>
+              <w:jc w:val="center"/>
+              <w:rPr>
+                <w:rFonts w:ascii="Times New Roman" w:hAnsi="Times New Roman" w:cs="Times New Roman"/>
+                <w:b/>
+                <w:color w:val="auto"/>
+                <w:sz w:val="28"/>
+                <w:szCs w:val="28"/>
+                <w:lang w:val="tr-TR" w:eastAsia="tr-TR"/>
+              </w:rPr>
+            </w:pPr>
+            <w:r>
+              <w:rPr>
+                <w:rFonts w:ascii="Times New Roman" w:hAnsi="Times New Roman" w:cs="Times New Roman"/>
+                <w:b/>
+                <w:color w:val="auto"/>
+                <w:sz w:val="28"/>
+                <w:szCs w:val="28"/>
+                <w:lang w:val="tr-TR" w:eastAsia="tr-TR"/>
+              </w:rPr>
+              <w:t>Problem Ne?</w:t>
+            </w:r>
+          </w:p>
+        </w:tc>
+      </w:tr>
+      <w:tr>
         <w:tc>
           <w:tcPr>
             <w:tcW w:w="2818" w:type="dxa"/>
@@ -16372,6 +16714,120 @@
         <w:gridCol w:w="4382"/>
         <w:gridCol w:w="2912"/>
       </w:tblGrid>
+      <w:tr>
+        <w:trPr>
+          <w:tblHeader/>
+          <w:cantSplit/>
+        </w:trPr>
+        <w:tc>
+          <w:tcPr>
+            <w:tcW w:w="2818" w:type="dxa"/>
+            <w:tcBorders>
+              <w:top w:val="single" w:sz="4" w:space="0" w:color="auto"/>
+              <w:left w:val="single" w:sz="4" w:space="0" w:color="auto"/>
+              <w:bottom w:val="single" w:sz="4" w:space="0" w:color="auto"/>
+              <w:right w:val="single" w:sz="4" w:space="0" w:color="auto"/>
+            </w:tcBorders>
+            <w:vAlign w:val="center"/>
+          </w:tcPr>
+          <w:p>
+            <w:pPr>
+              <w:jc w:val="center"/>
+              <w:rPr>
+                <w:rFonts w:ascii="Times New Roman" w:hAnsi="Times New Roman" w:cs="Times New Roman"/>
+                <w:b/>
+                <w:color w:val="auto"/>
+                <w:sz w:val="28"/>
+                <w:szCs w:val="28"/>
+                <w:lang w:val="tr-TR" w:eastAsia="tr-TR"/>
+              </w:rPr>
+            </w:pPr>
+            <w:r>
+              <w:rPr>
+                <w:rFonts w:ascii="Times New Roman" w:hAnsi="Times New Roman" w:cs="Times New Roman"/>
+                <w:b/>
+                <w:color w:val="auto"/>
+                <w:sz w:val="28"/>
+                <w:szCs w:val="28"/>
+                <w:lang w:val="tr-TR" w:eastAsia="tr-TR"/>
+              </w:rPr>
+              <w:t>İş</w:t>
+            </w:r>
+          </w:p>
+        </w:tc>
+        <w:tc>
+          <w:tcPr>
+            <w:tcW w:w="4382" w:type="dxa"/>
+            <w:tcBorders>
+              <w:top w:val="single" w:sz="4" w:space="0" w:color="auto"/>
+              <w:left w:val="single" w:sz="4" w:space="0" w:color="auto"/>
+              <w:bottom w:val="single" w:sz="4" w:space="0" w:color="auto"/>
+              <w:right w:val="single" w:sz="4" w:space="0" w:color="auto"/>
+            </w:tcBorders>
+            <w:vAlign w:val="center"/>
+          </w:tcPr>
+          <w:p>
+            <w:pPr>
+              <w:jc w:val="center"/>
+              <w:rPr>
+                <w:rFonts w:ascii="Times New Roman" w:hAnsi="Times New Roman" w:cs="Times New Roman"/>
+                <w:b/>
+                <w:color w:val="auto"/>
+                <w:sz w:val="28"/>
+                <w:szCs w:val="28"/>
+                <w:lang w:val="tr-TR" w:eastAsia="tr-TR"/>
+              </w:rPr>
+            </w:pPr>
+            <w:r>
+              <w:rPr>
+                <w:rFonts w:ascii="Times New Roman" w:hAnsi="Times New Roman" w:cs="Times New Roman"/>
+                <w:b/>
+                <w:color w:val="auto"/>
+                <w:sz w:val="28"/>
+                <w:szCs w:val="28"/>
+                <w:lang w:val="tr-TR" w:eastAsia="tr-TR"/>
+              </w:rPr>
+              <w:t>Bölüm / Kişi</w:t>
+            </w:r>
+          </w:p>
+        </w:tc>
+        <w:tc>
+          <w:tcPr>
+            <w:tcW w:w="2912" w:type="dxa"/>
+            <w:tcBorders>
+              <w:top w:val="single" w:sz="4" w:space="0" w:color="auto"/>
+              <w:left w:val="single" w:sz="4" w:space="0" w:color="auto"/>
+              <w:bottom w:val="single" w:sz="4" w:space="0" w:color="auto"/>
+              <w:right w:val="single" w:sz="4" w:space="0" w:color="auto"/>
+            </w:tcBorders>
+            <w:vAlign w:val="center"/>
+          </w:tcPr>
+          <w:p>
+            <w:pPr>
+              <w:jc w:val="center"/>
+              <w:rPr>
+                <w:rFonts w:ascii="Times New Roman" w:hAnsi="Times New Roman" w:cs="Times New Roman"/>
+                <w:b/>
+                <w:color w:val="auto"/>
+                <w:sz w:val="28"/>
+                <w:szCs w:val="28"/>
+                <w:lang w:val="tr-TR" w:eastAsia="tr-TR"/>
+              </w:rPr>
+            </w:pPr>
+            <w:r>
+              <w:rPr>
+                <w:rFonts w:ascii="Times New Roman" w:hAnsi="Times New Roman" w:cs="Times New Roman"/>
+                <w:b/>
+                <w:color w:val="auto"/>
+                <w:sz w:val="28"/>
+                <w:szCs w:val="28"/>
+                <w:lang w:val="tr-TR" w:eastAsia="tr-TR"/>
+              </w:rPr>
+              <w:t>Nasıl?</w:t>
+            </w:r>
+          </w:p>
+        </w:tc>
+      </w:tr>
       <w:tr>
         <w:tc>
           <w:tcPr>

</xml_diff>

<commit_message>
8. bolum: tablo disi basliklar tablo icine tasindi
</commit_message>
<xml_diff>
--- a/assets/IsAnaliziForm-template.docx
+++ b/assets/IsAnaliziForm-template.docx
@@ -16067,119 +16067,6 @@
         </w:rPr>
       </w:pPr>
     </w:p>
-    <w:p>
-      <w:pPr>
-        <w:ind w:left="720"/>
-        <w:rPr>
-          <w:rFonts w:ascii="Times New Roman" w:hAnsi="Times New Roman" w:cs="Times New Roman"/>
-          <w:noProof/>
-          <w:sz w:val="24"/>
-          <w:lang w:val="tr-TR"/>
-        </w:rPr>
-      </w:pPr>
-      <w:r>
-        <w:rPr>
-          <w:rFonts w:ascii="Times New Roman" w:hAnsi="Times New Roman" w:cs="Times New Roman"/>
-          <w:noProof/>
-          <w:sz w:val="24"/>
-          <w:u w:val="single"/>
-          <w:lang w:val="tr-TR"/>
-        </w:rPr>
-        <w:t>Kiminle</w:t>
-      </w:r>
-      <w:r>
-        <w:rPr>
-          <w:rFonts w:ascii="Times New Roman" w:hAnsi="Times New Roman" w:cs="Times New Roman"/>
-          <w:noProof/>
-          <w:sz w:val="24"/>
-          <w:lang w:val="tr-TR"/>
-        </w:rPr>
-        <w:tab/>
-      </w:r>
-      <w:r>
-        <w:rPr>
-          <w:rFonts w:ascii="Times New Roman" w:hAnsi="Times New Roman" w:cs="Times New Roman"/>
-          <w:noProof/>
-          <w:sz w:val="24"/>
-          <w:lang w:val="tr-TR"/>
-        </w:rPr>
-        <w:tab/>
-      </w:r>
-      <w:r>
-        <w:rPr>
-          <w:rFonts w:ascii="Times New Roman" w:hAnsi="Times New Roman" w:cs="Times New Roman"/>
-          <w:noProof/>
-          <w:sz w:val="24"/>
-          <w:lang w:val="tr-TR"/>
-        </w:rPr>
-        <w:tab/>
-      </w:r>
-      <w:r>
-        <w:rPr>
-          <w:rFonts w:ascii="Times New Roman" w:hAnsi="Times New Roman" w:cs="Times New Roman"/>
-          <w:noProof/>
-          <w:sz w:val="24"/>
-          <w:u w:val="single"/>
-          <w:lang w:val="tr-TR"/>
-        </w:rPr>
-        <w:t>Görüşülecek Konu</w:t>
-      </w:r>
-      <w:r>
-        <w:rPr>
-          <w:rFonts w:ascii="Times New Roman" w:hAnsi="Times New Roman" w:cs="Times New Roman"/>
-          <w:noProof/>
-          <w:sz w:val="24"/>
-          <w:lang w:val="tr-TR"/>
-        </w:rPr>
-        <w:tab/>
-      </w:r>
-      <w:r>
-        <w:rPr>
-          <w:rFonts w:ascii="Times New Roman" w:hAnsi="Times New Roman" w:cs="Times New Roman"/>
-          <w:noProof/>
-          <w:sz w:val="24"/>
-          <w:lang w:val="tr-TR"/>
-        </w:rPr>
-        <w:tab/>
-      </w:r>
-      <w:r>
-        <w:rPr>
-          <w:rFonts w:ascii="Times New Roman" w:hAnsi="Times New Roman" w:cs="Times New Roman"/>
-          <w:noProof/>
-          <w:sz w:val="24"/>
-          <w:lang w:val="tr-TR"/>
-        </w:rPr>
-        <w:tab/>
-      </w:r>
-      <w:r>
-        <w:rPr>
-          <w:rFonts w:ascii="Times New Roman" w:hAnsi="Times New Roman" w:cs="Times New Roman"/>
-          <w:noProof/>
-          <w:sz w:val="24"/>
-          <w:lang w:val="tr-TR"/>
-        </w:rPr>
-        <w:tab/>
-      </w:r>
-      <w:r>
-        <w:rPr>
-          <w:rFonts w:ascii="Times New Roman" w:hAnsi="Times New Roman" w:cs="Times New Roman"/>
-          <w:noProof/>
-          <w:sz w:val="24"/>
-          <w:lang w:val="tr-TR"/>
-        </w:rPr>
-        <w:tab/>
-      </w:r>
-      <w:r>
-        <w:rPr>
-          <w:rFonts w:ascii="Times New Roman" w:hAnsi="Times New Roman" w:cs="Times New Roman"/>
-          <w:noProof/>
-          <w:sz w:val="24"/>
-          <w:u w:val="single"/>
-          <w:lang w:val="tr-TR"/>
-        </w:rPr>
-        <w:t>Sıklık</w:t>
-      </w:r>
-    </w:p>
     <w:tbl>
       <w:tblPr>
         <w:tblW w:w="0" w:type="auto"/>
@@ -16200,6 +16087,121 @@
         <w:gridCol w:w="2192"/>
       </w:tblGrid>
       <w:tr>
+        <w:trPr>
+          <w:tblHeader/>
+          <w:cantSplit/>
+          <w:trHeight w:val="1233"/>
+        </w:trPr>
+        <w:tc>
+          <w:tcPr>
+            <w:tcW w:w="2818" w:type="dxa"/>
+            <w:tcBorders>
+              <w:top w:val="single" w:sz="4" w:space="0" w:color="auto"/>
+              <w:left w:val="single" w:sz="4" w:space="0" w:color="auto"/>
+              <w:bottom w:val="single" w:sz="4" w:space="0" w:color="auto"/>
+              <w:right w:val="single" w:sz="4" w:space="0" w:color="auto"/>
+            </w:tcBorders>
+            <w:vAlign w:val="center"/>
+          </w:tcPr>
+          <w:p>
+            <w:pPr>
+              <w:jc w:val="center"/>
+              <w:rPr>
+                <w:rFonts w:ascii="Times New Roman" w:hAnsi="Times New Roman" w:cs="Times New Roman"/>
+                <w:b/>
+                <w:color w:val="auto"/>
+                <w:sz w:val="24"/>
+                <w:szCs w:val="24"/>
+                <w:lang w:val="tr-TR" w:eastAsia="tr-TR"/>
+              </w:rPr>
+            </w:pPr>
+            <w:r>
+              <w:rPr>
+                <w:rFonts w:ascii="Times New Roman" w:hAnsi="Times New Roman" w:cs="Times New Roman"/>
+                <w:b/>
+                <w:color w:val="auto"/>
+                <w:sz w:val="24"/>
+                <w:szCs w:val="24"/>
+                <w:lang w:val="tr-TR" w:eastAsia="tr-TR"/>
+              </w:rPr>
+              <w:t>Kiminle</w:t>
+            </w:r>
+          </w:p>
+        </w:tc>
+        <w:tc>
+          <w:tcPr>
+            <w:tcW w:w="5102" w:type="dxa"/>
+            <w:tcBorders>
+              <w:top w:val="single" w:sz="4" w:space="0" w:color="auto"/>
+              <w:left w:val="single" w:sz="4" w:space="0" w:color="auto"/>
+              <w:bottom w:val="single" w:sz="4" w:space="0" w:color="auto"/>
+              <w:right w:val="single" w:sz="4" w:space="0" w:color="auto"/>
+            </w:tcBorders>
+            <w:vAlign w:val="center"/>
+          </w:tcPr>
+          <w:p>
+            <w:pPr>
+              <w:jc w:val="center"/>
+              <w:rPr>
+                <w:rFonts w:ascii="Times New Roman" w:hAnsi="Times New Roman" w:cs="Times New Roman"/>
+                <w:b/>
+                <w:color w:val="auto"/>
+                <w:sz w:val="24"/>
+                <w:szCs w:val="24"/>
+                <w:lang w:val="tr-TR" w:eastAsia="tr-TR"/>
+              </w:rPr>
+            </w:pPr>
+            <w:r>
+              <w:rPr>
+                <w:rFonts w:ascii="Times New Roman" w:hAnsi="Times New Roman" w:cs="Times New Roman"/>
+                <w:b/>
+                <w:color w:val="auto"/>
+                <w:sz w:val="24"/>
+                <w:szCs w:val="24"/>
+                <w:lang w:val="tr-TR" w:eastAsia="tr-TR"/>
+              </w:rPr>
+              <w:t>Görüşülecek Konu</w:t>
+            </w:r>
+          </w:p>
+        </w:tc>
+        <w:tc>
+          <w:tcPr>
+            <w:tcW w:w="2192" w:type="dxa"/>
+            <w:tcBorders>
+              <w:top w:val="single" w:sz="4" w:space="0" w:color="auto"/>
+              <w:left w:val="single" w:sz="4" w:space="0" w:color="auto"/>
+              <w:bottom w:val="single" w:sz="4" w:space="0" w:color="auto"/>
+              <w:right w:val="single" w:sz="4" w:space="0" w:color="auto"/>
+            </w:tcBorders>
+            <w:vAlign w:val="center"/>
+          </w:tcPr>
+          <w:p>
+            <w:pPr>
+              <w:jc w:val="center"/>
+              <w:rPr>
+                <w:rFonts w:ascii="Times New Roman" w:hAnsi="Times New Roman" w:cs="Times New Roman"/>
+                <w:b/>
+                <w:color w:val="auto"/>
+                <w:sz w:val="24"/>
+                <w:szCs w:val="24"/>
+                <w:lang w:val="tr-TR" w:eastAsia="tr-TR"/>
+              </w:rPr>
+            </w:pPr>
+            <w:r>
+              <w:rPr>
+                <w:rFonts w:ascii="Times New Roman" w:hAnsi="Times New Roman" w:cs="Times New Roman"/>
+                <w:b/>
+                <w:color w:val="auto"/>
+                <w:sz w:val="24"/>
+                <w:szCs w:val="24"/>
+                <w:lang w:val="tr-TR" w:eastAsia="tr-TR"/>
+              </w:rPr>
+              <w:t>Sıklık</w:t>
+            </w:r>
+          </w:p>
+        </w:tc>
+      </w:tr>
+      <w:tr>
         <w:tc>
           <w:tcPr>
             <w:tcW w:w="2818" w:type="dxa"/>
@@ -16313,119 +16315,6 @@
           <w:lang w:val="tr-TR"/>
         </w:rPr>
       </w:pPr>
-    </w:p>
-    <w:p>
-      <w:pPr>
-        <w:ind w:left="720"/>
-        <w:rPr>
-          <w:rFonts w:ascii="Times New Roman" w:hAnsi="Times New Roman" w:cs="Times New Roman"/>
-          <w:noProof/>
-          <w:sz w:val="24"/>
-          <w:lang w:val="tr-TR"/>
-        </w:rPr>
-      </w:pPr>
-      <w:r>
-        <w:rPr>
-          <w:rFonts w:ascii="Times New Roman" w:hAnsi="Times New Roman" w:cs="Times New Roman"/>
-          <w:noProof/>
-          <w:sz w:val="24"/>
-          <w:u w:val="single"/>
-          <w:lang w:val="tr-TR"/>
-        </w:rPr>
-        <w:t>Kiminle</w:t>
-      </w:r>
-      <w:r>
-        <w:rPr>
-          <w:rFonts w:ascii="Times New Roman" w:hAnsi="Times New Roman" w:cs="Times New Roman"/>
-          <w:noProof/>
-          <w:sz w:val="24"/>
-          <w:lang w:val="tr-TR"/>
-        </w:rPr>
-        <w:tab/>
-      </w:r>
-      <w:r>
-        <w:rPr>
-          <w:rFonts w:ascii="Times New Roman" w:hAnsi="Times New Roman" w:cs="Times New Roman"/>
-          <w:noProof/>
-          <w:sz w:val="24"/>
-          <w:lang w:val="tr-TR"/>
-        </w:rPr>
-        <w:tab/>
-      </w:r>
-      <w:r>
-        <w:rPr>
-          <w:rFonts w:ascii="Times New Roman" w:hAnsi="Times New Roman" w:cs="Times New Roman"/>
-          <w:noProof/>
-          <w:sz w:val="24"/>
-          <w:lang w:val="tr-TR"/>
-        </w:rPr>
-        <w:tab/>
-      </w:r>
-      <w:r>
-        <w:rPr>
-          <w:rFonts w:ascii="Times New Roman" w:hAnsi="Times New Roman" w:cs="Times New Roman"/>
-          <w:noProof/>
-          <w:sz w:val="24"/>
-          <w:u w:val="single"/>
-          <w:lang w:val="tr-TR"/>
-        </w:rPr>
-        <w:t>Görüşülecek Konu</w:t>
-      </w:r>
-      <w:r>
-        <w:rPr>
-          <w:rFonts w:ascii="Times New Roman" w:hAnsi="Times New Roman" w:cs="Times New Roman"/>
-          <w:noProof/>
-          <w:sz w:val="24"/>
-          <w:lang w:val="tr-TR"/>
-        </w:rPr>
-        <w:tab/>
-      </w:r>
-      <w:r>
-        <w:rPr>
-          <w:rFonts w:ascii="Times New Roman" w:hAnsi="Times New Roman" w:cs="Times New Roman"/>
-          <w:noProof/>
-          <w:sz w:val="24"/>
-          <w:lang w:val="tr-TR"/>
-        </w:rPr>
-        <w:tab/>
-      </w:r>
-      <w:r>
-        <w:rPr>
-          <w:rFonts w:ascii="Times New Roman" w:hAnsi="Times New Roman" w:cs="Times New Roman"/>
-          <w:noProof/>
-          <w:sz w:val="24"/>
-          <w:lang w:val="tr-TR"/>
-        </w:rPr>
-        <w:tab/>
-      </w:r>
-      <w:r>
-        <w:rPr>
-          <w:rFonts w:ascii="Times New Roman" w:hAnsi="Times New Roman" w:cs="Times New Roman"/>
-          <w:noProof/>
-          <w:sz w:val="24"/>
-          <w:lang w:val="tr-TR"/>
-        </w:rPr>
-        <w:tab/>
-      </w:r>
-      <w:r>
-        <w:rPr>
-          <w:rFonts w:ascii="Times New Roman" w:hAnsi="Times New Roman" w:cs="Times New Roman"/>
-          <w:noProof/>
-          <w:sz w:val="24"/>
-          <w:lang w:val="tr-TR"/>
-        </w:rPr>
-        <w:tab/>
-      </w:r>
-      <w:r>
-        <w:rPr>
-          <w:rFonts w:ascii="Times New Roman" w:hAnsi="Times New Roman" w:cs="Times New Roman"/>
-          <w:noProof/>
-          <w:sz w:val="24"/>
-          <w:u w:val="single"/>
-          <w:lang w:val="tr-TR"/>
-        </w:rPr>
-        <w:t>Sıklık</w:t>
-      </w:r>
     </w:p>
     <w:tbl>
       <w:tblPr>
@@ -16447,6 +16336,121 @@
         <w:gridCol w:w="2192"/>
       </w:tblGrid>
       <w:tr>
+        <w:trPr>
+          <w:tblHeader/>
+          <w:cantSplit/>
+          <w:trHeight w:val="1233"/>
+        </w:trPr>
+        <w:tc>
+          <w:tcPr>
+            <w:tcW w:w="2818" w:type="dxa"/>
+            <w:tcBorders>
+              <w:top w:val="single" w:sz="4" w:space="0" w:color="auto"/>
+              <w:left w:val="single" w:sz="4" w:space="0" w:color="auto"/>
+              <w:bottom w:val="single" w:sz="4" w:space="0" w:color="auto"/>
+              <w:right w:val="single" w:sz="4" w:space="0" w:color="auto"/>
+            </w:tcBorders>
+            <w:vAlign w:val="center"/>
+          </w:tcPr>
+          <w:p>
+            <w:pPr>
+              <w:jc w:val="center"/>
+              <w:rPr>
+                <w:rFonts w:ascii="Times New Roman" w:hAnsi="Times New Roman" w:cs="Times New Roman"/>
+                <w:b/>
+                <w:color w:val="auto"/>
+                <w:sz w:val="24"/>
+                <w:szCs w:val="24"/>
+                <w:lang w:val="tr-TR" w:eastAsia="tr-TR"/>
+              </w:rPr>
+            </w:pPr>
+            <w:r>
+              <w:rPr>
+                <w:rFonts w:ascii="Times New Roman" w:hAnsi="Times New Roman" w:cs="Times New Roman"/>
+                <w:b/>
+                <w:color w:val="auto"/>
+                <w:sz w:val="24"/>
+                <w:szCs w:val="24"/>
+                <w:lang w:val="tr-TR" w:eastAsia="tr-TR"/>
+              </w:rPr>
+              <w:t>Kiminle</w:t>
+            </w:r>
+          </w:p>
+        </w:tc>
+        <w:tc>
+          <w:tcPr>
+            <w:tcW w:w="5102" w:type="dxa"/>
+            <w:tcBorders>
+              <w:top w:val="single" w:sz="4" w:space="0" w:color="auto"/>
+              <w:left w:val="single" w:sz="4" w:space="0" w:color="auto"/>
+              <w:bottom w:val="single" w:sz="4" w:space="0" w:color="auto"/>
+              <w:right w:val="single" w:sz="4" w:space="0" w:color="auto"/>
+            </w:tcBorders>
+            <w:vAlign w:val="center"/>
+          </w:tcPr>
+          <w:p>
+            <w:pPr>
+              <w:jc w:val="center"/>
+              <w:rPr>
+                <w:rFonts w:ascii="Times New Roman" w:hAnsi="Times New Roman" w:cs="Times New Roman"/>
+                <w:b/>
+                <w:color w:val="auto"/>
+                <w:sz w:val="24"/>
+                <w:szCs w:val="24"/>
+                <w:lang w:val="tr-TR" w:eastAsia="tr-TR"/>
+              </w:rPr>
+            </w:pPr>
+            <w:r>
+              <w:rPr>
+                <w:rFonts w:ascii="Times New Roman" w:hAnsi="Times New Roman" w:cs="Times New Roman"/>
+                <w:b/>
+                <w:color w:val="auto"/>
+                <w:sz w:val="24"/>
+                <w:szCs w:val="24"/>
+                <w:lang w:val="tr-TR" w:eastAsia="tr-TR"/>
+              </w:rPr>
+              <w:t>Görüşülecek Konu</w:t>
+            </w:r>
+          </w:p>
+        </w:tc>
+        <w:tc>
+          <w:tcPr>
+            <w:tcW w:w="2192" w:type="dxa"/>
+            <w:tcBorders>
+              <w:top w:val="single" w:sz="4" w:space="0" w:color="auto"/>
+              <w:left w:val="single" w:sz="4" w:space="0" w:color="auto"/>
+              <w:bottom w:val="single" w:sz="4" w:space="0" w:color="auto"/>
+              <w:right w:val="single" w:sz="4" w:space="0" w:color="auto"/>
+            </w:tcBorders>
+            <w:vAlign w:val="center"/>
+          </w:tcPr>
+          <w:p>
+            <w:pPr>
+              <w:jc w:val="center"/>
+              <w:rPr>
+                <w:rFonts w:ascii="Times New Roman" w:hAnsi="Times New Roman" w:cs="Times New Roman"/>
+                <w:b/>
+                <w:color w:val="auto"/>
+                <w:sz w:val="24"/>
+                <w:szCs w:val="24"/>
+                <w:lang w:val="tr-TR" w:eastAsia="tr-TR"/>
+              </w:rPr>
+            </w:pPr>
+            <w:r>
+              <w:rPr>
+                <w:rFonts w:ascii="Times New Roman" w:hAnsi="Times New Roman" w:cs="Times New Roman"/>
+                <w:b/>
+                <w:color w:val="auto"/>
+                <w:sz w:val="24"/>
+                <w:szCs w:val="24"/>
+                <w:lang w:val="tr-TR" w:eastAsia="tr-TR"/>
+              </w:rPr>
+              <w:t>Sıklık</w:t>
+            </w:r>
+          </w:p>
+        </w:tc>
+      </w:tr>
+      <w:tr>
         <w:tc>
           <w:tcPr>
             <w:tcW w:w="2818" w:type="dxa"/>
@@ -16658,119 +16662,6 @@
           <w:lang w:val="tr-TR"/>
         </w:rPr>
       </w:pPr>
-    </w:p>
-    <w:p>
-      <w:pPr>
-        <w:ind w:left="720"/>
-        <w:rPr>
-          <w:rFonts w:ascii="Times New Roman" w:hAnsi="Times New Roman" w:cs="Times New Roman"/>
-          <w:noProof/>
-          <w:sz w:val="24"/>
-          <w:lang w:val="tr-TR"/>
-        </w:rPr>
-      </w:pPr>
-      <w:r>
-        <w:rPr>
-          <w:rFonts w:ascii="Times New Roman" w:hAnsi="Times New Roman" w:cs="Times New Roman"/>
-          <w:noProof/>
-          <w:sz w:val="24"/>
-          <w:u w:val="single"/>
-          <w:lang w:val="tr-TR"/>
-        </w:rPr>
-        <w:t>Nereden</w:t>
-      </w:r>
-      <w:r>
-        <w:rPr>
-          <w:rFonts w:ascii="Times New Roman" w:hAnsi="Times New Roman" w:cs="Times New Roman"/>
-          <w:noProof/>
-          <w:sz w:val="24"/>
-          <w:lang w:val="tr-TR"/>
-        </w:rPr>
-        <w:tab/>
-      </w:r>
-      <w:r>
-        <w:rPr>
-          <w:rFonts w:ascii="Times New Roman" w:hAnsi="Times New Roman" w:cs="Times New Roman"/>
-          <w:noProof/>
-          <w:sz w:val="24"/>
-          <w:lang w:val="tr-TR"/>
-        </w:rPr>
-        <w:tab/>
-      </w:r>
-      <w:r>
-        <w:rPr>
-          <w:rFonts w:ascii="Times New Roman" w:hAnsi="Times New Roman" w:cs="Times New Roman"/>
-          <w:noProof/>
-          <w:sz w:val="24"/>
-          <w:lang w:val="tr-TR"/>
-        </w:rPr>
-        <w:tab/>
-      </w:r>
-      <w:r>
-        <w:rPr>
-          <w:rFonts w:ascii="Times New Roman" w:hAnsi="Times New Roman" w:cs="Times New Roman"/>
-          <w:noProof/>
-          <w:sz w:val="24"/>
-          <w:u w:val="single"/>
-          <w:lang w:val="tr-TR"/>
-        </w:rPr>
-        <w:t>Hangi Bilgi</w:t>
-      </w:r>
-      <w:r>
-        <w:rPr>
-          <w:rFonts w:ascii="Times New Roman" w:hAnsi="Times New Roman" w:cs="Times New Roman"/>
-          <w:noProof/>
-          <w:sz w:val="24"/>
-          <w:lang w:val="tr-TR"/>
-        </w:rPr>
-        <w:tab/>
-      </w:r>
-      <w:r>
-        <w:rPr>
-          <w:rFonts w:ascii="Times New Roman" w:hAnsi="Times New Roman" w:cs="Times New Roman"/>
-          <w:noProof/>
-          <w:sz w:val="24"/>
-          <w:lang w:val="tr-TR"/>
-        </w:rPr>
-        <w:tab/>
-      </w:r>
-      <w:r>
-        <w:rPr>
-          <w:rFonts w:ascii="Times New Roman" w:hAnsi="Times New Roman" w:cs="Times New Roman"/>
-          <w:noProof/>
-          <w:sz w:val="24"/>
-          <w:lang w:val="tr-TR"/>
-        </w:rPr>
-        <w:tab/>
-      </w:r>
-      <w:r>
-        <w:rPr>
-          <w:rFonts w:ascii="Times New Roman" w:hAnsi="Times New Roman" w:cs="Times New Roman"/>
-          <w:noProof/>
-          <w:sz w:val="24"/>
-          <w:lang w:val="tr-TR"/>
-        </w:rPr>
-        <w:tab/>
-      </w:r>
-      <w:r>
-        <w:rPr>
-          <w:rFonts w:ascii="Times New Roman" w:hAnsi="Times New Roman" w:cs="Times New Roman"/>
-          <w:noProof/>
-          <w:sz w:val="24"/>
-          <w:lang w:val="tr-TR"/>
-        </w:rPr>
-        <w:tab/>
-      </w:r>
-      <w:r>
-        <w:rPr>
-          <w:rFonts w:ascii="Times New Roman" w:hAnsi="Times New Roman" w:cs="Times New Roman"/>
-          <w:noProof/>
-          <w:sz w:val="24"/>
-          <w:u w:val="single"/>
-          <w:lang w:val="tr-TR"/>
-        </w:rPr>
-        <w:t>Problem Ne?</w:t>
-      </w:r>
     </w:p>
     <w:tbl>
       <w:tblPr>
@@ -16792,6 +16683,121 @@
         <w:gridCol w:w="2912"/>
       </w:tblGrid>
       <w:tr>
+        <w:trPr>
+          <w:tblHeader/>
+          <w:cantSplit/>
+          <w:trHeight w:val="1233"/>
+        </w:trPr>
+        <w:tc>
+          <w:tcPr>
+            <w:tcW w:w="2818" w:type="dxa"/>
+            <w:tcBorders>
+              <w:top w:val="single" w:sz="4" w:space="0" w:color="auto"/>
+              <w:left w:val="single" w:sz="4" w:space="0" w:color="auto"/>
+              <w:bottom w:val="single" w:sz="4" w:space="0" w:color="auto"/>
+              <w:right w:val="single" w:sz="4" w:space="0" w:color="auto"/>
+            </w:tcBorders>
+            <w:vAlign w:val="center"/>
+          </w:tcPr>
+          <w:p>
+            <w:pPr>
+              <w:jc w:val="center"/>
+              <w:rPr>
+                <w:rFonts w:ascii="Times New Roman" w:hAnsi="Times New Roman" w:cs="Times New Roman"/>
+                <w:b/>
+                <w:color w:val="auto"/>
+                <w:sz w:val="24"/>
+                <w:szCs w:val="24"/>
+                <w:lang w:val="tr-TR" w:eastAsia="tr-TR"/>
+              </w:rPr>
+            </w:pPr>
+            <w:r>
+              <w:rPr>
+                <w:rFonts w:ascii="Times New Roman" w:hAnsi="Times New Roman" w:cs="Times New Roman"/>
+                <w:b/>
+                <w:color w:val="auto"/>
+                <w:sz w:val="24"/>
+                <w:szCs w:val="24"/>
+                <w:lang w:val="tr-TR" w:eastAsia="tr-TR"/>
+              </w:rPr>
+              <w:t>Nereden</w:t>
+            </w:r>
+          </w:p>
+        </w:tc>
+        <w:tc>
+          <w:tcPr>
+            <w:tcW w:w="4382" w:type="dxa"/>
+            <w:tcBorders>
+              <w:top w:val="single" w:sz="4" w:space="0" w:color="auto"/>
+              <w:left w:val="single" w:sz="4" w:space="0" w:color="auto"/>
+              <w:bottom w:val="single" w:sz="4" w:space="0" w:color="auto"/>
+              <w:right w:val="single" w:sz="4" w:space="0" w:color="auto"/>
+            </w:tcBorders>
+            <w:vAlign w:val="center"/>
+          </w:tcPr>
+          <w:p>
+            <w:pPr>
+              <w:jc w:val="center"/>
+              <w:rPr>
+                <w:rFonts w:ascii="Times New Roman" w:hAnsi="Times New Roman" w:cs="Times New Roman"/>
+                <w:b/>
+                <w:color w:val="auto"/>
+                <w:sz w:val="24"/>
+                <w:szCs w:val="24"/>
+                <w:lang w:val="tr-TR" w:eastAsia="tr-TR"/>
+              </w:rPr>
+            </w:pPr>
+            <w:r>
+              <w:rPr>
+                <w:rFonts w:ascii="Times New Roman" w:hAnsi="Times New Roman" w:cs="Times New Roman"/>
+                <w:b/>
+                <w:color w:val="auto"/>
+                <w:sz w:val="24"/>
+                <w:szCs w:val="24"/>
+                <w:lang w:val="tr-TR" w:eastAsia="tr-TR"/>
+              </w:rPr>
+              <w:t>Hangi Bilgi</w:t>
+            </w:r>
+          </w:p>
+        </w:tc>
+        <w:tc>
+          <w:tcPr>
+            <w:tcW w:w="2912" w:type="dxa"/>
+            <w:tcBorders>
+              <w:top w:val="single" w:sz="4" w:space="0" w:color="auto"/>
+              <w:left w:val="single" w:sz="4" w:space="0" w:color="auto"/>
+              <w:bottom w:val="single" w:sz="4" w:space="0" w:color="auto"/>
+              <w:right w:val="single" w:sz="4" w:space="0" w:color="auto"/>
+            </w:tcBorders>
+            <w:vAlign w:val="center"/>
+          </w:tcPr>
+          <w:p>
+            <w:pPr>
+              <w:jc w:val="center"/>
+              <w:rPr>
+                <w:rFonts w:ascii="Times New Roman" w:hAnsi="Times New Roman" w:cs="Times New Roman"/>
+                <w:b/>
+                <w:color w:val="auto"/>
+                <w:sz w:val="24"/>
+                <w:szCs w:val="24"/>
+                <w:lang w:val="tr-TR" w:eastAsia="tr-TR"/>
+              </w:rPr>
+            </w:pPr>
+            <w:r>
+              <w:rPr>
+                <w:rFonts w:ascii="Times New Roman" w:hAnsi="Times New Roman" w:cs="Times New Roman"/>
+                <w:b/>
+                <w:color w:val="auto"/>
+                <w:sz w:val="24"/>
+                <w:szCs w:val="24"/>
+                <w:lang w:val="tr-TR" w:eastAsia="tr-TR"/>
+              </w:rPr>
+              <w:t>Problem Ne?</w:t>
+            </w:r>
+          </w:p>
+        </w:tc>
+      </w:tr>
+      <w:tr>
         <w:tc>
           <w:tcPr>
             <w:tcW w:w="2818" w:type="dxa"/>
@@ -17029,6 +17035,121 @@
         <w:gridCol w:w="4382"/>
         <w:gridCol w:w="2912"/>
       </w:tblGrid>
+      <w:tr>
+        <w:trPr>
+          <w:tblHeader/>
+          <w:cantSplit/>
+          <w:trHeight w:val="1233"/>
+        </w:trPr>
+        <w:tc>
+          <w:tcPr>
+            <w:tcW w:w="2818" w:type="dxa"/>
+            <w:tcBorders>
+              <w:top w:val="single" w:sz="4" w:space="0" w:color="auto"/>
+              <w:left w:val="single" w:sz="4" w:space="0" w:color="auto"/>
+              <w:bottom w:val="single" w:sz="4" w:space="0" w:color="auto"/>
+              <w:right w:val="single" w:sz="4" w:space="0" w:color="auto"/>
+            </w:tcBorders>
+            <w:vAlign w:val="center"/>
+          </w:tcPr>
+          <w:p>
+            <w:pPr>
+              <w:jc w:val="center"/>
+              <w:rPr>
+                <w:rFonts w:ascii="Times New Roman" w:hAnsi="Times New Roman" w:cs="Times New Roman"/>
+                <w:b/>
+                <w:color w:val="auto"/>
+                <w:sz w:val="24"/>
+                <w:szCs w:val="24"/>
+                <w:lang w:val="tr-TR" w:eastAsia="tr-TR"/>
+              </w:rPr>
+            </w:pPr>
+            <w:r>
+              <w:rPr>
+                <w:rFonts w:ascii="Times New Roman" w:hAnsi="Times New Roman" w:cs="Times New Roman"/>
+                <w:b/>
+                <w:color w:val="auto"/>
+                <w:sz w:val="24"/>
+                <w:szCs w:val="24"/>
+                <w:lang w:val="tr-TR" w:eastAsia="tr-TR"/>
+              </w:rPr>
+              <w:t>İş</w:t>
+            </w:r>
+          </w:p>
+        </w:tc>
+        <w:tc>
+          <w:tcPr>
+            <w:tcW w:w="4382" w:type="dxa"/>
+            <w:tcBorders>
+              <w:top w:val="single" w:sz="4" w:space="0" w:color="auto"/>
+              <w:left w:val="single" w:sz="4" w:space="0" w:color="auto"/>
+              <w:bottom w:val="single" w:sz="4" w:space="0" w:color="auto"/>
+              <w:right w:val="single" w:sz="4" w:space="0" w:color="auto"/>
+            </w:tcBorders>
+            <w:vAlign w:val="center"/>
+          </w:tcPr>
+          <w:p>
+            <w:pPr>
+              <w:jc w:val="center"/>
+              <w:rPr>
+                <w:rFonts w:ascii="Times New Roman" w:hAnsi="Times New Roman" w:cs="Times New Roman"/>
+                <w:b/>
+                <w:color w:val="auto"/>
+                <w:sz w:val="24"/>
+                <w:szCs w:val="24"/>
+                <w:lang w:val="tr-TR" w:eastAsia="tr-TR"/>
+              </w:rPr>
+            </w:pPr>
+            <w:r>
+              <w:rPr>
+                <w:rFonts w:ascii="Times New Roman" w:hAnsi="Times New Roman" w:cs="Times New Roman"/>
+                <w:b/>
+                <w:color w:val="auto"/>
+                <w:sz w:val="24"/>
+                <w:szCs w:val="24"/>
+                <w:lang w:val="tr-TR" w:eastAsia="tr-TR"/>
+              </w:rPr>
+              <w:t>Bölüm / Kişi</w:t>
+            </w:r>
+          </w:p>
+        </w:tc>
+        <w:tc>
+          <w:tcPr>
+            <w:tcW w:w="2912" w:type="dxa"/>
+            <w:tcBorders>
+              <w:top w:val="single" w:sz="4" w:space="0" w:color="auto"/>
+              <w:left w:val="single" w:sz="4" w:space="0" w:color="auto"/>
+              <w:bottom w:val="single" w:sz="4" w:space="0" w:color="auto"/>
+              <w:right w:val="single" w:sz="4" w:space="0" w:color="auto"/>
+            </w:tcBorders>
+            <w:vAlign w:val="center"/>
+          </w:tcPr>
+          <w:p>
+            <w:pPr>
+              <w:jc w:val="center"/>
+              <w:rPr>
+                <w:rFonts w:ascii="Times New Roman" w:hAnsi="Times New Roman" w:cs="Times New Roman"/>
+                <w:b/>
+                <w:color w:val="auto"/>
+                <w:sz w:val="24"/>
+                <w:szCs w:val="24"/>
+                <w:lang w:val="tr-TR" w:eastAsia="tr-TR"/>
+              </w:rPr>
+            </w:pPr>
+            <w:r>
+              <w:rPr>
+                <w:rFonts w:ascii="Times New Roman" w:hAnsi="Times New Roman" w:cs="Times New Roman"/>
+                <w:b/>
+                <w:color w:val="auto"/>
+                <w:sz w:val="24"/>
+                <w:szCs w:val="24"/>
+                <w:lang w:val="tr-TR" w:eastAsia="tr-TR"/>
+              </w:rPr>
+              <w:t>Nasıl?</w:t>
+            </w:r>
+          </w:p>
+        </w:tc>
+      </w:tr>
       <w:tr>
         <w:tc>
           <w:tcPr>

</xml_diff>

<commit_message>
Etkilenenler dis baslik artigi temizlendi
</commit_message>
<xml_diff>
--- a/assets/IsAnaliziForm-template.docx
+++ b/assets/IsAnaliziForm-template.docx
@@ -16893,128 +16893,6 @@
           <w:lang w:val="tr-TR"/>
         </w:rPr>
       </w:pPr>
-    </w:p>
-    <w:p>
-      <w:pPr>
-        <w:ind w:left="720"/>
-        <w:rPr>
-          <w:rFonts w:ascii="Times New Roman" w:hAnsi="Times New Roman" w:cs="Times New Roman"/>
-          <w:noProof/>
-          <w:sz w:val="24"/>
-          <w:lang w:val="tr-TR"/>
-        </w:rPr>
-      </w:pPr>
-      <w:r>
-        <w:rPr>
-          <w:rFonts w:ascii="Times New Roman" w:hAnsi="Times New Roman" w:cs="Times New Roman"/>
-          <w:noProof/>
-          <w:sz w:val="24"/>
-          <w:u w:val="single"/>
-          <w:lang w:val="tr-TR"/>
-        </w:rPr>
-        <w:t>İş</w:t>
-      </w:r>
-      <w:r>
-        <w:rPr>
-          <w:rFonts w:ascii="Times New Roman" w:hAnsi="Times New Roman" w:cs="Times New Roman"/>
-          <w:noProof/>
-          <w:sz w:val="24"/>
-          <w:lang w:val="tr-TR"/>
-        </w:rPr>
-        <w:tab/>
-      </w:r>
-      <w:r>
-        <w:rPr>
-          <w:rFonts w:ascii="Times New Roman" w:hAnsi="Times New Roman" w:cs="Times New Roman"/>
-          <w:noProof/>
-          <w:sz w:val="24"/>
-          <w:lang w:val="tr-TR"/>
-        </w:rPr>
-        <w:tab/>
-      </w:r>
-      <w:r>
-        <w:rPr>
-          <w:rFonts w:ascii="Times New Roman" w:hAnsi="Times New Roman" w:cs="Times New Roman"/>
-          <w:noProof/>
-          <w:sz w:val="24"/>
-          <w:lang w:val="tr-TR"/>
-        </w:rPr>
-        <w:tab/>
-      </w:r>
-      <w:r>
-        <w:rPr>
-          <w:rFonts w:ascii="Times New Roman" w:hAnsi="Times New Roman" w:cs="Times New Roman"/>
-          <w:noProof/>
-          <w:sz w:val="24"/>
-          <w:lang w:val="tr-TR"/>
-        </w:rPr>
-        <w:tab/>
-      </w:r>
-      <w:r>
-        <w:rPr>
-          <w:rFonts w:ascii="Times New Roman" w:hAnsi="Times New Roman" w:cs="Times New Roman"/>
-          <w:noProof/>
-          <w:sz w:val="24"/>
-          <w:u w:val="single"/>
-          <w:lang w:val="tr-TR"/>
-        </w:rPr>
-        <w:t>Bölüm/Kişi</w:t>
-      </w:r>
-      <w:r>
-        <w:rPr>
-          <w:rFonts w:ascii="Times New Roman" w:hAnsi="Times New Roman" w:cs="Times New Roman"/>
-          <w:noProof/>
-          <w:sz w:val="24"/>
-          <w:lang w:val="tr-TR"/>
-        </w:rPr>
-        <w:tab/>
-      </w:r>
-      <w:r>
-        <w:rPr>
-          <w:rFonts w:ascii="Times New Roman" w:hAnsi="Times New Roman" w:cs="Times New Roman"/>
-          <w:noProof/>
-          <w:sz w:val="24"/>
-          <w:lang w:val="tr-TR"/>
-        </w:rPr>
-        <w:tab/>
-      </w:r>
-      <w:r>
-        <w:rPr>
-          <w:rFonts w:ascii="Times New Roman" w:hAnsi="Times New Roman" w:cs="Times New Roman"/>
-          <w:noProof/>
-          <w:sz w:val="24"/>
-          <w:lang w:val="tr-TR"/>
-        </w:rPr>
-        <w:tab/>
-      </w:r>
-      <w:r>
-        <w:rPr>
-          <w:rFonts w:ascii="Times New Roman" w:hAnsi="Times New Roman" w:cs="Times New Roman"/>
-          <w:noProof/>
-          <w:sz w:val="24"/>
-          <w:lang w:val="tr-TR"/>
-        </w:rPr>
-        <w:tab/>
-      </w:r>
-      <w:r>
-        <w:rPr>
-          <w:rFonts w:ascii="Times New Roman" w:hAnsi="Times New Roman" w:cs="Times New Roman"/>
-          <w:noProof/>
-          <w:sz w:val="24"/>
-          <w:lang w:val="tr-TR"/>
-        </w:rPr>
-        <w:tab/>
-      </w:r>
-      <w:r>
-        <w:rPr>
-          <w:rFonts w:ascii="Times New Roman" w:hAnsi="Times New Roman" w:cs="Times New Roman"/>
-          <w:noProof/>
-          <w:sz w:val="24"/>
-          <w:u w:val="single"/>
-          <w:lang w:val="tr-TR"/>
-        </w:rPr>
-        <w:t>Nasıl?</w:t>
-      </w:r>
     </w:p>
     <w:tbl>
       <w:tblPr>

</xml_diff>

<commit_message>
12. bolum: tarihin yanina saga imza alani eklendi
</commit_message>
<xml_diff>
--- a/assets/IsAnaliziForm-template.docx
+++ b/assets/IsAnaliziForm-template.docx
@@ -18150,16 +18150,27 @@
         <w:tblLook w:val="01E0" w:firstRow="1" w:lastRow="1" w:firstColumn="1" w:lastColumn="1" w:noHBand="0" w:noVBand="0"/>
       </w:tblPr>
       <w:tblGrid>
-        <w:gridCol w:w="10112"/>
+        <w:gridCol w:w="5056"/>
+        <w:gridCol w:w="5056"/>
       </w:tblGrid>
       <w:tr>
         <w:tc>
           <w:tcPr>
-            <w:tcW w:w="4642" w:type="dxa"/>
-          </w:tcPr>
-          <w:p>
-            <w:r>
-              <w:t xml:space="preserve">{{imza_tarih}}</w:t>
+            <w:tcW w:w="5056" w:type="dxa"/>
+          </w:tcPr>
+          <w:p>
+            <w:r>
+              <w:t xml:space="preserve">Tarih: {{imza_tarih}}</w:t>
+            </w:r>
+          </w:p>
+        </w:tc>
+        <w:tc>
+          <w:tcPr>
+            <w:tcW w:w="5056" w:type="dxa"/>
+          </w:tcPr>
+          <w:p>
+            <w:r>
+              <w:t xml:space="preserve">İmza: {{imza_ad}}</w:t>
             </w:r>
           </w:p>
         </w:tc>

</xml_diff>

<commit_message>
Son sayfadaki sahipsiz dikey cizgi kaldirildi, zor_yanlar basligi tabloya tasindi
</commit_message>
<xml_diff>
--- a/assets/IsAnaliziForm-template.docx
+++ b/assets/IsAnaliziForm-template.docx
@@ -17932,110 +17932,6 @@
         </w:rPr>
       </w:pPr>
     </w:p>
-    <w:p>
-      <w:pPr>
-        <w:jc w:val="both"/>
-        <w:rPr>
-          <w:rFonts w:ascii="Times New Roman" w:hAnsi="Times New Roman" w:cs="Times New Roman"/>
-          <w:b/>
-          <w:noProof/>
-          <w:sz w:val="24"/>
-          <w:lang w:val="tr-TR"/>
-        </w:rPr>
-      </w:pPr>
-      <w:r>
-        <w:rPr>
-          <w:rFonts w:ascii="Times New Roman" w:hAnsi="Times New Roman" w:cs="Times New Roman"/>
-          <w:noProof/>
-          <w:lang w:val="tr-TR" w:eastAsia="tr-TR"/>
-        </w:rPr>
-        <w:pict w14:anchorId="12382CE2">
-          <v:line id="_x0000_s1070" style="position:absolute;left:0;text-align:left;flip:y;z-index:251650048" from="324pt,15.1pt" to="324pt,249.1pt"/>
-        </w:pict>
-      </w:r>
-      <w:r>
-        <w:rPr>
-          <w:rFonts w:ascii="Times New Roman" w:hAnsi="Times New Roman" w:cs="Times New Roman"/>
-          <w:noProof/>
-          <w:sz w:val="24"/>
-          <w:lang w:val="tr-TR"/>
-        </w:rPr>
-        <w:tab/>
-        <w:t>KONULAR?</w:t>
-      </w:r>
-      <w:r>
-        <w:rPr>
-          <w:rFonts w:ascii="Times New Roman" w:hAnsi="Times New Roman" w:cs="Times New Roman"/>
-          <w:noProof/>
-          <w:sz w:val="24"/>
-          <w:lang w:val="tr-TR"/>
-        </w:rPr>
-        <w:tab/>
-      </w:r>
-      <w:r>
-        <w:rPr>
-          <w:rFonts w:ascii="Times New Roman" w:hAnsi="Times New Roman" w:cs="Times New Roman"/>
-          <w:noProof/>
-          <w:sz w:val="24"/>
-          <w:lang w:val="tr-TR"/>
-        </w:rPr>
-        <w:tab/>
-      </w:r>
-      <w:r>
-        <w:rPr>
-          <w:rFonts w:ascii="Times New Roman" w:hAnsi="Times New Roman" w:cs="Times New Roman"/>
-          <w:noProof/>
-          <w:sz w:val="24"/>
-          <w:lang w:val="tr-TR"/>
-        </w:rPr>
-        <w:tab/>
-      </w:r>
-      <w:r>
-        <w:rPr>
-          <w:rFonts w:ascii="Times New Roman" w:hAnsi="Times New Roman" w:cs="Times New Roman"/>
-          <w:noProof/>
-          <w:sz w:val="24"/>
-          <w:lang w:val="tr-TR"/>
-        </w:rPr>
-        <w:tab/>
-      </w:r>
-      <w:r>
-        <w:rPr>
-          <w:rFonts w:ascii="Times New Roman" w:hAnsi="Times New Roman" w:cs="Times New Roman"/>
-          <w:noProof/>
-          <w:sz w:val="24"/>
-          <w:lang w:val="tr-TR"/>
-        </w:rPr>
-        <w:tab/>
-      </w:r>
-      <w:r>
-        <w:rPr>
-          <w:rFonts w:ascii="Times New Roman" w:hAnsi="Times New Roman" w:cs="Times New Roman"/>
-          <w:noProof/>
-          <w:sz w:val="24"/>
-          <w:lang w:val="tr-TR"/>
-        </w:rPr>
-        <w:tab/>
-      </w:r>
-      <w:r>
-        <w:rPr>
-          <w:rFonts w:ascii="Times New Roman" w:hAnsi="Times New Roman" w:cs="Times New Roman"/>
-          <w:noProof/>
-          <w:sz w:val="24"/>
-          <w:lang w:val="tr-TR"/>
-        </w:rPr>
-        <w:t xml:space="preserve">            </w:t>
-      </w:r>
-      <w:r>
-        <w:rPr>
-          <w:rFonts w:ascii="Times New Roman" w:hAnsi="Times New Roman" w:cs="Times New Roman"/>
-          <w:noProof/>
-          <w:sz w:val="24"/>
-          <w:lang w:val="tr-TR"/>
-        </w:rPr>
-        <w:t>NİÇİN?</w:t>
-      </w:r>
-    </w:p>
     <w:tbl>
       <w:tblPr>
         <w:tblW w:w="0" w:type="auto"/>
@@ -18054,6 +17950,84 @@
         <w:gridCol w:w="5056"/>
         <w:gridCol w:w="5056"/>
       </w:tblGrid>
+      <w:tr>
+        <w:trPr>
+          <w:tblHeader/>
+          <w:cantSplit/>
+        </w:trPr>
+        <w:tc>
+          <w:tcPr>
+            <w:tcW w:w="10112" w:type="dxa"/>
+            <w:tcBorders>
+              <w:top w:val="single" w:sz="4" w:space="0" w:color="auto"/>
+              <w:left w:val="single" w:sz="4" w:space="0" w:color="auto"/>
+              <w:bottom w:val="single" w:sz="4" w:space="0" w:color="auto"/>
+              <w:right w:val="single" w:sz="4" w:space="0" w:color="auto"/>
+            </w:tcBorders>
+            <w:vAlign w:val="center"/>
+          </w:tcPr>
+          <w:p>
+            <w:pPr>
+              <w:jc w:val="center"/>
+              <w:rPr>
+                <w:rFonts w:ascii="Times New Roman" w:hAnsi="Times New Roman" w:cs="Times New Roman"/>
+                <w:b/>
+                <w:color w:val="auto"/>
+                <w:sz w:val="24"/>
+                <w:szCs w:val="24"/>
+                <w:lang w:val="tr-TR" w:eastAsia="tr-TR"/>
+              </w:rPr>
+            </w:pPr>
+            <w:r>
+              <w:rPr>
+                <w:rFonts w:ascii="Times New Roman" w:hAnsi="Times New Roman" w:cs="Times New Roman"/>
+                <w:b/>
+                <w:color w:val="auto"/>
+                <w:sz w:val="24"/>
+                <w:szCs w:val="24"/>
+                <w:lang w:val="tr-TR" w:eastAsia="tr-TR"/>
+              </w:rPr>
+              <w:t>Konu</w:t>
+            </w:r>
+          </w:p>
+        </w:tc>
+        <w:tc>
+          <w:tcPr>
+            <w:tcW w:w="10112" w:type="dxa"/>
+            <w:tcBorders>
+              <w:top w:val="single" w:sz="4" w:space="0" w:color="auto"/>
+              <w:left w:val="single" w:sz="4" w:space="0" w:color="auto"/>
+              <w:bottom w:val="single" w:sz="4" w:space="0" w:color="auto"/>
+              <w:right w:val="single" w:sz="4" w:space="0" w:color="auto"/>
+            </w:tcBorders>
+            <w:vAlign w:val="center"/>
+          </w:tcPr>
+          <w:p>
+            <w:pPr>
+              <w:jc w:val="center"/>
+              <w:rPr>
+                <w:rFonts w:ascii="Times New Roman" w:hAnsi="Times New Roman" w:cs="Times New Roman"/>
+                <w:b/>
+                <w:color w:val="auto"/>
+                <w:sz w:val="24"/>
+                <w:szCs w:val="24"/>
+                <w:lang w:val="tr-TR" w:eastAsia="tr-TR"/>
+              </w:rPr>
+            </w:pPr>
+            <w:r>
+              <w:rPr>
+                <w:rFonts w:ascii="Times New Roman" w:hAnsi="Times New Roman" w:cs="Times New Roman"/>
+                <w:b/>
+                <w:color w:val="auto"/>
+                <w:sz w:val="24"/>
+                <w:szCs w:val="24"/>
+                <w:lang w:val="tr-TR" w:eastAsia="tr-TR"/>
+              </w:rPr>
+              <w:t>Niçin?</w:t>
+            </w:r>
+          </w:p>
+        </w:tc>
+      </w:tr>
       <w:tr>
         <w:tc>
           <w:tcPr>

</xml_diff>